<commit_message>
invoice  sq mt calculation & alignment issue
</commit_message>
<xml_diff>
--- a/electron/database/generate-document/templates/custom-invoice.docx
+++ b/electron/database/generate-document/templates/custom-invoice.docx
@@ -10,16 +10,16 @@
         <w:tblLook w:val="04A0" w:firstRow="1" w:lastRow="0" w:firstColumn="1" w:lastColumn="0" w:noHBand="0" w:noVBand="1"/>
       </w:tblPr>
       <w:tblGrid>
-        <w:gridCol w:w="2509"/>
-        <w:gridCol w:w="338"/>
-        <w:gridCol w:w="880"/>
-        <w:gridCol w:w="1401"/>
-        <w:gridCol w:w="363"/>
-        <w:gridCol w:w="1712"/>
-        <w:gridCol w:w="1061"/>
-        <w:gridCol w:w="216"/>
-        <w:gridCol w:w="753"/>
-        <w:gridCol w:w="1873"/>
+        <w:gridCol w:w="2617"/>
+        <w:gridCol w:w="354"/>
+        <w:gridCol w:w="872"/>
+        <w:gridCol w:w="1368"/>
+        <w:gridCol w:w="379"/>
+        <w:gridCol w:w="1665"/>
+        <w:gridCol w:w="1044"/>
+        <w:gridCol w:w="203"/>
+        <w:gridCol w:w="786"/>
+        <w:gridCol w:w="1818"/>
       </w:tblGrid>
       <w:tr>
         <w:trPr>
@@ -220,12 +220,14 @@
               </w:rPr>
               <w:t>{</w:t>
             </w:r>
+            <w:proofErr w:type="spellStart"/>
             <w:r>
               <w:rPr>
                 <w:rFonts w:cstheme="minorHAnsi"/>
               </w:rPr>
               <w:t>invoiceNo</w:t>
             </w:r>
+            <w:proofErr w:type="spellEnd"/>
             <w:r>
               <w:rPr>
                 <w:rFonts w:cstheme="minorHAnsi"/>
@@ -267,12 +269,14 @@
               </w:rPr>
               <w:t>{</w:t>
             </w:r>
+            <w:proofErr w:type="spellStart"/>
             <w:r>
               <w:rPr>
                 <w:rFonts w:cstheme="minorHAnsi"/>
               </w:rPr>
               <w:t>invoiceDate</w:t>
             </w:r>
+            <w:proofErr w:type="spellEnd"/>
             <w:r>
               <w:rPr>
                 <w:rFonts w:cstheme="minorHAnsi"/>
@@ -336,12 +340,14 @@
               </w:rPr>
               <w:t>{</w:t>
             </w:r>
+            <w:proofErr w:type="spellStart"/>
             <w:r>
               <w:rPr>
                 <w:rFonts w:cstheme="minorHAnsi"/>
               </w:rPr>
               <w:t>buyersOrderNo</w:t>
             </w:r>
+            <w:proofErr w:type="spellEnd"/>
             <w:r>
               <w:rPr>
                 <w:rFonts w:cstheme="minorHAnsi"/>
@@ -384,12 +390,14 @@
               </w:rPr>
               <w:t>{</w:t>
             </w:r>
+            <w:proofErr w:type="spellStart"/>
             <w:r>
               <w:rPr>
                 <w:rFonts w:cstheme="minorHAnsi"/>
               </w:rPr>
               <w:t>orderDate</w:t>
             </w:r>
+            <w:proofErr w:type="spellEnd"/>
             <w:r>
               <w:rPr>
                 <w:rFonts w:cstheme="minorHAnsi"/>
@@ -446,6 +454,7 @@
               </w:rPr>
               <w:t>{</w:t>
             </w:r>
+            <w:proofErr w:type="spellStart"/>
             <w:r>
               <w:rPr>
                 <w:rFonts w:cstheme="minorHAnsi"/>
@@ -454,6 +463,7 @@
               </w:rPr>
               <w:t>consigneeCountry</w:t>
             </w:r>
+            <w:proofErr w:type="spellEnd"/>
             <w:r>
               <w:rPr>
                 <w:rFonts w:cstheme="minorHAnsi"/>
@@ -522,6 +532,7 @@
               </w:rPr>
               <w:t>{</w:t>
             </w:r>
+            <w:proofErr w:type="spellStart"/>
             <w:r>
               <w:rPr>
                 <w:rFonts w:cstheme="minorHAnsi"/>
@@ -530,6 +541,7 @@
               </w:rPr>
               <w:t>consigneeName</w:t>
             </w:r>
+            <w:proofErr w:type="spellEnd"/>
             <w:r>
               <w:rPr>
                 <w:rFonts w:cstheme="minorHAnsi"/>
@@ -555,6 +567,7 @@
               </w:rPr>
               <w:t>{</w:t>
             </w:r>
+            <w:proofErr w:type="spellStart"/>
             <w:r>
               <w:rPr>
                 <w:rFonts w:cstheme="minorHAnsi"/>
@@ -563,6 +576,7 @@
               </w:rPr>
               <w:t>consigneeAddress</w:t>
             </w:r>
+            <w:proofErr w:type="spellEnd"/>
             <w:r>
               <w:rPr>
                 <w:rFonts w:cstheme="minorHAnsi"/>
@@ -571,6 +585,7 @@
               </w:rPr>
               <w:t>} {</w:t>
             </w:r>
+            <w:proofErr w:type="spellStart"/>
             <w:r>
               <w:rPr>
                 <w:rFonts w:cstheme="minorHAnsi"/>
@@ -579,6 +594,7 @@
               </w:rPr>
               <w:t>consigneeCity</w:t>
             </w:r>
+            <w:proofErr w:type="spellEnd"/>
             <w:r>
               <w:rPr>
                 <w:rFonts w:cstheme="minorHAnsi"/>
@@ -587,6 +603,7 @@
               </w:rPr>
               <w:t>} {</w:t>
             </w:r>
+            <w:proofErr w:type="spellStart"/>
             <w:r>
               <w:rPr>
                 <w:rFonts w:cstheme="minorHAnsi"/>
@@ -595,6 +612,7 @@
               </w:rPr>
               <w:t>consigneeState</w:t>
             </w:r>
+            <w:proofErr w:type="spellEnd"/>
             <w:r>
               <w:rPr>
                 <w:rFonts w:cstheme="minorHAnsi"/>
@@ -620,6 +638,7 @@
               </w:rPr>
               <w:t>{</w:t>
             </w:r>
+            <w:proofErr w:type="spellStart"/>
             <w:r>
               <w:rPr>
                 <w:rFonts w:cstheme="minorHAnsi"/>
@@ -628,6 +647,7 @@
               </w:rPr>
               <w:t>consigneeCountry</w:t>
             </w:r>
+            <w:proofErr w:type="spellEnd"/>
             <w:r>
               <w:rPr>
                 <w:rFonts w:cstheme="minorHAnsi"/>
@@ -636,6 +656,7 @@
               </w:rPr>
               <w:t>} {</w:t>
             </w:r>
+            <w:proofErr w:type="spellStart"/>
             <w:r>
               <w:rPr>
                 <w:rFonts w:cstheme="minorHAnsi"/>
@@ -644,6 +665,7 @@
               </w:rPr>
               <w:t>consigneeZip</w:t>
             </w:r>
+            <w:proofErr w:type="spellEnd"/>
             <w:r>
               <w:rPr>
                 <w:rFonts w:cstheme="minorHAnsi"/>
@@ -696,6 +718,7 @@
               </w:rPr>
               <w:t>{</w:t>
             </w:r>
+            <w:proofErr w:type="spellStart"/>
             <w:r>
               <w:rPr>
                 <w:rFonts w:cstheme="minorHAnsi"/>
@@ -704,6 +727,7 @@
               </w:rPr>
               <w:t>buyerName</w:t>
             </w:r>
+            <w:proofErr w:type="spellEnd"/>
             <w:r>
               <w:rPr>
                 <w:rFonts w:cstheme="minorHAnsi"/>
@@ -729,6 +753,7 @@
               </w:rPr>
               <w:t>{</w:t>
             </w:r>
+            <w:proofErr w:type="spellStart"/>
             <w:r>
               <w:rPr>
                 <w:rFonts w:cstheme="minorHAnsi"/>
@@ -737,6 +762,7 @@
               </w:rPr>
               <w:t>buyerAddress</w:t>
             </w:r>
+            <w:proofErr w:type="spellEnd"/>
             <w:r>
               <w:rPr>
                 <w:rFonts w:cstheme="minorHAnsi"/>
@@ -745,6 +771,7 @@
               </w:rPr>
               <w:t>} {</w:t>
             </w:r>
+            <w:proofErr w:type="spellStart"/>
             <w:r>
               <w:rPr>
                 <w:rFonts w:cstheme="minorHAnsi"/>
@@ -753,6 +780,7 @@
               </w:rPr>
               <w:t>buyerCity</w:t>
             </w:r>
+            <w:proofErr w:type="spellEnd"/>
             <w:r>
               <w:rPr>
                 <w:rFonts w:cstheme="minorHAnsi"/>
@@ -761,6 +789,7 @@
               </w:rPr>
               <w:t>} {</w:t>
             </w:r>
+            <w:proofErr w:type="spellStart"/>
             <w:r>
               <w:rPr>
                 <w:rFonts w:cstheme="minorHAnsi"/>
@@ -769,6 +798,7 @@
               </w:rPr>
               <w:t>buyerState</w:t>
             </w:r>
+            <w:proofErr w:type="spellEnd"/>
             <w:r>
               <w:rPr>
                 <w:rFonts w:cstheme="minorHAnsi"/>
@@ -794,6 +824,7 @@
               </w:rPr>
               <w:t>{</w:t>
             </w:r>
+            <w:proofErr w:type="spellStart"/>
             <w:r>
               <w:rPr>
                 <w:rFonts w:cstheme="minorHAnsi"/>
@@ -802,6 +833,7 @@
               </w:rPr>
               <w:t>buyerCountry</w:t>
             </w:r>
+            <w:proofErr w:type="spellEnd"/>
             <w:r>
               <w:rPr>
                 <w:rFonts w:cstheme="minorHAnsi"/>
@@ -810,6 +842,7 @@
               </w:rPr>
               <w:t>} {</w:t>
             </w:r>
+            <w:proofErr w:type="spellStart"/>
             <w:r>
               <w:rPr>
                 <w:rFonts w:cstheme="minorHAnsi"/>
@@ -818,6 +851,7 @@
               </w:rPr>
               <w:t>buyerZip</w:t>
             </w:r>
+            <w:proofErr w:type="spellEnd"/>
             <w:r>
               <w:rPr>
                 <w:rFonts w:cstheme="minorHAnsi"/>
@@ -890,6 +924,7 @@
               </w:rPr>
               <w:t>{</w:t>
             </w:r>
+            <w:proofErr w:type="spellStart"/>
             <w:r>
               <w:rPr>
                 <w:rFonts w:cstheme="minorHAnsi"/>
@@ -898,6 +933,7 @@
               </w:rPr>
               <w:t>originOfGoods</w:t>
             </w:r>
+            <w:proofErr w:type="spellEnd"/>
             <w:r>
               <w:rPr>
                 <w:rFonts w:cstheme="minorHAnsi"/>
@@ -949,6 +985,7 @@
               </w:rPr>
               <w:t>{</w:t>
             </w:r>
+            <w:proofErr w:type="spellStart"/>
             <w:r>
               <w:rPr>
                 <w:rFonts w:cstheme="minorHAnsi"/>
@@ -957,6 +994,7 @@
               </w:rPr>
               <w:t>finalDestination</w:t>
             </w:r>
+            <w:proofErr w:type="spellEnd"/>
             <w:r>
               <w:rPr>
                 <w:rFonts w:cstheme="minorHAnsi"/>
@@ -1031,25 +1069,9 @@
                 <w:sz w:val="20"/>
                 <w:szCs w:val="20"/>
               </w:rPr>
-              <w:t>BY T.T.</w:t>
-            </w:r>
-          </w:p>
-          <w:p>
-            <w:pPr>
-              <w:rPr>
-                <w:rFonts w:cstheme="minorHAnsi"/>
-                <w:sz w:val="20"/>
-                <w:szCs w:val="20"/>
-              </w:rPr>
-            </w:pPr>
-            <w:r>
-              <w:rPr>
-                <w:rFonts w:cstheme="minorHAnsi"/>
-                <w:sz w:val="20"/>
-                <w:szCs w:val="20"/>
-              </w:rPr>
               <w:t>{</w:t>
             </w:r>
+            <w:proofErr w:type="spellStart"/>
             <w:r>
               <w:rPr>
                 <w:rFonts w:cstheme="minorHAnsi"/>
@@ -1058,6 +1080,7 @@
               </w:rPr>
               <w:t>termOfDeliveryAndPayment</w:t>
             </w:r>
+            <w:proofErr w:type="spellEnd"/>
             <w:r>
               <w:rPr>
                 <w:rFonts w:cstheme="minorHAnsi"/>
@@ -1094,6 +1117,7 @@
                 <w:szCs w:val="20"/>
               </w:rPr>
             </w:pPr>
+            <w:proofErr w:type="spellStart"/>
             <w:r>
               <w:rPr>
                 <w:rFonts w:ascii="SansSerif" w:hAnsi="SansSerif" w:cs="SansSerif"/>
@@ -1101,7 +1125,17 @@
                 <w:sz w:val="20"/>
                 <w:szCs w:val="20"/>
               </w:rPr>
-              <w:t>Precarriage by:</w:t>
+              <w:t>Precarriage</w:t>
+            </w:r>
+            <w:proofErr w:type="spellEnd"/>
+            <w:r>
+              <w:rPr>
+                <w:rFonts w:ascii="SansSerif" w:hAnsi="SansSerif" w:cs="SansSerif"/>
+                <w:color w:val="000000"/>
+                <w:sz w:val="20"/>
+                <w:szCs w:val="20"/>
+              </w:rPr>
+              <w:t xml:space="preserve"> by:</w:t>
             </w:r>
           </w:p>
           <w:p>
@@ -1121,6 +1155,7 @@
               </w:rPr>
               <w:t>{</w:t>
             </w:r>
+            <w:proofErr w:type="spellStart"/>
             <w:r>
               <w:rPr>
                 <w:rFonts w:cstheme="minorHAnsi"/>
@@ -1129,6 +1164,7 @@
               </w:rPr>
               <w:t>precarriageBy</w:t>
             </w:r>
+            <w:proofErr w:type="spellEnd"/>
             <w:r>
               <w:rPr>
                 <w:rFonts w:cstheme="minorHAnsi"/>
@@ -1190,6 +1226,7 @@
               </w:rPr>
               <w:t>{</w:t>
             </w:r>
+            <w:proofErr w:type="spellStart"/>
             <w:r>
               <w:rPr>
                 <w:rFonts w:ascii="SansSerif" w:hAnsi="SansSerif" w:cs="SansSerif"/>
@@ -1199,6 +1236,7 @@
               </w:rPr>
               <w:t>placeOfReceipt</w:t>
             </w:r>
+            <w:proofErr w:type="spellEnd"/>
             <w:r>
               <w:rPr>
                 <w:rFonts w:ascii="SansSerif" w:hAnsi="SansSerif" w:cs="SansSerif"/>
@@ -1289,6 +1327,7 @@
               </w:rPr>
               <w:t>{</w:t>
             </w:r>
+            <w:proofErr w:type="spellStart"/>
             <w:r>
               <w:rPr>
                 <w:rFonts w:ascii="SansSerif" w:hAnsi="SansSerif" w:cs="SansSerif"/>
@@ -1298,6 +1337,7 @@
               </w:rPr>
               <w:t>vesselNo</w:t>
             </w:r>
+            <w:proofErr w:type="spellEnd"/>
             <w:r>
               <w:rPr>
                 <w:rFonts w:ascii="SansSerif" w:hAnsi="SansSerif" w:cs="SansSerif"/>
@@ -1360,6 +1400,7 @@
               </w:rPr>
               <w:t>{</w:t>
             </w:r>
+            <w:proofErr w:type="spellStart"/>
             <w:r>
               <w:rPr>
                 <w:rFonts w:ascii="SansSerif" w:hAnsi="SansSerif" w:cs="SansSerif"/>
@@ -1369,6 +1410,7 @@
               </w:rPr>
               <w:t>portOfLoading</w:t>
             </w:r>
+            <w:proofErr w:type="spellEnd"/>
             <w:r>
               <w:rPr>
                 <w:rFonts w:ascii="SansSerif" w:hAnsi="SansSerif" w:cs="SansSerif"/>
@@ -1454,6 +1496,7 @@
               </w:rPr>
               <w:t>{</w:t>
             </w:r>
+            <w:proofErr w:type="spellStart"/>
             <w:r>
               <w:rPr>
                 <w:rFonts w:ascii="SansSerif" w:hAnsi="SansSerif" w:cs="SansSerif"/>
@@ -1463,6 +1506,7 @@
               </w:rPr>
               <w:t>portOfDischarge</w:t>
             </w:r>
+            <w:proofErr w:type="spellEnd"/>
             <w:r>
               <w:rPr>
                 <w:rFonts w:ascii="SansSerif" w:hAnsi="SansSerif" w:cs="SansSerif"/>
@@ -1521,6 +1565,7 @@
               </w:rPr>
               <w:t>{</w:t>
             </w:r>
+            <w:proofErr w:type="spellStart"/>
             <w:r>
               <w:rPr>
                 <w:rFonts w:ascii="SansSerif" w:hAnsi="SansSerif" w:cs="SansSerif"/>
@@ -1530,6 +1575,7 @@
               </w:rPr>
               <w:t>finalDestination</w:t>
             </w:r>
+            <w:proofErr w:type="spellEnd"/>
             <w:r>
               <w:rPr>
                 <w:rFonts w:ascii="SansSerif" w:hAnsi="SansSerif" w:cs="SansSerif"/>
@@ -1563,7 +1609,7 @@
       </w:tr>
       <w:tr>
         <w:trPr>
-          <w:trHeight w:val="478"/>
+          <w:trHeight w:val="302"/>
         </w:trPr>
         <w:tc>
           <w:tcPr>
@@ -1577,7 +1623,6 @@
           <w:p>
             <w:pPr>
               <w:pStyle w:val="NoSpacing"/>
-              <w:spacing w:line="276" w:lineRule="auto"/>
               <w:rPr>
                 <w:rFonts w:cstheme="minorHAnsi"/>
                 <w:sz w:val="20"/>
@@ -1600,6 +1645,7 @@
               </w:rPr>
               <w:t>{</w:t>
             </w:r>
+            <w:proofErr w:type="spellStart"/>
             <w:r>
               <w:rPr>
                 <w:rFonts w:cstheme="minorHAnsi"/>
@@ -1608,6 +1654,7 @@
               </w:rPr>
               <w:t>privateRemark</w:t>
             </w:r>
+            <w:proofErr w:type="spellEnd"/>
             <w:r>
               <w:rPr>
                 <w:rFonts w:cstheme="minorHAnsi"/>
@@ -1648,12 +1695,12 @@
               <w:tblLook w:val="04A0" w:firstRow="1" w:lastRow="0" w:firstColumn="1" w:lastColumn="0" w:noHBand="0" w:noVBand="1"/>
             </w:tblPr>
             <w:tblGrid>
-              <w:gridCol w:w="5450"/>
-              <w:gridCol w:w="1416"/>
-              <w:gridCol w:w="1020"/>
-              <w:gridCol w:w="1269"/>
-              <w:gridCol w:w="847"/>
-              <w:gridCol w:w="1069"/>
+              <w:gridCol w:w="4580"/>
+              <w:gridCol w:w="1184"/>
+              <w:gridCol w:w="906"/>
+              <w:gridCol w:w="816"/>
+              <w:gridCol w:w="1278"/>
+              <w:gridCol w:w="2125"/>
             </w:tblGrid>
             <w:tr>
               <w:trPr>
@@ -1792,8 +1839,22 @@
                       <w:sz w:val="20"/>
                       <w:szCs w:val="20"/>
                     </w:rPr>
-                    <w:t>Total Sq.Mt</w:t>
-                  </w:r>
+                    <w:t xml:space="preserve">Total </w:t>
+                  </w:r>
+                  <w:proofErr w:type="spellStart"/>
+                  <w:proofErr w:type="gramStart"/>
+                  <w:r>
+                    <w:rPr>
+                      <w:rFonts w:cstheme="minorHAnsi"/>
+                      <w:b/>
+                      <w:bCs/>
+                      <w:sz w:val="20"/>
+                      <w:szCs w:val="20"/>
+                    </w:rPr>
+                    <w:t>Sq.Mt</w:t>
+                  </w:r>
+                  <w:proofErr w:type="spellEnd"/>
+                  <w:proofErr w:type="gramEnd"/>
                 </w:p>
               </w:tc>
               <w:tc>
@@ -1847,7 +1908,37 @@
                       <w:sz w:val="20"/>
                       <w:szCs w:val="20"/>
                     </w:rPr>
-                    <w:t>(US $)</w:t>
+                    <w:t>{</w:t>
+                  </w:r>
+                  <w:proofErr w:type="spellStart"/>
+                  <w:r>
+                    <w:rPr>
+                      <w:rFonts w:cstheme="minorHAnsi"/>
+                      <w:b/>
+                      <w:bCs/>
+                      <w:sz w:val="20"/>
+                      <w:szCs w:val="20"/>
+                    </w:rPr>
+                    <w:t>currencyChar</w:t>
+                  </w:r>
+                  <w:proofErr w:type="spellEnd"/>
+                  <w:r>
+                    <w:rPr>
+                      <w:rFonts w:cstheme="minorHAnsi"/>
+                      <w:b/>
+                      <w:bCs/>
+                      <w:sz w:val="20"/>
+                      <w:szCs w:val="20"/>
+                    </w:rPr>
+                    <w:t>}</w:t>
+                  </w:r>
+                  <w:r>
+                    <w:rPr>
+                      <w:rFonts w:cstheme="minorHAnsi"/>
+                      <w:sz w:val="20"/>
+                      <w:szCs w:val="20"/>
+                    </w:rPr>
+                    <w:t xml:space="preserve"> </w:t>
                   </w:r>
                 </w:p>
               </w:tc>
@@ -1902,8 +1993,171 @@
                       <w:sz w:val="20"/>
                       <w:szCs w:val="20"/>
                     </w:rPr>
-                    <w:t>(US $)</w:t>
-                  </w:r>
+                    <w:t>{</w:t>
+                  </w:r>
+                  <w:proofErr w:type="spellStart"/>
+                  <w:r>
+                    <w:rPr>
+                      <w:rFonts w:cstheme="minorHAnsi"/>
+                      <w:b/>
+                      <w:bCs/>
+                      <w:sz w:val="20"/>
+                      <w:szCs w:val="20"/>
+                    </w:rPr>
+                    <w:t>currencyChar</w:t>
+                  </w:r>
+                  <w:proofErr w:type="spellEnd"/>
+                  <w:r>
+                    <w:rPr>
+                      <w:rFonts w:cstheme="minorHAnsi"/>
+                      <w:b/>
+                      <w:bCs/>
+                      <w:sz w:val="20"/>
+                      <w:szCs w:val="20"/>
+                    </w:rPr>
+                    <w:t>}</w:t>
+                  </w:r>
+                </w:p>
+              </w:tc>
+            </w:tr>
+            <w:tr>
+              <w:trPr>
+                <w:trHeight w:val="112"/>
+              </w:trPr>
+              <w:tc>
+                <w:tcPr>
+                  <w:tcW w:w="5450" w:type="dxa"/>
+                  <w:tcBorders>
+                    <w:right w:val="nil"/>
+                  </w:tcBorders>
+                </w:tcPr>
+                <w:p>
+                  <w:pPr>
+                    <w:pStyle w:val="NoSpacing"/>
+                    <w:framePr w:hSpace="180" w:wrap="around" w:vAnchor="page" w:hAnchor="margin" w:y="481"/>
+                    <w:spacing w:line="276" w:lineRule="auto"/>
+                    <w:rPr>
+                      <w:rFonts w:cstheme="minorHAnsi"/>
+                      <w:b/>
+                      <w:bCs/>
+                      <w:sz w:val="20"/>
+                      <w:szCs w:val="20"/>
+                    </w:rPr>
+                  </w:pPr>
+                  <w:r>
+                    <w:rPr>
+                      <w:rFonts w:cstheme="minorHAnsi"/>
+                      <w:b/>
+                      <w:bCs/>
+                      <w:sz w:val="20"/>
+                      <w:szCs w:val="20"/>
+                    </w:rPr>
+                    <w:t>DECORATIVE LAMINATES -</w:t>
+                  </w:r>
+                </w:p>
+              </w:tc>
+              <w:tc>
+                <w:tcPr>
+                  <w:tcW w:w="1416" w:type="dxa"/>
+                  <w:tcBorders>
+                    <w:left w:val="nil"/>
+                  </w:tcBorders>
+                </w:tcPr>
+                <w:p>
+                  <w:pPr>
+                    <w:pStyle w:val="NoSpacing"/>
+                    <w:framePr w:hSpace="180" w:wrap="around" w:vAnchor="page" w:hAnchor="margin" w:y="481"/>
+                    <w:spacing w:line="276" w:lineRule="auto"/>
+                    <w:jc w:val="center"/>
+                    <w:rPr>
+                      <w:rFonts w:cstheme="minorHAnsi"/>
+                      <w:b/>
+                      <w:bCs/>
+                      <w:color w:val="000000"/>
+                      <w:sz w:val="20"/>
+                      <w:szCs w:val="20"/>
+                    </w:rPr>
+                  </w:pPr>
+                </w:p>
+              </w:tc>
+              <w:tc>
+                <w:tcPr>
+                  <w:tcW w:w="1020" w:type="dxa"/>
+                </w:tcPr>
+                <w:p>
+                  <w:pPr>
+                    <w:pStyle w:val="NoSpacing"/>
+                    <w:framePr w:hSpace="180" w:wrap="around" w:vAnchor="page" w:hAnchor="margin" w:y="481"/>
+                    <w:spacing w:line="276" w:lineRule="auto"/>
+                    <w:jc w:val="center"/>
+                    <w:rPr>
+                      <w:rFonts w:cstheme="minorHAnsi"/>
+                      <w:b/>
+                      <w:bCs/>
+                      <w:sz w:val="20"/>
+                      <w:szCs w:val="20"/>
+                    </w:rPr>
+                  </w:pPr>
+                </w:p>
+              </w:tc>
+              <w:tc>
+                <w:tcPr>
+                  <w:tcW w:w="1269" w:type="dxa"/>
+                </w:tcPr>
+                <w:p>
+                  <w:pPr>
+                    <w:pStyle w:val="NoSpacing"/>
+                    <w:framePr w:hSpace="180" w:wrap="around" w:vAnchor="page" w:hAnchor="margin" w:y="481"/>
+                    <w:spacing w:line="276" w:lineRule="auto"/>
+                    <w:jc w:val="center"/>
+                    <w:rPr>
+                      <w:rFonts w:cstheme="minorHAnsi"/>
+                      <w:b/>
+                      <w:bCs/>
+                      <w:sz w:val="20"/>
+                      <w:szCs w:val="20"/>
+                    </w:rPr>
+                  </w:pPr>
+                </w:p>
+              </w:tc>
+              <w:tc>
+                <w:tcPr>
+                  <w:tcW w:w="847" w:type="dxa"/>
+                </w:tcPr>
+                <w:p>
+                  <w:pPr>
+                    <w:pStyle w:val="NoSpacing"/>
+                    <w:framePr w:hSpace="180" w:wrap="around" w:vAnchor="page" w:hAnchor="margin" w:y="481"/>
+                    <w:spacing w:line="276" w:lineRule="auto"/>
+                    <w:jc w:val="center"/>
+                    <w:rPr>
+                      <w:rFonts w:cstheme="minorHAnsi"/>
+                      <w:b/>
+                      <w:bCs/>
+                      <w:sz w:val="20"/>
+                      <w:szCs w:val="20"/>
+                    </w:rPr>
+                  </w:pPr>
+                </w:p>
+              </w:tc>
+              <w:tc>
+                <w:tcPr>
+                  <w:tcW w:w="1069" w:type="dxa"/>
+                </w:tcPr>
+                <w:p>
+                  <w:pPr>
+                    <w:pStyle w:val="NoSpacing"/>
+                    <w:framePr w:hSpace="180" w:wrap="around" w:vAnchor="page" w:hAnchor="margin" w:y="481"/>
+                    <w:spacing w:line="276" w:lineRule="auto"/>
+                    <w:jc w:val="center"/>
+                    <w:rPr>
+                      <w:rFonts w:cstheme="minorHAnsi"/>
+                      <w:b/>
+                      <w:bCs/>
+                      <w:sz w:val="20"/>
+                      <w:szCs w:val="20"/>
+                    </w:rPr>
+                  </w:pPr>
                 </w:p>
               </w:tc>
             </w:tr>
@@ -1923,7 +2177,6 @@
                   <w:pPr>
                     <w:pStyle w:val="NoSpacing"/>
                     <w:framePr w:hSpace="180" w:wrap="around" w:vAnchor="page" w:hAnchor="margin" w:y="481"/>
-                    <w:spacing w:before="120" w:after="100" w:afterAutospacing="1"/>
                     <w:rPr>
                       <w:rFonts w:cstheme="minorHAnsi"/>
                       <w:sz w:val="20"/>
@@ -1938,6 +2191,7 @@
                     </w:rPr>
                     <w:t>{#</w:t>
                   </w:r>
+                  <w:proofErr w:type="gramStart"/>
                   <w:r>
                     <w:rPr>
                       <w:rFonts w:cstheme="minorHAnsi"/>
@@ -1945,6 +2199,40 @@
                       <w:szCs w:val="20"/>
                     </w:rPr>
                     <w:t>CIItems</w:t>
+                  </w:r>
+                  <w:r>
+                    <w:rPr>
+                      <w:rFonts w:cstheme="minorHAnsi"/>
+                      <w:sz w:val="20"/>
+                      <w:szCs w:val="20"/>
+                    </w:rPr>
+                    <w:t>}</w:t>
+                  </w:r>
+                  <w:r>
+                    <w:rPr>
+                      <w:rFonts w:cstheme="minorHAnsi"/>
+                      <w:sz w:val="20"/>
+                      <w:szCs w:val="20"/>
+                    </w:rPr>
+                    <w:t>{</w:t>
+                  </w:r>
+                  <w:proofErr w:type="gramEnd"/>
+                  <w:r>
+                    <w:rPr>
+                      <w:rFonts w:cstheme="minorHAnsi"/>
+                      <w:sz w:val="20"/>
+                      <w:szCs w:val="20"/>
+                    </w:rPr>
+                    <w:t>#</w:t>
+                  </w:r>
+                  <w:proofErr w:type="gramStart"/>
+                  <w:r>
+                    <w:rPr>
+                      <w:rFonts w:cstheme="minorHAnsi"/>
+                      <w:sz w:val="20"/>
+                      <w:szCs w:val="20"/>
+                    </w:rPr>
+                    <w:t>showThickness</w:t>
                   </w:r>
                   <w:r>
                     <w:rPr>
@@ -1962,7 +2250,75 @@
                       <w:sz w:val="20"/>
                       <w:szCs w:val="20"/>
                     </w:rPr>
-                    <w:t>{length} X {width} X {height} MM</w:t>
+                    <w:t>{</w:t>
+                  </w:r>
+                  <w:proofErr w:type="gramEnd"/>
+                  <w:r>
+                    <w:rPr>
+                      <w:rFonts w:cstheme="minorHAnsi"/>
+                      <w:b/>
+                      <w:bCs/>
+                      <w:sz w:val="20"/>
+                      <w:szCs w:val="20"/>
+                    </w:rPr>
+                    <w:t>thic</w:t>
+                  </w:r>
+                  <w:r>
+                    <w:rPr>
+                      <w:rFonts w:cstheme="minorHAnsi"/>
+                      <w:b/>
+                      <w:bCs/>
+                      <w:sz w:val="20"/>
+                      <w:szCs w:val="20"/>
+                    </w:rPr>
+                    <w:t>knessDetail</w:t>
+                  </w:r>
+                  <w:r>
+                    <w:rPr>
+                      <w:rFonts w:cstheme="minorHAnsi"/>
+                      <w:sz w:val="20"/>
+                      <w:szCs w:val="20"/>
+                    </w:rPr>
+                    <w:t>}</w:t>
+                  </w:r>
+                  <w:r>
+                    <w:rPr>
+                      <w:rFonts w:cstheme="minorHAnsi"/>
+                      <w:sz w:val="20"/>
+                      <w:szCs w:val="20"/>
+                    </w:rPr>
+                    <w:t>{/showThickness}</w:t>
+                  </w:r>
+                </w:p>
+                <w:p>
+                  <w:pPr>
+                    <w:pStyle w:val="NoSpacing"/>
+                    <w:framePr w:hSpace="180" w:wrap="around" w:vAnchor="page" w:hAnchor="margin" w:y="481"/>
+                    <w:rPr>
+                      <w:rFonts w:cstheme="minorHAnsi"/>
+                      <w:sz w:val="20"/>
+                      <w:szCs w:val="20"/>
+                    </w:rPr>
+                  </w:pPr>
+                  <w:r>
+                    <w:rPr>
+                      <w:rFonts w:cstheme="minorHAnsi"/>
+                      <w:b/>
+                      <w:bCs/>
+                      <w:sz w:val="20"/>
+                      <w:szCs w:val="20"/>
+                    </w:rPr>
+                    <w:t>{length</w:t>
+                  </w:r>
+                  <w:r>
+                    <w:rPr>
+                      <w:rFonts w:cstheme="minorHAnsi"/>
+                      <w:b/>
+                      <w:bCs/>
+                      <w:sz w:val="20"/>
+                      <w:szCs w:val="20"/>
+                    </w:rPr>
+                    <w:t>} X {width} X {height} MM</w:t>
                   </w:r>
                 </w:p>
               </w:tc>
@@ -2183,6 +2539,7 @@
                     </w:rPr>
                     <w:t>{</w:t>
                   </w:r>
+                  <w:proofErr w:type="spellStart"/>
                   <w:r>
                     <w:rPr>
                       <w:rFonts w:cstheme="minorHAnsi"/>
@@ -2191,6 +2548,7 @@
                     </w:rPr>
                     <w:t>totalSq</w:t>
                   </w:r>
+                  <w:proofErr w:type="spellEnd"/>
                   <w:r>
                     <w:rPr>
                       <w:rFonts w:cstheme="minorHAnsi"/>
@@ -2272,36 +2630,27 @@
                       <w:sz w:val="20"/>
                       <w:szCs w:val="20"/>
                     </w:rPr>
-                    <w:t xml:space="preserve"> </w:t>
-                  </w:r>
-                  <w:r>
-                    <w:rPr>
-                      <w:rFonts w:cstheme="minorHAnsi"/>
-                      <w:sz w:val="20"/>
-                      <w:szCs w:val="20"/>
-                    </w:rPr>
-                    <w:t xml:space="preserve">{/invoices} </w:t>
-                  </w:r>
-                </w:p>
-                <w:p>
-                  <w:pPr>
-                    <w:pStyle w:val="NoSpacing"/>
-                    <w:framePr w:hSpace="180" w:wrap="around" w:vAnchor="page" w:hAnchor="margin" w:y="481"/>
-                    <w:jc w:val="right"/>
-                    <w:rPr>
-                      <w:rFonts w:cstheme="minorHAnsi"/>
-                      <w:sz w:val="20"/>
-                      <w:szCs w:val="20"/>
-                    </w:rPr>
-                  </w:pPr>
-                  <w:r>
-                    <w:rPr>
-                      <w:rFonts w:cstheme="minorHAnsi"/>
-                      <w:sz w:val="20"/>
-                      <w:szCs w:val="20"/>
-                    </w:rPr>
                     <w:t>{/</w:t>
                   </w:r>
+                  <w:proofErr w:type="gramStart"/>
+                  <w:r>
+                    <w:rPr>
+                      <w:rFonts w:cstheme="minorHAnsi"/>
+                      <w:sz w:val="20"/>
+                      <w:szCs w:val="20"/>
+                    </w:rPr>
+                    <w:t>invoices}{</w:t>
+                  </w:r>
+                  <w:proofErr w:type="gramEnd"/>
+                  <w:r>
+                    <w:rPr>
+                      <w:rFonts w:cstheme="minorHAnsi"/>
+                      <w:sz w:val="20"/>
+                      <w:szCs w:val="20"/>
+                    </w:rPr>
+                    <w:t>/</w:t>
+                  </w:r>
+                  <w:proofErr w:type="spellStart"/>
                   <w:r>
                     <w:rPr>
                       <w:rFonts w:cstheme="minorHAnsi"/>
@@ -2310,6 +2659,7 @@
                     </w:rPr>
                     <w:t>CIItems</w:t>
                   </w:r>
+                  <w:proofErr w:type="spellEnd"/>
                   <w:r>
                     <w:rPr>
                       <w:rFonts w:cstheme="minorHAnsi"/>
@@ -2362,12 +2712,14 @@
               </w:rPr>
               <w:t>{</w:t>
             </w:r>
+            <w:proofErr w:type="spellStart"/>
             <w:r>
               <w:rPr>
                 <w:rFonts w:cstheme="minorHAnsi"/>
               </w:rPr>
               <w:t>additionSumAmount</w:t>
             </w:r>
+            <w:proofErr w:type="spellEnd"/>
             <w:r>
               <w:rPr>
                 <w:rFonts w:cstheme="minorHAnsi"/>
@@ -2613,7 +2965,13 @@
               <w:rPr>
                 <w:rFonts w:cstheme="minorHAnsi"/>
               </w:rPr>
-              <w:t xml:space="preserve">Total </w:t>
+              <w:t>Total</w:t>
+            </w:r>
+            <w:r>
+              <w:rPr>
+                <w:rFonts w:cstheme="minorHAnsi"/>
+              </w:rPr>
+              <w:t xml:space="preserve"> </w:t>
             </w:r>
             <w:r>
               <w:rPr>
@@ -2621,12 +2979,82 @@
               </w:rPr>
               <w:t>{</w:t>
             </w:r>
+            <w:proofErr w:type="spellStart"/>
+            <w:r>
+              <w:rPr>
+                <w:rFonts w:cstheme="minorHAnsi"/>
+              </w:rPr>
+              <w:t>deliveryTerms</w:t>
+            </w:r>
+            <w:proofErr w:type="spellEnd"/>
+            <w:r>
+              <w:rPr>
+                <w:rFonts w:cstheme="minorHAnsi"/>
+              </w:rPr>
+              <w:t>}</w:t>
+            </w:r>
+            <w:r>
+              <w:rPr>
+                <w:rFonts w:cstheme="minorHAnsi"/>
+              </w:rPr>
+              <w:t xml:space="preserve"> {</w:t>
+            </w:r>
+            <w:proofErr w:type="spellStart"/>
+            <w:r>
+              <w:rPr>
+                <w:rFonts w:cstheme="minorHAnsi"/>
+              </w:rPr>
+              <w:t>portOfDischarge</w:t>
+            </w:r>
+            <w:proofErr w:type="spellEnd"/>
+            <w:r>
+              <w:rPr>
+                <w:rFonts w:cstheme="minorHAnsi"/>
+              </w:rPr>
+              <w:t>} ({</w:t>
+            </w:r>
+            <w:proofErr w:type="spellStart"/>
+            <w:r>
+              <w:rPr>
+                <w:rFonts w:cstheme="minorHAnsi"/>
+              </w:rPr>
+              <w:t>finalDestination</w:t>
+            </w:r>
+            <w:proofErr w:type="spellEnd"/>
+            <w:proofErr w:type="gramStart"/>
+            <w:r>
+              <w:rPr>
+                <w:rFonts w:cstheme="minorHAnsi"/>
+              </w:rPr>
+              <w:t xml:space="preserve">}) </w:t>
+            </w:r>
+            <w:r>
+              <w:rPr>
+                <w:rFonts w:cstheme="minorHAnsi"/>
+              </w:rPr>
+              <w:t xml:space="preserve">  </w:t>
+            </w:r>
+            <w:proofErr w:type="gramEnd"/>
+            <w:r>
+              <w:rPr>
+                <w:rFonts w:cstheme="minorHAnsi"/>
+              </w:rPr>
+              <w:t xml:space="preserve"> </w:t>
+            </w:r>
+            <w:r>
+              <w:rPr>
+                <w:rFonts w:cstheme="minorHAnsi"/>
+              </w:rPr>
+              <w:t>{</w:t>
+            </w:r>
+            <w:proofErr w:type="spellStart"/>
             <w:r>
               <w:rPr>
                 <w:rFonts w:cstheme="minorHAnsi"/>
               </w:rPr>
               <w:t>currencyChar</w:t>
             </w:r>
+            <w:proofErr w:type="spellEnd"/>
             <w:r>
               <w:rPr>
                 <w:rFonts w:cstheme="minorHAnsi"/>
@@ -2645,12 +3073,14 @@
               </w:rPr>
               <w:t>{</w:t>
             </w:r>
+            <w:proofErr w:type="spellStart"/>
             <w:r>
               <w:rPr>
                 <w:rFonts w:cstheme="minorHAnsi"/>
               </w:rPr>
               <w:t>netAmountWords</w:t>
             </w:r>
+            <w:proofErr w:type="spellEnd"/>
             <w:r>
               <w:rPr>
                 <w:rFonts w:cstheme="minorHAnsi"/>
@@ -2684,12 +3114,14 @@
               </w:rPr>
               <w:t>{</w:t>
             </w:r>
+            <w:proofErr w:type="spellStart"/>
             <w:r>
               <w:rPr>
                 <w:rFonts w:cstheme="minorHAnsi"/>
               </w:rPr>
               <w:t>netAmount</w:t>
             </w:r>
+            <w:proofErr w:type="spellEnd"/>
             <w:r>
               <w:rPr>
                 <w:rFonts w:cstheme="minorHAnsi"/>
@@ -2716,7 +3148,6 @@
           <w:p>
             <w:pPr>
               <w:pStyle w:val="NoSpacing"/>
-              <w:spacing w:line="276" w:lineRule="auto"/>
               <w:rPr>
                 <w:rFonts w:cstheme="minorHAnsi"/>
                 <w:sz w:val="20"/>
@@ -2731,6 +3162,7 @@
               </w:rPr>
               <w:t>{#</w:t>
             </w:r>
+            <w:proofErr w:type="gramStart"/>
             <w:r>
               <w:rPr>
                 <w:rFonts w:cstheme="minorHAnsi"/>
@@ -2755,6 +3187,7 @@
               </w:rPr>
               <w:t>}{</w:t>
             </w:r>
+            <w:proofErr w:type="gramEnd"/>
             <w:r>
               <w:rPr>
                 <w:rFonts w:cstheme="minorHAnsi"/>
@@ -2775,7 +3208,6 @@
           <w:p>
             <w:pPr>
               <w:pStyle w:val="NoSpacing"/>
-              <w:spacing w:line="276" w:lineRule="auto"/>
               <w:rPr>
                 <w:rFonts w:cstheme="minorHAnsi"/>
                 <w:sz w:val="20"/>
@@ -2790,6 +3222,7 @@
               </w:rPr>
               <w:t>{/</w:t>
             </w:r>
+            <w:proofErr w:type="spellStart"/>
             <w:r>
               <w:rPr>
                 <w:rFonts w:cstheme="minorHAnsi"/>
@@ -2806,84 +3239,7 @@
               </w:rPr>
               <w:t>s</w:t>
             </w:r>
-            <w:r>
-              <w:rPr>
-                <w:rFonts w:cstheme="minorHAnsi"/>
-                <w:sz w:val="20"/>
-                <w:szCs w:val="20"/>
-              </w:rPr>
-              <w:t>}</w:t>
-            </w:r>
-          </w:p>
-          <w:p>
-            <w:pPr>
-              <w:pStyle w:val="NoSpacing"/>
-              <w:spacing w:line="276" w:lineRule="auto"/>
-              <w:rPr>
-                <w:rFonts w:cstheme="minorHAnsi"/>
-                <w:sz w:val="20"/>
-                <w:szCs w:val="20"/>
-              </w:rPr>
-            </w:pPr>
-            <w:r>
-              <w:rPr>
-                <w:rFonts w:cstheme="minorHAnsi"/>
-                <w:sz w:val="20"/>
-                <w:szCs w:val="20"/>
-              </w:rPr>
-              <w:t>{#</w:t>
-            </w:r>
-            <w:r>
-              <w:rPr>
-                <w:rFonts w:cstheme="minorHAnsi"/>
-                <w:sz w:val="20"/>
-                <w:szCs w:val="20"/>
-              </w:rPr>
-              <w:t>invoiceInstructions</w:t>
-            </w:r>
-            <w:r>
-              <w:rPr>
-                <w:rFonts w:cstheme="minorHAnsi"/>
-                <w:sz w:val="20"/>
-                <w:szCs w:val="20"/>
-              </w:rPr>
-              <w:t>}</w:t>
-            </w:r>
-            <w:r>
-              <w:rPr>
-                <w:rFonts w:cstheme="minorHAnsi"/>
-                <w:sz w:val="20"/>
-                <w:szCs w:val="20"/>
-              </w:rPr>
-              <w:t>{.}</w:t>
-            </w:r>
-          </w:p>
-          <w:p>
-            <w:pPr>
-              <w:pStyle w:val="NoSpacing"/>
-              <w:spacing w:line="276" w:lineRule="auto"/>
-              <w:rPr>
-                <w:rFonts w:cstheme="minorHAnsi"/>
-                <w:sz w:val="20"/>
-                <w:szCs w:val="20"/>
-              </w:rPr>
-            </w:pPr>
-            <w:r>
-              <w:rPr>
-                <w:rFonts w:cstheme="minorHAnsi"/>
-                <w:sz w:val="20"/>
-                <w:szCs w:val="20"/>
-              </w:rPr>
-              <w:t>{/</w:t>
-            </w:r>
-            <w:r>
-              <w:rPr>
-                <w:rFonts w:cstheme="minorHAnsi"/>
-                <w:sz w:val="20"/>
-                <w:szCs w:val="20"/>
-              </w:rPr>
-              <w:t>invoiceInstructions</w:t>
-            </w:r>
+            <w:proofErr w:type="spellEnd"/>
             <w:r>
               <w:rPr>
                 <w:rFonts w:cstheme="minorHAnsi"/>
@@ -2943,7 +3299,6 @@
                     <w:pStyle w:val="NoSpacing"/>
                     <w:keepNext/>
                     <w:framePr w:hSpace="180" w:wrap="around" w:vAnchor="page" w:hAnchor="margin" w:y="481"/>
-                    <w:spacing w:line="276" w:lineRule="auto"/>
                     <w:rPr>
                       <w:rFonts w:cstheme="minorHAnsi"/>
                       <w:sz w:val="20"/>
@@ -2969,7 +3324,6 @@
                     <w:pStyle w:val="NoSpacing"/>
                     <w:keepNext/>
                     <w:framePr w:hSpace="180" w:wrap="around" w:vAnchor="page" w:hAnchor="margin" w:y="481"/>
-                    <w:spacing w:line="276" w:lineRule="auto"/>
                     <w:rPr>
                       <w:rFonts w:cstheme="minorHAnsi"/>
                       <w:sz w:val="20"/>
@@ -2984,6 +3338,7 @@
                     </w:rPr>
                     <w:t>{</w:t>
                   </w:r>
+                  <w:proofErr w:type="spellStart"/>
                   <w:r>
                     <w:rPr>
                       <w:rFonts w:cstheme="minorHAnsi"/>
@@ -2992,6 +3347,7 @@
                     </w:rPr>
                     <w:t>totalQuantity</w:t>
                   </w:r>
+                  <w:proofErr w:type="spellEnd"/>
                   <w:r>
                     <w:rPr>
                       <w:rFonts w:cstheme="minorHAnsi"/>
@@ -3017,7 +3373,6 @@
                     <w:pStyle w:val="NoSpacing"/>
                     <w:keepNext/>
                     <w:framePr w:hSpace="180" w:wrap="around" w:vAnchor="page" w:hAnchor="margin" w:y="481"/>
-                    <w:spacing w:line="276" w:lineRule="auto"/>
                     <w:rPr>
                       <w:rFonts w:cstheme="minorHAnsi"/>
                       <w:sz w:val="20"/>
@@ -3043,7 +3398,6 @@
                     <w:pStyle w:val="NoSpacing"/>
                     <w:keepNext/>
                     <w:framePr w:hSpace="180" w:wrap="around" w:vAnchor="page" w:hAnchor="margin" w:y="481"/>
-                    <w:spacing w:line="276" w:lineRule="auto"/>
                     <w:rPr>
                       <w:rFonts w:cstheme="minorHAnsi"/>
                       <w:sz w:val="20"/>
@@ -3058,6 +3412,7 @@
                     </w:rPr>
                     <w:t>{</w:t>
                   </w:r>
+                  <w:proofErr w:type="spellStart"/>
                   <w:r>
                     <w:rPr>
                       <w:rFonts w:cstheme="minorHAnsi"/>
@@ -3066,6 +3421,7 @@
                     </w:rPr>
                     <w:t>totalBox</w:t>
                   </w:r>
+                  <w:proofErr w:type="spellEnd"/>
                   <w:r>
                     <w:rPr>
                       <w:rFonts w:cstheme="minorHAnsi"/>
@@ -3091,7 +3447,6 @@
                     <w:pStyle w:val="NoSpacing"/>
                     <w:keepNext/>
                     <w:framePr w:hSpace="180" w:wrap="around" w:vAnchor="page" w:hAnchor="margin" w:y="481"/>
-                    <w:spacing w:line="276" w:lineRule="auto"/>
                     <w:rPr>
                       <w:rFonts w:cstheme="minorHAnsi"/>
                       <w:sz w:val="20"/>
@@ -3104,7 +3459,27 @@
                       <w:sz w:val="20"/>
                       <w:szCs w:val="20"/>
                     </w:rPr>
-                    <w:t>Total Sq.Meter:</w:t>
+                    <w:t xml:space="preserve">Total </w:t>
+                  </w:r>
+                  <w:proofErr w:type="spellStart"/>
+                  <w:proofErr w:type="gramStart"/>
+                  <w:r>
+                    <w:rPr>
+                      <w:rFonts w:cstheme="minorHAnsi"/>
+                      <w:sz w:val="20"/>
+                      <w:szCs w:val="20"/>
+                    </w:rPr>
+                    <w:t>Sq.Meter</w:t>
+                  </w:r>
+                  <w:proofErr w:type="spellEnd"/>
+                  <w:proofErr w:type="gramEnd"/>
+                  <w:r>
+                    <w:rPr>
+                      <w:rFonts w:cstheme="minorHAnsi"/>
+                      <w:sz w:val="20"/>
+                      <w:szCs w:val="20"/>
+                    </w:rPr>
+                    <w:t>:</w:t>
                   </w:r>
                 </w:p>
               </w:tc>
@@ -3117,7 +3492,6 @@
                     <w:pStyle w:val="NoSpacing"/>
                     <w:keepNext/>
                     <w:framePr w:hSpace="180" w:wrap="around" w:vAnchor="page" w:hAnchor="margin" w:y="481"/>
-                    <w:spacing w:line="276" w:lineRule="auto"/>
                     <w:rPr>
                       <w:rFonts w:cstheme="minorHAnsi"/>
                       <w:sz w:val="20"/>
@@ -3132,6 +3506,7 @@
                     </w:rPr>
                     <w:t>{</w:t>
                   </w:r>
+                  <w:proofErr w:type="spellStart"/>
                   <w:r>
                     <w:rPr>
                       <w:rFonts w:cstheme="minorHAnsi"/>
@@ -3140,6 +3515,7 @@
                     </w:rPr>
                     <w:t>totalSqMt</w:t>
                   </w:r>
+                  <w:proofErr w:type="spellEnd"/>
                   <w:r>
                     <w:rPr>
                       <w:rFonts w:cstheme="minorHAnsi"/>
@@ -3163,7 +3539,6 @@
           <w:p>
             <w:pPr>
               <w:pStyle w:val="NoSpacing"/>
-              <w:spacing w:line="276" w:lineRule="auto"/>
               <w:rPr>
                 <w:rFonts w:cstheme="minorHAnsi"/>
                 <w:sz w:val="20"/>
@@ -3233,7 +3608,6 @@
                     <w:pStyle w:val="NoSpacing"/>
                     <w:keepNext/>
                     <w:framePr w:hSpace="180" w:wrap="around" w:vAnchor="page" w:hAnchor="margin" w:y="481"/>
-                    <w:spacing w:line="276" w:lineRule="auto"/>
                     <w:rPr>
                       <w:rFonts w:cstheme="minorHAnsi"/>
                       <w:sz w:val="20"/>
@@ -3246,7 +3620,25 @@
                       <w:sz w:val="20"/>
                       <w:szCs w:val="20"/>
                     </w:rPr>
-                    <w:t>Avg./Wt.(Kg)</w:t>
+                    <w:t>Avg./</w:t>
+                  </w:r>
+                  <w:proofErr w:type="gramStart"/>
+                  <w:r>
+                    <w:rPr>
+                      <w:rFonts w:cstheme="minorHAnsi"/>
+                      <w:sz w:val="20"/>
+                      <w:szCs w:val="20"/>
+                    </w:rPr>
+                    <w:t>Wt.(</w:t>
+                  </w:r>
+                  <w:proofErr w:type="gramEnd"/>
+                  <w:r>
+                    <w:rPr>
+                      <w:rFonts w:cstheme="minorHAnsi"/>
+                      <w:sz w:val="20"/>
+                      <w:szCs w:val="20"/>
+                    </w:rPr>
+                    <w:t>Kg)</w:t>
                   </w:r>
                 </w:p>
               </w:tc>
@@ -3259,7 +3651,6 @@
                     <w:pStyle w:val="NoSpacing"/>
                     <w:keepNext/>
                     <w:framePr w:hSpace="180" w:wrap="around" w:vAnchor="page" w:hAnchor="margin" w:y="481"/>
-                    <w:spacing w:line="276" w:lineRule="auto"/>
                     <w:rPr>
                       <w:rFonts w:cstheme="minorHAnsi"/>
                       <w:sz w:val="20"/>
@@ -3285,7 +3676,6 @@
                     <w:pStyle w:val="NoSpacing"/>
                     <w:keepNext/>
                     <w:framePr w:hSpace="180" w:wrap="around" w:vAnchor="page" w:hAnchor="margin" w:y="481"/>
-                    <w:spacing w:line="276" w:lineRule="auto"/>
                     <w:rPr>
                       <w:rFonts w:cstheme="minorHAnsi"/>
                       <w:sz w:val="20"/>
@@ -3317,7 +3707,6 @@
                     <w:pStyle w:val="NoSpacing"/>
                     <w:keepNext/>
                     <w:framePr w:hSpace="180" w:wrap="around" w:vAnchor="page" w:hAnchor="margin" w:y="481"/>
-                    <w:spacing w:line="276" w:lineRule="auto"/>
                     <w:rPr>
                       <w:rFonts w:cstheme="minorHAnsi"/>
                       <w:sz w:val="20"/>
@@ -3332,6 +3721,7 @@
                     </w:rPr>
                     <w:t>{#</w:t>
                   </w:r>
+                  <w:proofErr w:type="gramStart"/>
                   <w:r>
                     <w:rPr>
                       <w:rFonts w:cstheme="minorHAnsi"/>
@@ -3348,6 +3738,7 @@
                     </w:rPr>
                     <w:t>}{</w:t>
                   </w:r>
+                  <w:proofErr w:type="gramEnd"/>
                   <w:r>
                     <w:rPr>
                       <w:rFonts w:cstheme="minorHAnsi"/>
@@ -3375,7 +3766,6 @@
                     <w:pStyle w:val="NoSpacing"/>
                     <w:keepNext/>
                     <w:framePr w:hSpace="180" w:wrap="around" w:vAnchor="page" w:hAnchor="margin" w:y="481"/>
-                    <w:spacing w:line="276" w:lineRule="auto"/>
                     <w:rPr>
                       <w:rFonts w:cstheme="minorHAnsi"/>
                       <w:sz w:val="20"/>
@@ -3390,6 +3780,7 @@
                     </w:rPr>
                     <w:t>{</w:t>
                   </w:r>
+                  <w:proofErr w:type="spellStart"/>
                   <w:r>
                     <w:rPr>
                       <w:rFonts w:cstheme="minorHAnsi"/>
@@ -3398,6 +3789,7 @@
                     </w:rPr>
                     <w:t>totalSqMtPerType</w:t>
                   </w:r>
+                  <w:proofErr w:type="spellEnd"/>
                   <w:r>
                     <w:rPr>
                       <w:rFonts w:cstheme="minorHAnsi"/>
@@ -3417,7 +3809,6 @@
                     <w:pStyle w:val="NoSpacing"/>
                     <w:keepNext/>
                     <w:framePr w:hSpace="180" w:wrap="around" w:vAnchor="page" w:hAnchor="margin" w:y="481"/>
-                    <w:spacing w:line="276" w:lineRule="auto"/>
                     <w:rPr>
                       <w:rFonts w:cstheme="minorHAnsi"/>
                       <w:sz w:val="20"/>
@@ -3488,6 +3879,7 @@
                     </w:rPr>
                     <w:t>} MM{/</w:t>
                   </w:r>
+                  <w:proofErr w:type="spellStart"/>
                   <w:r>
                     <w:rPr>
                       <w:rFonts w:cstheme="minorHAnsi"/>
@@ -3496,6 +3888,7 @@
                     </w:rPr>
                     <w:t>containerSummary</w:t>
                   </w:r>
+                  <w:proofErr w:type="spellEnd"/>
                   <w:r>
                     <w:rPr>
                       <w:rFonts w:cstheme="minorHAnsi"/>
@@ -3584,7 +3977,6 @@
             <w:pPr>
               <w:pStyle w:val="NoSpacing"/>
               <w:keepNext/>
-              <w:spacing w:line="276" w:lineRule="auto"/>
               <w:rPr>
                 <w:rFonts w:cstheme="minorHAnsi"/>
               </w:rPr>
@@ -3606,7 +3998,6 @@
             <w:pPr>
               <w:pStyle w:val="NoSpacing"/>
               <w:keepNext/>
-              <w:spacing w:line="276" w:lineRule="auto"/>
               <w:rPr>
                 <w:rFonts w:cstheme="minorHAnsi"/>
               </w:rPr>
@@ -3617,12 +4008,14 @@
               </w:rPr>
               <w:t>{</w:t>
             </w:r>
+            <w:proofErr w:type="spellStart"/>
             <w:r>
               <w:rPr>
                 <w:rFonts w:cstheme="minorHAnsi"/>
               </w:rPr>
               <w:t>panNo</w:t>
             </w:r>
+            <w:proofErr w:type="spellEnd"/>
             <w:r>
               <w:rPr>
                 <w:rFonts w:cstheme="minorHAnsi"/>
@@ -3645,7 +4038,6 @@
             <w:pPr>
               <w:pStyle w:val="NoSpacing"/>
               <w:keepNext/>
-              <w:spacing w:line="276" w:lineRule="auto"/>
               <w:rPr>
                 <w:rFonts w:cstheme="minorHAnsi"/>
               </w:rPr>
@@ -3666,7 +4058,6 @@
             <w:pPr>
               <w:pStyle w:val="NoSpacing"/>
               <w:keepNext/>
-              <w:spacing w:line="276" w:lineRule="auto"/>
               <w:rPr>
                 <w:rFonts w:cstheme="minorHAnsi"/>
               </w:rPr>
@@ -3677,12 +4068,14 @@
               </w:rPr>
               <w:t>{</w:t>
             </w:r>
+            <w:proofErr w:type="spellStart"/>
             <w:r>
               <w:rPr>
                 <w:rFonts w:cstheme="minorHAnsi"/>
               </w:rPr>
               <w:t>bankName</w:t>
             </w:r>
+            <w:proofErr w:type="spellEnd"/>
             <w:r>
               <w:rPr>
                 <w:rFonts w:cstheme="minorHAnsi"/>
@@ -3705,7 +4098,6 @@
             <w:pPr>
               <w:pStyle w:val="NoSpacing"/>
               <w:keepNext/>
-              <w:spacing w:line="276" w:lineRule="auto"/>
               <w:rPr>
                 <w:rFonts w:cstheme="minorHAnsi"/>
               </w:rPr>
@@ -3726,7 +4118,6 @@
             <w:pPr>
               <w:pStyle w:val="NoSpacing"/>
               <w:keepNext/>
-              <w:spacing w:line="276" w:lineRule="auto"/>
               <w:rPr>
                 <w:rFonts w:cstheme="minorHAnsi"/>
               </w:rPr>
@@ -3737,12 +4128,14 @@
               </w:rPr>
               <w:t>{</w:t>
             </w:r>
+            <w:proofErr w:type="spellStart"/>
             <w:r>
               <w:rPr>
                 <w:rFonts w:cstheme="minorHAnsi"/>
               </w:rPr>
               <w:t>adCode</w:t>
             </w:r>
+            <w:proofErr w:type="spellEnd"/>
             <w:r>
               <w:rPr>
                 <w:rFonts w:cstheme="minorHAnsi"/>
@@ -3765,7 +4158,6 @@
             <w:pPr>
               <w:pStyle w:val="NoSpacing"/>
               <w:keepNext/>
-              <w:spacing w:line="276" w:lineRule="auto"/>
               <w:rPr>
                 <w:rFonts w:cstheme="minorHAnsi"/>
               </w:rPr>
@@ -3786,7 +4178,6 @@
             <w:pPr>
               <w:pStyle w:val="NoSpacing"/>
               <w:keepNext/>
-              <w:spacing w:line="276" w:lineRule="auto"/>
               <w:rPr>
                 <w:rFonts w:cstheme="minorHAnsi"/>
               </w:rPr>
@@ -3797,12 +4188,14 @@
               </w:rPr>
               <w:t>{</w:t>
             </w:r>
+            <w:proofErr w:type="spellStart"/>
             <w:r>
               <w:rPr>
                 <w:rFonts w:cstheme="minorHAnsi"/>
               </w:rPr>
               <w:t>acCode</w:t>
             </w:r>
+            <w:proofErr w:type="spellEnd"/>
             <w:r>
               <w:rPr>
                 <w:rFonts w:cstheme="minorHAnsi"/>
@@ -3825,7 +4218,6 @@
             <w:pPr>
               <w:pStyle w:val="NoSpacing"/>
               <w:keepNext/>
-              <w:spacing w:line="276" w:lineRule="auto"/>
               <w:rPr>
                 <w:rFonts w:cstheme="minorHAnsi"/>
               </w:rPr>
@@ -3846,7 +4238,6 @@
             <w:pPr>
               <w:pStyle w:val="NoSpacing"/>
               <w:keepNext/>
-              <w:spacing w:line="276" w:lineRule="auto"/>
               <w:rPr>
                 <w:rFonts w:cstheme="minorHAnsi"/>
               </w:rPr>
@@ -3857,12 +4248,14 @@
               </w:rPr>
               <w:t>{</w:t>
             </w:r>
+            <w:proofErr w:type="spellStart"/>
             <w:r>
               <w:rPr>
                 <w:rFonts w:cstheme="minorHAnsi"/>
               </w:rPr>
               <w:t>iec</w:t>
             </w:r>
+            <w:proofErr w:type="spellEnd"/>
             <w:r>
               <w:rPr>
                 <w:rFonts w:cstheme="minorHAnsi"/>

</xml_diff>

<commit_message>
aus & uk case handle & fsc added
</commit_message>
<xml_diff>
--- a/electron/database/generate-document/templates/custom-invoice.docx
+++ b/electron/database/generate-document/templates/custom-invoice.docx
@@ -10,16 +10,16 @@
         <w:tblLook w:val="04A0" w:firstRow="1" w:lastRow="0" w:firstColumn="1" w:lastColumn="0" w:noHBand="0" w:noVBand="1"/>
       </w:tblPr>
       <w:tblGrid>
-        <w:gridCol w:w="2617"/>
-        <w:gridCol w:w="354"/>
-        <w:gridCol w:w="872"/>
-        <w:gridCol w:w="1368"/>
-        <w:gridCol w:w="379"/>
-        <w:gridCol w:w="1665"/>
-        <w:gridCol w:w="1044"/>
-        <w:gridCol w:w="203"/>
-        <w:gridCol w:w="786"/>
-        <w:gridCol w:w="1818"/>
+        <w:gridCol w:w="2655"/>
+        <w:gridCol w:w="359"/>
+        <w:gridCol w:w="869"/>
+        <w:gridCol w:w="1357"/>
+        <w:gridCol w:w="384"/>
+        <w:gridCol w:w="1649"/>
+        <w:gridCol w:w="1038"/>
+        <w:gridCol w:w="211"/>
+        <w:gridCol w:w="785"/>
+        <w:gridCol w:w="1799"/>
       </w:tblGrid>
       <w:tr>
         <w:trPr>
@@ -1695,12 +1695,12 @@
               <w:tblLook w:val="04A0" w:firstRow="1" w:lastRow="0" w:firstColumn="1" w:lastColumn="0" w:noHBand="0" w:noVBand="1"/>
             </w:tblPr>
             <w:tblGrid>
-              <w:gridCol w:w="4580"/>
-              <w:gridCol w:w="1184"/>
-              <w:gridCol w:w="906"/>
-              <w:gridCol w:w="816"/>
-              <w:gridCol w:w="1278"/>
-              <w:gridCol w:w="2125"/>
+              <w:gridCol w:w="4361"/>
+              <w:gridCol w:w="1616"/>
+              <w:gridCol w:w="871"/>
+              <w:gridCol w:w="786"/>
+              <w:gridCol w:w="1225"/>
+              <w:gridCol w:w="2030"/>
             </w:tblGrid>
             <w:tr>
               <w:trPr>
@@ -2471,6 +2471,80 @@
                       <w:szCs w:val="20"/>
                     </w:rPr>
                   </w:pPr>
+                  <w:r>
+                    <w:rPr>
+                      <w:rFonts w:cstheme="minorHAnsi"/>
+                      <w:sz w:val="20"/>
+                      <w:szCs w:val="20"/>
+                    </w:rPr>
+                    <w:t>{#</w:t>
+                  </w:r>
+                  <w:proofErr w:type="gramStart"/>
+                  <w:r>
+                    <w:rPr>
+                      <w:rFonts w:cstheme="minorHAnsi"/>
+                      <w:sz w:val="20"/>
+                      <w:szCs w:val="20"/>
+                    </w:rPr>
+                    <w:t>isFirst</w:t>
+                  </w:r>
+                  <w:r>
+                    <w:rPr>
+                      <w:rFonts w:cstheme="minorHAnsi"/>
+                      <w:sz w:val="20"/>
+                      <w:szCs w:val="20"/>
+                    </w:rPr>
+                    <w:t>}</w:t>
+                  </w:r>
+                  <w:r>
+                    <w:rPr>
+                      <w:rFonts w:cstheme="minorHAnsi"/>
+                      <w:sz w:val="20"/>
+                      <w:szCs w:val="20"/>
+                    </w:rPr>
+                    <w:t>{</w:t>
+                  </w:r>
+                  <w:proofErr w:type="gramEnd"/>
+                  <w:r>
+                    <w:rPr>
+                      <w:rFonts w:cstheme="minorHAnsi"/>
+                      <w:sz w:val="20"/>
+                      <w:szCs w:val="20"/>
+                    </w:rPr>
+                    <w:t>fsc</w:t>
+                  </w:r>
+                  <w:r>
+                    <w:rPr>
+                      <w:rFonts w:cstheme="minorHAnsi"/>
+                      <w:sz w:val="20"/>
+                      <w:szCs w:val="20"/>
+                    </w:rPr>
+                    <w:t>}</w:t>
+                  </w:r>
+                  <w:r>
+                    <w:rPr>
+                      <w:rFonts w:cstheme="minorHAnsi"/>
+                      <w:sz w:val="20"/>
+                      <w:szCs w:val="20"/>
+                    </w:rPr>
+                    <w:t>{/</w:t>
+                  </w:r>
+                  <w:r>
+                    <w:rPr>
+                      <w:rFonts w:cstheme="minorHAnsi"/>
+                      <w:sz w:val="20"/>
+                      <w:szCs w:val="20"/>
+                    </w:rPr>
+                    <w:t>isFirst</w:t>
+                  </w:r>
+                  <w:r>
+                    <w:rPr>
+                      <w:rFonts w:cstheme="minorHAnsi"/>
+                      <w:sz w:val="20"/>
+                      <w:szCs w:val="20"/>
+                    </w:rPr>
+                    <w:t>}</w:t>
+                  </w:r>
                 </w:p>
               </w:tc>
               <w:tc>
@@ -5207,7 +5281,6 @@
   <w:style w:type="character" w:default="1" w:styleId="DefaultParagraphFont">
     <w:name w:val="Default Paragraph Font"/>
     <w:uiPriority w:val="1"/>
-    <w:semiHidden/>
     <w:unhideWhenUsed/>
   </w:style>
   <w:style w:type="table" w:default="1" w:styleId="TableNormal">

</xml_diff>

<commit_message>
Fix double line header
</commit_message>
<xml_diff>
--- a/electron/database/generate-document/templates/custom-invoice.docx
+++ b/electron/database/generate-document/templates/custom-invoice.docx
@@ -1682,7 +1682,7 @@
           <w:tbl>
             <w:tblPr>
               <w:tblStyle w:val="TableGrid"/>
-              <w:tblW w:w="11071" w:type="dxa"/>
+              <w:tblW w:w="10889" w:type="dxa"/>
               <w:tblInd w:w="1" w:type="dxa"/>
               <w:tblBorders>
                 <w:top w:val="none" w:sz="0" w:space="0" w:color="auto"/>
@@ -1708,7 +1708,7 @@
               </w:trPr>
               <w:tc>
                 <w:tcPr>
-                  <w:tcW w:w="5450" w:type="dxa"/>
+                  <w:tcW w:w="4361" w:type="dxa"/>
                   <w:tcBorders>
                     <w:right w:val="nil"/>
                   </w:tcBorders>
@@ -1751,7 +1751,7 @@
               </w:tc>
               <w:tc>
                 <w:tcPr>
-                  <w:tcW w:w="1416" w:type="dxa"/>
+                  <w:tcW w:w="1616" w:type="dxa"/>
                   <w:tcBorders>
                     <w:left w:val="nil"/>
                   </w:tcBorders>
@@ -1785,7 +1785,7 @@
               </w:tc>
               <w:tc>
                 <w:tcPr>
-                  <w:tcW w:w="1020" w:type="dxa"/>
+                  <w:tcW w:w="871" w:type="dxa"/>
                 </w:tcPr>
                 <w:p>
                   <w:pPr>
@@ -1815,7 +1815,7 @@
               </w:tc>
               <w:tc>
                 <w:tcPr>
-                  <w:tcW w:w="1269" w:type="dxa"/>
+                  <w:tcW w:w="786" w:type="dxa"/>
                 </w:tcPr>
                 <w:p>
                   <w:pPr>
@@ -1859,7 +1859,7 @@
               </w:tc>
               <w:tc>
                 <w:tcPr>
-                  <w:tcW w:w="847" w:type="dxa"/>
+                  <w:tcW w:w="1225" w:type="dxa"/>
                 </w:tcPr>
                 <w:p>
                   <w:pPr>
@@ -1944,7 +1944,7 @@
               </w:tc>
               <w:tc>
                 <w:tcPr>
-                  <w:tcW w:w="1069" w:type="dxa"/>
+                  <w:tcW w:w="2030" w:type="dxa"/>
                 </w:tcPr>
                 <w:p>
                   <w:pPr>
@@ -2026,7 +2026,7 @@
               </w:trPr>
               <w:tc>
                 <w:tcPr>
-                  <w:tcW w:w="5450" w:type="dxa"/>
+                  <w:tcW w:w="4361" w:type="dxa"/>
                   <w:tcBorders>
                     <w:right w:val="nil"/>
                   </w:tcBorders>
@@ -2058,7 +2058,7 @@
               </w:tc>
               <w:tc>
                 <w:tcPr>
-                  <w:tcW w:w="1416" w:type="dxa"/>
+                  <w:tcW w:w="1616" w:type="dxa"/>
                   <w:tcBorders>
                     <w:left w:val="nil"/>
                   </w:tcBorders>
@@ -2082,7 +2082,7 @@
               </w:tc>
               <w:tc>
                 <w:tcPr>
-                  <w:tcW w:w="1020" w:type="dxa"/>
+                  <w:tcW w:w="871" w:type="dxa"/>
                 </w:tcPr>
                 <w:p>
                   <w:pPr>
@@ -2102,7 +2102,7 @@
               </w:tc>
               <w:tc>
                 <w:tcPr>
-                  <w:tcW w:w="1269" w:type="dxa"/>
+                  <w:tcW w:w="786" w:type="dxa"/>
                 </w:tcPr>
                 <w:p>
                   <w:pPr>
@@ -2122,7 +2122,7 @@
               </w:tc>
               <w:tc>
                 <w:tcPr>
-                  <w:tcW w:w="847" w:type="dxa"/>
+                  <w:tcW w:w="1225" w:type="dxa"/>
                 </w:tcPr>
                 <w:p>
                   <w:pPr>
@@ -2142,7 +2142,7 @@
               </w:tc>
               <w:tc>
                 <w:tcPr>
-                  <w:tcW w:w="1069" w:type="dxa"/>
+                  <w:tcW w:w="2030" w:type="dxa"/>
                 </w:tcPr>
                 <w:p>
                   <w:pPr>
@@ -2167,7 +2167,7 @@
               </w:trPr>
               <w:tc>
                 <w:tcPr>
-                  <w:tcW w:w="5450" w:type="dxa"/>
+                  <w:tcW w:w="4361" w:type="dxa"/>
                   <w:tcBorders>
                     <w:bottom w:val="nil"/>
                     <w:right w:val="nil"/>
@@ -2324,7 +2324,7 @@
               </w:tc>
               <w:tc>
                 <w:tcPr>
-                  <w:tcW w:w="1416" w:type="dxa"/>
+                  <w:tcW w:w="1616" w:type="dxa"/>
                   <w:tcBorders>
                     <w:left w:val="nil"/>
                     <w:bottom w:val="nil"/>
@@ -2354,7 +2354,7 @@
               </w:tc>
               <w:tc>
                 <w:tcPr>
-                  <w:tcW w:w="1020" w:type="dxa"/>
+                  <w:tcW w:w="871" w:type="dxa"/>
                 </w:tcPr>
                 <w:p>
                   <w:pPr>
@@ -2371,7 +2371,7 @@
               </w:tc>
               <w:tc>
                 <w:tcPr>
-                  <w:tcW w:w="1269" w:type="dxa"/>
+                  <w:tcW w:w="786" w:type="dxa"/>
                 </w:tcPr>
                 <w:p>
                   <w:pPr>
@@ -2388,7 +2388,7 @@
               </w:tc>
               <w:tc>
                 <w:tcPr>
-                  <w:tcW w:w="847" w:type="dxa"/>
+                  <w:tcW w:w="1225" w:type="dxa"/>
                 </w:tcPr>
                 <w:p>
                   <w:pPr>
@@ -2405,7 +2405,7 @@
               </w:tc>
               <w:tc>
                 <w:tcPr>
-                  <w:tcW w:w="1069" w:type="dxa"/>
+                  <w:tcW w:w="2030" w:type="dxa"/>
                 </w:tcPr>
                 <w:p>
                   <w:pPr>
@@ -2427,7 +2427,7 @@
               </w:trPr>
               <w:tc>
                 <w:tcPr>
-                  <w:tcW w:w="5450" w:type="dxa"/>
+                  <w:tcW w:w="4361" w:type="dxa"/>
                   <w:tcBorders>
                     <w:right w:val="nil"/>
                   </w:tcBorders>
@@ -2455,7 +2455,7 @@
               </w:tc>
               <w:tc>
                 <w:tcPr>
-                  <w:tcW w:w="1416" w:type="dxa"/>
+                  <w:tcW w:w="1616" w:type="dxa"/>
                   <w:tcBorders>
                     <w:left w:val="nil"/>
                   </w:tcBorders>
@@ -2549,7 +2549,7 @@
               </w:tc>
               <w:tc>
                 <w:tcPr>
-                  <w:tcW w:w="1020" w:type="dxa"/>
+                  <w:tcW w:w="871" w:type="dxa"/>
                 </w:tcPr>
                 <w:p>
                   <w:pPr>
@@ -2591,7 +2591,7 @@
               </w:tc>
               <w:tc>
                 <w:tcPr>
-                  <w:tcW w:w="1269" w:type="dxa"/>
+                  <w:tcW w:w="786" w:type="dxa"/>
                 </w:tcPr>
                 <w:p>
                   <w:pPr>
@@ -2635,7 +2635,7 @@
               </w:tc>
               <w:tc>
                 <w:tcPr>
-                  <w:tcW w:w="847" w:type="dxa"/>
+                  <w:tcW w:w="1225" w:type="dxa"/>
                 </w:tcPr>
                 <w:p>
                   <w:pPr>
@@ -2677,7 +2677,7 @@
               </w:tc>
               <w:tc>
                 <w:tcPr>
-                  <w:tcW w:w="1069" w:type="dxa"/>
+                  <w:tcW w:w="2030" w:type="dxa"/>
                 </w:tcPr>
                 <w:p>
                   <w:pPr>
@@ -3219,6 +3219,16 @@
               <w:right w:val="nil"/>
             </w:tcBorders>
           </w:tcPr>
+          <w:p>
+            <w:pPr>
+              <w:pStyle w:val="NoSpacing"/>
+              <w:rPr>
+                <w:rFonts w:cstheme="minorHAnsi"/>
+                <w:sz w:val="20"/>
+                <w:szCs w:val="20"/>
+              </w:rPr>
+            </w:pPr>
+          </w:p>
           <w:p>
             <w:pPr>
               <w:pStyle w:val="NoSpacing"/>
@@ -3340,6 +3350,7 @@
               <w:right w:val="nil"/>
             </w:tcBorders>
           </w:tcPr>
+          <w:p/>
           <w:tbl>
             <w:tblPr>
               <w:tblStyle w:val="TableGrid"/>
@@ -4059,7 +4070,6 @@
               <w:rPr>
                 <w:rFonts w:cstheme="minorHAnsi"/>
               </w:rPr>
-              <w:lastRenderedPageBreak/>
               <w:t>Pan No:</w:t>
             </w:r>
           </w:p>
@@ -4353,7 +4363,7 @@
       <w:headerReference w:type="default" r:id="rId8"/>
       <w:footerReference w:type="default" r:id="rId9"/>
       <w:pgSz w:w="12240" w:h="15840" w:code="1"/>
-      <w:pgMar w:top="567" w:right="567" w:bottom="1701" w:left="567" w:header="113" w:footer="510" w:gutter="0"/>
+      <w:pgMar w:top="482" w:right="567" w:bottom="1701" w:left="567" w:header="113" w:footer="510" w:gutter="0"/>
       <w:pgBorders w:offsetFrom="page">
         <w:top w:val="single" w:sz="4" w:space="24" w:color="auto"/>
         <w:left w:val="single" w:sz="4" w:space="28" w:color="auto"/>
@@ -5281,6 +5291,7 @@
   <w:style w:type="character" w:default="1" w:styleId="DefaultParagraphFont">
     <w:name w:val="Default Paragraph Font"/>
     <w:uiPriority w:val="1"/>
+    <w:semiHidden/>
     <w:unhideWhenUsed/>
   </w:style>
   <w:style w:type="table" w:default="1" w:styleId="TableNormal">

</xml_diff>

<commit_message>
Add contact and email in invoice
</commit_message>
<xml_diff>
--- a/electron/database/generate-document/templates/custom-invoice.docx
+++ b/electron/database/generate-document/templates/custom-invoice.docx
@@ -651,6 +651,96 @@
                 <w:szCs w:val="20"/>
               </w:rPr>
               <w:t>}</w:t>
+            </w:r>
+          </w:p>
+          <w:p>
+            <w:pPr>
+              <w:rPr>
+                <w:rFonts w:cstheme="minorHAnsi"/>
+                <w:sz w:val="20"/>
+                <w:szCs w:val="20"/>
+              </w:rPr>
+            </w:pPr>
+            <w:r>
+              <w:rPr>
+                <w:rFonts w:cstheme="minorHAnsi"/>
+                <w:sz w:val="20"/>
+                <w:szCs w:val="20"/>
+              </w:rPr>
+              <w:t>{#isUK}</w:t>
+            </w:r>
+            <w:r>
+              <w:rPr>
+                <w:rFonts w:cstheme="minorHAnsi"/>
+                <w:sz w:val="20"/>
+                <w:szCs w:val="20"/>
+              </w:rPr>
+              <w:t>TELE: {</w:t>
+            </w:r>
+            <w:r>
+              <w:rPr>
+                <w:rFonts w:cstheme="minorHAnsi"/>
+                <w:sz w:val="20"/>
+                <w:szCs w:val="20"/>
+              </w:rPr>
+              <w:t>consigneePhone</w:t>
+            </w:r>
+            <w:r>
+              <w:rPr>
+                <w:rFonts w:cstheme="minorHAnsi"/>
+                <w:sz w:val="20"/>
+                <w:szCs w:val="20"/>
+              </w:rPr>
+              <w:t xml:space="preserve">} </w:t>
+            </w:r>
+          </w:p>
+          <w:p>
+            <w:pPr>
+              <w:rPr>
+                <w:rFonts w:cstheme="minorHAnsi"/>
+                <w:sz w:val="20"/>
+                <w:szCs w:val="20"/>
+              </w:rPr>
+            </w:pPr>
+            <w:r>
+              <w:rPr>
+                <w:rFonts w:cstheme="minorHAnsi"/>
+                <w:sz w:val="20"/>
+                <w:szCs w:val="20"/>
+              </w:rPr>
+              <w:t>EMAIL</w:t>
+            </w:r>
+            <w:r>
+              <w:rPr>
+                <w:rFonts w:cstheme="minorHAnsi"/>
+                <w:sz w:val="20"/>
+                <w:szCs w:val="20"/>
+              </w:rPr>
+              <w:t>: {</w:t>
+            </w:r>
+            <w:r>
+              <w:rPr>
+                <w:rFonts w:cstheme="minorHAnsi"/>
+                <w:sz w:val="20"/>
+                <w:szCs w:val="20"/>
+              </w:rPr>
+              <w:t>consigneeEmail</w:t>
+            </w:r>
+            <w:r>
+              <w:rPr>
+                <w:rFonts w:cstheme="minorHAnsi"/>
+                <w:sz w:val="20"/>
+                <w:szCs w:val="20"/>
+              </w:rPr>
+              <w:t>}</w:t>
+            </w:r>
+            <w:r>
+              <w:rPr>
+                <w:rFonts w:cstheme="minorHAnsi"/>
+                <w:sz w:val="20"/>
+                <w:szCs w:val="20"/>
+              </w:rPr>
+              <w:t>{/isUK}</w:t>
             </w:r>
           </w:p>
         </w:tc>

</xml_diff>

<commit_message>
fix bankbranch and report fix
</commit_message>
<xml_diff>
--- a/electron/database/generate-document/templates/custom-invoice.docx
+++ b/electron/database/generate-document/templates/custom-invoice.docx
@@ -220,12 +220,14 @@
               </w:rPr>
               <w:t>{</w:t>
             </w:r>
+            <w:proofErr w:type="spellStart"/>
             <w:r>
               <w:rPr>
                 <w:rFonts w:cstheme="minorHAnsi"/>
               </w:rPr>
               <w:t>invoiceNo</w:t>
             </w:r>
+            <w:proofErr w:type="spellEnd"/>
             <w:r>
               <w:rPr>
                 <w:rFonts w:cstheme="minorHAnsi"/>
@@ -267,12 +269,14 @@
               </w:rPr>
               <w:t>{</w:t>
             </w:r>
+            <w:proofErr w:type="spellStart"/>
             <w:r>
               <w:rPr>
                 <w:rFonts w:cstheme="minorHAnsi"/>
               </w:rPr>
               <w:t>invoiceDate</w:t>
             </w:r>
+            <w:proofErr w:type="spellEnd"/>
             <w:r>
               <w:rPr>
                 <w:rFonts w:cstheme="minorHAnsi"/>
@@ -336,12 +340,14 @@
               </w:rPr>
               <w:t>{</w:t>
             </w:r>
+            <w:proofErr w:type="spellStart"/>
             <w:r>
               <w:rPr>
                 <w:rFonts w:cstheme="minorHAnsi"/>
               </w:rPr>
               <w:t>buyersOrderNo</w:t>
             </w:r>
+            <w:proofErr w:type="spellEnd"/>
             <w:r>
               <w:rPr>
                 <w:rFonts w:cstheme="minorHAnsi"/>
@@ -384,12 +390,14 @@
               </w:rPr>
               <w:t>{</w:t>
             </w:r>
+            <w:proofErr w:type="spellStart"/>
             <w:r>
               <w:rPr>
                 <w:rFonts w:cstheme="minorHAnsi"/>
               </w:rPr>
               <w:t>orderDate</w:t>
             </w:r>
+            <w:proofErr w:type="spellEnd"/>
             <w:r>
               <w:rPr>
                 <w:rFonts w:cstheme="minorHAnsi"/>
@@ -446,6 +454,7 @@
               </w:rPr>
               <w:t>{</w:t>
             </w:r>
+            <w:proofErr w:type="spellStart"/>
             <w:r>
               <w:rPr>
                 <w:rFonts w:cstheme="minorHAnsi"/>
@@ -454,6 +463,7 @@
               </w:rPr>
               <w:t>consigneeCountry</w:t>
             </w:r>
+            <w:proofErr w:type="spellEnd"/>
             <w:r>
               <w:rPr>
                 <w:rFonts w:cstheme="minorHAnsi"/>
@@ -522,6 +532,7 @@
               </w:rPr>
               <w:t>{</w:t>
             </w:r>
+            <w:proofErr w:type="spellStart"/>
             <w:r>
               <w:rPr>
                 <w:rFonts w:cstheme="minorHAnsi"/>
@@ -530,6 +541,7 @@
               </w:rPr>
               <w:t>consigneeName</w:t>
             </w:r>
+            <w:proofErr w:type="spellEnd"/>
             <w:r>
               <w:rPr>
                 <w:rFonts w:cstheme="minorHAnsi"/>
@@ -555,6 +567,7 @@
               </w:rPr>
               <w:t>{</w:t>
             </w:r>
+            <w:proofErr w:type="spellStart"/>
             <w:r>
               <w:rPr>
                 <w:rFonts w:cstheme="minorHAnsi"/>
@@ -563,6 +576,7 @@
               </w:rPr>
               <w:t>consigneeAddress</w:t>
             </w:r>
+            <w:proofErr w:type="spellEnd"/>
             <w:r>
               <w:rPr>
                 <w:rFonts w:cstheme="minorHAnsi"/>
@@ -571,6 +585,7 @@
               </w:rPr>
               <w:t>} {</w:t>
             </w:r>
+            <w:proofErr w:type="spellStart"/>
             <w:r>
               <w:rPr>
                 <w:rFonts w:cstheme="minorHAnsi"/>
@@ -579,6 +594,7 @@
               </w:rPr>
               <w:t>consigneeCity</w:t>
             </w:r>
+            <w:proofErr w:type="spellEnd"/>
             <w:r>
               <w:rPr>
                 <w:rFonts w:cstheme="minorHAnsi"/>
@@ -587,6 +603,7 @@
               </w:rPr>
               <w:t>} {</w:t>
             </w:r>
+            <w:proofErr w:type="spellStart"/>
             <w:r>
               <w:rPr>
                 <w:rFonts w:cstheme="minorHAnsi"/>
@@ -595,6 +612,7 @@
               </w:rPr>
               <w:t>consigneeState</w:t>
             </w:r>
+            <w:proofErr w:type="spellEnd"/>
             <w:r>
               <w:rPr>
                 <w:rFonts w:cstheme="minorHAnsi"/>
@@ -620,6 +638,7 @@
               </w:rPr>
               <w:t>{</w:t>
             </w:r>
+            <w:proofErr w:type="spellStart"/>
             <w:r>
               <w:rPr>
                 <w:rFonts w:cstheme="minorHAnsi"/>
@@ -628,6 +647,7 @@
               </w:rPr>
               <w:t>consigneeCountry</w:t>
             </w:r>
+            <w:proofErr w:type="spellEnd"/>
             <w:r>
               <w:rPr>
                 <w:rFonts w:cstheme="minorHAnsi"/>
@@ -636,6 +656,7 @@
               </w:rPr>
               <w:t>} {</w:t>
             </w:r>
+            <w:proofErr w:type="spellStart"/>
             <w:r>
               <w:rPr>
                 <w:rFonts w:cstheme="minorHAnsi"/>
@@ -644,6 +665,7 @@
               </w:rPr>
               <w:t>consigneeZip</w:t>
             </w:r>
+            <w:proofErr w:type="spellEnd"/>
             <w:r>
               <w:rPr>
                 <w:rFonts w:cstheme="minorHAnsi"/>
@@ -667,16 +689,35 @@
                 <w:sz w:val="20"/>
                 <w:szCs w:val="20"/>
               </w:rPr>
-              <w:t>{#isUK}</w:t>
-            </w:r>
-            <w:r>
-              <w:rPr>
-                <w:rFonts w:cstheme="minorHAnsi"/>
-                <w:sz w:val="20"/>
-                <w:szCs w:val="20"/>
-              </w:rPr>
-              <w:t>TELE: {</w:t>
-            </w:r>
+              <w:t>{#</w:t>
+            </w:r>
+            <w:proofErr w:type="gramStart"/>
+            <w:r>
+              <w:rPr>
+                <w:rFonts w:cstheme="minorHAnsi"/>
+                <w:sz w:val="20"/>
+                <w:szCs w:val="20"/>
+              </w:rPr>
+              <w:t>isUK}</w:t>
+            </w:r>
+            <w:r>
+              <w:rPr>
+                <w:rFonts w:cstheme="minorHAnsi"/>
+                <w:sz w:val="20"/>
+                <w:szCs w:val="20"/>
+              </w:rPr>
+              <w:t>TELE</w:t>
+            </w:r>
+            <w:proofErr w:type="gramEnd"/>
+            <w:r>
+              <w:rPr>
+                <w:rFonts w:cstheme="minorHAnsi"/>
+                <w:sz w:val="20"/>
+                <w:szCs w:val="20"/>
+              </w:rPr>
+              <w:t>: {</w:t>
+            </w:r>
+            <w:proofErr w:type="spellStart"/>
             <w:r>
               <w:rPr>
                 <w:rFonts w:cstheme="minorHAnsi"/>
@@ -685,6 +726,7 @@
               </w:rPr>
               <w:t>consigneePhone</w:t>
             </w:r>
+            <w:proofErr w:type="spellEnd"/>
             <w:r>
               <w:rPr>
                 <w:rFonts w:cstheme="minorHAnsi"/>
@@ -718,6 +760,7 @@
               </w:rPr>
               <w:t>: {</w:t>
             </w:r>
+            <w:proofErr w:type="spellStart"/>
             <w:r>
               <w:rPr>
                 <w:rFonts w:cstheme="minorHAnsi"/>
@@ -726,6 +769,7 @@
               </w:rPr>
               <w:t>consigneeEmail</w:t>
             </w:r>
+            <w:proofErr w:type="spellEnd"/>
             <w:r>
               <w:rPr>
                 <w:rFonts w:cstheme="minorHAnsi"/>
@@ -740,7 +784,25 @@
                 <w:sz w:val="20"/>
                 <w:szCs w:val="20"/>
               </w:rPr>
-              <w:t>{/isUK}</w:t>
+              <w:t>{/</w:t>
+            </w:r>
+            <w:proofErr w:type="spellStart"/>
+            <w:r>
+              <w:rPr>
+                <w:rFonts w:cstheme="minorHAnsi"/>
+                <w:sz w:val="20"/>
+                <w:szCs w:val="20"/>
+              </w:rPr>
+              <w:t>isUK</w:t>
+            </w:r>
+            <w:proofErr w:type="spellEnd"/>
+            <w:r>
+              <w:rPr>
+                <w:rFonts w:cstheme="minorHAnsi"/>
+                <w:sz w:val="20"/>
+                <w:szCs w:val="20"/>
+              </w:rPr>
+              <w:t>}</w:t>
             </w:r>
           </w:p>
         </w:tc>
@@ -786,6 +848,7 @@
               </w:rPr>
               <w:t>{</w:t>
             </w:r>
+            <w:proofErr w:type="spellStart"/>
             <w:r>
               <w:rPr>
                 <w:rFonts w:cstheme="minorHAnsi"/>
@@ -794,6 +857,7 @@
               </w:rPr>
               <w:t>buyerName</w:t>
             </w:r>
+            <w:proofErr w:type="spellEnd"/>
             <w:r>
               <w:rPr>
                 <w:rFonts w:cstheme="minorHAnsi"/>
@@ -819,6 +883,7 @@
               </w:rPr>
               <w:t>{</w:t>
             </w:r>
+            <w:proofErr w:type="spellStart"/>
             <w:r>
               <w:rPr>
                 <w:rFonts w:cstheme="minorHAnsi"/>
@@ -827,6 +892,7 @@
               </w:rPr>
               <w:t>buyerAddress</w:t>
             </w:r>
+            <w:proofErr w:type="spellEnd"/>
             <w:r>
               <w:rPr>
                 <w:rFonts w:cstheme="minorHAnsi"/>
@@ -835,6 +901,7 @@
               </w:rPr>
               <w:t>} {</w:t>
             </w:r>
+            <w:proofErr w:type="spellStart"/>
             <w:r>
               <w:rPr>
                 <w:rFonts w:cstheme="minorHAnsi"/>
@@ -843,6 +910,7 @@
               </w:rPr>
               <w:t>buyerCity</w:t>
             </w:r>
+            <w:proofErr w:type="spellEnd"/>
             <w:r>
               <w:rPr>
                 <w:rFonts w:cstheme="minorHAnsi"/>
@@ -851,6 +919,7 @@
               </w:rPr>
               <w:t>} {</w:t>
             </w:r>
+            <w:proofErr w:type="spellStart"/>
             <w:r>
               <w:rPr>
                 <w:rFonts w:cstheme="minorHAnsi"/>
@@ -859,6 +928,7 @@
               </w:rPr>
               <w:t>buyerState</w:t>
             </w:r>
+            <w:proofErr w:type="spellEnd"/>
             <w:r>
               <w:rPr>
                 <w:rFonts w:cstheme="minorHAnsi"/>
@@ -884,6 +954,7 @@
               </w:rPr>
               <w:t>{</w:t>
             </w:r>
+            <w:proofErr w:type="spellStart"/>
             <w:r>
               <w:rPr>
                 <w:rFonts w:cstheme="minorHAnsi"/>
@@ -892,6 +963,7 @@
               </w:rPr>
               <w:t>buyerCountry</w:t>
             </w:r>
+            <w:proofErr w:type="spellEnd"/>
             <w:r>
               <w:rPr>
                 <w:rFonts w:cstheme="minorHAnsi"/>
@@ -900,6 +972,7 @@
               </w:rPr>
               <w:t>} {</w:t>
             </w:r>
+            <w:proofErr w:type="spellStart"/>
             <w:r>
               <w:rPr>
                 <w:rFonts w:cstheme="minorHAnsi"/>
@@ -908,6 +981,7 @@
               </w:rPr>
               <w:t>buyerZip</w:t>
             </w:r>
+            <w:proofErr w:type="spellEnd"/>
             <w:r>
               <w:rPr>
                 <w:rFonts w:cstheme="minorHAnsi"/>
@@ -980,6 +1054,7 @@
               </w:rPr>
               <w:t>{</w:t>
             </w:r>
+            <w:proofErr w:type="spellStart"/>
             <w:r>
               <w:rPr>
                 <w:rFonts w:cstheme="minorHAnsi"/>
@@ -988,6 +1063,7 @@
               </w:rPr>
               <w:t>originOfGoods</w:t>
             </w:r>
+            <w:proofErr w:type="spellEnd"/>
             <w:r>
               <w:rPr>
                 <w:rFonts w:cstheme="minorHAnsi"/>
@@ -1039,6 +1115,7 @@
               </w:rPr>
               <w:t>{</w:t>
             </w:r>
+            <w:proofErr w:type="spellStart"/>
             <w:r>
               <w:rPr>
                 <w:rFonts w:cstheme="minorHAnsi"/>
@@ -1047,6 +1124,7 @@
               </w:rPr>
               <w:t>finalDestination</w:t>
             </w:r>
+            <w:proofErr w:type="spellEnd"/>
             <w:r>
               <w:rPr>
                 <w:rFonts w:cstheme="minorHAnsi"/>
@@ -1123,6 +1201,7 @@
               </w:rPr>
               <w:t>{</w:t>
             </w:r>
+            <w:proofErr w:type="spellStart"/>
             <w:r>
               <w:rPr>
                 <w:rFonts w:cstheme="minorHAnsi"/>
@@ -1131,6 +1210,7 @@
               </w:rPr>
               <w:t>termOfDeliveryAndPayment</w:t>
             </w:r>
+            <w:proofErr w:type="spellEnd"/>
             <w:r>
               <w:rPr>
                 <w:rFonts w:cstheme="minorHAnsi"/>
@@ -1167,6 +1247,7 @@
                 <w:szCs w:val="20"/>
               </w:rPr>
             </w:pPr>
+            <w:proofErr w:type="spellStart"/>
             <w:r>
               <w:rPr>
                 <w:rFonts w:ascii="SansSerif" w:hAnsi="SansSerif" w:cs="SansSerif"/>
@@ -1174,7 +1255,17 @@
                 <w:sz w:val="20"/>
                 <w:szCs w:val="20"/>
               </w:rPr>
-              <w:t>Precarriage by:</w:t>
+              <w:t>Precarriage</w:t>
+            </w:r>
+            <w:proofErr w:type="spellEnd"/>
+            <w:r>
+              <w:rPr>
+                <w:rFonts w:ascii="SansSerif" w:hAnsi="SansSerif" w:cs="SansSerif"/>
+                <w:color w:val="000000"/>
+                <w:sz w:val="20"/>
+                <w:szCs w:val="20"/>
+              </w:rPr>
+              <w:t xml:space="preserve"> by:</w:t>
             </w:r>
           </w:p>
           <w:p>
@@ -1194,6 +1285,7 @@
               </w:rPr>
               <w:t>{</w:t>
             </w:r>
+            <w:proofErr w:type="spellStart"/>
             <w:r>
               <w:rPr>
                 <w:rFonts w:cstheme="minorHAnsi"/>
@@ -1202,6 +1294,7 @@
               </w:rPr>
               <w:t>precarriageBy</w:t>
             </w:r>
+            <w:proofErr w:type="spellEnd"/>
             <w:r>
               <w:rPr>
                 <w:rFonts w:cstheme="minorHAnsi"/>
@@ -1263,6 +1356,7 @@
               </w:rPr>
               <w:t>{</w:t>
             </w:r>
+            <w:proofErr w:type="spellStart"/>
             <w:r>
               <w:rPr>
                 <w:rFonts w:ascii="SansSerif" w:hAnsi="SansSerif" w:cs="SansSerif"/>
@@ -1272,6 +1366,7 @@
               </w:rPr>
               <w:t>placeOfReceipt</w:t>
             </w:r>
+            <w:proofErr w:type="spellEnd"/>
             <w:r>
               <w:rPr>
                 <w:rFonts w:ascii="SansSerif" w:hAnsi="SansSerif" w:cs="SansSerif"/>
@@ -1362,6 +1457,7 @@
               </w:rPr>
               <w:t>{</w:t>
             </w:r>
+            <w:proofErr w:type="spellStart"/>
             <w:r>
               <w:rPr>
                 <w:rFonts w:ascii="SansSerif" w:hAnsi="SansSerif" w:cs="SansSerif"/>
@@ -1371,6 +1467,7 @@
               </w:rPr>
               <w:t>vesselNo</w:t>
             </w:r>
+            <w:proofErr w:type="spellEnd"/>
             <w:r>
               <w:rPr>
                 <w:rFonts w:ascii="SansSerif" w:hAnsi="SansSerif" w:cs="SansSerif"/>
@@ -1433,6 +1530,7 @@
               </w:rPr>
               <w:t>{</w:t>
             </w:r>
+            <w:proofErr w:type="spellStart"/>
             <w:r>
               <w:rPr>
                 <w:rFonts w:ascii="SansSerif" w:hAnsi="SansSerif" w:cs="SansSerif"/>
@@ -1442,6 +1540,7 @@
               </w:rPr>
               <w:t>portOfLoading</w:t>
             </w:r>
+            <w:proofErr w:type="spellEnd"/>
             <w:r>
               <w:rPr>
                 <w:rFonts w:ascii="SansSerif" w:hAnsi="SansSerif" w:cs="SansSerif"/>
@@ -1527,6 +1626,7 @@
               </w:rPr>
               <w:t>{</w:t>
             </w:r>
+            <w:proofErr w:type="spellStart"/>
             <w:r>
               <w:rPr>
                 <w:rFonts w:ascii="SansSerif" w:hAnsi="SansSerif" w:cs="SansSerif"/>
@@ -1536,6 +1636,7 @@
               </w:rPr>
               <w:t>portOfDischarge</w:t>
             </w:r>
+            <w:proofErr w:type="spellEnd"/>
             <w:r>
               <w:rPr>
                 <w:rFonts w:ascii="SansSerif" w:hAnsi="SansSerif" w:cs="SansSerif"/>
@@ -1594,6 +1695,7 @@
               </w:rPr>
               <w:t>{</w:t>
             </w:r>
+            <w:proofErr w:type="spellStart"/>
             <w:r>
               <w:rPr>
                 <w:rFonts w:ascii="SansSerif" w:hAnsi="SansSerif" w:cs="SansSerif"/>
@@ -1603,6 +1705,7 @@
               </w:rPr>
               <w:t>finalDestination</w:t>
             </w:r>
+            <w:proofErr w:type="spellEnd"/>
             <w:r>
               <w:rPr>
                 <w:rFonts w:ascii="SansSerif" w:hAnsi="SansSerif" w:cs="SansSerif"/>
@@ -1672,6 +1775,7 @@
               </w:rPr>
               <w:t>{</w:t>
             </w:r>
+            <w:proofErr w:type="spellStart"/>
             <w:r>
               <w:rPr>
                 <w:rFonts w:cstheme="minorHAnsi"/>
@@ -1680,6 +1784,7 @@
               </w:rPr>
               <w:t>privateRemark</w:t>
             </w:r>
+            <w:proofErr w:type="spellEnd"/>
             <w:r>
               <w:rPr>
                 <w:rFonts w:cstheme="minorHAnsi"/>
@@ -1864,8 +1969,22 @@
                       <w:sz w:val="20"/>
                       <w:szCs w:val="20"/>
                     </w:rPr>
-                    <w:t>Total Sq.Mt</w:t>
-                  </w:r>
+                    <w:t xml:space="preserve">Total </w:t>
+                  </w:r>
+                  <w:proofErr w:type="spellStart"/>
+                  <w:proofErr w:type="gramStart"/>
+                  <w:r>
+                    <w:rPr>
+                      <w:rFonts w:cstheme="minorHAnsi"/>
+                      <w:b/>
+                      <w:bCs/>
+                      <w:sz w:val="20"/>
+                      <w:szCs w:val="20"/>
+                    </w:rPr>
+                    <w:t>Sq.Mt</w:t>
+                  </w:r>
+                  <w:proofErr w:type="spellEnd"/>
+                  <w:proofErr w:type="gramEnd"/>
                 </w:p>
               </w:tc>
               <w:tc>
@@ -1925,7 +2044,29 @@
                       <w:sz w:val="20"/>
                       <w:szCs w:val="20"/>
                     </w:rPr>
-                    <w:t>{currencyChar}</w:t>
+                    <w:t>{</w:t>
+                  </w:r>
+                  <w:proofErr w:type="spellStart"/>
+                  <w:r>
+                    <w:rPr>
+                      <w:rFonts w:cstheme="minorHAnsi"/>
+                      <w:b/>
+                      <w:bCs/>
+                      <w:sz w:val="20"/>
+                      <w:szCs w:val="20"/>
+                    </w:rPr>
+                    <w:t>currencyChar</w:t>
+                  </w:r>
+                  <w:proofErr w:type="spellEnd"/>
+                  <w:r>
+                    <w:rPr>
+                      <w:rFonts w:cstheme="minorHAnsi"/>
+                      <w:b/>
+                      <w:bCs/>
+                      <w:sz w:val="20"/>
+                      <w:szCs w:val="20"/>
+                    </w:rPr>
+                    <w:t>}</w:t>
                   </w:r>
                 </w:p>
               </w:tc>
@@ -1980,7 +2121,29 @@
                       <w:sz w:val="20"/>
                       <w:szCs w:val="20"/>
                     </w:rPr>
-                    <w:t>{currencyChar}</w:t>
+                    <w:t>{</w:t>
+                  </w:r>
+                  <w:proofErr w:type="spellStart"/>
+                  <w:r>
+                    <w:rPr>
+                      <w:rFonts w:cstheme="minorHAnsi"/>
+                      <w:b/>
+                      <w:bCs/>
+                      <w:sz w:val="20"/>
+                      <w:szCs w:val="20"/>
+                    </w:rPr>
+                    <w:t>currencyChar</w:t>
+                  </w:r>
+                  <w:proofErr w:type="spellEnd"/>
+                  <w:r>
+                    <w:rPr>
+                      <w:rFonts w:cstheme="minorHAnsi"/>
+                      <w:b/>
+                      <w:bCs/>
+                      <w:sz w:val="20"/>
+                      <w:szCs w:val="20"/>
+                    </w:rPr>
+                    <w:t>}</w:t>
                   </w:r>
                 </w:p>
               </w:tc>
@@ -2035,7 +2198,34 @@
                       <w:sz w:val="18"/>
                       <w:szCs w:val="18"/>
                     </w:rPr>
-                    <w:t>{#CIItems}{#showThickness}</w:t>
+                    <w:t>{#</w:t>
+                  </w:r>
+                  <w:proofErr w:type="gramStart"/>
+                  <w:r>
+                    <w:rPr>
+                      <w:rFonts w:cstheme="minorHAnsi"/>
+                      <w:sz w:val="18"/>
+                      <w:szCs w:val="18"/>
+                    </w:rPr>
+                    <w:t>CIItems}{</w:t>
+                  </w:r>
+                  <w:proofErr w:type="gramEnd"/>
+                  <w:r>
+                    <w:rPr>
+                      <w:rFonts w:cstheme="minorHAnsi"/>
+                      <w:sz w:val="18"/>
+                      <w:szCs w:val="18"/>
+                    </w:rPr>
+                    <w:t>#</w:t>
+                  </w:r>
+                  <w:proofErr w:type="gramStart"/>
+                  <w:r>
+                    <w:rPr>
+                      <w:rFonts w:cstheme="minorHAnsi"/>
+                      <w:sz w:val="18"/>
+                      <w:szCs w:val="18"/>
+                    </w:rPr>
+                    <w:t>showThickness}</w:t>
                   </w:r>
                   <w:r>
                     <w:rPr>
@@ -2045,7 +2235,18 @@
                       <w:sz w:val="18"/>
                       <w:szCs w:val="18"/>
                     </w:rPr>
-                    <w:t>{thicknessDetail</w:t>
+                    <w:t>{</w:t>
+                  </w:r>
+                  <w:proofErr w:type="gramEnd"/>
+                  <w:r>
+                    <w:rPr>
+                      <w:rFonts w:cstheme="minorHAnsi"/>
+                      <w:b/>
+                      <w:bCs/>
+                      <w:sz w:val="18"/>
+                      <w:szCs w:val="18"/>
+                    </w:rPr>
+                    <w:t>thicknessDetail</w:t>
                   </w:r>
                   <w:r>
                     <w:rPr>
@@ -2299,7 +2500,25 @@
                       <w:sz w:val="18"/>
                       <w:szCs w:val="18"/>
                     </w:rPr>
-                    <w:t>{#invoices} {#isFirst}{fsc}{/isFirst}</w:t>
+                    <w:t>{#invoices} {#</w:t>
+                  </w:r>
+                  <w:proofErr w:type="gramStart"/>
+                  <w:r>
+                    <w:rPr>
+                      <w:rFonts w:cstheme="minorHAnsi"/>
+                      <w:sz w:val="18"/>
+                      <w:szCs w:val="18"/>
+                    </w:rPr>
+                    <w:t>isFirst}{</w:t>
+                  </w:r>
+                  <w:proofErr w:type="gramEnd"/>
+                  <w:r>
+                    <w:rPr>
+                      <w:rFonts w:cstheme="minorHAnsi"/>
+                      <w:sz w:val="18"/>
+                      <w:szCs w:val="18"/>
+                    </w:rPr>
+                    <w:t>fsc}{/isFirst}</w:t>
                   </w:r>
                 </w:p>
               </w:tc>
@@ -2351,7 +2570,25 @@
                       <w:sz w:val="18"/>
                       <w:szCs w:val="18"/>
                     </w:rPr>
-                    <w:t>{totalSq}</w:t>
+                    <w:t>{</w:t>
+                  </w:r>
+                  <w:proofErr w:type="spellStart"/>
+                  <w:r>
+                    <w:rPr>
+                      <w:rFonts w:cstheme="minorHAnsi"/>
+                      <w:sz w:val="18"/>
+                      <w:szCs w:val="18"/>
+                    </w:rPr>
+                    <w:t>totalSq</w:t>
+                  </w:r>
+                  <w:proofErr w:type="spellEnd"/>
+                  <w:r>
+                    <w:rPr>
+                      <w:rFonts w:cstheme="minorHAnsi"/>
+                      <w:sz w:val="18"/>
+                      <w:szCs w:val="18"/>
+                    </w:rPr>
+                    <w:t>}</w:t>
                   </w:r>
                 </w:p>
               </w:tc>
@@ -2402,7 +2639,25 @@
                       <w:sz w:val="18"/>
                       <w:szCs w:val="18"/>
                     </w:rPr>
-                    <w:t>{value} {/invoices} {/CIItems}</w:t>
+                    <w:t>{value} {/invoices} {/</w:t>
+                  </w:r>
+                  <w:proofErr w:type="spellStart"/>
+                  <w:r>
+                    <w:rPr>
+                      <w:rFonts w:cstheme="minorHAnsi"/>
+                      <w:sz w:val="18"/>
+                      <w:szCs w:val="18"/>
+                    </w:rPr>
+                    <w:t>CIItems</w:t>
+                  </w:r>
+                  <w:proofErr w:type="spellEnd"/>
+                  <w:r>
+                    <w:rPr>
+                      <w:rFonts w:cstheme="minorHAnsi"/>
+                      <w:sz w:val="18"/>
+                      <w:szCs w:val="18"/>
+                    </w:rPr>
+                    <w:t>}</w:t>
                   </w:r>
                 </w:p>
               </w:tc>
@@ -2448,12 +2703,14 @@
               </w:rPr>
               <w:t>{</w:t>
             </w:r>
+            <w:proofErr w:type="spellStart"/>
             <w:r>
               <w:rPr>
                 <w:rFonts w:cstheme="minorHAnsi"/>
               </w:rPr>
               <w:t>additionSumAmount</w:t>
             </w:r>
+            <w:proofErr w:type="spellEnd"/>
             <w:r>
               <w:rPr>
                 <w:rFonts w:cstheme="minorHAnsi"/>
@@ -2713,12 +2970,14 @@
               </w:rPr>
               <w:t>{</w:t>
             </w:r>
+            <w:proofErr w:type="spellStart"/>
             <w:r>
               <w:rPr>
                 <w:rFonts w:cstheme="minorHAnsi"/>
               </w:rPr>
               <w:t>deliveryTerms</w:t>
             </w:r>
+            <w:proofErr w:type="spellEnd"/>
             <w:r>
               <w:rPr>
                 <w:rFonts w:cstheme="minorHAnsi"/>
@@ -2731,24 +2990,29 @@
               </w:rPr>
               <w:t xml:space="preserve"> {</w:t>
             </w:r>
+            <w:proofErr w:type="spellStart"/>
             <w:r>
               <w:rPr>
                 <w:rFonts w:cstheme="minorHAnsi"/>
               </w:rPr>
               <w:t>portOfDischarge</w:t>
             </w:r>
+            <w:proofErr w:type="spellEnd"/>
             <w:r>
               <w:rPr>
                 <w:rFonts w:cstheme="minorHAnsi"/>
               </w:rPr>
               <w:t>} ({</w:t>
             </w:r>
+            <w:proofErr w:type="spellStart"/>
             <w:r>
               <w:rPr>
                 <w:rFonts w:cstheme="minorHAnsi"/>
               </w:rPr>
               <w:t>finalDestination</w:t>
             </w:r>
+            <w:proofErr w:type="spellEnd"/>
+            <w:proofErr w:type="gramStart"/>
             <w:r>
               <w:rPr>
                 <w:rFonts w:cstheme="minorHAnsi"/>
@@ -2759,7 +3023,14 @@
               <w:rPr>
                 <w:rFonts w:cstheme="minorHAnsi"/>
               </w:rPr>
-              <w:t xml:space="preserve">   </w:t>
+              <w:t xml:space="preserve">  </w:t>
+            </w:r>
+            <w:proofErr w:type="gramEnd"/>
+            <w:r>
+              <w:rPr>
+                <w:rFonts w:cstheme="minorHAnsi"/>
+              </w:rPr>
+              <w:t xml:space="preserve"> </w:t>
             </w:r>
             <w:r>
               <w:rPr>
@@ -2767,12 +3038,14 @@
               </w:rPr>
               <w:t>{</w:t>
             </w:r>
+            <w:proofErr w:type="spellStart"/>
             <w:r>
               <w:rPr>
                 <w:rFonts w:cstheme="minorHAnsi"/>
               </w:rPr>
               <w:t>currencyChar</w:t>
             </w:r>
+            <w:proofErr w:type="spellEnd"/>
             <w:r>
               <w:rPr>
                 <w:rFonts w:cstheme="minorHAnsi"/>
@@ -2791,12 +3064,14 @@
               </w:rPr>
               <w:t>{</w:t>
             </w:r>
+            <w:proofErr w:type="spellStart"/>
             <w:r>
               <w:rPr>
                 <w:rFonts w:cstheme="minorHAnsi"/>
               </w:rPr>
               <w:t>netAmountWords</w:t>
             </w:r>
+            <w:proofErr w:type="spellEnd"/>
             <w:r>
               <w:rPr>
                 <w:rFonts w:cstheme="minorHAnsi"/>
@@ -2830,12 +3105,14 @@
               </w:rPr>
               <w:t>{</w:t>
             </w:r>
+            <w:proofErr w:type="spellStart"/>
             <w:r>
               <w:rPr>
                 <w:rFonts w:cstheme="minorHAnsi"/>
               </w:rPr>
               <w:t>netAmount</w:t>
             </w:r>
+            <w:proofErr w:type="spellEnd"/>
             <w:r>
               <w:rPr>
                 <w:rFonts w:cstheme="minorHAnsi"/>
@@ -2886,6 +3163,7 @@
               </w:rPr>
               <w:t>{#</w:t>
             </w:r>
+            <w:proofErr w:type="gramStart"/>
             <w:r>
               <w:rPr>
                 <w:rFonts w:cstheme="minorHAnsi"/>
@@ -2910,6 +3188,7 @@
               </w:rPr>
               <w:t>}{</w:t>
             </w:r>
+            <w:proofErr w:type="gramEnd"/>
             <w:r>
               <w:rPr>
                 <w:rFonts w:cstheme="minorHAnsi"/>
@@ -2944,6 +3223,7 @@
               </w:rPr>
               <w:t>{/</w:t>
             </w:r>
+            <w:proofErr w:type="spellStart"/>
             <w:r>
               <w:rPr>
                 <w:rFonts w:cstheme="minorHAnsi"/>
@@ -2960,6 +3240,7 @@
               </w:rPr>
               <w:t>s</w:t>
             </w:r>
+            <w:proofErr w:type="spellEnd"/>
             <w:r>
               <w:rPr>
                 <w:rFonts w:cstheme="minorHAnsi"/>
@@ -3060,6 +3341,7 @@
                     </w:rPr>
                     <w:t>{</w:t>
                   </w:r>
+                  <w:proofErr w:type="spellStart"/>
                   <w:r>
                     <w:rPr>
                       <w:rFonts w:cstheme="minorHAnsi"/>
@@ -3068,6 +3350,7 @@
                     </w:rPr>
                     <w:t>totalQuantity</w:t>
                   </w:r>
+                  <w:proofErr w:type="spellEnd"/>
                   <w:r>
                     <w:rPr>
                       <w:rFonts w:cstheme="minorHAnsi"/>
@@ -3132,6 +3415,7 @@
                     </w:rPr>
                     <w:t>{</w:t>
                   </w:r>
+                  <w:proofErr w:type="spellStart"/>
                   <w:r>
                     <w:rPr>
                       <w:rFonts w:cstheme="minorHAnsi"/>
@@ -3140,6 +3424,7 @@
                     </w:rPr>
                     <w:t>totalBox</w:t>
                   </w:r>
+                  <w:proofErr w:type="spellEnd"/>
                   <w:r>
                     <w:rPr>
                       <w:rFonts w:cstheme="minorHAnsi"/>
@@ -3177,7 +3462,27 @@
                       <w:sz w:val="20"/>
                       <w:szCs w:val="20"/>
                     </w:rPr>
-                    <w:t>Total Sq.Meter:</w:t>
+                    <w:t xml:space="preserve">Total </w:t>
+                  </w:r>
+                  <w:proofErr w:type="spellStart"/>
+                  <w:proofErr w:type="gramStart"/>
+                  <w:r>
+                    <w:rPr>
+                      <w:rFonts w:cstheme="minorHAnsi"/>
+                      <w:sz w:val="20"/>
+                      <w:szCs w:val="20"/>
+                    </w:rPr>
+                    <w:t>Sq.Meter</w:t>
+                  </w:r>
+                  <w:proofErr w:type="spellEnd"/>
+                  <w:proofErr w:type="gramEnd"/>
+                  <w:r>
+                    <w:rPr>
+                      <w:rFonts w:cstheme="minorHAnsi"/>
+                      <w:sz w:val="20"/>
+                      <w:szCs w:val="20"/>
+                    </w:rPr>
+                    <w:t>:</w:t>
                   </w:r>
                 </w:p>
               </w:tc>
@@ -3204,6 +3509,7 @@
                     </w:rPr>
                     <w:t>{</w:t>
                   </w:r>
+                  <w:proofErr w:type="spellStart"/>
                   <w:r>
                     <w:rPr>
                       <w:rFonts w:cstheme="minorHAnsi"/>
@@ -3212,6 +3518,7 @@
                     </w:rPr>
                     <w:t>totalSqMt</w:t>
                   </w:r>
+                  <w:proofErr w:type="spellEnd"/>
                   <w:r>
                     <w:rPr>
                       <w:rFonts w:cstheme="minorHAnsi"/>
@@ -3317,7 +3624,25 @@
                       <w:sz w:val="20"/>
                       <w:szCs w:val="20"/>
                     </w:rPr>
-                    <w:t>Avg./Wt.(Kg)</w:t>
+                    <w:t>Avg./</w:t>
+                  </w:r>
+                  <w:proofErr w:type="gramStart"/>
+                  <w:r>
+                    <w:rPr>
+                      <w:rFonts w:cstheme="minorHAnsi"/>
+                      <w:sz w:val="20"/>
+                      <w:szCs w:val="20"/>
+                    </w:rPr>
+                    <w:t>Wt.(</w:t>
+                  </w:r>
+                  <w:proofErr w:type="gramEnd"/>
+                  <w:r>
+                    <w:rPr>
+                      <w:rFonts w:cstheme="minorHAnsi"/>
+                      <w:sz w:val="20"/>
+                      <w:szCs w:val="20"/>
+                    </w:rPr>
+                    <w:t>Kg)</w:t>
                   </w:r>
                 </w:p>
               </w:tc>
@@ -3400,6 +3725,7 @@
                     </w:rPr>
                     <w:t>{#</w:t>
                   </w:r>
+                  <w:proofErr w:type="gramStart"/>
                   <w:r>
                     <w:rPr>
                       <w:rFonts w:cstheme="minorHAnsi"/>
@@ -3416,6 +3742,7 @@
                     </w:rPr>
                     <w:t>}{</w:t>
                   </w:r>
+                  <w:proofErr w:type="gramEnd"/>
                   <w:r>
                     <w:rPr>
                       <w:rFonts w:cstheme="minorHAnsi"/>
@@ -3457,6 +3784,7 @@
                     </w:rPr>
                     <w:t>{</w:t>
                   </w:r>
+                  <w:proofErr w:type="spellStart"/>
                   <w:r>
                     <w:rPr>
                       <w:rFonts w:cstheme="minorHAnsi"/>
@@ -3465,6 +3793,7 @@
                     </w:rPr>
                     <w:t>totalSqMtPerType</w:t>
                   </w:r>
+                  <w:proofErr w:type="spellEnd"/>
                   <w:r>
                     <w:rPr>
                       <w:rFonts w:cstheme="minorHAnsi"/>
@@ -3554,6 +3883,7 @@
                     </w:rPr>
                     <w:t>} MM{/</w:t>
                   </w:r>
+                  <w:proofErr w:type="spellStart"/>
                   <w:r>
                     <w:rPr>
                       <w:rFonts w:cstheme="minorHAnsi"/>
@@ -3562,6 +3892,7 @@
                     </w:rPr>
                     <w:t>containerSummary</w:t>
                   </w:r>
+                  <w:proofErr w:type="spellEnd"/>
                   <w:r>
                     <w:rPr>
                       <w:rFonts w:cstheme="minorHAnsi"/>
@@ -3680,12 +4011,14 @@
               </w:rPr>
               <w:t>{</w:t>
             </w:r>
+            <w:proofErr w:type="spellStart"/>
             <w:r>
               <w:rPr>
                 <w:rFonts w:cstheme="minorHAnsi"/>
               </w:rPr>
               <w:t>panNo</w:t>
             </w:r>
+            <w:proofErr w:type="spellEnd"/>
             <w:r>
               <w:rPr>
                 <w:rFonts w:cstheme="minorHAnsi"/>
@@ -3738,12 +4071,34 @@
               </w:rPr>
               <w:t>{</w:t>
             </w:r>
+            <w:proofErr w:type="spellStart"/>
             <w:r>
               <w:rPr>
                 <w:rFonts w:cstheme="minorHAnsi"/>
               </w:rPr>
               <w:t>bankName</w:t>
             </w:r>
+            <w:proofErr w:type="spellEnd"/>
+            <w:r>
+              <w:rPr>
+                <w:rFonts w:cstheme="minorHAnsi"/>
+              </w:rPr>
+              <w:t>}</w:t>
+            </w:r>
+            <w:r>
+              <w:rPr>
+                <w:rFonts w:cstheme="minorHAnsi"/>
+              </w:rPr>
+              <w:t xml:space="preserve"> {</w:t>
+            </w:r>
+            <w:proofErr w:type="spellStart"/>
+            <w:r>
+              <w:rPr>
+                <w:rFonts w:cstheme="minorHAnsi"/>
+              </w:rPr>
+              <w:t>bankBranch</w:t>
+            </w:r>
+            <w:proofErr w:type="spellEnd"/>
             <w:r>
               <w:rPr>
                 <w:rFonts w:cstheme="minorHAnsi"/>
@@ -3796,12 +4151,14 @@
               </w:rPr>
               <w:t>{</w:t>
             </w:r>
+            <w:proofErr w:type="spellStart"/>
             <w:r>
               <w:rPr>
                 <w:rFonts w:cstheme="minorHAnsi"/>
               </w:rPr>
               <w:t>adCode</w:t>
             </w:r>
+            <w:proofErr w:type="spellEnd"/>
             <w:r>
               <w:rPr>
                 <w:rFonts w:cstheme="minorHAnsi"/>
@@ -3854,12 +4211,14 @@
               </w:rPr>
               <w:t>{</w:t>
             </w:r>
+            <w:proofErr w:type="spellStart"/>
             <w:r>
               <w:rPr>
                 <w:rFonts w:cstheme="minorHAnsi"/>
               </w:rPr>
               <w:t>acCode</w:t>
             </w:r>
+            <w:proofErr w:type="spellEnd"/>
             <w:r>
               <w:rPr>
                 <w:rFonts w:cstheme="minorHAnsi"/>
@@ -3912,12 +4271,14 @@
               </w:rPr>
               <w:t>{</w:t>
             </w:r>
+            <w:proofErr w:type="spellStart"/>
             <w:r>
               <w:rPr>
                 <w:rFonts w:cstheme="minorHAnsi"/>
               </w:rPr>
               <w:t>iec</w:t>
             </w:r>
+            <w:proofErr w:type="spellEnd"/>
             <w:r>
               <w:rPr>
                 <w:rFonts w:cstheme="minorHAnsi"/>

</xml_diff>

<commit_message>
Separate aus, uk party invoice
</commit_message>
<xml_diff>
--- a/electron/database/generate-document/templates/custom-invoice.docx
+++ b/electron/database/generate-document/templates/custom-invoice.docx
@@ -220,12 +220,14 @@
               </w:rPr>
               <w:t>{</w:t>
             </w:r>
-            <w:r>
-              <w:rPr>
-                <w:rFonts w:cstheme="minorHAnsi"/>
-              </w:rPr>
-              <w:t>invoiceNo</w:t>
-            </w:r>
+            <w:proofErr w:type="spellStart"/>
+            <w:r>
+              <w:rPr>
+                <w:rFonts w:cstheme="minorHAnsi"/>
+              </w:rPr>
+              <w:t>modifyInvNo</w:t>
+            </w:r>
+            <w:proofErr w:type="spellEnd"/>
             <w:r>
               <w:rPr>
                 <w:rFonts w:cstheme="minorHAnsi"/>
@@ -267,12 +269,14 @@
               </w:rPr>
               <w:t>{</w:t>
             </w:r>
+            <w:proofErr w:type="spellStart"/>
             <w:r>
               <w:rPr>
                 <w:rFonts w:cstheme="minorHAnsi"/>
               </w:rPr>
               <w:t>invoiceDate</w:t>
             </w:r>
+            <w:proofErr w:type="spellEnd"/>
             <w:r>
               <w:rPr>
                 <w:rFonts w:cstheme="minorHAnsi"/>
@@ -336,12 +340,14 @@
               </w:rPr>
               <w:t>{</w:t>
             </w:r>
+            <w:proofErr w:type="spellStart"/>
             <w:r>
               <w:rPr>
                 <w:rFonts w:cstheme="minorHAnsi"/>
               </w:rPr>
               <w:t>buyersOrderNo</w:t>
             </w:r>
+            <w:proofErr w:type="spellEnd"/>
             <w:r>
               <w:rPr>
                 <w:rFonts w:cstheme="minorHAnsi"/>
@@ -384,12 +390,14 @@
               </w:rPr>
               <w:t>{</w:t>
             </w:r>
+            <w:proofErr w:type="spellStart"/>
             <w:r>
               <w:rPr>
                 <w:rFonts w:cstheme="minorHAnsi"/>
               </w:rPr>
               <w:t>orderDate</w:t>
             </w:r>
+            <w:proofErr w:type="spellEnd"/>
             <w:r>
               <w:rPr>
                 <w:rFonts w:cstheme="minorHAnsi"/>
@@ -446,6 +454,7 @@
               </w:rPr>
               <w:t>{</w:t>
             </w:r>
+            <w:proofErr w:type="spellStart"/>
             <w:r>
               <w:rPr>
                 <w:rFonts w:cstheme="minorHAnsi"/>
@@ -454,6 +463,7 @@
               </w:rPr>
               <w:t>consigneeCountry</w:t>
             </w:r>
+            <w:proofErr w:type="spellEnd"/>
             <w:r>
               <w:rPr>
                 <w:rFonts w:cstheme="minorHAnsi"/>
@@ -522,6 +532,7 @@
               </w:rPr>
               <w:t>{</w:t>
             </w:r>
+            <w:proofErr w:type="spellStart"/>
             <w:r>
               <w:rPr>
                 <w:rFonts w:cstheme="minorHAnsi"/>
@@ -530,6 +541,7 @@
               </w:rPr>
               <w:t>consigneeName</w:t>
             </w:r>
+            <w:proofErr w:type="spellEnd"/>
             <w:r>
               <w:rPr>
                 <w:rFonts w:cstheme="minorHAnsi"/>
@@ -555,6 +567,7 @@
               </w:rPr>
               <w:t>{</w:t>
             </w:r>
+            <w:proofErr w:type="spellStart"/>
             <w:r>
               <w:rPr>
                 <w:rFonts w:cstheme="minorHAnsi"/>
@@ -563,6 +576,7 @@
               </w:rPr>
               <w:t>consigneeAddress</w:t>
             </w:r>
+            <w:proofErr w:type="spellEnd"/>
             <w:r>
               <w:rPr>
                 <w:rFonts w:cstheme="minorHAnsi"/>
@@ -571,6 +585,7 @@
               </w:rPr>
               <w:t>} {</w:t>
             </w:r>
+            <w:proofErr w:type="spellStart"/>
             <w:r>
               <w:rPr>
                 <w:rFonts w:cstheme="minorHAnsi"/>
@@ -579,6 +594,7 @@
               </w:rPr>
               <w:t>consigneeCity</w:t>
             </w:r>
+            <w:proofErr w:type="spellEnd"/>
             <w:r>
               <w:rPr>
                 <w:rFonts w:cstheme="minorHAnsi"/>
@@ -587,6 +603,7 @@
               </w:rPr>
               <w:t>} {</w:t>
             </w:r>
+            <w:proofErr w:type="spellStart"/>
             <w:r>
               <w:rPr>
                 <w:rFonts w:cstheme="minorHAnsi"/>
@@ -595,6 +612,7 @@
               </w:rPr>
               <w:t>consigneeState</w:t>
             </w:r>
+            <w:proofErr w:type="spellEnd"/>
             <w:r>
               <w:rPr>
                 <w:rFonts w:cstheme="minorHAnsi"/>
@@ -620,6 +638,7 @@
               </w:rPr>
               <w:t>{</w:t>
             </w:r>
+            <w:proofErr w:type="spellStart"/>
             <w:r>
               <w:rPr>
                 <w:rFonts w:cstheme="minorHAnsi"/>
@@ -628,6 +647,7 @@
               </w:rPr>
               <w:t>consigneeCountry</w:t>
             </w:r>
+            <w:proofErr w:type="spellEnd"/>
             <w:r>
               <w:rPr>
                 <w:rFonts w:cstheme="minorHAnsi"/>
@@ -636,6 +656,7 @@
               </w:rPr>
               <w:t>} {</w:t>
             </w:r>
+            <w:proofErr w:type="spellStart"/>
             <w:r>
               <w:rPr>
                 <w:rFonts w:cstheme="minorHAnsi"/>
@@ -644,6 +665,7 @@
               </w:rPr>
               <w:t>consigneeZip</w:t>
             </w:r>
+            <w:proofErr w:type="spellEnd"/>
             <w:r>
               <w:rPr>
                 <w:rFonts w:cstheme="minorHAnsi"/>
@@ -677,6 +699,7 @@
               </w:rPr>
               <w:t>TELE: {</w:t>
             </w:r>
+            <w:proofErr w:type="spellStart"/>
             <w:r>
               <w:rPr>
                 <w:rFonts w:cstheme="minorHAnsi"/>
@@ -685,6 +708,7 @@
               </w:rPr>
               <w:t>consigneePhone</w:t>
             </w:r>
+            <w:proofErr w:type="spellEnd"/>
             <w:r>
               <w:rPr>
                 <w:rFonts w:cstheme="minorHAnsi"/>
@@ -718,6 +742,7 @@
               </w:rPr>
               <w:t>: {</w:t>
             </w:r>
+            <w:proofErr w:type="spellStart"/>
             <w:r>
               <w:rPr>
                 <w:rFonts w:cstheme="minorHAnsi"/>
@@ -726,6 +751,7 @@
               </w:rPr>
               <w:t>consigneeEmail</w:t>
             </w:r>
+            <w:proofErr w:type="spellEnd"/>
             <w:r>
               <w:rPr>
                 <w:rFonts w:cstheme="minorHAnsi"/>
@@ -740,7 +766,25 @@
                 <w:sz w:val="20"/>
                 <w:szCs w:val="20"/>
               </w:rPr>
-              <w:t>{/isUK}</w:t>
+              <w:t>{/</w:t>
+            </w:r>
+            <w:proofErr w:type="spellStart"/>
+            <w:r>
+              <w:rPr>
+                <w:rFonts w:cstheme="minorHAnsi"/>
+                <w:sz w:val="20"/>
+                <w:szCs w:val="20"/>
+              </w:rPr>
+              <w:t>isUK</w:t>
+            </w:r>
+            <w:proofErr w:type="spellEnd"/>
+            <w:r>
+              <w:rPr>
+                <w:rFonts w:cstheme="minorHAnsi"/>
+                <w:sz w:val="20"/>
+                <w:szCs w:val="20"/>
+              </w:rPr>
+              <w:t>}</w:t>
             </w:r>
           </w:p>
         </w:tc>
@@ -786,6 +830,7 @@
               </w:rPr>
               <w:t>{</w:t>
             </w:r>
+            <w:proofErr w:type="spellStart"/>
             <w:r>
               <w:rPr>
                 <w:rFonts w:cstheme="minorHAnsi"/>
@@ -794,6 +839,7 @@
               </w:rPr>
               <w:t>buyerName</w:t>
             </w:r>
+            <w:proofErr w:type="spellEnd"/>
             <w:r>
               <w:rPr>
                 <w:rFonts w:cstheme="minorHAnsi"/>
@@ -819,6 +865,7 @@
               </w:rPr>
               <w:t>{</w:t>
             </w:r>
+            <w:proofErr w:type="spellStart"/>
             <w:r>
               <w:rPr>
                 <w:rFonts w:cstheme="minorHAnsi"/>
@@ -827,6 +874,7 @@
               </w:rPr>
               <w:t>buyerAddress</w:t>
             </w:r>
+            <w:proofErr w:type="spellEnd"/>
             <w:r>
               <w:rPr>
                 <w:rFonts w:cstheme="minorHAnsi"/>
@@ -835,6 +883,7 @@
               </w:rPr>
               <w:t>} {</w:t>
             </w:r>
+            <w:proofErr w:type="spellStart"/>
             <w:r>
               <w:rPr>
                 <w:rFonts w:cstheme="minorHAnsi"/>
@@ -843,6 +892,7 @@
               </w:rPr>
               <w:t>buyerCity</w:t>
             </w:r>
+            <w:proofErr w:type="spellEnd"/>
             <w:r>
               <w:rPr>
                 <w:rFonts w:cstheme="minorHAnsi"/>
@@ -851,6 +901,7 @@
               </w:rPr>
               <w:t>} {</w:t>
             </w:r>
+            <w:proofErr w:type="spellStart"/>
             <w:r>
               <w:rPr>
                 <w:rFonts w:cstheme="minorHAnsi"/>
@@ -859,6 +910,7 @@
               </w:rPr>
               <w:t>buyerState</w:t>
             </w:r>
+            <w:proofErr w:type="spellEnd"/>
             <w:r>
               <w:rPr>
                 <w:rFonts w:cstheme="minorHAnsi"/>
@@ -884,6 +936,7 @@
               </w:rPr>
               <w:t>{</w:t>
             </w:r>
+            <w:proofErr w:type="spellStart"/>
             <w:r>
               <w:rPr>
                 <w:rFonts w:cstheme="minorHAnsi"/>
@@ -892,6 +945,7 @@
               </w:rPr>
               <w:t>buyerCountry</w:t>
             </w:r>
+            <w:proofErr w:type="spellEnd"/>
             <w:r>
               <w:rPr>
                 <w:rFonts w:cstheme="minorHAnsi"/>
@@ -900,6 +954,7 @@
               </w:rPr>
               <w:t>} {</w:t>
             </w:r>
+            <w:proofErr w:type="spellStart"/>
             <w:r>
               <w:rPr>
                 <w:rFonts w:cstheme="minorHAnsi"/>
@@ -908,6 +963,7 @@
               </w:rPr>
               <w:t>buyerZip</w:t>
             </w:r>
+            <w:proofErr w:type="spellEnd"/>
             <w:r>
               <w:rPr>
                 <w:rFonts w:cstheme="minorHAnsi"/>
@@ -980,6 +1036,7 @@
               </w:rPr>
               <w:t>{</w:t>
             </w:r>
+            <w:proofErr w:type="spellStart"/>
             <w:r>
               <w:rPr>
                 <w:rFonts w:cstheme="minorHAnsi"/>
@@ -988,6 +1045,7 @@
               </w:rPr>
               <w:t>originOfGoods</w:t>
             </w:r>
+            <w:proofErr w:type="spellEnd"/>
             <w:r>
               <w:rPr>
                 <w:rFonts w:cstheme="minorHAnsi"/>
@@ -1039,6 +1097,7 @@
               </w:rPr>
               <w:t>{</w:t>
             </w:r>
+            <w:proofErr w:type="spellStart"/>
             <w:r>
               <w:rPr>
                 <w:rFonts w:cstheme="minorHAnsi"/>
@@ -1047,6 +1106,7 @@
               </w:rPr>
               <w:t>finalDestination</w:t>
             </w:r>
+            <w:proofErr w:type="spellEnd"/>
             <w:r>
               <w:rPr>
                 <w:rFonts w:cstheme="minorHAnsi"/>
@@ -1123,6 +1183,7 @@
               </w:rPr>
               <w:t>{</w:t>
             </w:r>
+            <w:proofErr w:type="spellStart"/>
             <w:r>
               <w:rPr>
                 <w:rFonts w:cstheme="minorHAnsi"/>
@@ -1131,6 +1192,7 @@
               </w:rPr>
               <w:t>termOfDeliveryAndPayment</w:t>
             </w:r>
+            <w:proofErr w:type="spellEnd"/>
             <w:r>
               <w:rPr>
                 <w:rFonts w:cstheme="minorHAnsi"/>
@@ -1162,11 +1224,12 @@
               <w:adjustRightInd w:val="0"/>
               <w:spacing w:before="20" w:line="276" w:lineRule="auto"/>
               <w:rPr>
-                <w:rFonts w:ascii="SansSerif" w:hAnsi="SansSerif"/>
-                <w:sz w:val="20"/>
-                <w:szCs w:val="20"/>
-              </w:rPr>
-            </w:pPr>
+                <w:rFonts w:cstheme="minorHAnsi"/>
+                <w:sz w:val="20"/>
+                <w:szCs w:val="20"/>
+              </w:rPr>
+            </w:pPr>
+            <w:proofErr w:type="spellStart"/>
             <w:r>
               <w:rPr>
                 <w:rFonts w:ascii="SansSerif" w:hAnsi="SansSerif" w:cs="SansSerif"/>
@@ -1174,41 +1237,17 @@
                 <w:sz w:val="20"/>
                 <w:szCs w:val="20"/>
               </w:rPr>
-              <w:t>Precarriage by:</w:t>
-            </w:r>
-          </w:p>
-          <w:p>
-            <w:pPr>
-              <w:spacing w:line="276" w:lineRule="auto"/>
-              <w:rPr>
-                <w:rFonts w:cstheme="minorHAnsi"/>
-                <w:sz w:val="20"/>
-                <w:szCs w:val="20"/>
-              </w:rPr>
-            </w:pPr>
-            <w:r>
-              <w:rPr>
-                <w:rFonts w:cstheme="minorHAnsi"/>
-                <w:sz w:val="20"/>
-                <w:szCs w:val="20"/>
-              </w:rPr>
-              <w:t>{</w:t>
-            </w:r>
-            <w:r>
-              <w:rPr>
-                <w:rFonts w:cstheme="minorHAnsi"/>
-                <w:sz w:val="20"/>
-                <w:szCs w:val="20"/>
-              </w:rPr>
-              <w:t>precarriageBy</w:t>
-            </w:r>
-            <w:r>
-              <w:rPr>
-                <w:rFonts w:cstheme="minorHAnsi"/>
-                <w:sz w:val="20"/>
-                <w:szCs w:val="20"/>
-              </w:rPr>
-              <w:t>}</w:t>
+              <w:t>Precarriage</w:t>
+            </w:r>
+            <w:proofErr w:type="spellEnd"/>
+            <w:r>
+              <w:rPr>
+                <w:rFonts w:ascii="SansSerif" w:hAnsi="SansSerif" w:cs="SansSerif"/>
+                <w:color w:val="000000"/>
+                <w:sz w:val="20"/>
+                <w:szCs w:val="20"/>
+              </w:rPr>
+              <w:t xml:space="preserve"> by:</w:t>
             </w:r>
           </w:p>
         </w:tc>
@@ -1263,6 +1302,7 @@
               </w:rPr>
               <w:t>{</w:t>
             </w:r>
+            <w:proofErr w:type="spellStart"/>
             <w:r>
               <w:rPr>
                 <w:rFonts w:ascii="SansSerif" w:hAnsi="SansSerif" w:cs="SansSerif"/>
@@ -1272,6 +1312,7 @@
               </w:rPr>
               <w:t>placeOfReceipt</w:t>
             </w:r>
+            <w:proofErr w:type="spellEnd"/>
             <w:r>
               <w:rPr>
                 <w:rFonts w:ascii="SansSerif" w:hAnsi="SansSerif" w:cs="SansSerif"/>
@@ -1353,33 +1394,6 @@
                 <w:szCs w:val="20"/>
               </w:rPr>
             </w:pPr>
-            <w:r>
-              <w:rPr>
-                <w:rFonts w:ascii="SansSerif" w:hAnsi="SansSerif" w:cs="SansSerif"/>
-                <w:color w:val="000000"/>
-                <w:sz w:val="20"/>
-                <w:szCs w:val="20"/>
-              </w:rPr>
-              <w:t>{</w:t>
-            </w:r>
-            <w:r>
-              <w:rPr>
-                <w:rFonts w:ascii="SansSerif" w:hAnsi="SansSerif" w:cs="SansSerif"/>
-                <w:color w:val="000000"/>
-                <w:sz w:val="20"/>
-                <w:szCs w:val="20"/>
-              </w:rPr>
-              <w:t>vesselNo</w:t>
-            </w:r>
-            <w:r>
-              <w:rPr>
-                <w:rFonts w:ascii="SansSerif" w:hAnsi="SansSerif" w:cs="SansSerif"/>
-                <w:color w:val="000000"/>
-                <w:sz w:val="20"/>
-                <w:szCs w:val="20"/>
-              </w:rPr>
-              <w:t>}</w:t>
-            </w:r>
           </w:p>
         </w:tc>
         <w:tc>
@@ -1433,6 +1447,7 @@
               </w:rPr>
               <w:t>{</w:t>
             </w:r>
+            <w:proofErr w:type="spellStart"/>
             <w:r>
               <w:rPr>
                 <w:rFonts w:ascii="SansSerif" w:hAnsi="SansSerif" w:cs="SansSerif"/>
@@ -1442,6 +1457,7 @@
               </w:rPr>
               <w:t>portOfLoading</w:t>
             </w:r>
+            <w:proofErr w:type="spellEnd"/>
             <w:r>
               <w:rPr>
                 <w:rFonts w:ascii="SansSerif" w:hAnsi="SansSerif" w:cs="SansSerif"/>
@@ -1527,6 +1543,7 @@
               </w:rPr>
               <w:t>{</w:t>
             </w:r>
+            <w:proofErr w:type="spellStart"/>
             <w:r>
               <w:rPr>
                 <w:rFonts w:ascii="SansSerif" w:hAnsi="SansSerif" w:cs="SansSerif"/>
@@ -1536,6 +1553,7 @@
               </w:rPr>
               <w:t>portOfDischarge</w:t>
             </w:r>
+            <w:proofErr w:type="spellEnd"/>
             <w:r>
               <w:rPr>
                 <w:rFonts w:ascii="SansSerif" w:hAnsi="SansSerif" w:cs="SansSerif"/>
@@ -1594,6 +1612,7 @@
               </w:rPr>
               <w:t>{</w:t>
             </w:r>
+            <w:proofErr w:type="spellStart"/>
             <w:r>
               <w:rPr>
                 <w:rFonts w:ascii="SansSerif" w:hAnsi="SansSerif" w:cs="SansSerif"/>
@@ -1603,6 +1622,7 @@
               </w:rPr>
               <w:t>finalDestination</w:t>
             </w:r>
+            <w:proofErr w:type="spellEnd"/>
             <w:r>
               <w:rPr>
                 <w:rFonts w:ascii="SansSerif" w:hAnsi="SansSerif" w:cs="SansSerif"/>
@@ -1672,6 +1692,7 @@
               </w:rPr>
               <w:t>{</w:t>
             </w:r>
+            <w:proofErr w:type="spellStart"/>
             <w:r>
               <w:rPr>
                 <w:rFonts w:cstheme="minorHAnsi"/>
@@ -1680,6 +1701,7 @@
               </w:rPr>
               <w:t>privateRemark</w:t>
             </w:r>
+            <w:proofErr w:type="spellEnd"/>
             <w:r>
               <w:rPr>
                 <w:rFonts w:cstheme="minorHAnsi"/>
@@ -1864,8 +1886,20 @@
                       <w:sz w:val="20"/>
                       <w:szCs w:val="20"/>
                     </w:rPr>
-                    <w:t>Total Sq.Mt</w:t>
-                  </w:r>
+                    <w:t xml:space="preserve">Total </w:t>
+                  </w:r>
+                  <w:proofErr w:type="spellStart"/>
+                  <w:r>
+                    <w:rPr>
+                      <w:rFonts w:cstheme="minorHAnsi"/>
+                      <w:b/>
+                      <w:bCs/>
+                      <w:sz w:val="20"/>
+                      <w:szCs w:val="20"/>
+                    </w:rPr>
+                    <w:t>Sq.Mt</w:t>
+                  </w:r>
+                  <w:proofErr w:type="spellEnd"/>
                 </w:p>
               </w:tc>
               <w:tc>
@@ -1925,7 +1959,29 @@
                       <w:sz w:val="20"/>
                       <w:szCs w:val="20"/>
                     </w:rPr>
-                    <w:t>{currencyChar}</w:t>
+                    <w:t>{</w:t>
+                  </w:r>
+                  <w:proofErr w:type="spellStart"/>
+                  <w:r>
+                    <w:rPr>
+                      <w:rFonts w:cstheme="minorHAnsi"/>
+                      <w:b/>
+                      <w:bCs/>
+                      <w:sz w:val="20"/>
+                      <w:szCs w:val="20"/>
+                    </w:rPr>
+                    <w:t>currencyChar</w:t>
+                  </w:r>
+                  <w:proofErr w:type="spellEnd"/>
+                  <w:r>
+                    <w:rPr>
+                      <w:rFonts w:cstheme="minorHAnsi"/>
+                      <w:b/>
+                      <w:bCs/>
+                      <w:sz w:val="20"/>
+                      <w:szCs w:val="20"/>
+                    </w:rPr>
+                    <w:t>}</w:t>
                   </w:r>
                 </w:p>
               </w:tc>
@@ -1980,7 +2036,29 @@
                       <w:sz w:val="20"/>
                       <w:szCs w:val="20"/>
                     </w:rPr>
-                    <w:t>{currencyChar}</w:t>
+                    <w:t>{</w:t>
+                  </w:r>
+                  <w:proofErr w:type="spellStart"/>
+                  <w:r>
+                    <w:rPr>
+                      <w:rFonts w:cstheme="minorHAnsi"/>
+                      <w:b/>
+                      <w:bCs/>
+                      <w:sz w:val="20"/>
+                      <w:szCs w:val="20"/>
+                    </w:rPr>
+                    <w:t>currencyChar</w:t>
+                  </w:r>
+                  <w:proofErr w:type="spellEnd"/>
+                  <w:r>
+                    <w:rPr>
+                      <w:rFonts w:cstheme="minorHAnsi"/>
+                      <w:b/>
+                      <w:bCs/>
+                      <w:sz w:val="20"/>
+                      <w:szCs w:val="20"/>
+                    </w:rPr>
+                    <w:t>}</w:t>
                   </w:r>
                 </w:p>
               </w:tc>
@@ -2468,7 +2546,25 @@
                       <w:sz w:val="18"/>
                       <w:szCs w:val="18"/>
                     </w:rPr>
-                    <w:t>{totalSq}</w:t>
+                    <w:t>{</w:t>
+                  </w:r>
+                  <w:proofErr w:type="spellStart"/>
+                  <w:r>
+                    <w:rPr>
+                      <w:rFonts w:cstheme="minorHAnsi"/>
+                      <w:sz w:val="18"/>
+                      <w:szCs w:val="18"/>
+                    </w:rPr>
+                    <w:t>totalSq</w:t>
+                  </w:r>
+                  <w:proofErr w:type="spellEnd"/>
+                  <w:r>
+                    <w:rPr>
+                      <w:rFonts w:cstheme="minorHAnsi"/>
+                      <w:sz w:val="18"/>
+                      <w:szCs w:val="18"/>
+                    </w:rPr>
+                    <w:t>}</w:t>
                   </w:r>
                 </w:p>
               </w:tc>
@@ -2519,7 +2615,25 @@
                       <w:sz w:val="18"/>
                       <w:szCs w:val="18"/>
                     </w:rPr>
-                    <w:t>{value} {/invoices} {/CIItems}</w:t>
+                    <w:t>{value} {/invoices} {/</w:t>
+                  </w:r>
+                  <w:proofErr w:type="spellStart"/>
+                  <w:r>
+                    <w:rPr>
+                      <w:rFonts w:cstheme="minorHAnsi"/>
+                      <w:sz w:val="18"/>
+                      <w:szCs w:val="18"/>
+                    </w:rPr>
+                    <w:t>CIItems</w:t>
+                  </w:r>
+                  <w:proofErr w:type="spellEnd"/>
+                  <w:r>
+                    <w:rPr>
+                      <w:rFonts w:cstheme="minorHAnsi"/>
+                      <w:sz w:val="18"/>
+                      <w:szCs w:val="18"/>
+                    </w:rPr>
+                    <w:t>}</w:t>
                   </w:r>
                 </w:p>
               </w:tc>
@@ -2565,12 +2679,14 @@
               </w:rPr>
               <w:t>{</w:t>
             </w:r>
+            <w:proofErr w:type="spellStart"/>
             <w:r>
               <w:rPr>
                 <w:rFonts w:cstheme="minorHAnsi"/>
               </w:rPr>
               <w:t>additionSumAmount</w:t>
             </w:r>
+            <w:proofErr w:type="spellEnd"/>
             <w:r>
               <w:rPr>
                 <w:rFonts w:cstheme="minorHAnsi"/>
@@ -2689,11 +2805,15 @@
               <w:jc w:val="right"/>
               <w:rPr>
                 <w:rFonts w:cstheme="minorHAnsi"/>
-              </w:rPr>
-            </w:pPr>
-            <w:r>
-              <w:rPr>
-                <w:rFonts w:cstheme="minorHAnsi"/>
+                <w:sz w:val="20"/>
+                <w:szCs w:val="20"/>
+              </w:rPr>
+            </w:pPr>
+            <w:r>
+              <w:rPr>
+                <w:rFonts w:cstheme="minorHAnsi"/>
+                <w:sz w:val="20"/>
+                <w:szCs w:val="20"/>
               </w:rPr>
               <w:t xml:space="preserve">Addition </w:t>
             </w:r>
@@ -2705,11 +2825,15 @@
               <w:jc w:val="right"/>
               <w:rPr>
                 <w:rFonts w:cstheme="minorHAnsi"/>
-              </w:rPr>
-            </w:pPr>
-            <w:r>
-              <w:rPr>
-                <w:rFonts w:cstheme="minorHAnsi"/>
+                <w:sz w:val="20"/>
+                <w:szCs w:val="20"/>
+              </w:rPr>
+            </w:pPr>
+            <w:r>
+              <w:rPr>
+                <w:rFonts w:cstheme="minorHAnsi"/>
+                <w:sz w:val="20"/>
+                <w:szCs w:val="20"/>
               </w:rPr>
               <w:t xml:space="preserve">Discount </w:t>
             </w:r>
@@ -2721,11 +2845,15 @@
               <w:jc w:val="right"/>
               <w:rPr>
                 <w:rFonts w:cstheme="minorHAnsi"/>
-              </w:rPr>
-            </w:pPr>
-            <w:r>
-              <w:rPr>
-                <w:rFonts w:cstheme="minorHAnsi"/>
+                <w:sz w:val="20"/>
+                <w:szCs w:val="20"/>
+              </w:rPr>
+            </w:pPr>
+            <w:r>
+              <w:rPr>
+                <w:rFonts w:cstheme="minorHAnsi"/>
+                <w:sz w:val="20"/>
+                <w:szCs w:val="20"/>
               </w:rPr>
               <w:t xml:space="preserve">Rounding                 </w:t>
             </w:r>
@@ -2747,6 +2875,8 @@
               <w:jc w:val="right"/>
               <w:rPr>
                 <w:rFonts w:cstheme="minorHAnsi"/>
+                <w:sz w:val="20"/>
+                <w:szCs w:val="20"/>
               </w:rPr>
             </w:pPr>
           </w:p>
@@ -2757,6 +2887,8 @@
               <w:jc w:val="right"/>
               <w:rPr>
                 <w:rFonts w:cstheme="minorHAnsi"/>
+                <w:sz w:val="20"/>
+                <w:szCs w:val="20"/>
               </w:rPr>
             </w:pPr>
           </w:p>
@@ -2767,25 +2899,17 @@
               <w:jc w:val="right"/>
               <w:rPr>
                 <w:rFonts w:cstheme="minorHAnsi"/>
-              </w:rPr>
-            </w:pPr>
-            <w:r>
-              <w:rPr>
-                <w:rFonts w:cstheme="minorHAnsi"/>
-              </w:rPr>
-              <w:t>{</w:t>
-            </w:r>
-            <w:r>
-              <w:rPr>
-                <w:rFonts w:cstheme="minorHAnsi"/>
-              </w:rPr>
-              <w:t>rounding</w:t>
-            </w:r>
-            <w:r>
-              <w:rPr>
-                <w:rFonts w:cstheme="minorHAnsi"/>
-              </w:rPr>
-              <w:t>}</w:t>
+                <w:sz w:val="20"/>
+                <w:szCs w:val="20"/>
+              </w:rPr>
+            </w:pPr>
+            <w:r>
+              <w:rPr>
+                <w:rFonts w:cstheme="minorHAnsi"/>
+                <w:sz w:val="20"/>
+                <w:szCs w:val="20"/>
+              </w:rPr>
+              <w:t>{rounding}</w:t>
             </w:r>
           </w:p>
         </w:tc>
@@ -2810,113 +2934,161 @@
               <w:spacing w:line="276" w:lineRule="auto"/>
               <w:rPr>
                 <w:rFonts w:cstheme="minorHAnsi"/>
-              </w:rPr>
-            </w:pPr>
-            <w:r>
-              <w:rPr>
-                <w:rFonts w:cstheme="minorHAnsi"/>
+                <w:sz w:val="20"/>
+                <w:szCs w:val="20"/>
+              </w:rPr>
+            </w:pPr>
+            <w:r>
+              <w:rPr>
+                <w:rFonts w:cstheme="minorHAnsi"/>
+                <w:sz w:val="20"/>
+                <w:szCs w:val="20"/>
               </w:rPr>
               <w:t>Total</w:t>
             </w:r>
             <w:r>
               <w:rPr>
                 <w:rFonts w:cstheme="minorHAnsi"/>
+                <w:sz w:val="20"/>
+                <w:szCs w:val="20"/>
               </w:rPr>
               <w:t xml:space="preserve"> </w:t>
             </w:r>
             <w:r>
               <w:rPr>
                 <w:rFonts w:cstheme="minorHAnsi"/>
+                <w:sz w:val="20"/>
+                <w:szCs w:val="20"/>
               </w:rPr>
               <w:t>{</w:t>
             </w:r>
-            <w:r>
-              <w:rPr>
-                <w:rFonts w:cstheme="minorHAnsi"/>
+            <w:proofErr w:type="spellStart"/>
+            <w:r>
+              <w:rPr>
+                <w:rFonts w:cstheme="minorHAnsi"/>
+                <w:sz w:val="20"/>
+                <w:szCs w:val="20"/>
               </w:rPr>
               <w:t>deliveryTerms</w:t>
             </w:r>
-            <w:r>
-              <w:rPr>
-                <w:rFonts w:cstheme="minorHAnsi"/>
+            <w:proofErr w:type="spellEnd"/>
+            <w:r>
+              <w:rPr>
+                <w:rFonts w:cstheme="minorHAnsi"/>
+                <w:sz w:val="20"/>
+                <w:szCs w:val="20"/>
               </w:rPr>
               <w:t>}</w:t>
             </w:r>
             <w:r>
               <w:rPr>
                 <w:rFonts w:cstheme="minorHAnsi"/>
+                <w:sz w:val="20"/>
+                <w:szCs w:val="20"/>
               </w:rPr>
               <w:t xml:space="preserve"> {</w:t>
             </w:r>
-            <w:r>
-              <w:rPr>
-                <w:rFonts w:cstheme="minorHAnsi"/>
+            <w:proofErr w:type="spellStart"/>
+            <w:r>
+              <w:rPr>
+                <w:rFonts w:cstheme="minorHAnsi"/>
+                <w:sz w:val="20"/>
+                <w:szCs w:val="20"/>
               </w:rPr>
               <w:t>portOfDischarge</w:t>
             </w:r>
-            <w:r>
-              <w:rPr>
-                <w:rFonts w:cstheme="minorHAnsi"/>
+            <w:proofErr w:type="spellEnd"/>
+            <w:r>
+              <w:rPr>
+                <w:rFonts w:cstheme="minorHAnsi"/>
+                <w:sz w:val="20"/>
+                <w:szCs w:val="20"/>
               </w:rPr>
               <w:t>} ({</w:t>
             </w:r>
-            <w:r>
-              <w:rPr>
-                <w:rFonts w:cstheme="minorHAnsi"/>
+            <w:proofErr w:type="spellStart"/>
+            <w:r>
+              <w:rPr>
+                <w:rFonts w:cstheme="minorHAnsi"/>
+                <w:sz w:val="20"/>
+                <w:szCs w:val="20"/>
               </w:rPr>
               <w:t>finalDestination</w:t>
             </w:r>
-            <w:r>
-              <w:rPr>
-                <w:rFonts w:cstheme="minorHAnsi"/>
+            <w:proofErr w:type="spellEnd"/>
+            <w:r>
+              <w:rPr>
+                <w:rFonts w:cstheme="minorHAnsi"/>
+                <w:sz w:val="20"/>
+                <w:szCs w:val="20"/>
               </w:rPr>
               <w:t xml:space="preserve">}) </w:t>
             </w:r>
             <w:r>
               <w:rPr>
                 <w:rFonts w:cstheme="minorHAnsi"/>
+                <w:sz w:val="20"/>
+                <w:szCs w:val="20"/>
               </w:rPr>
               <w:t xml:space="preserve">   </w:t>
             </w:r>
             <w:r>
               <w:rPr>
                 <w:rFonts w:cstheme="minorHAnsi"/>
+                <w:sz w:val="20"/>
+                <w:szCs w:val="20"/>
               </w:rPr>
               <w:t>{</w:t>
             </w:r>
-            <w:r>
-              <w:rPr>
-                <w:rFonts w:cstheme="minorHAnsi"/>
+            <w:proofErr w:type="spellStart"/>
+            <w:r>
+              <w:rPr>
+                <w:rFonts w:cstheme="minorHAnsi"/>
+                <w:sz w:val="20"/>
+                <w:szCs w:val="20"/>
               </w:rPr>
               <w:t>currencyChar</w:t>
             </w:r>
-            <w:r>
-              <w:rPr>
-                <w:rFonts w:cstheme="minorHAnsi"/>
+            <w:proofErr w:type="spellEnd"/>
+            <w:r>
+              <w:rPr>
+                <w:rFonts w:cstheme="minorHAnsi"/>
+                <w:sz w:val="20"/>
+                <w:szCs w:val="20"/>
               </w:rPr>
               <w:t>}</w:t>
             </w:r>
             <w:r>
               <w:rPr>
                 <w:rFonts w:cstheme="minorHAnsi"/>
+                <w:sz w:val="20"/>
+                <w:szCs w:val="20"/>
               </w:rPr>
               <w:t xml:space="preserve"> </w:t>
             </w:r>
             <w:r>
               <w:rPr>
                 <w:rFonts w:cstheme="minorHAnsi"/>
+                <w:sz w:val="20"/>
+                <w:szCs w:val="20"/>
               </w:rPr>
               <w:t>{</w:t>
             </w:r>
-            <w:r>
-              <w:rPr>
-                <w:rFonts w:cstheme="minorHAnsi"/>
+            <w:proofErr w:type="spellStart"/>
+            <w:r>
+              <w:rPr>
+                <w:rFonts w:cstheme="minorHAnsi"/>
+                <w:sz w:val="20"/>
+                <w:szCs w:val="20"/>
               </w:rPr>
               <w:t>netAmountWords</w:t>
             </w:r>
-            <w:r>
-              <w:rPr>
-                <w:rFonts w:cstheme="minorHAnsi"/>
+            <w:proofErr w:type="spellEnd"/>
+            <w:r>
+              <w:rPr>
+                <w:rFonts w:cstheme="minorHAnsi"/>
+                <w:sz w:val="20"/>
+                <w:szCs w:val="20"/>
               </w:rPr>
               <w:t>}</w:t>
             </w:r>
@@ -2939,23 +3111,33 @@
               <w:jc w:val="right"/>
               <w:rPr>
                 <w:rFonts w:cstheme="minorHAnsi"/>
-              </w:rPr>
-            </w:pPr>
-            <w:r>
-              <w:rPr>
-                <w:rFonts w:cstheme="minorHAnsi"/>
+                <w:sz w:val="20"/>
+                <w:szCs w:val="20"/>
+              </w:rPr>
+            </w:pPr>
+            <w:r>
+              <w:rPr>
+                <w:rFonts w:cstheme="minorHAnsi"/>
+                <w:sz w:val="20"/>
+                <w:szCs w:val="20"/>
               </w:rPr>
               <w:t>{</w:t>
             </w:r>
-            <w:r>
-              <w:rPr>
-                <w:rFonts w:cstheme="minorHAnsi"/>
+            <w:proofErr w:type="spellStart"/>
+            <w:r>
+              <w:rPr>
+                <w:rFonts w:cstheme="minorHAnsi"/>
+                <w:sz w:val="20"/>
+                <w:szCs w:val="20"/>
               </w:rPr>
               <w:t>netAmount</w:t>
             </w:r>
-            <w:r>
-              <w:rPr>
-                <w:rFonts w:cstheme="minorHAnsi"/>
+            <w:proofErr w:type="spellEnd"/>
+            <w:r>
+              <w:rPr>
+                <w:rFonts w:cstheme="minorHAnsi"/>
+                <w:sz w:val="20"/>
+                <w:szCs w:val="20"/>
               </w:rPr>
               <w:t>}</w:t>
             </w:r>
@@ -2991,55 +3173,47 @@
               <w:pStyle w:val="NoSpacing"/>
               <w:rPr>
                 <w:rFonts w:cstheme="minorHAnsi"/>
-                <w:sz w:val="20"/>
-                <w:szCs w:val="20"/>
-              </w:rPr>
-            </w:pPr>
-            <w:r>
-              <w:rPr>
-                <w:rFonts w:cstheme="minorHAnsi"/>
-                <w:sz w:val="20"/>
-                <w:szCs w:val="20"/>
+                <w:sz w:val="18"/>
+                <w:szCs w:val="18"/>
+              </w:rPr>
+            </w:pPr>
+            <w:r>
+              <w:rPr>
+                <w:rFonts w:cstheme="minorHAnsi"/>
+                <w:sz w:val="18"/>
+                <w:szCs w:val="18"/>
               </w:rPr>
               <w:t>{#</w:t>
             </w:r>
             <w:r>
               <w:rPr>
                 <w:rFonts w:cstheme="minorHAnsi"/>
-                <w:sz w:val="20"/>
-                <w:szCs w:val="20"/>
+                <w:sz w:val="18"/>
+                <w:szCs w:val="18"/>
+              </w:rPr>
+              <w:t>bottomNotes</w:t>
+            </w:r>
+            <w:r>
+              <w:rPr>
+                <w:rFonts w:cstheme="minorHAnsi"/>
+                <w:sz w:val="18"/>
+                <w:szCs w:val="18"/>
+              </w:rPr>
+              <w:t>}{</w:t>
+            </w:r>
+            <w:r>
+              <w:rPr>
+                <w:rFonts w:cstheme="minorHAnsi"/>
+                <w:sz w:val="18"/>
+                <w:szCs w:val="18"/>
               </w:rPr>
               <w:t>bottomNote</w:t>
             </w:r>
             <w:r>
               <w:rPr>
                 <w:rFonts w:cstheme="minorHAnsi"/>
-                <w:sz w:val="20"/>
-                <w:szCs w:val="20"/>
-              </w:rPr>
-              <w:t>s</w:t>
-            </w:r>
-            <w:r>
-              <w:rPr>
-                <w:rFonts w:cstheme="minorHAnsi"/>
-                <w:sz w:val="20"/>
-                <w:szCs w:val="20"/>
-              </w:rPr>
-              <w:t>}{</w:t>
-            </w:r>
-            <w:r>
-              <w:rPr>
-                <w:rFonts w:cstheme="minorHAnsi"/>
-                <w:sz w:val="20"/>
-                <w:szCs w:val="20"/>
-              </w:rPr>
-              <w:t>bottomNote</w:t>
-            </w:r>
-            <w:r>
-              <w:rPr>
-                <w:rFonts w:cstheme="minorHAnsi"/>
-                <w:sz w:val="20"/>
-                <w:szCs w:val="20"/>
+                <w:sz w:val="18"/>
+                <w:szCs w:val="18"/>
               </w:rPr>
               <w:t>}</w:t>
             </w:r>
@@ -3056,32 +3230,26 @@
             <w:r>
               <w:rPr>
                 <w:rFonts w:cstheme="minorHAnsi"/>
-                <w:sz w:val="20"/>
-                <w:szCs w:val="20"/>
+                <w:sz w:val="18"/>
+                <w:szCs w:val="18"/>
               </w:rPr>
               <w:t>{/</w:t>
             </w:r>
-            <w:r>
-              <w:rPr>
-                <w:rFonts w:cstheme="minorHAnsi"/>
-                <w:sz w:val="20"/>
-                <w:szCs w:val="20"/>
-              </w:rPr>
-              <w:t>bottomNote</w:t>
-            </w:r>
-            <w:r>
-              <w:rPr>
-                <w:rFonts w:cstheme="minorHAnsi"/>
-                <w:sz w:val="20"/>
-                <w:szCs w:val="20"/>
-              </w:rPr>
-              <w:t>s</w:t>
-            </w:r>
-            <w:r>
-              <w:rPr>
-                <w:rFonts w:cstheme="minorHAnsi"/>
-                <w:sz w:val="20"/>
-                <w:szCs w:val="20"/>
+            <w:proofErr w:type="spellStart"/>
+            <w:r>
+              <w:rPr>
+                <w:rFonts w:cstheme="minorHAnsi"/>
+                <w:sz w:val="18"/>
+                <w:szCs w:val="18"/>
+              </w:rPr>
+              <w:t>bottomNotes</w:t>
+            </w:r>
+            <w:proofErr w:type="spellEnd"/>
+            <w:r>
+              <w:rPr>
+                <w:rFonts w:cstheme="minorHAnsi"/>
+                <w:sz w:val="18"/>
+                <w:szCs w:val="18"/>
               </w:rPr>
               <w:t>}</w:t>
             </w:r>
@@ -3103,7 +3271,6 @@
               <w:right w:val="nil"/>
             </w:tcBorders>
           </w:tcPr>
-          <w:p/>
           <w:tbl>
             <w:tblPr>
               <w:tblStyle w:val="TableGrid"/>
@@ -3177,6 +3344,7 @@
                     </w:rPr>
                     <w:t>{</w:t>
                   </w:r>
+                  <w:proofErr w:type="spellStart"/>
                   <w:r>
                     <w:rPr>
                       <w:rFonts w:cstheme="minorHAnsi"/>
@@ -3185,6 +3353,7 @@
                     </w:rPr>
                     <w:t>totalQuantity</w:t>
                   </w:r>
+                  <w:proofErr w:type="spellEnd"/>
                   <w:r>
                     <w:rPr>
                       <w:rFonts w:cstheme="minorHAnsi"/>
@@ -3249,6 +3418,7 @@
                     </w:rPr>
                     <w:t>{</w:t>
                   </w:r>
+                  <w:proofErr w:type="spellStart"/>
                   <w:r>
                     <w:rPr>
                       <w:rFonts w:cstheme="minorHAnsi"/>
@@ -3257,6 +3427,7 @@
                     </w:rPr>
                     <w:t>totalBox</w:t>
                   </w:r>
+                  <w:proofErr w:type="spellEnd"/>
                   <w:r>
                     <w:rPr>
                       <w:rFonts w:cstheme="minorHAnsi"/>
@@ -3294,7 +3465,25 @@
                       <w:sz w:val="20"/>
                       <w:szCs w:val="20"/>
                     </w:rPr>
-                    <w:t>Total Sq.Meter:</w:t>
+                    <w:t xml:space="preserve">Total </w:t>
+                  </w:r>
+                  <w:proofErr w:type="spellStart"/>
+                  <w:r>
+                    <w:rPr>
+                      <w:rFonts w:cstheme="minorHAnsi"/>
+                      <w:sz w:val="20"/>
+                      <w:szCs w:val="20"/>
+                    </w:rPr>
+                    <w:t>Sq.Meter</w:t>
+                  </w:r>
+                  <w:proofErr w:type="spellEnd"/>
+                  <w:r>
+                    <w:rPr>
+                      <w:rFonts w:cstheme="minorHAnsi"/>
+                      <w:sz w:val="20"/>
+                      <w:szCs w:val="20"/>
+                    </w:rPr>
+                    <w:t>:</w:t>
                   </w:r>
                 </w:p>
               </w:tc>
@@ -3321,6 +3510,7 @@
                     </w:rPr>
                     <w:t>{</w:t>
                   </w:r>
+                  <w:proofErr w:type="spellStart"/>
                   <w:r>
                     <w:rPr>
                       <w:rFonts w:cstheme="minorHAnsi"/>
@@ -3329,6 +3519,7 @@
                     </w:rPr>
                     <w:t>totalSqMt</w:t>
                   </w:r>
+                  <w:proofErr w:type="spellEnd"/>
                   <w:r>
                     <w:rPr>
                       <w:rFonts w:cstheme="minorHAnsi"/>
@@ -3574,6 +3765,7 @@
                     </w:rPr>
                     <w:t>{</w:t>
                   </w:r>
+                  <w:proofErr w:type="spellStart"/>
                   <w:r>
                     <w:rPr>
                       <w:rFonts w:cstheme="minorHAnsi"/>
@@ -3582,6 +3774,7 @@
                     </w:rPr>
                     <w:t>totalSqMtPerType</w:t>
                   </w:r>
+                  <w:proofErr w:type="spellEnd"/>
                   <w:r>
                     <w:rPr>
                       <w:rFonts w:cstheme="minorHAnsi"/>
@@ -3671,6 +3864,7 @@
                     </w:rPr>
                     <w:t>} MM{/</w:t>
                   </w:r>
+                  <w:proofErr w:type="spellStart"/>
                   <w:r>
                     <w:rPr>
                       <w:rFonts w:cstheme="minorHAnsi"/>
@@ -3679,6 +3873,7 @@
                     </w:rPr>
                     <w:t>containerSummary</w:t>
                   </w:r>
+                  <w:proofErr w:type="spellEnd"/>
                   <w:r>
                     <w:rPr>
                       <w:rFonts w:cstheme="minorHAnsi"/>
@@ -3768,11 +3963,15 @@
               <w:keepNext/>
               <w:rPr>
                 <w:rFonts w:cstheme="minorHAnsi"/>
-              </w:rPr>
-            </w:pPr>
-            <w:r>
-              <w:rPr>
-                <w:rFonts w:cstheme="minorHAnsi"/>
+                <w:sz w:val="20"/>
+                <w:szCs w:val="20"/>
+              </w:rPr>
+            </w:pPr>
+            <w:r>
+              <w:rPr>
+                <w:rFonts w:cstheme="minorHAnsi"/>
+                <w:sz w:val="20"/>
+                <w:szCs w:val="20"/>
               </w:rPr>
               <w:lastRenderedPageBreak/>
               <w:t>Pan No:</w:t>
@@ -3789,23 +3988,33 @@
               <w:keepNext/>
               <w:rPr>
                 <w:rFonts w:cstheme="minorHAnsi"/>
-              </w:rPr>
-            </w:pPr>
-            <w:r>
-              <w:rPr>
-                <w:rFonts w:cstheme="minorHAnsi"/>
+                <w:sz w:val="20"/>
+                <w:szCs w:val="20"/>
+              </w:rPr>
+            </w:pPr>
+            <w:r>
+              <w:rPr>
+                <w:rFonts w:cstheme="minorHAnsi"/>
+                <w:sz w:val="20"/>
+                <w:szCs w:val="20"/>
               </w:rPr>
               <w:t>{</w:t>
             </w:r>
-            <w:r>
-              <w:rPr>
-                <w:rFonts w:cstheme="minorHAnsi"/>
+            <w:proofErr w:type="spellStart"/>
+            <w:r>
+              <w:rPr>
+                <w:rFonts w:cstheme="minorHAnsi"/>
+                <w:sz w:val="20"/>
+                <w:szCs w:val="20"/>
               </w:rPr>
               <w:t>panNo</w:t>
             </w:r>
-            <w:r>
-              <w:rPr>
-                <w:rFonts w:cstheme="minorHAnsi"/>
+            <w:proofErr w:type="spellEnd"/>
+            <w:r>
+              <w:rPr>
+                <w:rFonts w:cstheme="minorHAnsi"/>
+                <w:sz w:val="20"/>
+                <w:szCs w:val="20"/>
               </w:rPr>
               <w:t>}</w:t>
             </w:r>
@@ -3827,11 +4036,15 @@
               <w:keepNext/>
               <w:rPr>
                 <w:rFonts w:cstheme="minorHAnsi"/>
-              </w:rPr>
-            </w:pPr>
-            <w:r>
-              <w:rPr>
-                <w:rFonts w:cstheme="minorHAnsi"/>
+                <w:sz w:val="20"/>
+                <w:szCs w:val="20"/>
+              </w:rPr>
+            </w:pPr>
+            <w:r>
+              <w:rPr>
+                <w:rFonts w:cstheme="minorHAnsi"/>
+                <w:sz w:val="20"/>
+                <w:szCs w:val="20"/>
               </w:rPr>
               <w:t>Bank Name:</w:t>
             </w:r>
@@ -3847,41 +4060,59 @@
               <w:keepNext/>
               <w:rPr>
                 <w:rFonts w:cstheme="minorHAnsi"/>
-              </w:rPr>
-            </w:pPr>
-            <w:r>
-              <w:rPr>
-                <w:rFonts w:cstheme="minorHAnsi"/>
+                <w:sz w:val="20"/>
+                <w:szCs w:val="20"/>
+              </w:rPr>
+            </w:pPr>
+            <w:r>
+              <w:rPr>
+                <w:rFonts w:cstheme="minorHAnsi"/>
+                <w:sz w:val="20"/>
+                <w:szCs w:val="20"/>
               </w:rPr>
               <w:t>{</w:t>
             </w:r>
-            <w:r>
-              <w:rPr>
-                <w:rFonts w:cstheme="minorHAnsi"/>
+            <w:proofErr w:type="spellStart"/>
+            <w:r>
+              <w:rPr>
+                <w:rFonts w:cstheme="minorHAnsi"/>
+                <w:sz w:val="20"/>
+                <w:szCs w:val="20"/>
               </w:rPr>
               <w:t>bankName</w:t>
             </w:r>
-            <w:r>
-              <w:rPr>
-                <w:rFonts w:cstheme="minorHAnsi"/>
+            <w:proofErr w:type="spellEnd"/>
+            <w:r>
+              <w:rPr>
+                <w:rFonts w:cstheme="minorHAnsi"/>
+                <w:sz w:val="20"/>
+                <w:szCs w:val="20"/>
               </w:rPr>
               <w:t>}</w:t>
             </w:r>
             <w:r>
               <w:rPr>
                 <w:rFonts w:cstheme="minorHAnsi"/>
+                <w:sz w:val="20"/>
+                <w:szCs w:val="20"/>
               </w:rPr>
               <w:t xml:space="preserve"> {</w:t>
             </w:r>
-            <w:r>
-              <w:rPr>
-                <w:rFonts w:cstheme="minorHAnsi"/>
+            <w:proofErr w:type="spellStart"/>
+            <w:r>
+              <w:rPr>
+                <w:rFonts w:cstheme="minorHAnsi"/>
+                <w:sz w:val="20"/>
+                <w:szCs w:val="20"/>
               </w:rPr>
               <w:t>bankBranch</w:t>
             </w:r>
-            <w:r>
-              <w:rPr>
-                <w:rFonts w:cstheme="minorHAnsi"/>
+            <w:proofErr w:type="spellEnd"/>
+            <w:r>
+              <w:rPr>
+                <w:rFonts w:cstheme="minorHAnsi"/>
+                <w:sz w:val="20"/>
+                <w:szCs w:val="20"/>
               </w:rPr>
               <w:t>}</w:t>
             </w:r>
@@ -3903,11 +4134,15 @@
               <w:keepNext/>
               <w:rPr>
                 <w:rFonts w:cstheme="minorHAnsi"/>
-              </w:rPr>
-            </w:pPr>
-            <w:r>
-              <w:rPr>
-                <w:rFonts w:cstheme="minorHAnsi"/>
+                <w:sz w:val="20"/>
+                <w:szCs w:val="20"/>
+              </w:rPr>
+            </w:pPr>
+            <w:r>
+              <w:rPr>
+                <w:rFonts w:cstheme="minorHAnsi"/>
+                <w:sz w:val="20"/>
+                <w:szCs w:val="20"/>
               </w:rPr>
               <w:t xml:space="preserve">AD Code: </w:t>
             </w:r>
@@ -3923,23 +4158,33 @@
               <w:keepNext/>
               <w:rPr>
                 <w:rFonts w:cstheme="minorHAnsi"/>
-              </w:rPr>
-            </w:pPr>
-            <w:r>
-              <w:rPr>
-                <w:rFonts w:cstheme="minorHAnsi"/>
+                <w:sz w:val="20"/>
+                <w:szCs w:val="20"/>
+              </w:rPr>
+            </w:pPr>
+            <w:r>
+              <w:rPr>
+                <w:rFonts w:cstheme="minorHAnsi"/>
+                <w:sz w:val="20"/>
+                <w:szCs w:val="20"/>
               </w:rPr>
               <w:t>{</w:t>
             </w:r>
-            <w:r>
-              <w:rPr>
-                <w:rFonts w:cstheme="minorHAnsi"/>
+            <w:proofErr w:type="spellStart"/>
+            <w:r>
+              <w:rPr>
+                <w:rFonts w:cstheme="minorHAnsi"/>
+                <w:sz w:val="20"/>
+                <w:szCs w:val="20"/>
               </w:rPr>
               <w:t>adCode</w:t>
             </w:r>
-            <w:r>
-              <w:rPr>
-                <w:rFonts w:cstheme="minorHAnsi"/>
+            <w:proofErr w:type="spellEnd"/>
+            <w:r>
+              <w:rPr>
+                <w:rFonts w:cstheme="minorHAnsi"/>
+                <w:sz w:val="20"/>
+                <w:szCs w:val="20"/>
               </w:rPr>
               <w:t>}</w:t>
             </w:r>
@@ -3961,11 +4206,15 @@
               <w:keepNext/>
               <w:rPr>
                 <w:rFonts w:cstheme="minorHAnsi"/>
-              </w:rPr>
-            </w:pPr>
-            <w:r>
-              <w:rPr>
-                <w:rFonts w:cstheme="minorHAnsi"/>
+                <w:sz w:val="20"/>
+                <w:szCs w:val="20"/>
+              </w:rPr>
+            </w:pPr>
+            <w:r>
+              <w:rPr>
+                <w:rFonts w:cstheme="minorHAnsi"/>
+                <w:sz w:val="20"/>
+                <w:szCs w:val="20"/>
               </w:rPr>
               <w:t xml:space="preserve">Account No: </w:t>
             </w:r>
@@ -3981,23 +4230,33 @@
               <w:keepNext/>
               <w:rPr>
                 <w:rFonts w:cstheme="minorHAnsi"/>
-              </w:rPr>
-            </w:pPr>
-            <w:r>
-              <w:rPr>
-                <w:rFonts w:cstheme="minorHAnsi"/>
+                <w:sz w:val="20"/>
+                <w:szCs w:val="20"/>
+              </w:rPr>
+            </w:pPr>
+            <w:r>
+              <w:rPr>
+                <w:rFonts w:cstheme="minorHAnsi"/>
+                <w:sz w:val="20"/>
+                <w:szCs w:val="20"/>
               </w:rPr>
               <w:t>{</w:t>
             </w:r>
-            <w:r>
-              <w:rPr>
-                <w:rFonts w:cstheme="minorHAnsi"/>
+            <w:proofErr w:type="spellStart"/>
+            <w:r>
+              <w:rPr>
+                <w:rFonts w:cstheme="minorHAnsi"/>
+                <w:sz w:val="20"/>
+                <w:szCs w:val="20"/>
               </w:rPr>
               <w:t>acCode</w:t>
             </w:r>
-            <w:r>
-              <w:rPr>
-                <w:rFonts w:cstheme="minorHAnsi"/>
+            <w:proofErr w:type="spellEnd"/>
+            <w:r>
+              <w:rPr>
+                <w:rFonts w:cstheme="minorHAnsi"/>
+                <w:sz w:val="20"/>
+                <w:szCs w:val="20"/>
               </w:rPr>
               <w:t>}</w:t>
             </w:r>
@@ -4019,11 +4278,15 @@
               <w:keepNext/>
               <w:rPr>
                 <w:rFonts w:cstheme="minorHAnsi"/>
-              </w:rPr>
-            </w:pPr>
-            <w:r>
-              <w:rPr>
-                <w:rFonts w:cstheme="minorHAnsi"/>
+                <w:sz w:val="20"/>
+                <w:szCs w:val="20"/>
+              </w:rPr>
+            </w:pPr>
+            <w:r>
+              <w:rPr>
+                <w:rFonts w:cstheme="minorHAnsi"/>
+                <w:sz w:val="20"/>
+                <w:szCs w:val="20"/>
               </w:rPr>
               <w:t>IEC Code No:</w:t>
             </w:r>
@@ -4039,23 +4302,33 @@
               <w:keepNext/>
               <w:rPr>
                 <w:rFonts w:cstheme="minorHAnsi"/>
-              </w:rPr>
-            </w:pPr>
-            <w:r>
-              <w:rPr>
-                <w:rFonts w:cstheme="minorHAnsi"/>
+                <w:sz w:val="20"/>
+                <w:szCs w:val="20"/>
+              </w:rPr>
+            </w:pPr>
+            <w:r>
+              <w:rPr>
+                <w:rFonts w:cstheme="minorHAnsi"/>
+                <w:sz w:val="20"/>
+                <w:szCs w:val="20"/>
               </w:rPr>
               <w:t>{</w:t>
             </w:r>
-            <w:r>
-              <w:rPr>
-                <w:rFonts w:cstheme="minorHAnsi"/>
+            <w:proofErr w:type="spellStart"/>
+            <w:r>
+              <w:rPr>
+                <w:rFonts w:cstheme="minorHAnsi"/>
+                <w:sz w:val="20"/>
+                <w:szCs w:val="20"/>
               </w:rPr>
               <w:t>iec</w:t>
             </w:r>
-            <w:r>
-              <w:rPr>
-                <w:rFonts w:cstheme="minorHAnsi"/>
+            <w:proofErr w:type="spellEnd"/>
+            <w:r>
+              <w:rPr>
+                <w:rFonts w:cstheme="minorHAnsi"/>
+                <w:sz w:val="20"/>
+                <w:szCs w:val="20"/>
               </w:rPr>
               <w:t>}</w:t>
             </w:r>
@@ -5040,7 +5313,6 @@
   <w:style w:type="character" w:default="1" w:styleId="DefaultParagraphFont">
     <w:name w:val="Default Paragraph Font"/>
     <w:uiPriority w:val="1"/>
-    <w:semiHidden/>
     <w:unhideWhenUsed/>
   </w:style>
   <w:style w:type="table" w:default="1" w:styleId="TableNormal">

</xml_diff>

<commit_message>
Fix digits and add sample boxes
</commit_message>
<xml_diff>
--- a/electron/database/generate-document/templates/custom-invoice.docx
+++ b/electron/database/generate-document/templates/custom-invoice.docx
@@ -220,12 +220,14 @@
               </w:rPr>
               <w:t>{</w:t>
             </w:r>
+            <w:proofErr w:type="spellStart"/>
             <w:r>
               <w:rPr>
                 <w:rFonts w:cstheme="minorHAnsi"/>
               </w:rPr>
               <w:t>modifyInvNo</w:t>
             </w:r>
+            <w:proofErr w:type="spellEnd"/>
             <w:r>
               <w:rPr>
                 <w:rFonts w:cstheme="minorHAnsi"/>
@@ -267,12 +269,14 @@
               </w:rPr>
               <w:t>{</w:t>
             </w:r>
+            <w:proofErr w:type="spellStart"/>
             <w:r>
               <w:rPr>
                 <w:rFonts w:cstheme="minorHAnsi"/>
               </w:rPr>
               <w:t>invoiceDate</w:t>
             </w:r>
+            <w:proofErr w:type="spellEnd"/>
             <w:r>
               <w:rPr>
                 <w:rFonts w:cstheme="minorHAnsi"/>
@@ -336,12 +340,14 @@
               </w:rPr>
               <w:t>{</w:t>
             </w:r>
+            <w:proofErr w:type="spellStart"/>
             <w:r>
               <w:rPr>
                 <w:rFonts w:cstheme="minorHAnsi"/>
               </w:rPr>
               <w:t>buyersOrderNo</w:t>
             </w:r>
+            <w:proofErr w:type="spellEnd"/>
             <w:r>
               <w:rPr>
                 <w:rFonts w:cstheme="minorHAnsi"/>
@@ -384,12 +390,14 @@
               </w:rPr>
               <w:t>{</w:t>
             </w:r>
+            <w:proofErr w:type="spellStart"/>
             <w:r>
               <w:rPr>
                 <w:rFonts w:cstheme="minorHAnsi"/>
               </w:rPr>
               <w:t>orderDate</w:t>
             </w:r>
+            <w:proofErr w:type="spellEnd"/>
             <w:r>
               <w:rPr>
                 <w:rFonts w:cstheme="minorHAnsi"/>
@@ -446,6 +454,7 @@
               </w:rPr>
               <w:t>{</w:t>
             </w:r>
+            <w:proofErr w:type="spellStart"/>
             <w:r>
               <w:rPr>
                 <w:rFonts w:cstheme="minorHAnsi"/>
@@ -454,6 +463,7 @@
               </w:rPr>
               <w:t>consigneeCountry</w:t>
             </w:r>
+            <w:proofErr w:type="spellEnd"/>
             <w:r>
               <w:rPr>
                 <w:rFonts w:cstheme="minorHAnsi"/>
@@ -522,6 +532,7 @@
               </w:rPr>
               <w:t>{</w:t>
             </w:r>
+            <w:proofErr w:type="spellStart"/>
             <w:r>
               <w:rPr>
                 <w:rFonts w:cstheme="minorHAnsi"/>
@@ -530,6 +541,7 @@
               </w:rPr>
               <w:t>consigneeName</w:t>
             </w:r>
+            <w:proofErr w:type="spellEnd"/>
             <w:r>
               <w:rPr>
                 <w:rFonts w:cstheme="minorHAnsi"/>
@@ -555,6 +567,7 @@
               </w:rPr>
               <w:t>{</w:t>
             </w:r>
+            <w:proofErr w:type="spellStart"/>
             <w:r>
               <w:rPr>
                 <w:rFonts w:cstheme="minorHAnsi"/>
@@ -563,6 +576,7 @@
               </w:rPr>
               <w:t>consigneeAddress</w:t>
             </w:r>
+            <w:proofErr w:type="spellEnd"/>
             <w:r>
               <w:rPr>
                 <w:rFonts w:cstheme="minorHAnsi"/>
@@ -571,6 +585,7 @@
               </w:rPr>
               <w:t>} {</w:t>
             </w:r>
+            <w:proofErr w:type="spellStart"/>
             <w:r>
               <w:rPr>
                 <w:rFonts w:cstheme="minorHAnsi"/>
@@ -579,6 +594,7 @@
               </w:rPr>
               <w:t>consigneeCity</w:t>
             </w:r>
+            <w:proofErr w:type="spellEnd"/>
             <w:r>
               <w:rPr>
                 <w:rFonts w:cstheme="minorHAnsi"/>
@@ -587,6 +603,7 @@
               </w:rPr>
               <w:t>} {</w:t>
             </w:r>
+            <w:proofErr w:type="spellStart"/>
             <w:r>
               <w:rPr>
                 <w:rFonts w:cstheme="minorHAnsi"/>
@@ -595,6 +612,7 @@
               </w:rPr>
               <w:t>consigneeState</w:t>
             </w:r>
+            <w:proofErr w:type="spellEnd"/>
             <w:r>
               <w:rPr>
                 <w:rFonts w:cstheme="minorHAnsi"/>
@@ -620,6 +638,7 @@
               </w:rPr>
               <w:t>{</w:t>
             </w:r>
+            <w:proofErr w:type="spellStart"/>
             <w:r>
               <w:rPr>
                 <w:rFonts w:cstheme="minorHAnsi"/>
@@ -628,6 +647,7 @@
               </w:rPr>
               <w:t>consigneeCountry</w:t>
             </w:r>
+            <w:proofErr w:type="spellEnd"/>
             <w:r>
               <w:rPr>
                 <w:rFonts w:cstheme="minorHAnsi"/>
@@ -636,6 +656,7 @@
               </w:rPr>
               <w:t>} {</w:t>
             </w:r>
+            <w:proofErr w:type="spellStart"/>
             <w:r>
               <w:rPr>
                 <w:rFonts w:cstheme="minorHAnsi"/>
@@ -644,6 +665,7 @@
               </w:rPr>
               <w:t>consigneeZip</w:t>
             </w:r>
+            <w:proofErr w:type="spellEnd"/>
             <w:r>
               <w:rPr>
                 <w:rFonts w:cstheme="minorHAnsi"/>
@@ -667,26 +689,51 @@
                 <w:sz w:val="20"/>
                 <w:szCs w:val="20"/>
               </w:rPr>
-              <w:t>{#</w:t>
-            </w:r>
-            <w:proofErr w:type="gramStart"/>
-            <w:r>
-              <w:rPr>
-                <w:rFonts w:cstheme="minorHAnsi"/>
-                <w:sz w:val="20"/>
-                <w:szCs w:val="20"/>
-              </w:rPr>
-              <w:t>isUK}</w:t>
-            </w:r>
-            <w:r>
-              <w:rPr>
-                <w:rFonts w:cstheme="minorHAnsi"/>
-                <w:sz w:val="20"/>
-                <w:szCs w:val="20"/>
-              </w:rPr>
-              <w:t>TELE</w:t>
-            </w:r>
-            <w:proofErr w:type="gramEnd"/>
+              <w:t>{#isUK}</w:t>
+            </w:r>
+            <w:r>
+              <w:rPr>
+                <w:rFonts w:cstheme="minorHAnsi"/>
+                <w:sz w:val="20"/>
+                <w:szCs w:val="20"/>
+              </w:rPr>
+              <w:t>TELE: {</w:t>
+            </w:r>
+            <w:proofErr w:type="spellStart"/>
+            <w:r>
+              <w:rPr>
+                <w:rFonts w:cstheme="minorHAnsi"/>
+                <w:sz w:val="20"/>
+                <w:szCs w:val="20"/>
+              </w:rPr>
+              <w:t>consigneePhone</w:t>
+            </w:r>
+            <w:proofErr w:type="spellEnd"/>
+            <w:r>
+              <w:rPr>
+                <w:rFonts w:cstheme="minorHAnsi"/>
+                <w:sz w:val="20"/>
+                <w:szCs w:val="20"/>
+              </w:rPr>
+              <w:t xml:space="preserve">} </w:t>
+            </w:r>
+          </w:p>
+          <w:p>
+            <w:pPr>
+              <w:rPr>
+                <w:rFonts w:cstheme="minorHAnsi"/>
+                <w:sz w:val="20"/>
+                <w:szCs w:val="20"/>
+              </w:rPr>
+            </w:pPr>
+            <w:r>
+              <w:rPr>
+                <w:rFonts w:cstheme="minorHAnsi"/>
+                <w:sz w:val="20"/>
+                <w:szCs w:val="20"/>
+              </w:rPr>
+              <w:t>EMAIL</w:t>
+            </w:r>
             <w:r>
               <w:rPr>
                 <w:rFonts w:cstheme="minorHAnsi"/>
@@ -695,47 +742,7 @@
               </w:rPr>
               <w:t>: {</w:t>
             </w:r>
-            <w:r>
-              <w:rPr>
-                <w:rFonts w:cstheme="minorHAnsi"/>
-                <w:sz w:val="20"/>
-                <w:szCs w:val="20"/>
-              </w:rPr>
-              <w:t>consigneePhone</w:t>
-            </w:r>
-            <w:r>
-              <w:rPr>
-                <w:rFonts w:cstheme="minorHAnsi"/>
-                <w:sz w:val="20"/>
-                <w:szCs w:val="20"/>
-              </w:rPr>
-              <w:t xml:space="preserve">} </w:t>
-            </w:r>
-          </w:p>
-          <w:p>
-            <w:pPr>
-              <w:rPr>
-                <w:rFonts w:cstheme="minorHAnsi"/>
-                <w:sz w:val="20"/>
-                <w:szCs w:val="20"/>
-              </w:rPr>
-            </w:pPr>
-            <w:r>
-              <w:rPr>
-                <w:rFonts w:cstheme="minorHAnsi"/>
-                <w:sz w:val="20"/>
-                <w:szCs w:val="20"/>
-              </w:rPr>
-              <w:t>EMAIL</w:t>
-            </w:r>
-            <w:r>
-              <w:rPr>
-                <w:rFonts w:cstheme="minorHAnsi"/>
-                <w:sz w:val="20"/>
-                <w:szCs w:val="20"/>
-              </w:rPr>
-              <w:t>: {</w:t>
-            </w:r>
+            <w:proofErr w:type="spellStart"/>
             <w:r>
               <w:rPr>
                 <w:rFonts w:cstheme="minorHAnsi"/>
@@ -744,6 +751,7 @@
               </w:rPr>
               <w:t>consigneeEmail</w:t>
             </w:r>
+            <w:proofErr w:type="spellEnd"/>
             <w:r>
               <w:rPr>
                 <w:rFonts w:cstheme="minorHAnsi"/>
@@ -758,7 +766,25 @@
                 <w:sz w:val="20"/>
                 <w:szCs w:val="20"/>
               </w:rPr>
-              <w:t>{/isUK}</w:t>
+              <w:t>{/</w:t>
+            </w:r>
+            <w:proofErr w:type="spellStart"/>
+            <w:r>
+              <w:rPr>
+                <w:rFonts w:cstheme="minorHAnsi"/>
+                <w:sz w:val="20"/>
+                <w:szCs w:val="20"/>
+              </w:rPr>
+              <w:t>isUK</w:t>
+            </w:r>
+            <w:proofErr w:type="spellEnd"/>
+            <w:r>
+              <w:rPr>
+                <w:rFonts w:cstheme="minorHAnsi"/>
+                <w:sz w:val="20"/>
+                <w:szCs w:val="20"/>
+              </w:rPr>
+              <w:t>}</w:t>
             </w:r>
           </w:p>
         </w:tc>
@@ -804,6 +830,7 @@
               </w:rPr>
               <w:t>{</w:t>
             </w:r>
+            <w:proofErr w:type="spellStart"/>
             <w:r>
               <w:rPr>
                 <w:rFonts w:cstheme="minorHAnsi"/>
@@ -812,6 +839,7 @@
               </w:rPr>
               <w:t>buyerName</w:t>
             </w:r>
+            <w:proofErr w:type="spellEnd"/>
             <w:r>
               <w:rPr>
                 <w:rFonts w:cstheme="minorHAnsi"/>
@@ -837,6 +865,7 @@
               </w:rPr>
               <w:t>{</w:t>
             </w:r>
+            <w:proofErr w:type="spellStart"/>
             <w:r>
               <w:rPr>
                 <w:rFonts w:cstheme="minorHAnsi"/>
@@ -845,6 +874,7 @@
               </w:rPr>
               <w:t>buyerAddress</w:t>
             </w:r>
+            <w:proofErr w:type="spellEnd"/>
             <w:r>
               <w:rPr>
                 <w:rFonts w:cstheme="minorHAnsi"/>
@@ -853,6 +883,7 @@
               </w:rPr>
               <w:t>} {</w:t>
             </w:r>
+            <w:proofErr w:type="spellStart"/>
             <w:r>
               <w:rPr>
                 <w:rFonts w:cstheme="minorHAnsi"/>
@@ -861,6 +892,7 @@
               </w:rPr>
               <w:t>buyerCity</w:t>
             </w:r>
+            <w:proofErr w:type="spellEnd"/>
             <w:r>
               <w:rPr>
                 <w:rFonts w:cstheme="minorHAnsi"/>
@@ -869,6 +901,7 @@
               </w:rPr>
               <w:t>} {</w:t>
             </w:r>
+            <w:proofErr w:type="spellStart"/>
             <w:r>
               <w:rPr>
                 <w:rFonts w:cstheme="minorHAnsi"/>
@@ -877,6 +910,7 @@
               </w:rPr>
               <w:t>buyerState</w:t>
             </w:r>
+            <w:proofErr w:type="spellEnd"/>
             <w:r>
               <w:rPr>
                 <w:rFonts w:cstheme="minorHAnsi"/>
@@ -902,6 +936,7 @@
               </w:rPr>
               <w:t>{</w:t>
             </w:r>
+            <w:proofErr w:type="spellStart"/>
             <w:r>
               <w:rPr>
                 <w:rFonts w:cstheme="minorHAnsi"/>
@@ -910,6 +945,7 @@
               </w:rPr>
               <w:t>buyerCountry</w:t>
             </w:r>
+            <w:proofErr w:type="spellEnd"/>
             <w:r>
               <w:rPr>
                 <w:rFonts w:cstheme="minorHAnsi"/>
@@ -918,6 +954,7 @@
               </w:rPr>
               <w:t>} {</w:t>
             </w:r>
+            <w:proofErr w:type="spellStart"/>
             <w:r>
               <w:rPr>
                 <w:rFonts w:cstheme="minorHAnsi"/>
@@ -926,6 +963,7 @@
               </w:rPr>
               <w:t>buyerZip</w:t>
             </w:r>
+            <w:proofErr w:type="spellEnd"/>
             <w:r>
               <w:rPr>
                 <w:rFonts w:cstheme="minorHAnsi"/>
@@ -998,6 +1036,7 @@
               </w:rPr>
               <w:t>{</w:t>
             </w:r>
+            <w:proofErr w:type="spellStart"/>
             <w:r>
               <w:rPr>
                 <w:rFonts w:cstheme="minorHAnsi"/>
@@ -1006,6 +1045,7 @@
               </w:rPr>
               <w:t>originOfGoods</w:t>
             </w:r>
+            <w:proofErr w:type="spellEnd"/>
             <w:r>
               <w:rPr>
                 <w:rFonts w:cstheme="minorHAnsi"/>
@@ -1057,6 +1097,7 @@
               </w:rPr>
               <w:t>{</w:t>
             </w:r>
+            <w:proofErr w:type="spellStart"/>
             <w:r>
               <w:rPr>
                 <w:rFonts w:cstheme="minorHAnsi"/>
@@ -1065,6 +1106,7 @@
               </w:rPr>
               <w:t>finalDestination</w:t>
             </w:r>
+            <w:proofErr w:type="spellEnd"/>
             <w:r>
               <w:rPr>
                 <w:rFonts w:cstheme="minorHAnsi"/>
@@ -1141,6 +1183,7 @@
               </w:rPr>
               <w:t>{</w:t>
             </w:r>
+            <w:proofErr w:type="spellStart"/>
             <w:r>
               <w:rPr>
                 <w:rFonts w:cstheme="minorHAnsi"/>
@@ -1149,6 +1192,7 @@
               </w:rPr>
               <w:t>termOfDeliveryAndPayment</w:t>
             </w:r>
+            <w:proofErr w:type="spellEnd"/>
             <w:r>
               <w:rPr>
                 <w:rFonts w:cstheme="minorHAnsi"/>
@@ -1185,6 +1229,7 @@
                 <w:szCs w:val="20"/>
               </w:rPr>
             </w:pPr>
+            <w:proofErr w:type="spellStart"/>
             <w:r>
               <w:rPr>
                 <w:rFonts w:ascii="SansSerif" w:hAnsi="SansSerif" w:cs="SansSerif"/>
@@ -1192,7 +1237,17 @@
                 <w:sz w:val="20"/>
                 <w:szCs w:val="20"/>
               </w:rPr>
-              <w:t>Precarriage by:</w:t>
+              <w:t>Precarriage</w:t>
+            </w:r>
+            <w:proofErr w:type="spellEnd"/>
+            <w:r>
+              <w:rPr>
+                <w:rFonts w:ascii="SansSerif" w:hAnsi="SansSerif" w:cs="SansSerif"/>
+                <w:color w:val="000000"/>
+                <w:sz w:val="20"/>
+                <w:szCs w:val="20"/>
+              </w:rPr>
+              <w:t xml:space="preserve"> by:</w:t>
             </w:r>
           </w:p>
         </w:tc>
@@ -1247,6 +1302,7 @@
               </w:rPr>
               <w:t>{</w:t>
             </w:r>
+            <w:proofErr w:type="spellStart"/>
             <w:r>
               <w:rPr>
                 <w:rFonts w:ascii="SansSerif" w:hAnsi="SansSerif" w:cs="SansSerif"/>
@@ -1256,6 +1312,7 @@
               </w:rPr>
               <w:t>placeOfReceipt</w:t>
             </w:r>
+            <w:proofErr w:type="spellEnd"/>
             <w:r>
               <w:rPr>
                 <w:rFonts w:ascii="SansSerif" w:hAnsi="SansSerif" w:cs="SansSerif"/>
@@ -1390,6 +1447,7 @@
               </w:rPr>
               <w:t>{</w:t>
             </w:r>
+            <w:proofErr w:type="spellStart"/>
             <w:r>
               <w:rPr>
                 <w:rFonts w:ascii="SansSerif" w:hAnsi="SansSerif" w:cs="SansSerif"/>
@@ -1399,6 +1457,7 @@
               </w:rPr>
               <w:t>portOfLoading</w:t>
             </w:r>
+            <w:proofErr w:type="spellEnd"/>
             <w:r>
               <w:rPr>
                 <w:rFonts w:ascii="SansSerif" w:hAnsi="SansSerif" w:cs="SansSerif"/>
@@ -1484,6 +1543,7 @@
               </w:rPr>
               <w:t>{</w:t>
             </w:r>
+            <w:proofErr w:type="spellStart"/>
             <w:r>
               <w:rPr>
                 <w:rFonts w:ascii="SansSerif" w:hAnsi="SansSerif" w:cs="SansSerif"/>
@@ -1493,6 +1553,7 @@
               </w:rPr>
               <w:t>portOfDischarge</w:t>
             </w:r>
+            <w:proofErr w:type="spellEnd"/>
             <w:r>
               <w:rPr>
                 <w:rFonts w:ascii="SansSerif" w:hAnsi="SansSerif" w:cs="SansSerif"/>
@@ -1551,6 +1612,7 @@
               </w:rPr>
               <w:t>{</w:t>
             </w:r>
+            <w:proofErr w:type="spellStart"/>
             <w:r>
               <w:rPr>
                 <w:rFonts w:ascii="SansSerif" w:hAnsi="SansSerif" w:cs="SansSerif"/>
@@ -1560,6 +1622,7 @@
               </w:rPr>
               <w:t>finalDestination</w:t>
             </w:r>
+            <w:proofErr w:type="spellEnd"/>
             <w:r>
               <w:rPr>
                 <w:rFonts w:ascii="SansSerif" w:hAnsi="SansSerif" w:cs="SansSerif"/>
@@ -1629,6 +1692,7 @@
               </w:rPr>
               <w:t>{</w:t>
             </w:r>
+            <w:proofErr w:type="spellStart"/>
             <w:r>
               <w:rPr>
                 <w:rFonts w:cstheme="minorHAnsi"/>
@@ -1637,6 +1701,7 @@
               </w:rPr>
               <w:t>privateRemark</w:t>
             </w:r>
+            <w:proofErr w:type="spellEnd"/>
             <w:r>
               <w:rPr>
                 <w:rFonts w:cstheme="minorHAnsi"/>
@@ -1664,7 +1729,7 @@
           <w:tbl>
             <w:tblPr>
               <w:tblStyle w:val="TableGrid"/>
-              <w:tblW w:w="0" w:type="auto"/>
+              <w:tblW w:w="11001" w:type="dxa"/>
               <w:tblInd w:w="1" w:type="dxa"/>
               <w:tblBorders>
                 <w:top w:val="none" w:sz="0" w:space="0" w:color="auto"/>
@@ -1677,20 +1742,20 @@
               <w:tblLook w:val="04A0" w:firstRow="1" w:lastRow="0" w:firstColumn="1" w:lastColumn="0" w:noHBand="0" w:noVBand="1"/>
             </w:tblPr>
             <w:tblGrid>
-              <w:gridCol w:w="2900"/>
-              <w:gridCol w:w="3620"/>
-              <w:gridCol w:w="992"/>
-              <w:gridCol w:w="1134"/>
-              <w:gridCol w:w="992"/>
-              <w:gridCol w:w="1241"/>
+              <w:gridCol w:w="2934"/>
+              <w:gridCol w:w="3668"/>
+              <w:gridCol w:w="1001"/>
+              <w:gridCol w:w="1144"/>
+              <w:gridCol w:w="1001"/>
+              <w:gridCol w:w="1253"/>
             </w:tblGrid>
             <w:tr>
               <w:trPr>
-                <w:trHeight w:val="114"/>
+                <w:trHeight w:val="118"/>
               </w:trPr>
               <w:tc>
                 <w:tcPr>
-                  <w:tcW w:w="2900" w:type="dxa"/>
+                  <w:tcW w:w="2934" w:type="dxa"/>
                   <w:tcBorders>
                     <w:right w:val="nil"/>
                   </w:tcBorders>
@@ -1733,7 +1798,7 @@
               </w:tc>
               <w:tc>
                 <w:tcPr>
-                  <w:tcW w:w="3620" w:type="dxa"/>
+                  <w:tcW w:w="3668" w:type="dxa"/>
                   <w:tcBorders>
                     <w:left w:val="nil"/>
                   </w:tcBorders>
@@ -1767,7 +1832,7 @@
               </w:tc>
               <w:tc>
                 <w:tcPr>
-                  <w:tcW w:w="992" w:type="dxa"/>
+                  <w:tcW w:w="1001" w:type="dxa"/>
                 </w:tcPr>
                 <w:p>
                   <w:pPr>
@@ -1797,7 +1862,7 @@
               </w:tc>
               <w:tc>
                 <w:tcPr>
-                  <w:tcW w:w="1134" w:type="dxa"/>
+                  <w:tcW w:w="1144" w:type="dxa"/>
                 </w:tcPr>
                 <w:p>
                   <w:pPr>
@@ -1823,7 +1888,7 @@
                     </w:rPr>
                     <w:t xml:space="preserve">Total </w:t>
                   </w:r>
-                  <w:proofErr w:type="gramStart"/>
+                  <w:proofErr w:type="spellStart"/>
                   <w:r>
                     <w:rPr>
                       <w:rFonts w:cstheme="minorHAnsi"/>
@@ -1834,12 +1899,12 @@
                     </w:rPr>
                     <w:t>Sq.Mt</w:t>
                   </w:r>
-                  <w:proofErr w:type="gramEnd"/>
+                  <w:proofErr w:type="spellEnd"/>
                 </w:p>
               </w:tc>
               <w:tc>
                 <w:tcPr>
-                  <w:tcW w:w="992" w:type="dxa"/>
+                  <w:tcW w:w="1001" w:type="dxa"/>
                 </w:tcPr>
                 <w:p>
                   <w:pPr>
@@ -1894,13 +1959,35 @@
                       <w:sz w:val="20"/>
                       <w:szCs w:val="20"/>
                     </w:rPr>
-                    <w:t>{currencyChar}</w:t>
+                    <w:t>{</w:t>
+                  </w:r>
+                  <w:proofErr w:type="spellStart"/>
+                  <w:r>
+                    <w:rPr>
+                      <w:rFonts w:cstheme="minorHAnsi"/>
+                      <w:b/>
+                      <w:bCs/>
+                      <w:sz w:val="20"/>
+                      <w:szCs w:val="20"/>
+                    </w:rPr>
+                    <w:t>currencyChar</w:t>
+                  </w:r>
+                  <w:proofErr w:type="spellEnd"/>
+                  <w:r>
+                    <w:rPr>
+                      <w:rFonts w:cstheme="minorHAnsi"/>
+                      <w:b/>
+                      <w:bCs/>
+                      <w:sz w:val="20"/>
+                      <w:szCs w:val="20"/>
+                    </w:rPr>
+                    <w:t>}</w:t>
                   </w:r>
                 </w:p>
               </w:tc>
               <w:tc>
                 <w:tcPr>
-                  <w:tcW w:w="1241" w:type="dxa"/>
+                  <w:tcW w:w="1253" w:type="dxa"/>
                 </w:tcPr>
                 <w:p>
                   <w:pPr>
@@ -1949,18 +2036,40 @@
                       <w:sz w:val="20"/>
                       <w:szCs w:val="20"/>
                     </w:rPr>
-                    <w:t>{currencyChar}</w:t>
+                    <w:t>{</w:t>
+                  </w:r>
+                  <w:proofErr w:type="spellStart"/>
+                  <w:r>
+                    <w:rPr>
+                      <w:rFonts w:cstheme="minorHAnsi"/>
+                      <w:b/>
+                      <w:bCs/>
+                      <w:sz w:val="20"/>
+                      <w:szCs w:val="20"/>
+                    </w:rPr>
+                    <w:t>currencyChar</w:t>
+                  </w:r>
+                  <w:proofErr w:type="spellEnd"/>
+                  <w:r>
+                    <w:rPr>
+                      <w:rFonts w:cstheme="minorHAnsi"/>
+                      <w:b/>
+                      <w:bCs/>
+                      <w:sz w:val="20"/>
+                      <w:szCs w:val="20"/>
+                    </w:rPr>
+                    <w:t>}</w:t>
                   </w:r>
                 </w:p>
               </w:tc>
             </w:tr>
             <w:tr>
               <w:trPr>
-                <w:trHeight w:val="114"/>
+                <w:trHeight w:val="225"/>
               </w:trPr>
               <w:tc>
                 <w:tcPr>
-                  <w:tcW w:w="2900" w:type="dxa"/>
+                  <w:tcW w:w="2934" w:type="dxa"/>
                   <w:tcBorders>
                     <w:right w:val="nil"/>
                   </w:tcBorders>
@@ -1992,7 +2101,7 @@
               </w:tc>
               <w:tc>
                 <w:tcPr>
-                  <w:tcW w:w="3620" w:type="dxa"/>
+                  <w:tcW w:w="3668" w:type="dxa"/>
                   <w:tcBorders>
                     <w:left w:val="nil"/>
                   </w:tcBorders>
@@ -2016,7 +2125,7 @@
               </w:tc>
               <w:tc>
                 <w:tcPr>
-                  <w:tcW w:w="992" w:type="dxa"/>
+                  <w:tcW w:w="1001" w:type="dxa"/>
                 </w:tcPr>
                 <w:p>
                   <w:pPr>
@@ -2035,7 +2144,7 @@
               </w:tc>
               <w:tc>
                 <w:tcPr>
-                  <w:tcW w:w="1134" w:type="dxa"/>
+                  <w:tcW w:w="1144" w:type="dxa"/>
                 </w:tcPr>
                 <w:p>
                   <w:pPr>
@@ -2054,7 +2163,7 @@
               </w:tc>
               <w:tc>
                 <w:tcPr>
-                  <w:tcW w:w="992" w:type="dxa"/>
+                  <w:tcW w:w="1001" w:type="dxa"/>
                 </w:tcPr>
                 <w:p>
                   <w:pPr>
@@ -2074,7 +2183,7 @@
               </w:tc>
               <w:tc>
                 <w:tcPr>
-                  <w:tcW w:w="1241" w:type="dxa"/>
+                  <w:tcW w:w="1253" w:type="dxa"/>
                 </w:tcPr>
                 <w:p>
                   <w:pPr>
@@ -2095,11 +2204,11 @@
             </w:tr>
             <w:tr>
               <w:trPr>
-                <w:trHeight w:val="114"/>
+                <w:trHeight w:val="118"/>
               </w:trPr>
               <w:tc>
                 <w:tcPr>
-                  <w:tcW w:w="6520" w:type="dxa"/>
+                  <w:tcW w:w="6602" w:type="dxa"/>
                   <w:gridSpan w:val="2"/>
                   <w:vAlign w:val="center"/>
                 </w:tcPr>
@@ -2119,34 +2228,7 @@
                       <w:sz w:val="18"/>
                       <w:szCs w:val="18"/>
                     </w:rPr>
-                    <w:t>{#</w:t>
-                  </w:r>
-                  <w:proofErr w:type="gramStart"/>
-                  <w:r>
-                    <w:rPr>
-                      <w:rFonts w:cstheme="minorHAnsi"/>
-                      <w:sz w:val="18"/>
-                      <w:szCs w:val="18"/>
-                    </w:rPr>
-                    <w:t>CIItems}{</w:t>
-                  </w:r>
-                  <w:proofErr w:type="gramEnd"/>
-                  <w:r>
-                    <w:rPr>
-                      <w:rFonts w:cstheme="minorHAnsi"/>
-                      <w:sz w:val="18"/>
-                      <w:szCs w:val="18"/>
-                    </w:rPr>
-                    <w:t>#</w:t>
-                  </w:r>
-                  <w:proofErr w:type="gramStart"/>
-                  <w:r>
-                    <w:rPr>
-                      <w:rFonts w:cstheme="minorHAnsi"/>
-                      <w:sz w:val="18"/>
-                      <w:szCs w:val="18"/>
-                    </w:rPr>
-                    <w:t>showThickness}</w:t>
+                    <w:t>{#CIItems}{#showThickness}</w:t>
                   </w:r>
                   <w:r>
                     <w:rPr>
@@ -2156,18 +2238,7 @@
                       <w:sz w:val="18"/>
                       <w:szCs w:val="18"/>
                     </w:rPr>
-                    <w:t>{</w:t>
-                  </w:r>
-                  <w:proofErr w:type="gramEnd"/>
-                  <w:r>
-                    <w:rPr>
-                      <w:rFonts w:cstheme="minorHAnsi"/>
-                      <w:b/>
-                      <w:bCs/>
-                      <w:sz w:val="18"/>
-                      <w:szCs w:val="18"/>
-                    </w:rPr>
-                    <w:t>thicknessDetail</w:t>
+                    <w:t>{thicknessDetail</w:t>
                   </w:r>
                   <w:r>
                     <w:rPr>
@@ -2181,7 +2252,7 @@
               </w:tc>
               <w:tc>
                 <w:tcPr>
-                  <w:tcW w:w="992" w:type="dxa"/>
+                  <w:tcW w:w="1001" w:type="dxa"/>
                 </w:tcPr>
                 <w:p>
                   <w:pPr>
@@ -2200,7 +2271,7 @@
               </w:tc>
               <w:tc>
                 <w:tcPr>
-                  <w:tcW w:w="1134" w:type="dxa"/>
+                  <w:tcW w:w="1144" w:type="dxa"/>
                 </w:tcPr>
                 <w:p>
                   <w:pPr>
@@ -2219,7 +2290,7 @@
               </w:tc>
               <w:tc>
                 <w:tcPr>
-                  <w:tcW w:w="992" w:type="dxa"/>
+                  <w:tcW w:w="1001" w:type="dxa"/>
                 </w:tcPr>
                 <w:p>
                   <w:pPr>
@@ -2239,7 +2310,7 @@
               </w:tc>
               <w:tc>
                 <w:tcPr>
-                  <w:tcW w:w="1241" w:type="dxa"/>
+                  <w:tcW w:w="1253" w:type="dxa"/>
                 </w:tcPr>
                 <w:p>
                   <w:pPr>
@@ -2264,7 +2335,7 @@
               </w:trPr>
               <w:tc>
                 <w:tcPr>
-                  <w:tcW w:w="2900" w:type="dxa"/>
+                  <w:tcW w:w="2934" w:type="dxa"/>
                   <w:tcBorders>
                     <w:bottom w:val="nil"/>
                     <w:right w:val="nil"/>
@@ -2294,7 +2365,7 @@
               </w:tc>
               <w:tc>
                 <w:tcPr>
-                  <w:tcW w:w="3620" w:type="dxa"/>
+                  <w:tcW w:w="3668" w:type="dxa"/>
                   <w:tcBorders>
                     <w:left w:val="nil"/>
                     <w:bottom w:val="nil"/>
@@ -2372,6 +2443,7 @@
                     </w:rPr>
                     <w:t>COMMISION-USD.{</w:t>
                   </w:r>
+                  <w:proofErr w:type="spellStart"/>
                   <w:r>
                     <w:rPr>
                       <w:rFonts w:cstheme="minorHAnsi"/>
@@ -2380,6 +2452,7 @@
                     </w:rPr>
                     <w:t>commision</w:t>
                   </w:r>
+                  <w:proofErr w:type="spellEnd"/>
                   <w:r>
                     <w:rPr>
                       <w:rFonts w:cstheme="minorHAnsi"/>
@@ -2388,6 +2461,7 @@
                     </w:rPr>
                     <w:t>}{/</w:t>
                   </w:r>
+                  <w:proofErr w:type="spellStart"/>
                   <w:r>
                     <w:rPr>
                       <w:rFonts w:cstheme="minorHAnsi"/>
@@ -2396,6 +2470,7 @@
                     </w:rPr>
                     <w:t>isAus</w:t>
                   </w:r>
+                  <w:proofErr w:type="spellEnd"/>
                   <w:r>
                     <w:rPr>
                       <w:rFonts w:cstheme="minorHAnsi"/>
@@ -2408,7 +2483,7 @@
               </w:tc>
               <w:tc>
                 <w:tcPr>
-                  <w:tcW w:w="992" w:type="dxa"/>
+                  <w:tcW w:w="1001" w:type="dxa"/>
                 </w:tcPr>
                 <w:p>
                   <w:pPr>
@@ -2425,7 +2500,7 @@
               </w:tc>
               <w:tc>
                 <w:tcPr>
-                  <w:tcW w:w="1134" w:type="dxa"/>
+                  <w:tcW w:w="1144" w:type="dxa"/>
                 </w:tcPr>
                 <w:p>
                   <w:pPr>
@@ -2442,7 +2517,7 @@
               </w:tc>
               <w:tc>
                 <w:tcPr>
-                  <w:tcW w:w="992" w:type="dxa"/>
+                  <w:tcW w:w="1001" w:type="dxa"/>
                 </w:tcPr>
                 <w:p>
                   <w:pPr>
@@ -2459,7 +2534,7 @@
               </w:tc>
               <w:tc>
                 <w:tcPr>
-                  <w:tcW w:w="1241" w:type="dxa"/>
+                  <w:tcW w:w="1253" w:type="dxa"/>
                 </w:tcPr>
                 <w:p>
                   <w:pPr>
@@ -2477,13 +2552,41 @@
             </w:tr>
             <w:tr>
               <w:trPr>
-                <w:trHeight w:val="255"/>
+                <w:trHeight w:val="69"/>
               </w:trPr>
               <w:tc>
                 <w:tcPr>
-                  <w:tcW w:w="6520" w:type="dxa"/>
+                  <w:tcW w:w="6602" w:type="dxa"/>
                   <w:gridSpan w:val="2"/>
+                  <w:tcBorders>
+                    <w:bottom w:val="nil"/>
+                  </w:tcBorders>
                   <w:vAlign w:val="center"/>
+                </w:tcPr>
+                <w:p>
+                  <w:pPr>
+                    <w:pStyle w:val="NoSpacing"/>
+                    <w:framePr w:hSpace="180" w:wrap="around" w:vAnchor="page" w:hAnchor="margin" w:y="481"/>
+                    <w:jc w:val="right"/>
+                    <w:rPr>
+                      <w:rFonts w:cstheme="minorHAnsi"/>
+                      <w:sz w:val="18"/>
+                      <w:szCs w:val="18"/>
+                    </w:rPr>
+                  </w:pPr>
+                  <w:r>
+                    <w:rPr>
+                      <w:rFonts w:cstheme="minorHAnsi"/>
+                      <w:sz w:val="18"/>
+                      <w:szCs w:val="18"/>
+                    </w:rPr>
+                    <w:t>{#invoices} {#isFirst}{fsc}{/isFirst}</w:t>
+                  </w:r>
+                </w:p>
+              </w:tc>
+              <w:tc>
+                <w:tcPr>
+                  <w:tcW w:w="1001" w:type="dxa"/>
                 </w:tcPr>
                 <w:p>
                   <w:pPr>
@@ -2503,37 +2606,19 @@
                       <w:sz w:val="18"/>
                       <w:szCs w:val="18"/>
                     </w:rPr>
-                    <w:t>{#invoices} {#</w:t>
-                  </w:r>
-                  <w:proofErr w:type="gramStart"/>
-                  <w:r>
-                    <w:rPr>
-                      <w:rFonts w:cstheme="minorHAnsi"/>
-                      <w:sz w:val="18"/>
-                      <w:szCs w:val="18"/>
-                    </w:rPr>
-                    <w:t>isFirst}{</w:t>
-                  </w:r>
-                  <w:proofErr w:type="gramEnd"/>
-                  <w:r>
-                    <w:rPr>
-                      <w:rFonts w:cstheme="minorHAnsi"/>
-                      <w:sz w:val="18"/>
-                      <w:szCs w:val="18"/>
-                    </w:rPr>
-                    <w:t>fsc}{/isFirst}</w:t>
+                    <w:t>{quantity}</w:t>
                   </w:r>
                 </w:p>
               </w:tc>
               <w:tc>
                 <w:tcPr>
-                  <w:tcW w:w="992" w:type="dxa"/>
+                  <w:tcW w:w="1144" w:type="dxa"/>
                 </w:tcPr>
                 <w:p>
                   <w:pPr>
                     <w:pStyle w:val="NoSpacing"/>
                     <w:framePr w:hSpace="180" w:wrap="around" w:vAnchor="page" w:hAnchor="margin" w:y="481"/>
-                    <w:ind w:right="-57"/>
+                    <w:spacing w:line="276" w:lineRule="auto"/>
                     <w:jc w:val="right"/>
                     <w:rPr>
                       <w:rFonts w:cstheme="minorHAnsi"/>
@@ -2547,19 +2632,37 @@
                       <w:sz w:val="18"/>
                       <w:szCs w:val="18"/>
                     </w:rPr>
-                    <w:t>{quantity}</w:t>
+                    <w:t>{</w:t>
+                  </w:r>
+                  <w:proofErr w:type="spellStart"/>
+                  <w:r>
+                    <w:rPr>
+                      <w:rFonts w:cstheme="minorHAnsi"/>
+                      <w:sz w:val="18"/>
+                      <w:szCs w:val="18"/>
+                    </w:rPr>
+                    <w:t>totalSq</w:t>
+                  </w:r>
+                  <w:proofErr w:type="spellEnd"/>
+                  <w:r>
+                    <w:rPr>
+                      <w:rFonts w:cstheme="minorHAnsi"/>
+                      <w:sz w:val="18"/>
+                      <w:szCs w:val="18"/>
+                    </w:rPr>
+                    <w:t>}</w:t>
                   </w:r>
                 </w:p>
               </w:tc>
               <w:tc>
                 <w:tcPr>
-                  <w:tcW w:w="1134" w:type="dxa"/>
+                  <w:tcW w:w="1001" w:type="dxa"/>
                 </w:tcPr>
                 <w:p>
                   <w:pPr>
                     <w:pStyle w:val="NoSpacing"/>
                     <w:framePr w:hSpace="180" w:wrap="around" w:vAnchor="page" w:hAnchor="margin" w:y="481"/>
-                    <w:ind w:right="-57"/>
+                    <w:spacing w:line="276" w:lineRule="auto"/>
                     <w:jc w:val="right"/>
                     <w:rPr>
                       <w:rFonts w:cstheme="minorHAnsi"/>
@@ -2573,19 +2676,19 @@
                       <w:sz w:val="18"/>
                       <w:szCs w:val="18"/>
                     </w:rPr>
-                    <w:t>{totalSq}</w:t>
+                    <w:t>{rate}</w:t>
                   </w:r>
                 </w:p>
               </w:tc>
               <w:tc>
                 <w:tcPr>
-                  <w:tcW w:w="992" w:type="dxa"/>
+                  <w:tcW w:w="1253" w:type="dxa"/>
                 </w:tcPr>
                 <w:p>
                   <w:pPr>
                     <w:pStyle w:val="NoSpacing"/>
                     <w:framePr w:hSpace="180" w:wrap="around" w:vAnchor="page" w:hAnchor="margin" w:y="481"/>
-                    <w:ind w:right="-57"/>
+                    <w:spacing w:line="276" w:lineRule="auto"/>
                     <w:jc w:val="right"/>
                     <w:rPr>
                       <w:rFonts w:cstheme="minorHAnsi"/>
@@ -2599,18 +2702,218 @@
                       <w:sz w:val="18"/>
                       <w:szCs w:val="18"/>
                     </w:rPr>
-                    <w:t>{rate}</w:t>
+                    <w:t>{value} {/invoices} {/</w:t>
+                  </w:r>
+                  <w:proofErr w:type="spellStart"/>
+                  <w:r>
+                    <w:rPr>
+                      <w:rFonts w:cstheme="minorHAnsi"/>
+                      <w:sz w:val="18"/>
+                      <w:szCs w:val="18"/>
+                    </w:rPr>
+                    <w:t>CIItems</w:t>
+                  </w:r>
+                  <w:proofErr w:type="spellEnd"/>
+                  <w:r>
+                    <w:rPr>
+                      <w:rFonts w:cstheme="minorHAnsi"/>
+                      <w:sz w:val="18"/>
+                      <w:szCs w:val="18"/>
+                    </w:rPr>
+                    <w:t>}</w:t>
                   </w:r>
                 </w:p>
               </w:tc>
+            </w:tr>
+            <w:tr>
+              <w:trPr>
+                <w:trHeight w:val="69"/>
+              </w:trPr>
               <w:tc>
                 <w:tcPr>
-                  <w:tcW w:w="1241" w:type="dxa"/>
+                  <w:tcW w:w="2934" w:type="dxa"/>
+                  <w:tcBorders>
+                    <w:bottom w:val="nil"/>
+                    <w:right w:val="nil"/>
+                  </w:tcBorders>
                 </w:tcPr>
                 <w:p>
                   <w:pPr>
                     <w:pStyle w:val="NoSpacing"/>
                     <w:framePr w:hSpace="180" w:wrap="around" w:vAnchor="page" w:hAnchor="margin" w:y="481"/>
+                    <w:spacing w:before="80"/>
+                    <w:rPr>
+                      <w:rFonts w:cstheme="minorHAnsi"/>
+                      <w:sz w:val="18"/>
+                      <w:szCs w:val="18"/>
+                    </w:rPr>
+                  </w:pPr>
+                  <w:r>
+                    <w:rPr>
+                      <w:rFonts w:cstheme="minorHAnsi"/>
+                      <w:sz w:val="18"/>
+                      <w:szCs w:val="18"/>
+                    </w:rPr>
+                    <w:t>{#</w:t>
+                  </w:r>
+                  <w:r>
+                    <w:rPr>
+                      <w:rFonts w:cstheme="minorHAnsi"/>
+                      <w:sz w:val="18"/>
+                      <w:szCs w:val="18"/>
+                    </w:rPr>
+                    <w:t>sampleBox</w:t>
+                  </w:r>
+                  <w:r>
+                    <w:rPr>
+                      <w:rFonts w:cstheme="minorHAnsi"/>
+                      <w:sz w:val="18"/>
+                      <w:szCs w:val="18"/>
+                    </w:rPr>
+                    <w:t>}</w:t>
+                  </w:r>
+                  <w:r>
+                    <w:rPr>
+                      <w:rFonts w:cstheme="minorHAnsi"/>
+                      <w:sz w:val="18"/>
+                      <w:szCs w:val="18"/>
+                    </w:rPr>
+                    <w:t xml:space="preserve"> </w:t>
+                  </w:r>
+                  <w:r>
+                    <w:rPr>
+                      <w:rFonts w:cstheme="minorHAnsi"/>
+                      <w:b/>
+                      <w:bCs/>
+                      <w:sz w:val="18"/>
+                      <w:szCs w:val="18"/>
+                    </w:rPr>
+                    <w:t>SAMPLE BOX</w:t>
+                  </w:r>
+                </w:p>
+              </w:tc>
+              <w:tc>
+                <w:tcPr>
+                  <w:tcW w:w="3668" w:type="dxa"/>
+                  <w:tcBorders>
+                    <w:left w:val="nil"/>
+                    <w:bottom w:val="nil"/>
+                  </w:tcBorders>
+                  <w:vAlign w:val="bottom"/>
+                </w:tcPr>
+                <w:p>
+                  <w:pPr>
+                    <w:pStyle w:val="NoSpacing"/>
+                    <w:framePr w:hSpace="180" w:wrap="around" w:vAnchor="page" w:hAnchor="margin" w:y="481"/>
+                    <w:spacing w:before="80"/>
+                    <w:jc w:val="center"/>
+                    <w:rPr>
+                      <w:rFonts w:cstheme="minorHAnsi"/>
+                      <w:sz w:val="18"/>
+                      <w:szCs w:val="18"/>
+                    </w:rPr>
+                  </w:pPr>
+                  <w:r>
+                    <w:rPr>
+                      <w:rFonts w:cstheme="minorHAnsi"/>
+                      <w:sz w:val="18"/>
+                      <w:szCs w:val="18"/>
+                    </w:rPr>
+                    <w:t>As Per P/List</w:t>
+                  </w:r>
+                </w:p>
+                <w:p>
+                  <w:pPr>
+                    <w:pStyle w:val="NoSpacing"/>
+                    <w:framePr w:hSpace="180" w:wrap="around" w:vAnchor="page" w:hAnchor="margin" w:y="481"/>
+                    <w:spacing w:before="40"/>
+                    <w:jc w:val="center"/>
+                    <w:rPr>
+                      <w:rFonts w:cstheme="minorHAnsi"/>
+                      <w:sz w:val="18"/>
+                      <w:szCs w:val="18"/>
+                    </w:rPr>
+                  </w:pPr>
+                  <w:r>
+                    <w:rPr>
+                      <w:rFonts w:cstheme="minorHAnsi"/>
+                      <w:sz w:val="18"/>
+                      <w:szCs w:val="18"/>
+                    </w:rPr>
+                    <w:t>{</w:t>
+                  </w:r>
+                  <w:proofErr w:type="spellStart"/>
+                  <w:r>
+                    <w:rPr>
+                      <w:rFonts w:cstheme="minorHAnsi"/>
+                      <w:sz w:val="18"/>
+                      <w:szCs w:val="18"/>
+                    </w:rPr>
+                    <w:t>designType</w:t>
+                  </w:r>
+                  <w:proofErr w:type="spellEnd"/>
+                  <w:r>
+                    <w:rPr>
+                      <w:rFonts w:cstheme="minorHAnsi"/>
+                      <w:sz w:val="18"/>
+                      <w:szCs w:val="18"/>
+                    </w:rPr>
+                    <w:t>}</w:t>
+                  </w:r>
+                  <w:r>
+                    <w:rPr>
+                      <w:rFonts w:cstheme="minorHAnsi"/>
+                      <w:sz w:val="18"/>
+                      <w:szCs w:val="18"/>
+                    </w:rPr>
+                    <w:t xml:space="preserve"> </w:t>
+                  </w:r>
+                  <w:r>
+                    <w:rPr>
+                      <w:rFonts w:cstheme="minorHAnsi"/>
+                      <w:sz w:val="18"/>
+                      <w:szCs w:val="18"/>
+                    </w:rPr>
+                    <w:t xml:space="preserve">- </w:t>
+                  </w:r>
+                  <w:r>
+                    <w:rPr>
+                      <w:rFonts w:cstheme="minorHAnsi"/>
+                      <w:sz w:val="18"/>
+                      <w:szCs w:val="18"/>
+                    </w:rPr>
+                    <w:t>{</w:t>
+                  </w:r>
+                  <w:proofErr w:type="spellStart"/>
+                  <w:r>
+                    <w:rPr>
+                      <w:rFonts w:cstheme="minorHAnsi"/>
+                      <w:sz w:val="18"/>
+                      <w:szCs w:val="18"/>
+                    </w:rPr>
+                    <w:t>finishType</w:t>
+                  </w:r>
+                  <w:proofErr w:type="spellEnd"/>
+                  <w:r>
+                    <w:rPr>
+                      <w:rFonts w:cstheme="minorHAnsi"/>
+                      <w:sz w:val="18"/>
+                      <w:szCs w:val="18"/>
+                    </w:rPr>
+                    <w:t>}</w:t>
+                  </w:r>
+                </w:p>
+              </w:tc>
+              <w:tc>
+                <w:tcPr>
+                  <w:tcW w:w="1001" w:type="dxa"/>
+                  <w:vAlign w:val="bottom"/>
+                </w:tcPr>
+                <w:p>
+                  <w:pPr>
+                    <w:pStyle w:val="NoSpacing"/>
+                    <w:framePr w:hSpace="180" w:wrap="around" w:vAnchor="page" w:hAnchor="margin" w:y="481"/>
+                    <w:spacing w:before="80" w:line="276" w:lineRule="auto"/>
                     <w:jc w:val="right"/>
                     <w:rPr>
                       <w:rFonts w:cstheme="minorHAnsi"/>
@@ -2624,7 +2927,122 @@
                       <w:sz w:val="18"/>
                       <w:szCs w:val="18"/>
                     </w:rPr>
-                    <w:t>{value} {/invoices} {/CIItems}</w:t>
+                    <w:t>0</w:t>
+                  </w:r>
+                </w:p>
+              </w:tc>
+              <w:tc>
+                <w:tcPr>
+                  <w:tcW w:w="1144" w:type="dxa"/>
+                  <w:vAlign w:val="bottom"/>
+                </w:tcPr>
+                <w:p>
+                  <w:pPr>
+                    <w:pStyle w:val="NoSpacing"/>
+                    <w:framePr w:hSpace="180" w:wrap="around" w:vAnchor="page" w:hAnchor="margin" w:y="481"/>
+                    <w:spacing w:before="80" w:line="276" w:lineRule="auto"/>
+                    <w:jc w:val="right"/>
+                    <w:rPr>
+                      <w:rFonts w:cstheme="minorHAnsi"/>
+                      <w:sz w:val="18"/>
+                      <w:szCs w:val="18"/>
+                    </w:rPr>
+                  </w:pPr>
+                  <w:r>
+                    <w:rPr>
+                      <w:rFonts w:cstheme="minorHAnsi"/>
+                      <w:sz w:val="18"/>
+                      <w:szCs w:val="18"/>
+                    </w:rPr>
+                    <w:t>0.0000</w:t>
+                  </w:r>
+                </w:p>
+              </w:tc>
+              <w:tc>
+                <w:tcPr>
+                  <w:tcW w:w="1001" w:type="dxa"/>
+                  <w:vAlign w:val="bottom"/>
+                </w:tcPr>
+                <w:p>
+                  <w:pPr>
+                    <w:pStyle w:val="NoSpacing"/>
+                    <w:framePr w:hSpace="180" w:wrap="around" w:vAnchor="page" w:hAnchor="margin" w:y="481"/>
+                    <w:spacing w:before="80" w:line="276" w:lineRule="auto"/>
+                    <w:jc w:val="right"/>
+                    <w:rPr>
+                      <w:rFonts w:cstheme="minorHAnsi"/>
+                      <w:sz w:val="18"/>
+                      <w:szCs w:val="18"/>
+                    </w:rPr>
+                  </w:pPr>
+                  <w:r>
+                    <w:rPr>
+                      <w:rFonts w:cstheme="minorHAnsi"/>
+                      <w:sz w:val="18"/>
+                      <w:szCs w:val="18"/>
+                    </w:rPr>
+                    <w:t>FREE</w:t>
+                  </w:r>
+                </w:p>
+              </w:tc>
+              <w:tc>
+                <w:tcPr>
+                  <w:tcW w:w="1253" w:type="dxa"/>
+                  <w:vAlign w:val="bottom"/>
+                </w:tcPr>
+                <w:p>
+                  <w:pPr>
+                    <w:pStyle w:val="NoSpacing"/>
+                    <w:framePr w:hSpace="180" w:wrap="around" w:vAnchor="page" w:hAnchor="margin" w:y="481"/>
+                    <w:spacing w:before="80" w:line="276" w:lineRule="auto"/>
+                    <w:jc w:val="right"/>
+                    <w:rPr>
+                      <w:rFonts w:cstheme="minorHAnsi"/>
+                      <w:sz w:val="18"/>
+                      <w:szCs w:val="18"/>
+                    </w:rPr>
+                  </w:pPr>
+                  <w:r>
+                    <w:rPr>
+                      <w:rFonts w:cstheme="minorHAnsi"/>
+                      <w:sz w:val="18"/>
+                      <w:szCs w:val="18"/>
+                    </w:rPr>
+                    <w:t>FREE</w:t>
+                  </w:r>
+                  <w:r>
+                    <w:rPr>
+                      <w:rFonts w:cstheme="minorHAnsi"/>
+                      <w:sz w:val="18"/>
+                      <w:szCs w:val="18"/>
+                    </w:rPr>
+                    <w:t>{</w:t>
+                  </w:r>
+                  <w:r>
+                    <w:rPr>
+                      <w:rFonts w:cstheme="minorHAnsi"/>
+                      <w:sz w:val="18"/>
+                      <w:szCs w:val="18"/>
+                    </w:rPr>
+                    <w:t>/</w:t>
+                  </w:r>
+                  <w:proofErr w:type="spellStart"/>
+                  <w:r>
+                    <w:rPr>
+                      <w:rFonts w:cstheme="minorHAnsi"/>
+                      <w:sz w:val="18"/>
+                      <w:szCs w:val="18"/>
+                    </w:rPr>
+                    <w:t>sampleBox</w:t>
+                  </w:r>
+                  <w:proofErr w:type="spellEnd"/>
+                  <w:r>
+                    <w:rPr>
+                      <w:rFonts w:cstheme="minorHAnsi"/>
+                      <w:sz w:val="18"/>
+                      <w:szCs w:val="18"/>
+                    </w:rPr>
+                    <w:t>}</w:t>
                   </w:r>
                 </w:p>
               </w:tc>
@@ -2670,12 +3088,14 @@
               </w:rPr>
               <w:t>{</w:t>
             </w:r>
+            <w:proofErr w:type="spellStart"/>
             <w:r>
               <w:rPr>
                 <w:rFonts w:cstheme="minorHAnsi"/>
               </w:rPr>
               <w:t>additionSumAmount</w:t>
             </w:r>
+            <w:proofErr w:type="spellEnd"/>
             <w:r>
               <w:rPr>
                 <w:rFonts w:cstheme="minorHAnsi"/>
@@ -2949,17 +3369,62 @@
                 <w:sz w:val="20"/>
                 <w:szCs w:val="20"/>
               </w:rPr>
-              <w:t>{deliveryTerms}</w:t>
-            </w:r>
-            <w:r>
-              <w:rPr>
-                <w:rFonts w:cstheme="minorHAnsi"/>
-                <w:sz w:val="20"/>
-                <w:szCs w:val="20"/>
-              </w:rPr>
-              <w:t xml:space="preserve"> {portOfDischarge} ({finalDestination</w:t>
-            </w:r>
-            <w:proofErr w:type="gramStart"/>
+              <w:t>{</w:t>
+            </w:r>
+            <w:proofErr w:type="spellStart"/>
+            <w:r>
+              <w:rPr>
+                <w:rFonts w:cstheme="minorHAnsi"/>
+                <w:sz w:val="20"/>
+                <w:szCs w:val="20"/>
+              </w:rPr>
+              <w:t>deliveryTerms</w:t>
+            </w:r>
+            <w:proofErr w:type="spellEnd"/>
+            <w:r>
+              <w:rPr>
+                <w:rFonts w:cstheme="minorHAnsi"/>
+                <w:sz w:val="20"/>
+                <w:szCs w:val="20"/>
+              </w:rPr>
+              <w:t>}</w:t>
+            </w:r>
+            <w:r>
+              <w:rPr>
+                <w:rFonts w:cstheme="minorHAnsi"/>
+                <w:sz w:val="20"/>
+                <w:szCs w:val="20"/>
+              </w:rPr>
+              <w:t xml:space="preserve"> {</w:t>
+            </w:r>
+            <w:proofErr w:type="spellStart"/>
+            <w:r>
+              <w:rPr>
+                <w:rFonts w:cstheme="minorHAnsi"/>
+                <w:sz w:val="20"/>
+                <w:szCs w:val="20"/>
+              </w:rPr>
+              <w:t>portOfDischarge</w:t>
+            </w:r>
+            <w:proofErr w:type="spellEnd"/>
+            <w:r>
+              <w:rPr>
+                <w:rFonts w:cstheme="minorHAnsi"/>
+                <w:sz w:val="20"/>
+                <w:szCs w:val="20"/>
+              </w:rPr>
+              <w:t>} ({</w:t>
+            </w:r>
+            <w:proofErr w:type="spellStart"/>
+            <w:r>
+              <w:rPr>
+                <w:rFonts w:cstheme="minorHAnsi"/>
+                <w:sz w:val="20"/>
+                <w:szCs w:val="20"/>
+              </w:rPr>
+              <w:t>finalDestination</w:t>
+            </w:r>
+            <w:proofErr w:type="spellEnd"/>
             <w:r>
               <w:rPr>
                 <w:rFonts w:cstheme="minorHAnsi"/>
@@ -2974,9 +3439,34 @@
                 <w:sz w:val="20"/>
                 <w:szCs w:val="20"/>
               </w:rPr>
-              <w:t xml:space="preserve">  </w:t>
-            </w:r>
-            <w:proofErr w:type="gramEnd"/>
+              <w:t xml:space="preserve">   </w:t>
+            </w:r>
+            <w:r>
+              <w:rPr>
+                <w:rFonts w:cstheme="minorHAnsi"/>
+                <w:sz w:val="20"/>
+                <w:szCs w:val="20"/>
+              </w:rPr>
+              <w:t>{</w:t>
+            </w:r>
+            <w:proofErr w:type="spellStart"/>
+            <w:r>
+              <w:rPr>
+                <w:rFonts w:cstheme="minorHAnsi"/>
+                <w:sz w:val="20"/>
+                <w:szCs w:val="20"/>
+              </w:rPr>
+              <w:t>currencyChar</w:t>
+            </w:r>
+            <w:proofErr w:type="spellEnd"/>
+            <w:r>
+              <w:rPr>
+                <w:rFonts w:cstheme="minorHAnsi"/>
+                <w:sz w:val="20"/>
+                <w:szCs w:val="20"/>
+              </w:rPr>
+              <w:t>}</w:t>
+            </w:r>
             <w:r>
               <w:rPr>
                 <w:rFonts w:cstheme="minorHAnsi"/>
@@ -2993,14 +3483,16 @@
               </w:rPr>
               <w:t>{</w:t>
             </w:r>
-            <w:r>
-              <w:rPr>
-                <w:rFonts w:cstheme="minorHAnsi"/>
-                <w:sz w:val="20"/>
-                <w:szCs w:val="20"/>
-              </w:rPr>
-              <w:t>currencyChar</w:t>
-            </w:r>
+            <w:proofErr w:type="spellStart"/>
+            <w:r>
+              <w:rPr>
+                <w:rFonts w:cstheme="minorHAnsi"/>
+                <w:sz w:val="20"/>
+                <w:szCs w:val="20"/>
+              </w:rPr>
+              <w:t>netAmountWords</w:t>
+            </w:r>
+            <w:proofErr w:type="spellEnd"/>
             <w:r>
               <w:rPr>
                 <w:rFonts w:cstheme="minorHAnsi"/>
@@ -3008,22 +3500,6 @@
                 <w:szCs w:val="20"/>
               </w:rPr>
               <w:t>}</w:t>
-            </w:r>
-            <w:r>
-              <w:rPr>
-                <w:rFonts w:cstheme="minorHAnsi"/>
-                <w:sz w:val="20"/>
-                <w:szCs w:val="20"/>
-              </w:rPr>
-              <w:t xml:space="preserve"> </w:t>
-            </w:r>
-            <w:r>
-              <w:rPr>
-                <w:rFonts w:cstheme="minorHAnsi"/>
-                <w:sz w:val="20"/>
-                <w:szCs w:val="20"/>
-              </w:rPr>
-              <w:t>{netAmountWords}</w:t>
             </w:r>
           </w:p>
         </w:tc>
@@ -3054,7 +3530,25 @@
                 <w:sz w:val="20"/>
                 <w:szCs w:val="20"/>
               </w:rPr>
-              <w:t>{netAmount}</w:t>
+              <w:t>{</w:t>
+            </w:r>
+            <w:proofErr w:type="spellStart"/>
+            <w:r>
+              <w:rPr>
+                <w:rFonts w:cstheme="minorHAnsi"/>
+                <w:sz w:val="20"/>
+                <w:szCs w:val="20"/>
+              </w:rPr>
+              <w:t>netAmount</w:t>
+            </w:r>
+            <w:proofErr w:type="spellEnd"/>
+            <w:r>
+              <w:rPr>
+                <w:rFonts w:cstheme="minorHAnsi"/>
+                <w:sz w:val="20"/>
+                <w:szCs w:val="20"/>
+              </w:rPr>
+              <w:t>}</w:t>
             </w:r>
           </w:p>
         </w:tc>
@@ -3100,7 +3594,6 @@
               </w:rPr>
               <w:t>{#</w:t>
             </w:r>
-            <w:proofErr w:type="gramStart"/>
             <w:r>
               <w:rPr>
                 <w:rFonts w:cstheme="minorHAnsi"/>
@@ -3117,7 +3610,6 @@
               </w:rPr>
               <w:t>}{</w:t>
             </w:r>
-            <w:proofErr w:type="gramEnd"/>
             <w:r>
               <w:rPr>
                 <w:rFonts w:cstheme="minorHAnsi"/>
@@ -3152,6 +3644,7 @@
               </w:rPr>
               <w:t>{/</w:t>
             </w:r>
+            <w:proofErr w:type="spellStart"/>
             <w:r>
               <w:rPr>
                 <w:rFonts w:cstheme="minorHAnsi"/>
@@ -3160,6 +3653,7 @@
               </w:rPr>
               <w:t>bottomNotes</w:t>
             </w:r>
+            <w:proofErr w:type="spellEnd"/>
             <w:r>
               <w:rPr>
                 <w:rFonts w:cstheme="minorHAnsi"/>
@@ -3259,6 +3753,7 @@
                     </w:rPr>
                     <w:t>{</w:t>
                   </w:r>
+                  <w:proofErr w:type="spellStart"/>
                   <w:r>
                     <w:rPr>
                       <w:rFonts w:cstheme="minorHAnsi"/>
@@ -3267,6 +3762,7 @@
                     </w:rPr>
                     <w:t>totalQuantity</w:t>
                   </w:r>
+                  <w:proofErr w:type="spellEnd"/>
                   <w:r>
                     <w:rPr>
                       <w:rFonts w:cstheme="minorHAnsi"/>
@@ -3331,6 +3827,7 @@
                     </w:rPr>
                     <w:t>{</w:t>
                   </w:r>
+                  <w:proofErr w:type="spellStart"/>
                   <w:r>
                     <w:rPr>
                       <w:rFonts w:cstheme="minorHAnsi"/>
@@ -3339,6 +3836,7 @@
                     </w:rPr>
                     <w:t>totalBox</w:t>
                   </w:r>
+                  <w:proofErr w:type="spellEnd"/>
                   <w:r>
                     <w:rPr>
                       <w:rFonts w:cstheme="minorHAnsi"/>
@@ -3378,7 +3876,7 @@
                     </w:rPr>
                     <w:t xml:space="preserve">Total </w:t>
                   </w:r>
-                  <w:proofErr w:type="gramStart"/>
+                  <w:proofErr w:type="spellStart"/>
                   <w:r>
                     <w:rPr>
                       <w:rFonts w:cstheme="minorHAnsi"/>
@@ -3387,7 +3885,7 @@
                     </w:rPr>
                     <w:t>Sq.Meter</w:t>
                   </w:r>
-                  <w:proofErr w:type="gramEnd"/>
+                  <w:proofErr w:type="spellEnd"/>
                   <w:r>
                     <w:rPr>
                       <w:rFonts w:cstheme="minorHAnsi"/>
@@ -3421,6 +3919,7 @@
                     </w:rPr>
                     <w:t>{</w:t>
                   </w:r>
+                  <w:proofErr w:type="spellStart"/>
                   <w:r>
                     <w:rPr>
                       <w:rFonts w:cstheme="minorHAnsi"/>
@@ -3429,6 +3928,7 @@
                     </w:rPr>
                     <w:t>totalSqMt</w:t>
                   </w:r>
+                  <w:proofErr w:type="spellEnd"/>
                   <w:r>
                     <w:rPr>
                       <w:rFonts w:cstheme="minorHAnsi"/>
@@ -3534,25 +4034,7 @@
                       <w:sz w:val="20"/>
                       <w:szCs w:val="20"/>
                     </w:rPr>
-                    <w:t>Avg./</w:t>
-                  </w:r>
-                  <w:proofErr w:type="gramStart"/>
-                  <w:r>
-                    <w:rPr>
-                      <w:rFonts w:cstheme="minorHAnsi"/>
-                      <w:sz w:val="20"/>
-                      <w:szCs w:val="20"/>
-                    </w:rPr>
-                    <w:t>Wt.(</w:t>
-                  </w:r>
-                  <w:proofErr w:type="gramEnd"/>
-                  <w:r>
-                    <w:rPr>
-                      <w:rFonts w:cstheme="minorHAnsi"/>
-                      <w:sz w:val="20"/>
-                      <w:szCs w:val="20"/>
-                    </w:rPr>
-                    <w:t>Kg)</w:t>
+                    <w:t>Avg./Wt.(Kg)</w:t>
                   </w:r>
                 </w:p>
               </w:tc>
@@ -3635,7 +4117,6 @@
                     </w:rPr>
                     <w:t>{#</w:t>
                   </w:r>
-                  <w:proofErr w:type="gramStart"/>
                   <w:r>
                     <w:rPr>
                       <w:rFonts w:cstheme="minorHAnsi"/>
@@ -3652,7 +4133,6 @@
                     </w:rPr>
                     <w:t>}{</w:t>
                   </w:r>
-                  <w:proofErr w:type="gramEnd"/>
                   <w:r>
                     <w:rPr>
                       <w:rFonts w:cstheme="minorHAnsi"/>
@@ -3694,6 +4174,7 @@
                     </w:rPr>
                     <w:t>{</w:t>
                   </w:r>
+                  <w:proofErr w:type="spellStart"/>
                   <w:r>
                     <w:rPr>
                       <w:rFonts w:cstheme="minorHAnsi"/>
@@ -3702,6 +4183,7 @@
                     </w:rPr>
                     <w:t>totalSqMtPerType</w:t>
                   </w:r>
+                  <w:proofErr w:type="spellEnd"/>
                   <w:r>
                     <w:rPr>
                       <w:rFonts w:cstheme="minorHAnsi"/>
@@ -3791,6 +4273,7 @@
                     </w:rPr>
                     <w:t>} MM{/</w:t>
                   </w:r>
+                  <w:proofErr w:type="spellStart"/>
                   <w:r>
                     <w:rPr>
                       <w:rFonts w:cstheme="minorHAnsi"/>
@@ -3799,6 +4282,7 @@
                     </w:rPr>
                     <w:t>containerSummary</w:t>
                   </w:r>
+                  <w:proofErr w:type="spellEnd"/>
                   <w:r>
                     <w:rPr>
                       <w:rFonts w:cstheme="minorHAnsi"/>
@@ -3898,7 +4382,6 @@
                 <w:sz w:val="20"/>
                 <w:szCs w:val="20"/>
               </w:rPr>
-              <w:lastRenderedPageBreak/>
               <w:t>Pan No:</w:t>
             </w:r>
           </w:p>
@@ -3923,7 +4406,25 @@
                 <w:sz w:val="20"/>
                 <w:szCs w:val="20"/>
               </w:rPr>
-              <w:t>{panNo}</w:t>
+              <w:t>{</w:t>
+            </w:r>
+            <w:proofErr w:type="spellStart"/>
+            <w:r>
+              <w:rPr>
+                <w:rFonts w:cstheme="minorHAnsi"/>
+                <w:sz w:val="20"/>
+                <w:szCs w:val="20"/>
+              </w:rPr>
+              <w:t>panNo</w:t>
+            </w:r>
+            <w:proofErr w:type="spellEnd"/>
+            <w:r>
+              <w:rPr>
+                <w:rFonts w:cstheme="minorHAnsi"/>
+                <w:sz w:val="20"/>
+                <w:szCs w:val="20"/>
+              </w:rPr>
+              <w:t>}</w:t>
             </w:r>
           </w:p>
         </w:tc>
@@ -3977,15 +4478,51 @@
                 <w:sz w:val="20"/>
                 <w:szCs w:val="20"/>
               </w:rPr>
-              <w:t>{bankName}</w:t>
-            </w:r>
-            <w:r>
-              <w:rPr>
-                <w:rFonts w:cstheme="minorHAnsi"/>
-                <w:sz w:val="20"/>
-                <w:szCs w:val="20"/>
-              </w:rPr>
-              <w:t xml:space="preserve"> {bankBranch}</w:t>
+              <w:t>{</w:t>
+            </w:r>
+            <w:proofErr w:type="spellStart"/>
+            <w:r>
+              <w:rPr>
+                <w:rFonts w:cstheme="minorHAnsi"/>
+                <w:sz w:val="20"/>
+                <w:szCs w:val="20"/>
+              </w:rPr>
+              <w:t>bankName</w:t>
+            </w:r>
+            <w:proofErr w:type="spellEnd"/>
+            <w:r>
+              <w:rPr>
+                <w:rFonts w:cstheme="minorHAnsi"/>
+                <w:sz w:val="20"/>
+                <w:szCs w:val="20"/>
+              </w:rPr>
+              <w:t>}</w:t>
+            </w:r>
+            <w:r>
+              <w:rPr>
+                <w:rFonts w:cstheme="minorHAnsi"/>
+                <w:sz w:val="20"/>
+                <w:szCs w:val="20"/>
+              </w:rPr>
+              <w:t xml:space="preserve"> {</w:t>
+            </w:r>
+            <w:proofErr w:type="spellStart"/>
+            <w:r>
+              <w:rPr>
+                <w:rFonts w:cstheme="minorHAnsi"/>
+                <w:sz w:val="20"/>
+                <w:szCs w:val="20"/>
+              </w:rPr>
+              <w:t>bankBranch</w:t>
+            </w:r>
+            <w:proofErr w:type="spellEnd"/>
+            <w:r>
+              <w:rPr>
+                <w:rFonts w:cstheme="minorHAnsi"/>
+                <w:sz w:val="20"/>
+                <w:szCs w:val="20"/>
+              </w:rPr>
+              <w:t>}</w:t>
             </w:r>
           </w:p>
         </w:tc>
@@ -4039,7 +4576,25 @@
                 <w:sz w:val="20"/>
                 <w:szCs w:val="20"/>
               </w:rPr>
-              <w:t>{adCode}</w:t>
+              <w:t>{</w:t>
+            </w:r>
+            <w:proofErr w:type="spellStart"/>
+            <w:r>
+              <w:rPr>
+                <w:rFonts w:cstheme="minorHAnsi"/>
+                <w:sz w:val="20"/>
+                <w:szCs w:val="20"/>
+              </w:rPr>
+              <w:t>adCode</w:t>
+            </w:r>
+            <w:proofErr w:type="spellEnd"/>
+            <w:r>
+              <w:rPr>
+                <w:rFonts w:cstheme="minorHAnsi"/>
+                <w:sz w:val="20"/>
+                <w:szCs w:val="20"/>
+              </w:rPr>
+              <w:t>}</w:t>
             </w:r>
           </w:p>
         </w:tc>
@@ -4093,7 +4648,25 @@
                 <w:sz w:val="20"/>
                 <w:szCs w:val="20"/>
               </w:rPr>
-              <w:t>{acCode}</w:t>
+              <w:t>{</w:t>
+            </w:r>
+            <w:proofErr w:type="spellStart"/>
+            <w:r>
+              <w:rPr>
+                <w:rFonts w:cstheme="minorHAnsi"/>
+                <w:sz w:val="20"/>
+                <w:szCs w:val="20"/>
+              </w:rPr>
+              <w:t>acCode</w:t>
+            </w:r>
+            <w:proofErr w:type="spellEnd"/>
+            <w:r>
+              <w:rPr>
+                <w:rFonts w:cstheme="minorHAnsi"/>
+                <w:sz w:val="20"/>
+                <w:szCs w:val="20"/>
+              </w:rPr>
+              <w:t>}</w:t>
             </w:r>
           </w:p>
         </w:tc>
@@ -4147,7 +4720,25 @@
                 <w:sz w:val="20"/>
                 <w:szCs w:val="20"/>
               </w:rPr>
-              <w:t>{iec}</w:t>
+              <w:t>{</w:t>
+            </w:r>
+            <w:proofErr w:type="spellStart"/>
+            <w:r>
+              <w:rPr>
+                <w:rFonts w:cstheme="minorHAnsi"/>
+                <w:sz w:val="20"/>
+                <w:szCs w:val="20"/>
+              </w:rPr>
+              <w:t>iec</w:t>
+            </w:r>
+            <w:proofErr w:type="spellEnd"/>
+            <w:r>
+              <w:rPr>
+                <w:rFonts w:cstheme="minorHAnsi"/>
+                <w:sz w:val="20"/>
+                <w:szCs w:val="20"/>
+              </w:rPr>
+              <w:t>}</w:t>
             </w:r>
           </w:p>
         </w:tc>
@@ -4465,16 +5056,7 @@
         <w:bCs/>
         <w:spacing w:val="60"/>
       </w:rPr>
-      <w:t xml:space="preserve"> </w:t>
-    </w:r>
-    <w:proofErr w:type="gramStart"/>
-    <w:r>
-      <w:rPr>
-        <w:b/>
-        <w:bCs/>
-        <w:spacing w:val="60"/>
-      </w:rPr>
-      <w:t xml:space="preserve"> </w:t>
+      <w:t xml:space="preserve">  </w:t>
     </w:r>
     <w:r>
       <w:rPr>
@@ -4498,16 +5080,7 @@
         <w:bCs/>
         <w:spacing w:val="60"/>
       </w:rPr>
-      <w:t>(</w:t>
-    </w:r>
-    <w:proofErr w:type="gramEnd"/>
-    <w:r>
-      <w:rPr>
-        <w:b/>
-        <w:bCs/>
-        <w:spacing w:val="60"/>
-      </w:rPr>
-      <w:t>I)</w:t>
+      <w:t>(I)</w:t>
     </w:r>
     <w:r>
       <w:rPr>

</xml_diff>

<commit_message>
Margin adding in reports
</commit_message>
<xml_diff>
--- a/electron/database/generate-document/templates/custom-invoice.docx
+++ b/electron/database/generate-document/templates/custom-invoice.docx
@@ -689,15 +689,33 @@
                 <w:sz w:val="20"/>
                 <w:szCs w:val="20"/>
               </w:rPr>
-              <w:t>{#isUK}</w:t>
-            </w:r>
-            <w:r>
-              <w:rPr>
-                <w:rFonts w:cstheme="minorHAnsi"/>
-                <w:sz w:val="20"/>
-                <w:szCs w:val="20"/>
-              </w:rPr>
-              <w:t>TELE: {</w:t>
+              <w:t>{#</w:t>
+            </w:r>
+            <w:proofErr w:type="gramStart"/>
+            <w:r>
+              <w:rPr>
+                <w:rFonts w:cstheme="minorHAnsi"/>
+                <w:sz w:val="20"/>
+                <w:szCs w:val="20"/>
+              </w:rPr>
+              <w:t>isUK}</w:t>
+            </w:r>
+            <w:r>
+              <w:rPr>
+                <w:rFonts w:cstheme="minorHAnsi"/>
+                <w:sz w:val="20"/>
+                <w:szCs w:val="20"/>
+              </w:rPr>
+              <w:t>TELE</w:t>
+            </w:r>
+            <w:proofErr w:type="gramEnd"/>
+            <w:r>
+              <w:rPr>
+                <w:rFonts w:cstheme="minorHAnsi"/>
+                <w:sz w:val="20"/>
+                <w:szCs w:val="20"/>
+              </w:rPr>
+              <w:t>: {</w:t>
             </w:r>
             <w:proofErr w:type="spellStart"/>
             <w:r>
@@ -1889,6 +1907,7 @@
                     <w:t xml:space="preserve">Total </w:t>
                   </w:r>
                   <w:proofErr w:type="spellStart"/>
+                  <w:proofErr w:type="gramStart"/>
                   <w:r>
                     <w:rPr>
                       <w:rFonts w:cstheme="minorHAnsi"/>
@@ -1900,6 +1919,7 @@
                     <w:t>Sq.Mt</w:t>
                   </w:r>
                   <w:proofErr w:type="spellEnd"/>
+                  <w:proofErr w:type="gramEnd"/>
                 </w:p>
               </w:tc>
               <w:tc>
@@ -2228,7 +2248,34 @@
                       <w:sz w:val="18"/>
                       <w:szCs w:val="18"/>
                     </w:rPr>
-                    <w:t>{#CIItems}{#showThickness}</w:t>
+                    <w:t>{#</w:t>
+                  </w:r>
+                  <w:proofErr w:type="gramStart"/>
+                  <w:r>
+                    <w:rPr>
+                      <w:rFonts w:cstheme="minorHAnsi"/>
+                      <w:sz w:val="18"/>
+                      <w:szCs w:val="18"/>
+                    </w:rPr>
+                    <w:t>CIItems}{</w:t>
+                  </w:r>
+                  <w:proofErr w:type="gramEnd"/>
+                  <w:r>
+                    <w:rPr>
+                      <w:rFonts w:cstheme="minorHAnsi"/>
+                      <w:sz w:val="18"/>
+                      <w:szCs w:val="18"/>
+                    </w:rPr>
+                    <w:t>#</w:t>
+                  </w:r>
+                  <w:proofErr w:type="gramStart"/>
+                  <w:r>
+                    <w:rPr>
+                      <w:rFonts w:cstheme="minorHAnsi"/>
+                      <w:sz w:val="18"/>
+                      <w:szCs w:val="18"/>
+                    </w:rPr>
+                    <w:t>showThickness}</w:t>
                   </w:r>
                   <w:r>
                     <w:rPr>
@@ -2238,7 +2285,18 @@
                       <w:sz w:val="18"/>
                       <w:szCs w:val="18"/>
                     </w:rPr>
-                    <w:t>{thicknessDetail</w:t>
+                    <w:t>{</w:t>
+                  </w:r>
+                  <w:proofErr w:type="gramEnd"/>
+                  <w:r>
+                    <w:rPr>
+                      <w:rFonts w:cstheme="minorHAnsi"/>
+                      <w:b/>
+                      <w:bCs/>
+                      <w:sz w:val="18"/>
+                      <w:szCs w:val="18"/>
+                    </w:rPr>
+                    <w:t>thicknessDetail</w:t>
                   </w:r>
                   <w:r>
                     <w:rPr>
@@ -2441,9 +2499,19 @@
                       <w:sz w:val="18"/>
                       <w:szCs w:val="18"/>
                     </w:rPr>
-                    <w:t>COMMISION-USD.{</w:t>
+                    <w:t>COMMISION-</w:t>
+                  </w:r>
+                  <w:proofErr w:type="gramStart"/>
+                  <w:r>
+                    <w:rPr>
+                      <w:rFonts w:cstheme="minorHAnsi"/>
+                      <w:sz w:val="18"/>
+                      <w:szCs w:val="18"/>
+                    </w:rPr>
+                    <w:t>USD.{</w:t>
                   </w:r>
                   <w:proofErr w:type="spellStart"/>
+                  <w:proofErr w:type="gramEnd"/>
                   <w:r>
                     <w:rPr>
                       <w:rFonts w:cstheme="minorHAnsi"/>
@@ -2580,7 +2648,25 @@
                       <w:sz w:val="18"/>
                       <w:szCs w:val="18"/>
                     </w:rPr>
-                    <w:t>{#invoices} {#isFirst}{fsc}{/isFirst}</w:t>
+                    <w:t>{#invoices} {#</w:t>
+                  </w:r>
+                  <w:proofErr w:type="gramStart"/>
+                  <w:r>
+                    <w:rPr>
+                      <w:rFonts w:cstheme="minorHAnsi"/>
+                      <w:sz w:val="18"/>
+                      <w:szCs w:val="18"/>
+                    </w:rPr>
+                    <w:t>isFirst}{</w:t>
+                  </w:r>
+                  <w:proofErr w:type="gramEnd"/>
+                  <w:r>
+                    <w:rPr>
+                      <w:rFonts w:cstheme="minorHAnsi"/>
+                      <w:sz w:val="18"/>
+                      <w:szCs w:val="18"/>
+                    </w:rPr>
+                    <w:t>fsc}{/isFirst}</w:t>
                   </w:r>
                 </w:p>
               </w:tc>
@@ -3016,15 +3102,7 @@
                       <w:sz w:val="18"/>
                       <w:szCs w:val="18"/>
                     </w:rPr>
-                    <w:t>{</w:t>
-                  </w:r>
-                  <w:r>
-                    <w:rPr>
-                      <w:rFonts w:cstheme="minorHAnsi"/>
-                      <w:sz w:val="18"/>
-                      <w:szCs w:val="18"/>
-                    </w:rPr>
-                    <w:t>/</w:t>
+                    <w:t>{/</w:t>
                   </w:r>
                   <w:proofErr w:type="spellStart"/>
                   <w:r>
@@ -3425,6 +3503,7 @@
               <w:t>finalDestination</w:t>
             </w:r>
             <w:proofErr w:type="spellEnd"/>
+            <w:proofErr w:type="gramStart"/>
             <w:r>
               <w:rPr>
                 <w:rFonts w:cstheme="minorHAnsi"/>
@@ -3439,7 +3518,16 @@
                 <w:sz w:val="20"/>
                 <w:szCs w:val="20"/>
               </w:rPr>
-              <w:t xml:space="preserve">   </w:t>
+              <w:t xml:space="preserve">  </w:t>
+            </w:r>
+            <w:proofErr w:type="gramEnd"/>
+            <w:r>
+              <w:rPr>
+                <w:rFonts w:cstheme="minorHAnsi"/>
+                <w:sz w:val="20"/>
+                <w:szCs w:val="20"/>
+              </w:rPr>
+              <w:t xml:space="preserve"> </w:t>
             </w:r>
             <w:r>
               <w:rPr>
@@ -3594,6 +3682,7 @@
               </w:rPr>
               <w:t>{#</w:t>
             </w:r>
+            <w:proofErr w:type="gramStart"/>
             <w:r>
               <w:rPr>
                 <w:rFonts w:cstheme="minorHAnsi"/>
@@ -3610,6 +3699,7 @@
               </w:rPr>
               <w:t>}{</w:t>
             </w:r>
+            <w:proofErr w:type="gramEnd"/>
             <w:r>
               <w:rPr>
                 <w:rFonts w:cstheme="minorHAnsi"/>
@@ -3877,6 +3967,7 @@
                     <w:t xml:space="preserve">Total </w:t>
                   </w:r>
                   <w:proofErr w:type="spellStart"/>
+                  <w:proofErr w:type="gramStart"/>
                   <w:r>
                     <w:rPr>
                       <w:rFonts w:cstheme="minorHAnsi"/>
@@ -3886,6 +3977,7 @@
                     <w:t>Sq.Meter</w:t>
                   </w:r>
                   <w:proofErr w:type="spellEnd"/>
+                  <w:proofErr w:type="gramEnd"/>
                   <w:r>
                     <w:rPr>
                       <w:rFonts w:cstheme="minorHAnsi"/>
@@ -4034,7 +4126,25 @@
                       <w:sz w:val="20"/>
                       <w:szCs w:val="20"/>
                     </w:rPr>
-                    <w:t>Avg./Wt.(Kg)</w:t>
+                    <w:t>Avg./</w:t>
+                  </w:r>
+                  <w:proofErr w:type="gramStart"/>
+                  <w:r>
+                    <w:rPr>
+                      <w:rFonts w:cstheme="minorHAnsi"/>
+                      <w:sz w:val="20"/>
+                      <w:szCs w:val="20"/>
+                    </w:rPr>
+                    <w:t>Wt.(</w:t>
+                  </w:r>
+                  <w:proofErr w:type="gramEnd"/>
+                  <w:r>
+                    <w:rPr>
+                      <w:rFonts w:cstheme="minorHAnsi"/>
+                      <w:sz w:val="20"/>
+                      <w:szCs w:val="20"/>
+                    </w:rPr>
+                    <w:t>Kg)</w:t>
                   </w:r>
                 </w:p>
               </w:tc>
@@ -4117,6 +4227,7 @@
                     </w:rPr>
                     <w:t>{#</w:t>
                   </w:r>
+                  <w:proofErr w:type="gramStart"/>
                   <w:r>
                     <w:rPr>
                       <w:rFonts w:cstheme="minorHAnsi"/>
@@ -4133,6 +4244,7 @@
                     </w:rPr>
                     <w:t>}{</w:t>
                   </w:r>
+                  <w:proofErr w:type="gramEnd"/>
                   <w:r>
                     <w:rPr>
                       <w:rFonts w:cstheme="minorHAnsi"/>
@@ -4790,14 +4902,10 @@
       </w:pPr>
     </w:p>
     <w:sectPr>
-      <w:headerReference w:type="even" r:id="rId8"/>
-      <w:headerReference w:type="default" r:id="rId9"/>
-      <w:footerReference w:type="even" r:id="rId10"/>
-      <w:footerReference w:type="default" r:id="rId11"/>
-      <w:headerReference w:type="first" r:id="rId12"/>
-      <w:footerReference w:type="first" r:id="rId13"/>
+      <w:headerReference w:type="default" r:id="rId8"/>
+      <w:footerReference w:type="default" r:id="rId9"/>
       <w:pgSz w:w="12240" w:h="15840" w:code="1"/>
-      <w:pgMar w:top="482" w:right="567" w:bottom="1701" w:left="567" w:header="113" w:footer="510" w:gutter="0"/>
+      <w:pgMar w:top="482" w:right="567" w:bottom="1701" w:left="567" w:header="198" w:footer="510" w:gutter="0"/>
       <w:pgBorders w:offsetFrom="page">
         <w:top w:val="single" w:sz="4" w:space="24" w:color="auto"/>
         <w:left w:val="single" w:sz="4" w:space="28" w:color="auto"/>
@@ -4837,16 +4945,6 @@
 </file>
 
 <file path=word/footer1.xml><?xml version="1.0" encoding="utf-8"?>
-<w:ftr xmlns:wpc="http://schemas.microsoft.com/office/word/2010/wordprocessingCanvas" xmlns:cx="http://schemas.microsoft.com/office/drawing/2014/chartex" xmlns:cx1="http://schemas.microsoft.com/office/drawing/2015/9/8/chartex" xmlns:cx2="http://schemas.microsoft.com/office/drawing/2015/10/21/chartex" xmlns:cx3="http://schemas.microsoft.com/office/drawing/2016/5/9/chartex" xmlns:cx4="http://schemas.microsoft.com/office/drawing/2016/5/10/chartex" xmlns:cx5="http://schemas.microsoft.com/office/drawing/2016/5/11/chartex" xmlns:cx6="http://schemas.microsoft.com/office/drawing/2016/5/12/chartex" xmlns:cx7="http://schemas.microsoft.com/office/drawing/2016/5/13/chartex" xmlns:cx8="http://schemas.microsoft.com/office/drawing/2016/5/14/chartex" xmlns:mc="http://schemas.openxmlformats.org/markup-compatibility/2006" xmlns:aink="http://schemas.microsoft.com/office/drawing/2016/ink" xmlns:am3d="http://schemas.microsoft.com/office/drawing/2017/model3d" xmlns:o="urn:schemas-microsoft-com:office:office" xmlns:oel="http://schemas.microsoft.com/office/2019/extlst" xmlns:r="http://schemas.openxmlformats.org/officeDocument/2006/relationships" xmlns:m="http://schemas.openxmlformats.org/officeDocument/2006/math" xmlns:v="urn:schemas-microsoft-com:vml" xmlns:wp14="http://schemas.microsoft.com/office/word/2010/wordprocessingDrawing" xmlns:wp="http://schemas.openxmlformats.org/drawingml/2006/wordprocessingDrawing" xmlns:w10="urn:schemas-microsoft-com:office:word" xmlns:w="http://schemas.openxmlformats.org/wordprocessingml/2006/main" xmlns:w14="http://schemas.microsoft.com/office/word/2010/wordml" xmlns:w15="http://schemas.microsoft.com/office/word/2012/wordml" xmlns:w16cex="http://schemas.microsoft.com/office/word/2018/wordml/cex" xmlns:w16cid="http://schemas.microsoft.com/office/word/2016/wordml/cid" xmlns:w16="http://schemas.microsoft.com/office/word/2018/wordml" xmlns:w16du="http://schemas.microsoft.com/office/word/2023/wordml/word16du" xmlns:w16sdtdh="http://schemas.microsoft.com/office/word/2020/wordml/sdtdatahash" xmlns:w16sdtfl="http://schemas.microsoft.com/office/word/2024/wordml/sdtformatlock" xmlns:w16se="http://schemas.microsoft.com/office/word/2015/wordml/symex" xmlns:wpg="http://schemas.microsoft.com/office/word/2010/wordprocessingGroup" xmlns:wpi="http://schemas.microsoft.com/office/word/2010/wordprocessingInk" xmlns:wne="http://schemas.microsoft.com/office/word/2006/wordml" xmlns:wps="http://schemas.microsoft.com/office/word/2010/wordprocessingShape" mc:Ignorable="w14 w15 w16se w16cid w16 w16cex w16sdtdh w16sdtfl w16du wp14">
-  <w:p>
-    <w:pPr>
-      <w:pStyle w:val="Footer"/>
-    </w:pPr>
-  </w:p>
-</w:ftr>
-</file>
-
-<file path=word/footer2.xml><?xml version="1.0" encoding="utf-8"?>
 <w:ftr xmlns:wpc="http://schemas.microsoft.com/office/word/2010/wordprocessingCanvas" xmlns:cx="http://schemas.microsoft.com/office/drawing/2014/chartex" xmlns:cx1="http://schemas.microsoft.com/office/drawing/2015/9/8/chartex" xmlns:cx2="http://schemas.microsoft.com/office/drawing/2015/10/21/chartex" xmlns:cx3="http://schemas.microsoft.com/office/drawing/2016/5/9/chartex" xmlns:cx4="http://schemas.microsoft.com/office/drawing/2016/5/10/chartex" xmlns:cx5="http://schemas.microsoft.com/office/drawing/2016/5/11/chartex" xmlns:cx6="http://schemas.microsoft.com/office/drawing/2016/5/12/chartex" xmlns:cx7="http://schemas.microsoft.com/office/drawing/2016/5/13/chartex" xmlns:cx8="http://schemas.microsoft.com/office/drawing/2016/5/14/chartex" xmlns:mc="http://schemas.openxmlformats.org/markup-compatibility/2006" xmlns:aink="http://schemas.microsoft.com/office/drawing/2016/ink" xmlns:am3d="http://schemas.microsoft.com/office/drawing/2017/model3d" xmlns:o="urn:schemas-microsoft-com:office:office" xmlns:oel="http://schemas.microsoft.com/office/2019/extlst" xmlns:r="http://schemas.openxmlformats.org/officeDocument/2006/relationships" xmlns:m="http://schemas.openxmlformats.org/officeDocument/2006/math" xmlns:v="urn:schemas-microsoft-com:vml" xmlns:wp14="http://schemas.microsoft.com/office/word/2010/wordprocessingDrawing" xmlns:wp="http://schemas.openxmlformats.org/drawingml/2006/wordprocessingDrawing" xmlns:w10="urn:schemas-microsoft-com:office:word" xmlns:w="http://schemas.openxmlformats.org/wordprocessingml/2006/main" xmlns:w14="http://schemas.microsoft.com/office/word/2010/wordml" xmlns:w15="http://schemas.microsoft.com/office/word/2012/wordml" xmlns:w16cex="http://schemas.microsoft.com/office/word/2018/wordml/cex" xmlns:w16cid="http://schemas.microsoft.com/office/word/2016/wordml/cid" xmlns:w16="http://schemas.microsoft.com/office/word/2018/wordml" xmlns:w16du="http://schemas.microsoft.com/office/word/2023/wordml/word16du" xmlns:w16sdtdh="http://schemas.microsoft.com/office/word/2020/wordml/sdtdatahash" xmlns:w16sdtfl="http://schemas.microsoft.com/office/word/2024/wordml/sdtformatlock" xmlns:w16se="http://schemas.microsoft.com/office/word/2015/wordml/symex" xmlns:wpg="http://schemas.microsoft.com/office/word/2010/wordprocessingGroup" xmlns:wpi="http://schemas.microsoft.com/office/word/2010/wordprocessingInk" xmlns:wne="http://schemas.microsoft.com/office/word/2006/wordml" xmlns:wps="http://schemas.microsoft.com/office/word/2010/wordprocessingShape" mc:Ignorable="w14 w15 w16se w16cid w16 w16cex w16sdtdh w16sdtfl w16du wp14">
   <w:p>
     <w:pPr>
@@ -5056,7 +5154,16 @@
         <w:bCs/>
         <w:spacing w:val="60"/>
       </w:rPr>
-      <w:t xml:space="preserve">  </w:t>
+      <w:t xml:space="preserve"> </w:t>
+    </w:r>
+    <w:proofErr w:type="gramStart"/>
+    <w:r>
+      <w:rPr>
+        <w:b/>
+        <w:bCs/>
+        <w:spacing w:val="60"/>
+      </w:rPr>
+      <w:t xml:space="preserve"> </w:t>
     </w:r>
     <w:r>
       <w:rPr>
@@ -5080,7 +5187,16 @@
         <w:bCs/>
         <w:spacing w:val="60"/>
       </w:rPr>
-      <w:t>(I)</w:t>
+      <w:t>(</w:t>
+    </w:r>
+    <w:proofErr w:type="gramEnd"/>
+    <w:r>
+      <w:rPr>
+        <w:b/>
+        <w:bCs/>
+        <w:spacing w:val="60"/>
+      </w:rPr>
+      <w:t>I)</w:t>
     </w:r>
     <w:r>
       <w:rPr>
@@ -5191,16 +5307,6 @@
 </w:ftr>
 </file>
 
-<file path=word/footer3.xml><?xml version="1.0" encoding="utf-8"?>
-<w:ftr xmlns:wpc="http://schemas.microsoft.com/office/word/2010/wordprocessingCanvas" xmlns:cx="http://schemas.microsoft.com/office/drawing/2014/chartex" xmlns:cx1="http://schemas.microsoft.com/office/drawing/2015/9/8/chartex" xmlns:cx2="http://schemas.microsoft.com/office/drawing/2015/10/21/chartex" xmlns:cx3="http://schemas.microsoft.com/office/drawing/2016/5/9/chartex" xmlns:cx4="http://schemas.microsoft.com/office/drawing/2016/5/10/chartex" xmlns:cx5="http://schemas.microsoft.com/office/drawing/2016/5/11/chartex" xmlns:cx6="http://schemas.microsoft.com/office/drawing/2016/5/12/chartex" xmlns:cx7="http://schemas.microsoft.com/office/drawing/2016/5/13/chartex" xmlns:cx8="http://schemas.microsoft.com/office/drawing/2016/5/14/chartex" xmlns:mc="http://schemas.openxmlformats.org/markup-compatibility/2006" xmlns:aink="http://schemas.microsoft.com/office/drawing/2016/ink" xmlns:am3d="http://schemas.microsoft.com/office/drawing/2017/model3d" xmlns:o="urn:schemas-microsoft-com:office:office" xmlns:oel="http://schemas.microsoft.com/office/2019/extlst" xmlns:r="http://schemas.openxmlformats.org/officeDocument/2006/relationships" xmlns:m="http://schemas.openxmlformats.org/officeDocument/2006/math" xmlns:v="urn:schemas-microsoft-com:vml" xmlns:wp14="http://schemas.microsoft.com/office/word/2010/wordprocessingDrawing" xmlns:wp="http://schemas.openxmlformats.org/drawingml/2006/wordprocessingDrawing" xmlns:w10="urn:schemas-microsoft-com:office:word" xmlns:w="http://schemas.openxmlformats.org/wordprocessingml/2006/main" xmlns:w14="http://schemas.microsoft.com/office/word/2010/wordml" xmlns:w15="http://schemas.microsoft.com/office/word/2012/wordml" xmlns:w16cex="http://schemas.microsoft.com/office/word/2018/wordml/cex" xmlns:w16cid="http://schemas.microsoft.com/office/word/2016/wordml/cid" xmlns:w16="http://schemas.microsoft.com/office/word/2018/wordml" xmlns:w16du="http://schemas.microsoft.com/office/word/2023/wordml/word16du" xmlns:w16sdtdh="http://schemas.microsoft.com/office/word/2020/wordml/sdtdatahash" xmlns:w16sdtfl="http://schemas.microsoft.com/office/word/2024/wordml/sdtformatlock" xmlns:w16se="http://schemas.microsoft.com/office/word/2015/wordml/symex" xmlns:wpg="http://schemas.microsoft.com/office/word/2010/wordprocessingGroup" xmlns:wpi="http://schemas.microsoft.com/office/word/2010/wordprocessingInk" xmlns:wne="http://schemas.microsoft.com/office/word/2006/wordml" xmlns:wps="http://schemas.microsoft.com/office/word/2010/wordprocessingShape" mc:Ignorable="w14 w15 w16se w16cid w16 w16cex w16sdtdh w16sdtfl w16du wp14">
-  <w:p>
-    <w:pPr>
-      <w:pStyle w:val="Footer"/>
-    </w:pPr>
-  </w:p>
-</w:ftr>
-</file>
-
 <file path=word/footnotes.xml><?xml version="1.0" encoding="utf-8"?>
 <w:footnotes xmlns:wpc="http://schemas.microsoft.com/office/word/2010/wordprocessingCanvas" xmlns:cx="http://schemas.microsoft.com/office/drawing/2014/chartex" xmlns:cx1="http://schemas.microsoft.com/office/drawing/2015/9/8/chartex" xmlns:cx2="http://schemas.microsoft.com/office/drawing/2015/10/21/chartex" xmlns:cx3="http://schemas.microsoft.com/office/drawing/2016/5/9/chartex" xmlns:cx4="http://schemas.microsoft.com/office/drawing/2016/5/10/chartex" xmlns:cx5="http://schemas.microsoft.com/office/drawing/2016/5/11/chartex" xmlns:cx6="http://schemas.microsoft.com/office/drawing/2016/5/12/chartex" xmlns:cx7="http://schemas.microsoft.com/office/drawing/2016/5/13/chartex" xmlns:cx8="http://schemas.microsoft.com/office/drawing/2016/5/14/chartex" xmlns:mc="http://schemas.openxmlformats.org/markup-compatibility/2006" xmlns:aink="http://schemas.microsoft.com/office/drawing/2016/ink" xmlns:am3d="http://schemas.microsoft.com/office/drawing/2017/model3d" xmlns:o="urn:schemas-microsoft-com:office:office" xmlns:oel="http://schemas.microsoft.com/office/2019/extlst" xmlns:r="http://schemas.openxmlformats.org/officeDocument/2006/relationships" xmlns:m="http://schemas.openxmlformats.org/officeDocument/2006/math" xmlns:v="urn:schemas-microsoft-com:vml" xmlns:wp14="http://schemas.microsoft.com/office/word/2010/wordprocessingDrawing" xmlns:wp="http://schemas.openxmlformats.org/drawingml/2006/wordprocessingDrawing" xmlns:w10="urn:schemas-microsoft-com:office:word" xmlns:w="http://schemas.openxmlformats.org/wordprocessingml/2006/main" xmlns:w14="http://schemas.microsoft.com/office/word/2010/wordml" xmlns:w15="http://schemas.microsoft.com/office/word/2012/wordml" xmlns:w16cex="http://schemas.microsoft.com/office/word/2018/wordml/cex" xmlns:w16cid="http://schemas.microsoft.com/office/word/2016/wordml/cid" xmlns:w16="http://schemas.microsoft.com/office/word/2018/wordml" xmlns:w16du="http://schemas.microsoft.com/office/word/2023/wordml/word16du" xmlns:w16sdtdh="http://schemas.microsoft.com/office/word/2020/wordml/sdtdatahash" xmlns:w16sdtfl="http://schemas.microsoft.com/office/word/2024/wordml/sdtformatlock" xmlns:w16se="http://schemas.microsoft.com/office/word/2015/wordml/symex" xmlns:wpg="http://schemas.microsoft.com/office/word/2010/wordprocessingGroup" xmlns:wpi="http://schemas.microsoft.com/office/word/2010/wordprocessingInk" xmlns:wne="http://schemas.microsoft.com/office/word/2006/wordml" xmlns:wps="http://schemas.microsoft.com/office/word/2010/wordprocessingShape" mc:Ignorable="w14 w15 w16se w16cid w16 w16cex w16sdtdh w16sdtfl w16du wp14">
   <w:footnote w:type="separator" w:id="-1">
@@ -5231,21 +5337,11 @@
   <w:p>
     <w:pPr>
       <w:pStyle w:val="Header"/>
-    </w:pPr>
-  </w:p>
-</w:hdr>
-</file>
-
-<file path=word/header2.xml><?xml version="1.0" encoding="utf-8"?>
-<w:hdr xmlns:wpc="http://schemas.microsoft.com/office/word/2010/wordprocessingCanvas" xmlns:cx="http://schemas.microsoft.com/office/drawing/2014/chartex" xmlns:cx1="http://schemas.microsoft.com/office/drawing/2015/9/8/chartex" xmlns:cx2="http://schemas.microsoft.com/office/drawing/2015/10/21/chartex" xmlns:cx3="http://schemas.microsoft.com/office/drawing/2016/5/9/chartex" xmlns:cx4="http://schemas.microsoft.com/office/drawing/2016/5/10/chartex" xmlns:cx5="http://schemas.microsoft.com/office/drawing/2016/5/11/chartex" xmlns:cx6="http://schemas.microsoft.com/office/drawing/2016/5/12/chartex" xmlns:cx7="http://schemas.microsoft.com/office/drawing/2016/5/13/chartex" xmlns:cx8="http://schemas.microsoft.com/office/drawing/2016/5/14/chartex" xmlns:mc="http://schemas.openxmlformats.org/markup-compatibility/2006" xmlns:aink="http://schemas.microsoft.com/office/drawing/2016/ink" xmlns:am3d="http://schemas.microsoft.com/office/drawing/2017/model3d" xmlns:o="urn:schemas-microsoft-com:office:office" xmlns:oel="http://schemas.microsoft.com/office/2019/extlst" xmlns:r="http://schemas.openxmlformats.org/officeDocument/2006/relationships" xmlns:m="http://schemas.openxmlformats.org/officeDocument/2006/math" xmlns:v="urn:schemas-microsoft-com:vml" xmlns:wp14="http://schemas.microsoft.com/office/word/2010/wordprocessingDrawing" xmlns:wp="http://schemas.openxmlformats.org/drawingml/2006/wordprocessingDrawing" xmlns:w10="urn:schemas-microsoft-com:office:word" xmlns:w="http://schemas.openxmlformats.org/wordprocessingml/2006/main" xmlns:w14="http://schemas.microsoft.com/office/word/2010/wordml" xmlns:w15="http://schemas.microsoft.com/office/word/2012/wordml" xmlns:w16cex="http://schemas.microsoft.com/office/word/2018/wordml/cex" xmlns:w16cid="http://schemas.microsoft.com/office/word/2016/wordml/cid" xmlns:w16="http://schemas.microsoft.com/office/word/2018/wordml" xmlns:w16du="http://schemas.microsoft.com/office/word/2023/wordml/word16du" xmlns:w16sdtdh="http://schemas.microsoft.com/office/word/2020/wordml/sdtdatahash" xmlns:w16sdtfl="http://schemas.microsoft.com/office/word/2024/wordml/sdtformatlock" xmlns:w16se="http://schemas.microsoft.com/office/word/2015/wordml/symex" xmlns:wpg="http://schemas.microsoft.com/office/word/2010/wordprocessingGroup" xmlns:wpi="http://schemas.microsoft.com/office/word/2010/wordprocessingInk" xmlns:wne="http://schemas.microsoft.com/office/word/2006/wordml" xmlns:wps="http://schemas.microsoft.com/office/word/2010/wordprocessingShape" mc:Ignorable="w14 w15 w16se w16cid w16 w16cex w16sdtdh w16sdtfl w16du wp14">
-  <w:p>
-    <w:pPr>
-      <w:pStyle w:val="Header"/>
       <w:jc w:val="center"/>
       <w:rPr>
         <w:b/>
         <w:bCs/>
-        <w:spacing w:val="80"/>
+        <w:spacing w:val="120"/>
         <w:sz w:val="24"/>
       </w:rPr>
     </w:pPr>
@@ -5253,21 +5349,11 @@
       <w:rPr>
         <w:b/>
         <w:bCs/>
-        <w:spacing w:val="80"/>
+        <w:spacing w:val="120"/>
         <w:sz w:val="24"/>
       </w:rPr>
       <w:t>INVOICE</w:t>
     </w:r>
-  </w:p>
-</w:hdr>
-</file>
-
-<file path=word/header3.xml><?xml version="1.0" encoding="utf-8"?>
-<w:hdr xmlns:wpc="http://schemas.microsoft.com/office/word/2010/wordprocessingCanvas" xmlns:cx="http://schemas.microsoft.com/office/drawing/2014/chartex" xmlns:cx1="http://schemas.microsoft.com/office/drawing/2015/9/8/chartex" xmlns:cx2="http://schemas.microsoft.com/office/drawing/2015/10/21/chartex" xmlns:cx3="http://schemas.microsoft.com/office/drawing/2016/5/9/chartex" xmlns:cx4="http://schemas.microsoft.com/office/drawing/2016/5/10/chartex" xmlns:cx5="http://schemas.microsoft.com/office/drawing/2016/5/11/chartex" xmlns:cx6="http://schemas.microsoft.com/office/drawing/2016/5/12/chartex" xmlns:cx7="http://schemas.microsoft.com/office/drawing/2016/5/13/chartex" xmlns:cx8="http://schemas.microsoft.com/office/drawing/2016/5/14/chartex" xmlns:mc="http://schemas.openxmlformats.org/markup-compatibility/2006" xmlns:aink="http://schemas.microsoft.com/office/drawing/2016/ink" xmlns:am3d="http://schemas.microsoft.com/office/drawing/2017/model3d" xmlns:o="urn:schemas-microsoft-com:office:office" xmlns:oel="http://schemas.microsoft.com/office/2019/extlst" xmlns:r="http://schemas.openxmlformats.org/officeDocument/2006/relationships" xmlns:m="http://schemas.openxmlformats.org/officeDocument/2006/math" xmlns:v="urn:schemas-microsoft-com:vml" xmlns:wp14="http://schemas.microsoft.com/office/word/2010/wordprocessingDrawing" xmlns:wp="http://schemas.openxmlformats.org/drawingml/2006/wordprocessingDrawing" xmlns:w10="urn:schemas-microsoft-com:office:word" xmlns:w="http://schemas.openxmlformats.org/wordprocessingml/2006/main" xmlns:w14="http://schemas.microsoft.com/office/word/2010/wordml" xmlns:w15="http://schemas.microsoft.com/office/word/2012/wordml" xmlns:w16cex="http://schemas.microsoft.com/office/word/2018/wordml/cex" xmlns:w16cid="http://schemas.microsoft.com/office/word/2016/wordml/cid" xmlns:w16="http://schemas.microsoft.com/office/word/2018/wordml" xmlns:w16du="http://schemas.microsoft.com/office/word/2023/wordml/word16du" xmlns:w16sdtdh="http://schemas.microsoft.com/office/word/2020/wordml/sdtdatahash" xmlns:w16sdtfl="http://schemas.microsoft.com/office/word/2024/wordml/sdtformatlock" xmlns:w16se="http://schemas.microsoft.com/office/word/2015/wordml/symex" xmlns:wpg="http://schemas.microsoft.com/office/word/2010/wordprocessingGroup" xmlns:wpi="http://schemas.microsoft.com/office/word/2010/wordprocessingInk" xmlns:wne="http://schemas.microsoft.com/office/word/2006/wordml" xmlns:wps="http://schemas.microsoft.com/office/word/2010/wordprocessingShape" mc:Ignorable="w14 w15 w16se w16cid w16 w16cex w16sdtdh w16sdtfl w16du wp14">
-  <w:p>
-    <w:pPr>
-      <w:pStyle w:val="Header"/>
-    </w:pPr>
   </w:p>
 </w:hdr>
 </file>
@@ -5876,6 +5962,7 @@
   <w:style w:type="character" w:default="1" w:styleId="DefaultParagraphFont">
     <w:name w:val="Default Paragraph Font"/>
     <w:uiPriority w:val="1"/>
+    <w:semiHidden/>
     <w:unhideWhenUsed/>
   </w:style>
   <w:style w:type="table" w:default="1" w:styleId="TableNormal">

</xml_diff>

<commit_message>
weight round off 100 -> 10
</commit_message>
<xml_diff>
--- a/electron/database/generate-document/templates/custom-invoice.docx
+++ b/electron/database/generate-document/templates/custom-invoice.docx
@@ -689,33 +689,15 @@
                 <w:sz w:val="20"/>
                 <w:szCs w:val="20"/>
               </w:rPr>
-              <w:t>{#</w:t>
-            </w:r>
-            <w:proofErr w:type="gramStart"/>
-            <w:r>
-              <w:rPr>
-                <w:rFonts w:cstheme="minorHAnsi"/>
-                <w:sz w:val="20"/>
-                <w:szCs w:val="20"/>
-              </w:rPr>
-              <w:t>isUK}</w:t>
-            </w:r>
-            <w:r>
-              <w:rPr>
-                <w:rFonts w:cstheme="minorHAnsi"/>
-                <w:sz w:val="20"/>
-                <w:szCs w:val="20"/>
-              </w:rPr>
-              <w:t>TELE</w:t>
-            </w:r>
-            <w:proofErr w:type="gramEnd"/>
-            <w:r>
-              <w:rPr>
-                <w:rFonts w:cstheme="minorHAnsi"/>
-                <w:sz w:val="20"/>
-                <w:szCs w:val="20"/>
-              </w:rPr>
-              <w:t>: {</w:t>
+              <w:t>{#isUK}</w:t>
+            </w:r>
+            <w:r>
+              <w:rPr>
+                <w:rFonts w:cstheme="minorHAnsi"/>
+                <w:sz w:val="20"/>
+                <w:szCs w:val="20"/>
+              </w:rPr>
+              <w:t>TELE: {</w:t>
             </w:r>
             <w:proofErr w:type="spellStart"/>
             <w:r>
@@ -1907,7 +1889,6 @@
                     <w:t xml:space="preserve">Total </w:t>
                   </w:r>
                   <w:proofErr w:type="spellStart"/>
-                  <w:proofErr w:type="gramStart"/>
                   <w:r>
                     <w:rPr>
                       <w:rFonts w:cstheme="minorHAnsi"/>
@@ -1919,7 +1900,6 @@
                     <w:t>Sq.Mt</w:t>
                   </w:r>
                   <w:proofErr w:type="spellEnd"/>
-                  <w:proofErr w:type="gramEnd"/>
                 </w:p>
               </w:tc>
               <w:tc>
@@ -2248,34 +2228,7 @@
                       <w:sz w:val="18"/>
                       <w:szCs w:val="18"/>
                     </w:rPr>
-                    <w:t>{#</w:t>
-                  </w:r>
-                  <w:proofErr w:type="gramStart"/>
-                  <w:r>
-                    <w:rPr>
-                      <w:rFonts w:cstheme="minorHAnsi"/>
-                      <w:sz w:val="18"/>
-                      <w:szCs w:val="18"/>
-                    </w:rPr>
-                    <w:t>CIItems}{</w:t>
-                  </w:r>
-                  <w:proofErr w:type="gramEnd"/>
-                  <w:r>
-                    <w:rPr>
-                      <w:rFonts w:cstheme="minorHAnsi"/>
-                      <w:sz w:val="18"/>
-                      <w:szCs w:val="18"/>
-                    </w:rPr>
-                    <w:t>#</w:t>
-                  </w:r>
-                  <w:proofErr w:type="gramStart"/>
-                  <w:r>
-                    <w:rPr>
-                      <w:rFonts w:cstheme="minorHAnsi"/>
-                      <w:sz w:val="18"/>
-                      <w:szCs w:val="18"/>
-                    </w:rPr>
-                    <w:t>showThickness}</w:t>
+                    <w:t>{#CIItems}{#showThickness}</w:t>
                   </w:r>
                   <w:r>
                     <w:rPr>
@@ -2285,18 +2238,7 @@
                       <w:sz w:val="18"/>
                       <w:szCs w:val="18"/>
                     </w:rPr>
-                    <w:t>{</w:t>
-                  </w:r>
-                  <w:proofErr w:type="gramEnd"/>
-                  <w:r>
-                    <w:rPr>
-                      <w:rFonts w:cstheme="minorHAnsi"/>
-                      <w:b/>
-                      <w:bCs/>
-                      <w:sz w:val="18"/>
-                      <w:szCs w:val="18"/>
-                    </w:rPr>
-                    <w:t>thicknessDetail</w:t>
+                    <w:t>{thicknessDetail</w:t>
                   </w:r>
                   <w:r>
                     <w:rPr>
@@ -2499,19 +2441,9 @@
                       <w:sz w:val="18"/>
                       <w:szCs w:val="18"/>
                     </w:rPr>
-                    <w:t>COMMISION-</w:t>
-                  </w:r>
-                  <w:proofErr w:type="gramStart"/>
-                  <w:r>
-                    <w:rPr>
-                      <w:rFonts w:cstheme="minorHAnsi"/>
-                      <w:sz w:val="18"/>
-                      <w:szCs w:val="18"/>
-                    </w:rPr>
-                    <w:t>USD.{</w:t>
+                    <w:t>COMMISION-USD.{</w:t>
                   </w:r>
                   <w:proofErr w:type="spellStart"/>
-                  <w:proofErr w:type="gramEnd"/>
                   <w:r>
                     <w:rPr>
                       <w:rFonts w:cstheme="minorHAnsi"/>
@@ -2648,25 +2580,7 @@
                       <w:sz w:val="18"/>
                       <w:szCs w:val="18"/>
                     </w:rPr>
-                    <w:t>{#invoices} {#</w:t>
-                  </w:r>
-                  <w:proofErr w:type="gramStart"/>
-                  <w:r>
-                    <w:rPr>
-                      <w:rFonts w:cstheme="minorHAnsi"/>
-                      <w:sz w:val="18"/>
-                      <w:szCs w:val="18"/>
-                    </w:rPr>
-                    <w:t>isFirst}{</w:t>
-                  </w:r>
-                  <w:proofErr w:type="gramEnd"/>
-                  <w:r>
-                    <w:rPr>
-                      <w:rFonts w:cstheme="minorHAnsi"/>
-                      <w:sz w:val="18"/>
-                      <w:szCs w:val="18"/>
-                    </w:rPr>
-                    <w:t>fsc}{/isFirst}</w:t>
+                    <w:t>{#invoices} {#isFirst}{fsc}{/isFirst}</w:t>
                   </w:r>
                 </w:p>
               </w:tc>
@@ -3007,14 +2921,6 @@
                       <w:szCs w:val="18"/>
                     </w:rPr>
                   </w:pPr>
-                  <w:r>
-                    <w:rPr>
-                      <w:rFonts w:cstheme="minorHAnsi"/>
-                      <w:sz w:val="18"/>
-                      <w:szCs w:val="18"/>
-                    </w:rPr>
-                    <w:t>0</w:t>
-                  </w:r>
                 </w:p>
               </w:tc>
               <w:tc>
@@ -3034,14 +2940,6 @@
                       <w:szCs w:val="18"/>
                     </w:rPr>
                   </w:pPr>
-                  <w:r>
-                    <w:rPr>
-                      <w:rFonts w:cstheme="minorHAnsi"/>
-                      <w:sz w:val="18"/>
-                      <w:szCs w:val="18"/>
-                    </w:rPr>
-                    <w:t>0.0000</w:t>
-                  </w:r>
                 </w:p>
               </w:tc>
               <w:tc>
@@ -3061,14 +2959,6 @@
                       <w:szCs w:val="18"/>
                     </w:rPr>
                   </w:pPr>
-                  <w:r>
-                    <w:rPr>
-                      <w:rFonts w:cstheme="minorHAnsi"/>
-                      <w:sz w:val="18"/>
-                      <w:szCs w:val="18"/>
-                    </w:rPr>
-                    <w:t>FREE</w:t>
-                  </w:r>
                 </w:p>
               </w:tc>
               <w:tc>
@@ -3088,14 +2978,6 @@
                       <w:szCs w:val="18"/>
                     </w:rPr>
                   </w:pPr>
-                  <w:r>
-                    <w:rPr>
-                      <w:rFonts w:cstheme="minorHAnsi"/>
-                      <w:sz w:val="18"/>
-                      <w:szCs w:val="18"/>
-                    </w:rPr>
-                    <w:t>FREE</w:t>
-                  </w:r>
                   <w:r>
                     <w:rPr>
                       <w:rFonts w:cstheme="minorHAnsi"/>
@@ -3503,7 +3385,6 @@
               <w:t>finalDestination</w:t>
             </w:r>
             <w:proofErr w:type="spellEnd"/>
-            <w:proofErr w:type="gramStart"/>
             <w:r>
               <w:rPr>
                 <w:rFonts w:cstheme="minorHAnsi"/>
@@ -3518,16 +3399,7 @@
                 <w:sz w:val="20"/>
                 <w:szCs w:val="20"/>
               </w:rPr>
-              <w:t xml:space="preserve">  </w:t>
-            </w:r>
-            <w:proofErr w:type="gramEnd"/>
-            <w:r>
-              <w:rPr>
-                <w:rFonts w:cstheme="minorHAnsi"/>
-                <w:sz w:val="20"/>
-                <w:szCs w:val="20"/>
-              </w:rPr>
-              <w:t xml:space="preserve"> </w:t>
+              <w:t xml:space="preserve">   </w:t>
             </w:r>
             <w:r>
               <w:rPr>
@@ -3682,7 +3554,6 @@
               </w:rPr>
               <w:t>{#</w:t>
             </w:r>
-            <w:proofErr w:type="gramStart"/>
             <w:r>
               <w:rPr>
                 <w:rFonts w:cstheme="minorHAnsi"/>
@@ -3699,7 +3570,6 @@
               </w:rPr>
               <w:t>}{</w:t>
             </w:r>
-            <w:proofErr w:type="gramEnd"/>
             <w:r>
               <w:rPr>
                 <w:rFonts w:cstheme="minorHAnsi"/>
@@ -3967,7 +3837,6 @@
                     <w:t xml:space="preserve">Total </w:t>
                   </w:r>
                   <w:proofErr w:type="spellStart"/>
-                  <w:proofErr w:type="gramStart"/>
                   <w:r>
                     <w:rPr>
                       <w:rFonts w:cstheme="minorHAnsi"/>
@@ -3977,7 +3846,6 @@
                     <w:t>Sq.Meter</w:t>
                   </w:r>
                   <w:proofErr w:type="spellEnd"/>
-                  <w:proofErr w:type="gramEnd"/>
                   <w:r>
                     <w:rPr>
                       <w:rFonts w:cstheme="minorHAnsi"/>
@@ -4126,25 +3994,7 @@
                       <w:sz w:val="20"/>
                       <w:szCs w:val="20"/>
                     </w:rPr>
-                    <w:t>Avg./</w:t>
-                  </w:r>
-                  <w:proofErr w:type="gramStart"/>
-                  <w:r>
-                    <w:rPr>
-                      <w:rFonts w:cstheme="minorHAnsi"/>
-                      <w:sz w:val="20"/>
-                      <w:szCs w:val="20"/>
-                    </w:rPr>
-                    <w:t>Wt.(</w:t>
-                  </w:r>
-                  <w:proofErr w:type="gramEnd"/>
-                  <w:r>
-                    <w:rPr>
-                      <w:rFonts w:cstheme="minorHAnsi"/>
-                      <w:sz w:val="20"/>
-                      <w:szCs w:val="20"/>
-                    </w:rPr>
-                    <w:t>Kg)</w:t>
+                    <w:t>Avg./Wt.(Kg)</w:t>
                   </w:r>
                 </w:p>
               </w:tc>
@@ -4227,7 +4077,6 @@
                     </w:rPr>
                     <w:t>{#</w:t>
                   </w:r>
-                  <w:proofErr w:type="gramStart"/>
                   <w:r>
                     <w:rPr>
                       <w:rFonts w:cstheme="minorHAnsi"/>
@@ -4244,7 +4093,6 @@
                     </w:rPr>
                     <w:t>}{</w:t>
                   </w:r>
-                  <w:proofErr w:type="gramEnd"/>
                   <w:r>
                     <w:rPr>
                       <w:rFonts w:cstheme="minorHAnsi"/>
@@ -5154,16 +5002,7 @@
         <w:bCs/>
         <w:spacing w:val="60"/>
       </w:rPr>
-      <w:t xml:space="preserve"> </w:t>
-    </w:r>
-    <w:proofErr w:type="gramStart"/>
-    <w:r>
-      <w:rPr>
-        <w:b/>
-        <w:bCs/>
-        <w:spacing w:val="60"/>
-      </w:rPr>
-      <w:t xml:space="preserve"> </w:t>
+      <w:t xml:space="preserve">  </w:t>
     </w:r>
     <w:r>
       <w:rPr>
@@ -5187,16 +5026,7 @@
         <w:bCs/>
         <w:spacing w:val="60"/>
       </w:rPr>
-      <w:t>(</w:t>
-    </w:r>
-    <w:proofErr w:type="gramEnd"/>
-    <w:r>
-      <w:rPr>
-        <w:b/>
-        <w:bCs/>
-        <w:spacing w:val="60"/>
-      </w:rPr>
-      <w:t>I)</w:t>
+      <w:t>(I)</w:t>
     </w:r>
     <w:r>
       <w:rPr>

</xml_diff>

<commit_message>
price digit and commision fix
</commit_message>
<xml_diff>
--- a/electron/database/generate-document/templates/custom-invoice.docx
+++ b/electron/database/generate-document/templates/custom-invoice.docx
@@ -689,15 +689,33 @@
                 <w:sz w:val="20"/>
                 <w:szCs w:val="20"/>
               </w:rPr>
-              <w:t>{#isUK}</w:t>
-            </w:r>
-            <w:r>
-              <w:rPr>
-                <w:rFonts w:cstheme="minorHAnsi"/>
-                <w:sz w:val="20"/>
-                <w:szCs w:val="20"/>
-              </w:rPr>
-              <w:t>TELE: {</w:t>
+              <w:t>{#</w:t>
+            </w:r>
+            <w:proofErr w:type="gramStart"/>
+            <w:r>
+              <w:rPr>
+                <w:rFonts w:cstheme="minorHAnsi"/>
+                <w:sz w:val="20"/>
+                <w:szCs w:val="20"/>
+              </w:rPr>
+              <w:t>isUK}</w:t>
+            </w:r>
+            <w:r>
+              <w:rPr>
+                <w:rFonts w:cstheme="minorHAnsi"/>
+                <w:sz w:val="20"/>
+                <w:szCs w:val="20"/>
+              </w:rPr>
+              <w:t>TELE</w:t>
+            </w:r>
+            <w:proofErr w:type="gramEnd"/>
+            <w:r>
+              <w:rPr>
+                <w:rFonts w:cstheme="minorHAnsi"/>
+                <w:sz w:val="20"/>
+                <w:szCs w:val="20"/>
+              </w:rPr>
+              <w:t>: {</w:t>
             </w:r>
             <w:proofErr w:type="spellStart"/>
             <w:r>
@@ -1889,6 +1907,7 @@
                     <w:t xml:space="preserve">Total </w:t>
                   </w:r>
                   <w:proofErr w:type="spellStart"/>
+                  <w:proofErr w:type="gramStart"/>
                   <w:r>
                     <w:rPr>
                       <w:rFonts w:cstheme="minorHAnsi"/>
@@ -1900,6 +1919,7 @@
                     <w:t>Sq.Mt</w:t>
                   </w:r>
                   <w:proofErr w:type="spellEnd"/>
+                  <w:proofErr w:type="gramEnd"/>
                 </w:p>
               </w:tc>
               <w:tc>
@@ -2228,7 +2248,34 @@
                       <w:sz w:val="18"/>
                       <w:szCs w:val="18"/>
                     </w:rPr>
-                    <w:t>{#CIItems}{#showThickness}</w:t>
+                    <w:t>{#</w:t>
+                  </w:r>
+                  <w:proofErr w:type="gramStart"/>
+                  <w:r>
+                    <w:rPr>
+                      <w:rFonts w:cstheme="minorHAnsi"/>
+                      <w:sz w:val="18"/>
+                      <w:szCs w:val="18"/>
+                    </w:rPr>
+                    <w:t>CIItems}{</w:t>
+                  </w:r>
+                  <w:proofErr w:type="gramEnd"/>
+                  <w:r>
+                    <w:rPr>
+                      <w:rFonts w:cstheme="minorHAnsi"/>
+                      <w:sz w:val="18"/>
+                      <w:szCs w:val="18"/>
+                    </w:rPr>
+                    <w:t>#</w:t>
+                  </w:r>
+                  <w:proofErr w:type="gramStart"/>
+                  <w:r>
+                    <w:rPr>
+                      <w:rFonts w:cstheme="minorHAnsi"/>
+                      <w:sz w:val="18"/>
+                      <w:szCs w:val="18"/>
+                    </w:rPr>
+                    <w:t>showThickness}</w:t>
                   </w:r>
                   <w:r>
                     <w:rPr>
@@ -2238,7 +2285,18 @@
                       <w:sz w:val="18"/>
                       <w:szCs w:val="18"/>
                     </w:rPr>
-                    <w:t>{thicknessDetail</w:t>
+                    <w:t>{</w:t>
+                  </w:r>
+                  <w:proofErr w:type="gramEnd"/>
+                  <w:r>
+                    <w:rPr>
+                      <w:rFonts w:cstheme="minorHAnsi"/>
+                      <w:b/>
+                      <w:bCs/>
+                      <w:sz w:val="18"/>
+                      <w:szCs w:val="18"/>
+                    </w:rPr>
+                    <w:t>thicknessDetail</w:t>
                   </w:r>
                   <w:r>
                     <w:rPr>
@@ -2413,7 +2471,7 @@
                       <w:sz w:val="18"/>
                       <w:szCs w:val="18"/>
                     </w:rPr>
-                    <w:t>isAus</w:t>
+                    <w:t>commision</w:t>
                   </w:r>
                   <w:r>
                     <w:rPr>
@@ -2441,9 +2499,19 @@
                       <w:sz w:val="18"/>
                       <w:szCs w:val="18"/>
                     </w:rPr>
-                    <w:t>COMMISION-USD.{</w:t>
+                    <w:t>COMMISION-</w:t>
+                  </w:r>
+                  <w:proofErr w:type="gramStart"/>
+                  <w:r>
+                    <w:rPr>
+                      <w:rFonts w:cstheme="minorHAnsi"/>
+                      <w:sz w:val="18"/>
+                      <w:szCs w:val="18"/>
+                    </w:rPr>
+                    <w:t>USD.{</w:t>
                   </w:r>
                   <w:proofErr w:type="spellStart"/>
+                  <w:proofErr w:type="gramEnd"/>
                   <w:r>
                     <w:rPr>
                       <w:rFonts w:cstheme="minorHAnsi"/>
@@ -2468,7 +2536,7 @@
                       <w:sz w:val="18"/>
                       <w:szCs w:val="18"/>
                     </w:rPr>
-                    <w:t>isAus</w:t>
+                    <w:t>commision</w:t>
                   </w:r>
                   <w:proofErr w:type="spellEnd"/>
                   <w:r>
@@ -2580,7 +2648,25 @@
                       <w:sz w:val="18"/>
                       <w:szCs w:val="18"/>
                     </w:rPr>
-                    <w:t>{#invoices} {#isFirst}{fsc}{/isFirst}</w:t>
+                    <w:t>{#invoices} {#</w:t>
+                  </w:r>
+                  <w:proofErr w:type="gramStart"/>
+                  <w:r>
+                    <w:rPr>
+                      <w:rFonts w:cstheme="minorHAnsi"/>
+                      <w:sz w:val="18"/>
+                      <w:szCs w:val="18"/>
+                    </w:rPr>
+                    <w:t>isFirst}{</w:t>
+                  </w:r>
+                  <w:proofErr w:type="gramEnd"/>
+                  <w:r>
+                    <w:rPr>
+                      <w:rFonts w:cstheme="minorHAnsi"/>
+                      <w:sz w:val="18"/>
+                      <w:szCs w:val="18"/>
+                    </w:rPr>
+                    <w:t>fsc}{/isFirst}</w:t>
                   </w:r>
                 </w:p>
               </w:tc>
@@ -3385,6 +3471,7 @@
               <w:t>finalDestination</w:t>
             </w:r>
             <w:proofErr w:type="spellEnd"/>
+            <w:proofErr w:type="gramStart"/>
             <w:r>
               <w:rPr>
                 <w:rFonts w:cstheme="minorHAnsi"/>
@@ -3399,7 +3486,16 @@
                 <w:sz w:val="20"/>
                 <w:szCs w:val="20"/>
               </w:rPr>
-              <w:t xml:space="preserve">   </w:t>
+              <w:t xml:space="preserve">  </w:t>
+            </w:r>
+            <w:proofErr w:type="gramEnd"/>
+            <w:r>
+              <w:rPr>
+                <w:rFonts w:cstheme="minorHAnsi"/>
+                <w:sz w:val="20"/>
+                <w:szCs w:val="20"/>
+              </w:rPr>
+              <w:t xml:space="preserve"> </w:t>
             </w:r>
             <w:r>
               <w:rPr>
@@ -3554,6 +3650,7 @@
               </w:rPr>
               <w:t>{#</w:t>
             </w:r>
+            <w:proofErr w:type="gramStart"/>
             <w:r>
               <w:rPr>
                 <w:rFonts w:cstheme="minorHAnsi"/>
@@ -3570,6 +3667,7 @@
               </w:rPr>
               <w:t>}{</w:t>
             </w:r>
+            <w:proofErr w:type="gramEnd"/>
             <w:r>
               <w:rPr>
                 <w:rFonts w:cstheme="minorHAnsi"/>
@@ -3837,6 +3935,7 @@
                     <w:t xml:space="preserve">Total </w:t>
                   </w:r>
                   <w:proofErr w:type="spellStart"/>
+                  <w:proofErr w:type="gramStart"/>
                   <w:r>
                     <w:rPr>
                       <w:rFonts w:cstheme="minorHAnsi"/>
@@ -3846,6 +3945,7 @@
                     <w:t>Sq.Meter</w:t>
                   </w:r>
                   <w:proofErr w:type="spellEnd"/>
+                  <w:proofErr w:type="gramEnd"/>
                   <w:r>
                     <w:rPr>
                       <w:rFonts w:cstheme="minorHAnsi"/>
@@ -3994,7 +4094,25 @@
                       <w:sz w:val="20"/>
                       <w:szCs w:val="20"/>
                     </w:rPr>
-                    <w:t>Avg./Wt.(Kg)</w:t>
+                    <w:t>Avg./</w:t>
+                  </w:r>
+                  <w:proofErr w:type="gramStart"/>
+                  <w:r>
+                    <w:rPr>
+                      <w:rFonts w:cstheme="minorHAnsi"/>
+                      <w:sz w:val="20"/>
+                      <w:szCs w:val="20"/>
+                    </w:rPr>
+                    <w:t>Wt.(</w:t>
+                  </w:r>
+                  <w:proofErr w:type="gramEnd"/>
+                  <w:r>
+                    <w:rPr>
+                      <w:rFonts w:cstheme="minorHAnsi"/>
+                      <w:sz w:val="20"/>
+                      <w:szCs w:val="20"/>
+                    </w:rPr>
+                    <w:t>Kg)</w:t>
                   </w:r>
                 </w:p>
               </w:tc>
@@ -4077,6 +4195,7 @@
                     </w:rPr>
                     <w:t>{#</w:t>
                   </w:r>
+                  <w:proofErr w:type="gramStart"/>
                   <w:r>
                     <w:rPr>
                       <w:rFonts w:cstheme="minorHAnsi"/>
@@ -4093,6 +4212,7 @@
                     </w:rPr>
                     <w:t>}{</w:t>
                   </w:r>
+                  <w:proofErr w:type="gramEnd"/>
                   <w:r>
                     <w:rPr>
                       <w:rFonts w:cstheme="minorHAnsi"/>
@@ -5002,7 +5122,16 @@
         <w:bCs/>
         <w:spacing w:val="60"/>
       </w:rPr>
-      <w:t xml:space="preserve">  </w:t>
+      <w:t xml:space="preserve"> </w:t>
+    </w:r>
+    <w:proofErr w:type="gramStart"/>
+    <w:r>
+      <w:rPr>
+        <w:b/>
+        <w:bCs/>
+        <w:spacing w:val="60"/>
+      </w:rPr>
+      <w:t xml:space="preserve"> </w:t>
     </w:r>
     <w:r>
       <w:rPr>
@@ -5026,7 +5155,16 @@
         <w:bCs/>
         <w:spacing w:val="60"/>
       </w:rPr>
-      <w:t>(I)</w:t>
+      <w:t>(</w:t>
+    </w:r>
+    <w:proofErr w:type="gramEnd"/>
+    <w:r>
+      <w:rPr>
+        <w:b/>
+        <w:bCs/>
+        <w:spacing w:val="60"/>
+      </w:rPr>
+      <w:t>I)</w:t>
     </w:r>
     <w:r>
       <w:rPr>
@@ -5792,7 +5930,6 @@
   <w:style w:type="character" w:default="1" w:styleId="DefaultParagraphFont">
     <w:name w:val="Default Paragraph Font"/>
     <w:uiPriority w:val="1"/>
-    <w:semiHidden/>
     <w:unhideWhenUsed/>
   </w:style>
   <w:style w:type="table" w:default="1" w:styleId="TableNormal">

</xml_diff>

<commit_message>
condition render swift,branch,tele,email re add
</commit_message>
<xml_diff>
--- a/electron/database/generate-document/templates/custom-invoice.docx
+++ b/electron/database/generate-document/templates/custom-invoice.docx
@@ -689,33 +689,39 @@
                 <w:sz w:val="20"/>
                 <w:szCs w:val="20"/>
               </w:rPr>
+              <w:t>{#isUK}</w:t>
+            </w:r>
+            <w:r>
+              <w:rPr>
+                <w:rFonts w:cstheme="minorHAnsi"/>
+                <w:sz w:val="20"/>
+                <w:szCs w:val="20"/>
+              </w:rPr>
               <w:t>{#</w:t>
             </w:r>
-            <w:proofErr w:type="gramStart"/>
-            <w:r>
-              <w:rPr>
-                <w:rFonts w:cstheme="minorHAnsi"/>
-                <w:sz w:val="20"/>
-                <w:szCs w:val="20"/>
-              </w:rPr>
-              <w:t>isUK}</w:t>
-            </w:r>
-            <w:r>
-              <w:rPr>
-                <w:rFonts w:cstheme="minorHAnsi"/>
-                <w:sz w:val="20"/>
-                <w:szCs w:val="20"/>
-              </w:rPr>
-              <w:t>TELE</w:t>
-            </w:r>
-            <w:proofErr w:type="gramEnd"/>
-            <w:r>
-              <w:rPr>
-                <w:rFonts w:cstheme="minorHAnsi"/>
-                <w:sz w:val="20"/>
-                <w:szCs w:val="20"/>
-              </w:rPr>
-              <w:t>: {</w:t>
+            <w:r>
+              <w:rPr>
+                <w:rFonts w:cstheme="minorHAnsi"/>
+                <w:sz w:val="20"/>
+                <w:szCs w:val="20"/>
+              </w:rPr>
+              <w:t>consigneePhone</w:t>
+            </w:r>
+            <w:r>
+              <w:rPr>
+                <w:rFonts w:cstheme="minorHAnsi"/>
+                <w:sz w:val="20"/>
+                <w:szCs w:val="20"/>
+              </w:rPr>
+              <w:t>}</w:t>
+            </w:r>
+            <w:r>
+              <w:rPr>
+                <w:rFonts w:cstheme="minorHAnsi"/>
+                <w:sz w:val="20"/>
+                <w:szCs w:val="20"/>
+              </w:rPr>
+              <w:t>TELE: {</w:t>
             </w:r>
             <w:proofErr w:type="spellStart"/>
             <w:r>
@@ -733,17 +739,67 @@
                 <w:sz w:val="20"/>
                 <w:szCs w:val="20"/>
               </w:rPr>
-              <w:t xml:space="preserve">} </w:t>
-            </w:r>
-          </w:p>
-          <w:p>
-            <w:pPr>
-              <w:rPr>
-                <w:rFonts w:cstheme="minorHAnsi"/>
-                <w:sz w:val="20"/>
-                <w:szCs w:val="20"/>
-              </w:rPr>
-            </w:pPr>
+              <w:t>}</w:t>
+            </w:r>
+            <w:r>
+              <w:rPr>
+                <w:rFonts w:cstheme="minorHAnsi"/>
+                <w:sz w:val="20"/>
+                <w:szCs w:val="20"/>
+              </w:rPr>
+              <w:t>{/</w:t>
+            </w:r>
+            <w:proofErr w:type="spellStart"/>
+            <w:r>
+              <w:rPr>
+                <w:rFonts w:cstheme="minorHAnsi"/>
+                <w:sz w:val="20"/>
+                <w:szCs w:val="20"/>
+              </w:rPr>
+              <w:t>consigneePhone</w:t>
+            </w:r>
+            <w:proofErr w:type="spellEnd"/>
+            <w:r>
+              <w:rPr>
+                <w:rFonts w:cstheme="minorHAnsi"/>
+                <w:sz w:val="20"/>
+                <w:szCs w:val="20"/>
+              </w:rPr>
+              <w:t>}</w:t>
+            </w:r>
+          </w:p>
+          <w:p>
+            <w:pPr>
+              <w:rPr>
+                <w:rFonts w:cstheme="minorHAnsi"/>
+                <w:sz w:val="20"/>
+                <w:szCs w:val="20"/>
+              </w:rPr>
+            </w:pPr>
+            <w:r>
+              <w:rPr>
+                <w:rFonts w:cstheme="minorHAnsi"/>
+                <w:sz w:val="20"/>
+                <w:szCs w:val="20"/>
+              </w:rPr>
+              <w:t>{#</w:t>
+            </w:r>
+            <w:r>
+              <w:rPr>
+                <w:rFonts w:cstheme="minorHAnsi"/>
+                <w:sz w:val="20"/>
+                <w:szCs w:val="20"/>
+              </w:rPr>
+              <w:t>consigneeEmail</w:t>
+            </w:r>
+            <w:r>
+              <w:rPr>
+                <w:rFonts w:cstheme="minorHAnsi"/>
+                <w:sz w:val="20"/>
+                <w:szCs w:val="20"/>
+              </w:rPr>
+              <w:t>}</w:t>
+            </w:r>
             <w:r>
               <w:rPr>
                 <w:rFonts w:cstheme="minorHAnsi"/>
@@ -758,7 +814,49 @@
                 <w:sz w:val="20"/>
                 <w:szCs w:val="20"/>
               </w:rPr>
-              <w:t>: {</w:t>
+              <w:t>:</w:t>
+            </w:r>
+            <w:r>
+              <w:rPr>
+                <w:rFonts w:cstheme="minorHAnsi"/>
+                <w:sz w:val="20"/>
+                <w:szCs w:val="20"/>
+              </w:rPr>
+              <w:t xml:space="preserve"> </w:t>
+            </w:r>
+            <w:r>
+              <w:rPr>
+                <w:rFonts w:cstheme="minorHAnsi"/>
+                <w:sz w:val="20"/>
+                <w:szCs w:val="20"/>
+              </w:rPr>
+              <w:t>{</w:t>
+            </w:r>
+            <w:proofErr w:type="spellStart"/>
+            <w:r>
+              <w:rPr>
+                <w:rFonts w:cstheme="minorHAnsi"/>
+                <w:sz w:val="20"/>
+                <w:szCs w:val="20"/>
+              </w:rPr>
+              <w:t>consigneeEmail</w:t>
+            </w:r>
+            <w:proofErr w:type="spellEnd"/>
+            <w:r>
+              <w:rPr>
+                <w:rFonts w:cstheme="minorHAnsi"/>
+                <w:sz w:val="20"/>
+                <w:szCs w:val="20"/>
+              </w:rPr>
+              <w:t>}</w:t>
+            </w:r>
+            <w:r>
+              <w:rPr>
+                <w:rFonts w:cstheme="minorHAnsi"/>
+                <w:sz w:val="20"/>
+                <w:szCs w:val="20"/>
+              </w:rPr>
+              <w:t>{/</w:t>
             </w:r>
             <w:proofErr w:type="spellStart"/>
             <w:r>
@@ -1907,7 +2005,6 @@
                     <w:t xml:space="preserve">Total </w:t>
                   </w:r>
                   <w:proofErr w:type="spellStart"/>
-                  <w:proofErr w:type="gramStart"/>
                   <w:r>
                     <w:rPr>
                       <w:rFonts w:cstheme="minorHAnsi"/>
@@ -1919,7 +2016,6 @@
                     <w:t>Sq.Mt</w:t>
                   </w:r>
                   <w:proofErr w:type="spellEnd"/>
-                  <w:proofErr w:type="gramEnd"/>
                 </w:p>
               </w:tc>
               <w:tc>
@@ -2248,34 +2344,7 @@
                       <w:sz w:val="18"/>
                       <w:szCs w:val="18"/>
                     </w:rPr>
-                    <w:t>{#</w:t>
-                  </w:r>
-                  <w:proofErr w:type="gramStart"/>
-                  <w:r>
-                    <w:rPr>
-                      <w:rFonts w:cstheme="minorHAnsi"/>
-                      <w:sz w:val="18"/>
-                      <w:szCs w:val="18"/>
-                    </w:rPr>
-                    <w:t>CIItems}{</w:t>
-                  </w:r>
-                  <w:proofErr w:type="gramEnd"/>
-                  <w:r>
-                    <w:rPr>
-                      <w:rFonts w:cstheme="minorHAnsi"/>
-                      <w:sz w:val="18"/>
-                      <w:szCs w:val="18"/>
-                    </w:rPr>
-                    <w:t>#</w:t>
-                  </w:r>
-                  <w:proofErr w:type="gramStart"/>
-                  <w:r>
-                    <w:rPr>
-                      <w:rFonts w:cstheme="minorHAnsi"/>
-                      <w:sz w:val="18"/>
-                      <w:szCs w:val="18"/>
-                    </w:rPr>
-                    <w:t>showThickness}</w:t>
+                    <w:t>{#CIItems}{#showThickness}</w:t>
                   </w:r>
                   <w:r>
                     <w:rPr>
@@ -2285,18 +2354,7 @@
                       <w:sz w:val="18"/>
                       <w:szCs w:val="18"/>
                     </w:rPr>
-                    <w:t>{</w:t>
-                  </w:r>
-                  <w:proofErr w:type="gramEnd"/>
-                  <w:r>
-                    <w:rPr>
-                      <w:rFonts w:cstheme="minorHAnsi"/>
-                      <w:b/>
-                      <w:bCs/>
-                      <w:sz w:val="18"/>
-                      <w:szCs w:val="18"/>
-                    </w:rPr>
-                    <w:t>thicknessDetail</w:t>
+                    <w:t>{thicknessDetail</w:t>
                   </w:r>
                   <w:r>
                     <w:rPr>
@@ -2499,19 +2557,9 @@
                       <w:sz w:val="18"/>
                       <w:szCs w:val="18"/>
                     </w:rPr>
-                    <w:t>COMMISION-</w:t>
-                  </w:r>
-                  <w:proofErr w:type="gramStart"/>
-                  <w:r>
-                    <w:rPr>
-                      <w:rFonts w:cstheme="minorHAnsi"/>
-                      <w:sz w:val="18"/>
-                      <w:szCs w:val="18"/>
-                    </w:rPr>
-                    <w:t>USD.{</w:t>
+                    <w:t>COMMISION-USD.{</w:t>
                   </w:r>
                   <w:proofErr w:type="spellStart"/>
-                  <w:proofErr w:type="gramEnd"/>
                   <w:r>
                     <w:rPr>
                       <w:rFonts w:cstheme="minorHAnsi"/>
@@ -2648,25 +2696,7 @@
                       <w:sz w:val="18"/>
                       <w:szCs w:val="18"/>
                     </w:rPr>
-                    <w:t>{#invoices} {#</w:t>
-                  </w:r>
-                  <w:proofErr w:type="gramStart"/>
-                  <w:r>
-                    <w:rPr>
-                      <w:rFonts w:cstheme="minorHAnsi"/>
-                      <w:sz w:val="18"/>
-                      <w:szCs w:val="18"/>
-                    </w:rPr>
-                    <w:t>isFirst}{</w:t>
-                  </w:r>
-                  <w:proofErr w:type="gramEnd"/>
-                  <w:r>
-                    <w:rPr>
-                      <w:rFonts w:cstheme="minorHAnsi"/>
-                      <w:sz w:val="18"/>
-                      <w:szCs w:val="18"/>
-                    </w:rPr>
-                    <w:t>fsc}{/isFirst}</w:t>
+                    <w:t>{#invoices} {#isFirst}{fsc}{/isFirst}</w:t>
                   </w:r>
                 </w:p>
               </w:tc>
@@ -3471,7 +3501,6 @@
               <w:t>finalDestination</w:t>
             </w:r>
             <w:proofErr w:type="spellEnd"/>
-            <w:proofErr w:type="gramStart"/>
             <w:r>
               <w:rPr>
                 <w:rFonts w:cstheme="minorHAnsi"/>
@@ -3486,16 +3515,7 @@
                 <w:sz w:val="20"/>
                 <w:szCs w:val="20"/>
               </w:rPr>
-              <w:t xml:space="preserve">  </w:t>
-            </w:r>
-            <w:proofErr w:type="gramEnd"/>
-            <w:r>
-              <w:rPr>
-                <w:rFonts w:cstheme="minorHAnsi"/>
-                <w:sz w:val="20"/>
-                <w:szCs w:val="20"/>
-              </w:rPr>
-              <w:t xml:space="preserve"> </w:t>
+              <w:t xml:space="preserve">   </w:t>
             </w:r>
             <w:r>
               <w:rPr>
@@ -3650,7 +3670,6 @@
               </w:rPr>
               <w:t>{#</w:t>
             </w:r>
-            <w:proofErr w:type="gramStart"/>
             <w:r>
               <w:rPr>
                 <w:rFonts w:cstheme="minorHAnsi"/>
@@ -3667,7 +3686,6 @@
               </w:rPr>
               <w:t>}{</w:t>
             </w:r>
-            <w:proofErr w:type="gramEnd"/>
             <w:r>
               <w:rPr>
                 <w:rFonts w:cstheme="minorHAnsi"/>
@@ -3935,7 +3953,6 @@
                     <w:t xml:space="preserve">Total </w:t>
                   </w:r>
                   <w:proofErr w:type="spellStart"/>
-                  <w:proofErr w:type="gramStart"/>
                   <w:r>
                     <w:rPr>
                       <w:rFonts w:cstheme="minorHAnsi"/>
@@ -3945,7 +3962,6 @@
                     <w:t>Sq.Meter</w:t>
                   </w:r>
                   <w:proofErr w:type="spellEnd"/>
-                  <w:proofErr w:type="gramEnd"/>
                   <w:r>
                     <w:rPr>
                       <w:rFonts w:cstheme="minorHAnsi"/>
@@ -4094,25 +4110,7 @@
                       <w:sz w:val="20"/>
                       <w:szCs w:val="20"/>
                     </w:rPr>
-                    <w:t>Avg./</w:t>
-                  </w:r>
-                  <w:proofErr w:type="gramStart"/>
-                  <w:r>
-                    <w:rPr>
-                      <w:rFonts w:cstheme="minorHAnsi"/>
-                      <w:sz w:val="20"/>
-                      <w:szCs w:val="20"/>
-                    </w:rPr>
-                    <w:t>Wt.(</w:t>
-                  </w:r>
-                  <w:proofErr w:type="gramEnd"/>
-                  <w:r>
-                    <w:rPr>
-                      <w:rFonts w:cstheme="minorHAnsi"/>
-                      <w:sz w:val="20"/>
-                      <w:szCs w:val="20"/>
-                    </w:rPr>
-                    <w:t>Kg)</w:t>
+                    <w:t>Avg./Wt.(Kg)</w:t>
                   </w:r>
                 </w:p>
               </w:tc>
@@ -4193,9 +4191,9 @@
                       <w:sz w:val="20"/>
                       <w:szCs w:val="20"/>
                     </w:rPr>
+                    <w:lastRenderedPageBreak/>
                     <w:t>{#</w:t>
                   </w:r>
-                  <w:proofErr w:type="gramStart"/>
                   <w:r>
                     <w:rPr>
                       <w:rFonts w:cstheme="minorHAnsi"/>
@@ -4212,7 +4210,6 @@
                     </w:rPr>
                     <w:t>}{</w:t>
                   </w:r>
-                  <w:proofErr w:type="gramEnd"/>
                   <w:r>
                     <w:rPr>
                       <w:rFonts w:cstheme="minorHAnsi"/>
@@ -5122,16 +5119,7 @@
         <w:bCs/>
         <w:spacing w:val="60"/>
       </w:rPr>
-      <w:t xml:space="preserve"> </w:t>
-    </w:r>
-    <w:proofErr w:type="gramStart"/>
-    <w:r>
-      <w:rPr>
-        <w:b/>
-        <w:bCs/>
-        <w:spacing w:val="60"/>
-      </w:rPr>
-      <w:t xml:space="preserve"> </w:t>
+      <w:t xml:space="preserve">  </w:t>
     </w:r>
     <w:r>
       <w:rPr>
@@ -5155,16 +5143,7 @@
         <w:bCs/>
         <w:spacing w:val="60"/>
       </w:rPr>
-      <w:t>(</w:t>
-    </w:r>
-    <w:proofErr w:type="gramEnd"/>
-    <w:r>
-      <w:rPr>
-        <w:b/>
-        <w:bCs/>
-        <w:spacing w:val="60"/>
-      </w:rPr>
-      <w:t>I)</w:t>
+      <w:t>(I)</w:t>
     </w:r>
     <w:r>
       <w:rPr>
@@ -5930,6 +5909,7 @@
   <w:style w:type="character" w:default="1" w:styleId="DefaultParagraphFont">
     <w:name w:val="Default Paragraph Font"/>
     <w:uiPriority w:val="1"/>
+    <w:semiHidden/>
     <w:unhideWhenUsed/>
   </w:style>
   <w:style w:type="table" w:default="1" w:styleId="TableNormal">

</xml_diff>

<commit_message>
sample box add brand grade desing and finish
</commit_message>
<xml_diff>
--- a/electron/database/generate-document/templates/custom-invoice.docx
+++ b/electron/database/generate-document/templates/custom-invoice.docx
@@ -689,16 +689,140 @@
                 <w:sz w:val="20"/>
                 <w:szCs w:val="20"/>
               </w:rPr>
+              <w:t>{#isUK}</w:t>
+            </w:r>
+            <w:r>
+              <w:rPr>
+                <w:rFonts w:cstheme="minorHAnsi"/>
+                <w:sz w:val="20"/>
+                <w:szCs w:val="20"/>
+              </w:rPr>
               <w:t>{#</w:t>
             </w:r>
-            <w:proofErr w:type="gramStart"/>
-            <w:r>
-              <w:rPr>
-                <w:rFonts w:cstheme="minorHAnsi"/>
-                <w:sz w:val="20"/>
-                <w:szCs w:val="20"/>
-              </w:rPr>
-              <w:t>isUK}</w:t>
+            <w:r>
+              <w:rPr>
+                <w:rFonts w:cstheme="minorHAnsi"/>
+                <w:sz w:val="20"/>
+                <w:szCs w:val="20"/>
+              </w:rPr>
+              <w:t>consigneePhone</w:t>
+            </w:r>
+            <w:r>
+              <w:rPr>
+                <w:rFonts w:cstheme="minorHAnsi"/>
+                <w:sz w:val="20"/>
+                <w:szCs w:val="20"/>
+              </w:rPr>
+              <w:t>}</w:t>
+            </w:r>
+            <w:r>
+              <w:rPr>
+                <w:rFonts w:cstheme="minorHAnsi"/>
+                <w:sz w:val="20"/>
+                <w:szCs w:val="20"/>
+              </w:rPr>
+              <w:t>TELE: {</w:t>
+            </w:r>
+            <w:proofErr w:type="spellStart"/>
+            <w:r>
+              <w:rPr>
+                <w:rFonts w:cstheme="minorHAnsi"/>
+                <w:sz w:val="20"/>
+                <w:szCs w:val="20"/>
+              </w:rPr>
+              <w:t>consigneePhone</w:t>
+            </w:r>
+            <w:proofErr w:type="spellEnd"/>
+            <w:r>
+              <w:rPr>
+                <w:rFonts w:cstheme="minorHAnsi"/>
+                <w:sz w:val="20"/>
+                <w:szCs w:val="20"/>
+              </w:rPr>
+              <w:t>}</w:t>
+            </w:r>
+            <w:r>
+              <w:rPr>
+                <w:rFonts w:cstheme="minorHAnsi"/>
+                <w:sz w:val="20"/>
+                <w:szCs w:val="20"/>
+              </w:rPr>
+              <w:t>{/</w:t>
+            </w:r>
+            <w:proofErr w:type="spellStart"/>
+            <w:r>
+              <w:rPr>
+                <w:rFonts w:cstheme="minorHAnsi"/>
+                <w:sz w:val="20"/>
+                <w:szCs w:val="20"/>
+              </w:rPr>
+              <w:t>consigneePhone</w:t>
+            </w:r>
+            <w:proofErr w:type="spellEnd"/>
+            <w:r>
+              <w:rPr>
+                <w:rFonts w:cstheme="minorHAnsi"/>
+                <w:sz w:val="20"/>
+                <w:szCs w:val="20"/>
+              </w:rPr>
+              <w:t>}</w:t>
+            </w:r>
+          </w:p>
+          <w:p>
+            <w:pPr>
+              <w:rPr>
+                <w:rFonts w:cstheme="minorHAnsi"/>
+                <w:sz w:val="20"/>
+                <w:szCs w:val="20"/>
+              </w:rPr>
+            </w:pPr>
+            <w:r>
+              <w:rPr>
+                <w:rFonts w:cstheme="minorHAnsi"/>
+                <w:sz w:val="20"/>
+                <w:szCs w:val="20"/>
+              </w:rPr>
+              <w:t>{#</w:t>
+            </w:r>
+            <w:r>
+              <w:rPr>
+                <w:rFonts w:cstheme="minorHAnsi"/>
+                <w:sz w:val="20"/>
+                <w:szCs w:val="20"/>
+              </w:rPr>
+              <w:t>consigneeEmail</w:t>
+            </w:r>
+            <w:r>
+              <w:rPr>
+                <w:rFonts w:cstheme="minorHAnsi"/>
+                <w:sz w:val="20"/>
+                <w:szCs w:val="20"/>
+              </w:rPr>
+              <w:t>}</w:t>
+            </w:r>
+            <w:r>
+              <w:rPr>
+                <w:rFonts w:cstheme="minorHAnsi"/>
+                <w:sz w:val="20"/>
+                <w:szCs w:val="20"/>
+              </w:rPr>
+              <w:t>EMAIL</w:t>
+            </w:r>
+            <w:r>
+              <w:rPr>
+                <w:rFonts w:cstheme="minorHAnsi"/>
+                <w:sz w:val="20"/>
+                <w:szCs w:val="20"/>
+              </w:rPr>
+              <w:t>:</w:t>
+            </w:r>
+            <w:r>
+              <w:rPr>
+                <w:rFonts w:cstheme="minorHAnsi"/>
+                <w:sz w:val="20"/>
+                <w:szCs w:val="20"/>
+              </w:rPr>
+              <w:t xml:space="preserve"> </w:t>
             </w:r>
             <w:r>
               <w:rPr>
@@ -708,24 +832,16 @@
               </w:rPr>
               <w:t>{</w:t>
             </w:r>
-            <w:proofErr w:type="gramEnd"/>
-            <w:r>
-              <w:rPr>
-                <w:rFonts w:cstheme="minorHAnsi"/>
-                <w:sz w:val="20"/>
-                <w:szCs w:val="20"/>
-              </w:rPr>
-              <w:t>#</w:t>
-            </w:r>
-            <w:proofErr w:type="gramStart"/>
-            <w:r>
-              <w:rPr>
-                <w:rFonts w:cstheme="minorHAnsi"/>
-                <w:sz w:val="20"/>
-                <w:szCs w:val="20"/>
-              </w:rPr>
-              <w:t>consigneePhone</w:t>
-            </w:r>
+            <w:proofErr w:type="spellStart"/>
+            <w:r>
+              <w:rPr>
+                <w:rFonts w:cstheme="minorHAnsi"/>
+                <w:sz w:val="20"/>
+                <w:szCs w:val="20"/>
+              </w:rPr>
+              <w:t>consigneeEmail</w:t>
+            </w:r>
+            <w:proofErr w:type="spellEnd"/>
             <w:r>
               <w:rPr>
                 <w:rFonts w:cstheme="minorHAnsi"/>
@@ -740,16 +856,7 @@
                 <w:sz w:val="20"/>
                 <w:szCs w:val="20"/>
               </w:rPr>
-              <w:t>TELE</w:t>
-            </w:r>
-            <w:proofErr w:type="gramEnd"/>
-            <w:r>
-              <w:rPr>
-                <w:rFonts w:cstheme="minorHAnsi"/>
-                <w:sz w:val="20"/>
-                <w:szCs w:val="20"/>
-              </w:rPr>
-              <w:t>: {</w:t>
+              <w:t>{/</w:t>
             </w:r>
             <w:proofErr w:type="spellStart"/>
             <w:r>
@@ -758,7 +865,7 @@
                 <w:sz w:val="20"/>
                 <w:szCs w:val="20"/>
               </w:rPr>
-              <w:t>consigneePhone</w:t>
+              <w:t>consigneeEmail</w:t>
             </w:r>
             <w:proofErr w:type="spellEnd"/>
             <w:r>
@@ -776,153 +883,6 @@
                 <w:szCs w:val="20"/>
               </w:rPr>
               <w:t>{/</w:t>
-            </w:r>
-            <w:proofErr w:type="spellStart"/>
-            <w:r>
-              <w:rPr>
-                <w:rFonts w:cstheme="minorHAnsi"/>
-                <w:sz w:val="20"/>
-                <w:szCs w:val="20"/>
-              </w:rPr>
-              <w:t>consigneePhone</w:t>
-            </w:r>
-            <w:proofErr w:type="spellEnd"/>
-            <w:r>
-              <w:rPr>
-                <w:rFonts w:cstheme="minorHAnsi"/>
-                <w:sz w:val="20"/>
-                <w:szCs w:val="20"/>
-              </w:rPr>
-              <w:t>}</w:t>
-            </w:r>
-          </w:p>
-          <w:p>
-            <w:pPr>
-              <w:rPr>
-                <w:rFonts w:cstheme="minorHAnsi"/>
-                <w:sz w:val="20"/>
-                <w:szCs w:val="20"/>
-              </w:rPr>
-            </w:pPr>
-            <w:r>
-              <w:rPr>
-                <w:rFonts w:cstheme="minorHAnsi"/>
-                <w:sz w:val="20"/>
-                <w:szCs w:val="20"/>
-              </w:rPr>
-              <w:t>{#</w:t>
-            </w:r>
-            <w:proofErr w:type="gramStart"/>
-            <w:r>
-              <w:rPr>
-                <w:rFonts w:cstheme="minorHAnsi"/>
-                <w:sz w:val="20"/>
-                <w:szCs w:val="20"/>
-              </w:rPr>
-              <w:t>consigneeEmail</w:t>
-            </w:r>
-            <w:r>
-              <w:rPr>
-                <w:rFonts w:cstheme="minorHAnsi"/>
-                <w:sz w:val="20"/>
-                <w:szCs w:val="20"/>
-              </w:rPr>
-              <w:t>}</w:t>
-            </w:r>
-            <w:r>
-              <w:rPr>
-                <w:rFonts w:cstheme="minorHAnsi"/>
-                <w:sz w:val="20"/>
-                <w:szCs w:val="20"/>
-              </w:rPr>
-              <w:t>EMAIL</w:t>
-            </w:r>
-            <w:proofErr w:type="gramEnd"/>
-            <w:r>
-              <w:rPr>
-                <w:rFonts w:cstheme="minorHAnsi"/>
-                <w:sz w:val="20"/>
-                <w:szCs w:val="20"/>
-              </w:rPr>
-              <w:t>:</w:t>
-            </w:r>
-            <w:r>
-              <w:rPr>
-                <w:rFonts w:cstheme="minorHAnsi"/>
-                <w:sz w:val="20"/>
-                <w:szCs w:val="20"/>
-              </w:rPr>
-              <w:t xml:space="preserve"> </w:t>
-            </w:r>
-            <w:r>
-              <w:rPr>
-                <w:rFonts w:cstheme="minorHAnsi"/>
-                <w:sz w:val="20"/>
-                <w:szCs w:val="20"/>
-              </w:rPr>
-              <w:t>{</w:t>
-            </w:r>
-            <w:proofErr w:type="spellStart"/>
-            <w:r>
-              <w:rPr>
-                <w:rFonts w:cstheme="minorHAnsi"/>
-                <w:sz w:val="20"/>
-                <w:szCs w:val="20"/>
-              </w:rPr>
-              <w:t>consigneeEmail</w:t>
-            </w:r>
-            <w:proofErr w:type="spellEnd"/>
-            <w:r>
-              <w:rPr>
-                <w:rFonts w:cstheme="minorHAnsi"/>
-                <w:sz w:val="20"/>
-                <w:szCs w:val="20"/>
-              </w:rPr>
-              <w:t>}</w:t>
-            </w:r>
-            <w:r>
-              <w:rPr>
-                <w:rFonts w:cstheme="minorHAnsi"/>
-                <w:sz w:val="20"/>
-                <w:szCs w:val="20"/>
-              </w:rPr>
-              <w:t>{/</w:t>
-            </w:r>
-            <w:proofErr w:type="spellStart"/>
-            <w:proofErr w:type="gramStart"/>
-            <w:r>
-              <w:rPr>
-                <w:rFonts w:cstheme="minorHAnsi"/>
-                <w:sz w:val="20"/>
-                <w:szCs w:val="20"/>
-              </w:rPr>
-              <w:t>consigneeEmail</w:t>
-            </w:r>
-            <w:proofErr w:type="spellEnd"/>
-            <w:r>
-              <w:rPr>
-                <w:rFonts w:cstheme="minorHAnsi"/>
-                <w:sz w:val="20"/>
-                <w:szCs w:val="20"/>
-              </w:rPr>
-              <w:t>}</w:t>
-            </w:r>
-            <w:r>
-              <w:rPr>
-                <w:rFonts w:cstheme="minorHAnsi"/>
-                <w:sz w:val="20"/>
-                <w:szCs w:val="20"/>
-              </w:rPr>
-              <w:t>{</w:t>
-            </w:r>
-            <w:proofErr w:type="gramEnd"/>
-            <w:r>
-              <w:rPr>
-                <w:rFonts w:cstheme="minorHAnsi"/>
-                <w:sz w:val="20"/>
-                <w:szCs w:val="20"/>
-              </w:rPr>
-              <w:t>/</w:t>
             </w:r>
             <w:proofErr w:type="spellStart"/>
             <w:r>
@@ -1898,7 +1858,8 @@
               <w:tblLook w:val="04A0" w:firstRow="1" w:lastRow="0" w:firstColumn="1" w:lastColumn="0" w:noHBand="0" w:noVBand="1"/>
             </w:tblPr>
             <w:tblGrid>
-              <w:gridCol w:w="2934"/>
+              <w:gridCol w:w="1467"/>
+              <w:gridCol w:w="1467"/>
               <w:gridCol w:w="3668"/>
               <w:gridCol w:w="1001"/>
               <w:gridCol w:w="1144"/>
@@ -1912,6 +1873,7 @@
               <w:tc>
                 <w:tcPr>
                   <w:tcW w:w="2934" w:type="dxa"/>
+                  <w:gridSpan w:val="2"/>
                   <w:tcBorders>
                     <w:right w:val="nil"/>
                   </w:tcBorders>
@@ -2045,7 +2007,6 @@
                     <w:t xml:space="preserve">Total </w:t>
                   </w:r>
                   <w:proofErr w:type="spellStart"/>
-                  <w:proofErr w:type="gramStart"/>
                   <w:r>
                     <w:rPr>
                       <w:rFonts w:cstheme="minorHAnsi"/>
@@ -2057,7 +2018,6 @@
                     <w:t>Sq.Mt</w:t>
                   </w:r>
                   <w:proofErr w:type="spellEnd"/>
-                  <w:proofErr w:type="gramEnd"/>
                 </w:p>
               </w:tc>
               <w:tc>
@@ -2228,6 +2188,7 @@
               <w:tc>
                 <w:tcPr>
                   <w:tcW w:w="2934" w:type="dxa"/>
+                  <w:gridSpan w:val="2"/>
                   <w:tcBorders>
                     <w:right w:val="nil"/>
                   </w:tcBorders>
@@ -2367,7 +2328,7 @@
               <w:tc>
                 <w:tcPr>
                   <w:tcW w:w="6602" w:type="dxa"/>
-                  <w:gridSpan w:val="2"/>
+                  <w:gridSpan w:val="3"/>
                   <w:vAlign w:val="center"/>
                 </w:tcPr>
                 <w:p>
@@ -2386,34 +2347,7 @@
                       <w:sz w:val="18"/>
                       <w:szCs w:val="18"/>
                     </w:rPr>
-                    <w:t>{#</w:t>
-                  </w:r>
-                  <w:proofErr w:type="gramStart"/>
-                  <w:r>
-                    <w:rPr>
-                      <w:rFonts w:cstheme="minorHAnsi"/>
-                      <w:sz w:val="18"/>
-                      <w:szCs w:val="18"/>
-                    </w:rPr>
-                    <w:t>CIItems}{</w:t>
-                  </w:r>
-                  <w:proofErr w:type="gramEnd"/>
-                  <w:r>
-                    <w:rPr>
-                      <w:rFonts w:cstheme="minorHAnsi"/>
-                      <w:sz w:val="18"/>
-                      <w:szCs w:val="18"/>
-                    </w:rPr>
-                    <w:t>#</w:t>
-                  </w:r>
-                  <w:proofErr w:type="gramStart"/>
-                  <w:r>
-                    <w:rPr>
-                      <w:rFonts w:cstheme="minorHAnsi"/>
-                      <w:sz w:val="18"/>
-                      <w:szCs w:val="18"/>
-                    </w:rPr>
-                    <w:t>showThickness}</w:t>
+                    <w:t>{#CIItems}{#showThickness}</w:t>
                   </w:r>
                   <w:r>
                     <w:rPr>
@@ -2423,18 +2357,7 @@
                       <w:sz w:val="18"/>
                       <w:szCs w:val="18"/>
                     </w:rPr>
-                    <w:t>{</w:t>
-                  </w:r>
-                  <w:proofErr w:type="gramEnd"/>
-                  <w:r>
-                    <w:rPr>
-                      <w:rFonts w:cstheme="minorHAnsi"/>
-                      <w:b/>
-                      <w:bCs/>
-                      <w:sz w:val="18"/>
-                      <w:szCs w:val="18"/>
-                    </w:rPr>
-                    <w:t>thicknessDetail</w:t>
+                    <w:t>{thicknessDetail</w:t>
                   </w:r>
                   <w:r>
                     <w:rPr>
@@ -2532,6 +2455,7 @@
               <w:tc>
                 <w:tcPr>
                   <w:tcW w:w="2934" w:type="dxa"/>
+                  <w:gridSpan w:val="2"/>
                   <w:tcBorders>
                     <w:bottom w:val="nil"/>
                     <w:right w:val="nil"/>
@@ -2637,19 +2561,9 @@
                       <w:sz w:val="18"/>
                       <w:szCs w:val="18"/>
                     </w:rPr>
-                    <w:t>COMMISION-</w:t>
-                  </w:r>
-                  <w:proofErr w:type="gramStart"/>
-                  <w:r>
-                    <w:rPr>
-                      <w:rFonts w:cstheme="minorHAnsi"/>
-                      <w:sz w:val="18"/>
-                      <w:szCs w:val="18"/>
-                    </w:rPr>
-                    <w:t>USD.{</w:t>
+                    <w:t>COMMISION-USD.{</w:t>
                   </w:r>
                   <w:proofErr w:type="spellStart"/>
-                  <w:proofErr w:type="gramEnd"/>
                   <w:r>
                     <w:rPr>
                       <w:rFonts w:cstheme="minorHAnsi"/>
@@ -2763,7 +2677,7 @@
               <w:tc>
                 <w:tcPr>
                   <w:tcW w:w="6602" w:type="dxa"/>
-                  <w:gridSpan w:val="2"/>
+                  <w:gridSpan w:val="3"/>
                   <w:tcBorders>
                     <w:bottom w:val="nil"/>
                   </w:tcBorders>
@@ -2786,25 +2700,7 @@
                       <w:sz w:val="18"/>
                       <w:szCs w:val="18"/>
                     </w:rPr>
-                    <w:t>{#invoices} {#</w:t>
-                  </w:r>
-                  <w:proofErr w:type="gramStart"/>
-                  <w:r>
-                    <w:rPr>
-                      <w:rFonts w:cstheme="minorHAnsi"/>
-                      <w:sz w:val="18"/>
-                      <w:szCs w:val="18"/>
-                    </w:rPr>
-                    <w:t>isFirst}{</w:t>
-                  </w:r>
-                  <w:proofErr w:type="gramEnd"/>
-                  <w:r>
-                    <w:rPr>
-                      <w:rFonts w:cstheme="minorHAnsi"/>
-                      <w:sz w:val="18"/>
-                      <w:szCs w:val="18"/>
-                    </w:rPr>
-                    <w:t>fsc}{/isFirst}</w:t>
+                    <w:t>{#invoices} {#isFirst}{fsc}{/isFirst}</w:t>
                   </w:r>
                 </w:p>
               </w:tc>
@@ -2955,7 +2851,7 @@
               </w:trPr>
               <w:tc>
                 <w:tcPr>
-                  <w:tcW w:w="2934" w:type="dxa"/>
+                  <w:tcW w:w="1467" w:type="dxa"/>
                   <w:tcBorders>
                     <w:bottom w:val="nil"/>
                     <w:right w:val="nil"/>
@@ -2994,15 +2890,7 @@
                       <w:sz w:val="18"/>
                       <w:szCs w:val="18"/>
                     </w:rPr>
-                    <w:t>}</w:t>
-                  </w:r>
-                  <w:r>
-                    <w:rPr>
-                      <w:rFonts w:cstheme="minorHAnsi"/>
-                      <w:sz w:val="18"/>
-                      <w:szCs w:val="18"/>
-                    </w:rPr>
-                    <w:t xml:space="preserve"> </w:t>
+                    <w:t xml:space="preserve">} </w:t>
                   </w:r>
                   <w:r>
                     <w:rPr>
@@ -3018,17 +2906,16 @@
               </w:tc>
               <w:tc>
                 <w:tcPr>
-                  <w:tcW w:w="3668" w:type="dxa"/>
+                  <w:tcW w:w="5135" w:type="dxa"/>
+                  <w:gridSpan w:val="2"/>
                   <w:tcBorders>
                     <w:left w:val="nil"/>
                     <w:bottom w:val="nil"/>
                   </w:tcBorders>
-                  <w:vAlign w:val="bottom"/>
                 </w:tcPr>
                 <w:p>
                   <w:pPr>
                     <w:pStyle w:val="NoSpacing"/>
-                    <w:framePr w:hSpace="180" w:wrap="around" w:vAnchor="page" w:hAnchor="margin" w:y="481"/>
                     <w:spacing w:before="80"/>
                     <w:jc w:val="center"/>
                     <w:rPr>
@@ -3073,7 +2960,7 @@
                       <w:sz w:val="18"/>
                       <w:szCs w:val="18"/>
                     </w:rPr>
-                    <w:t>designType</w:t>
+                    <w:t>materialGrade</w:t>
                   </w:r>
                   <w:proofErr w:type="spellEnd"/>
                   <w:r>
@@ -3082,23 +2969,25 @@
                       <w:sz w:val="18"/>
                       <w:szCs w:val="18"/>
                     </w:rPr>
-                    <w:t>}</w:t>
-                  </w:r>
+                    <w:t>}  {</w:t>
+                  </w:r>
+                  <w:proofErr w:type="spellStart"/>
                   <w:r>
                     <w:rPr>
                       <w:rFonts w:cstheme="minorHAnsi"/>
                       <w:sz w:val="18"/>
                       <w:szCs w:val="18"/>
                     </w:rPr>
-                    <w:t xml:space="preserve"> </w:t>
-                  </w:r>
+                    <w:t>brandName</w:t>
+                  </w:r>
+                  <w:proofErr w:type="spellEnd"/>
                   <w:r>
                     <w:rPr>
                       <w:rFonts w:cstheme="minorHAnsi"/>
                       <w:sz w:val="18"/>
                       <w:szCs w:val="18"/>
                     </w:rPr>
-                    <w:t xml:space="preserve">- </w:t>
+                    <w:t>}</w:t>
                   </w:r>
                   <w:r>
                     <w:rPr>
@@ -3106,7 +2995,33 @@
                       <w:sz w:val="18"/>
                       <w:szCs w:val="18"/>
                     </w:rPr>
-                    <w:t>{</w:t>
+                    <w:t xml:space="preserve"> </w:t>
+                  </w:r>
+                  <w:r>
+                    <w:rPr>
+                      <w:rFonts w:cstheme="minorHAnsi"/>
+                      <w:sz w:val="18"/>
+                      <w:szCs w:val="18"/>
+                    </w:rPr>
+                    <w:t xml:space="preserve"> {</w:t>
+                  </w:r>
+                  <w:proofErr w:type="spellStart"/>
+                  <w:r>
+                    <w:rPr>
+                      <w:rFonts w:cstheme="minorHAnsi"/>
+                      <w:sz w:val="18"/>
+                      <w:szCs w:val="18"/>
+                    </w:rPr>
+                    <w:t>designType</w:t>
+                  </w:r>
+                  <w:proofErr w:type="spellEnd"/>
+                  <w:r>
+                    <w:rPr>
+                      <w:rFonts w:cstheme="minorHAnsi"/>
+                      <w:sz w:val="18"/>
+                      <w:szCs w:val="18"/>
+                    </w:rPr>
+                    <w:t>}  {</w:t>
                   </w:r>
                   <w:proofErr w:type="spellStart"/>
                   <w:r>
@@ -3590,7 +3505,6 @@
               <w:t>{</w:t>
             </w:r>
             <w:proofErr w:type="spellStart"/>
-            <w:proofErr w:type="gramStart"/>
             <w:r>
               <w:rPr>
                 <w:rFonts w:cstheme="minorHAnsi"/>
@@ -3624,7 +3538,6 @@
               </w:rPr>
               <w:t xml:space="preserve">  </w:t>
             </w:r>
-            <w:proofErr w:type="gramEnd"/>
             <w:r>
               <w:rPr>
                 <w:rFonts w:cstheme="minorHAnsi"/>
@@ -3778,7 +3691,6 @@
               </w:rPr>
               <w:t>{#</w:t>
             </w:r>
-            <w:proofErr w:type="gramStart"/>
             <w:r>
               <w:rPr>
                 <w:rFonts w:cstheme="minorHAnsi"/>
@@ -3795,7 +3707,6 @@
               </w:rPr>
               <w:t>}{</w:t>
             </w:r>
-            <w:proofErr w:type="gramEnd"/>
             <w:r>
               <w:rPr>
                 <w:rFonts w:cstheme="minorHAnsi"/>
@@ -4063,7 +3974,6 @@
                     <w:t xml:space="preserve">Total </w:t>
                   </w:r>
                   <w:proofErr w:type="spellStart"/>
-                  <w:proofErr w:type="gramStart"/>
                   <w:r>
                     <w:rPr>
                       <w:rFonts w:cstheme="minorHAnsi"/>
@@ -4073,7 +3983,6 @@
                     <w:t>Sq.Meter</w:t>
                   </w:r>
                   <w:proofErr w:type="spellEnd"/>
-                  <w:proofErr w:type="gramEnd"/>
                   <w:r>
                     <w:rPr>
                       <w:rFonts w:cstheme="minorHAnsi"/>
@@ -4222,25 +4131,7 @@
                       <w:sz w:val="20"/>
                       <w:szCs w:val="20"/>
                     </w:rPr>
-                    <w:t>Avg./</w:t>
-                  </w:r>
-                  <w:proofErr w:type="gramStart"/>
-                  <w:r>
-                    <w:rPr>
-                      <w:rFonts w:cstheme="minorHAnsi"/>
-                      <w:sz w:val="20"/>
-                      <w:szCs w:val="20"/>
-                    </w:rPr>
-                    <w:t>Wt.(</w:t>
-                  </w:r>
-                  <w:proofErr w:type="gramEnd"/>
-                  <w:r>
-                    <w:rPr>
-                      <w:rFonts w:cstheme="minorHAnsi"/>
-                      <w:sz w:val="20"/>
-                      <w:szCs w:val="20"/>
-                    </w:rPr>
-                    <w:t>Kg)</w:t>
+                    <w:t>Avg./Wt.(Kg)</w:t>
                   </w:r>
                 </w:p>
               </w:tc>
@@ -4324,7 +4215,6 @@
                     <w:lastRenderedPageBreak/>
                     <w:t>{#</w:t>
                   </w:r>
-                  <w:proofErr w:type="gramStart"/>
                   <w:r>
                     <w:rPr>
                       <w:rFonts w:cstheme="minorHAnsi"/>
@@ -4341,7 +4231,6 @@
                     </w:rPr>
                     <w:t>}{</w:t>
                   </w:r>
-                  <w:proofErr w:type="gramEnd"/>
                   <w:r>
                     <w:rPr>
                       <w:rFonts w:cstheme="minorHAnsi"/>
@@ -5251,16 +5140,7 @@
         <w:bCs/>
         <w:spacing w:val="60"/>
       </w:rPr>
-      <w:t xml:space="preserve"> </w:t>
-    </w:r>
-    <w:proofErr w:type="gramStart"/>
-    <w:r>
-      <w:rPr>
-        <w:b/>
-        <w:bCs/>
-        <w:spacing w:val="60"/>
-      </w:rPr>
-      <w:t xml:space="preserve"> </w:t>
+      <w:t xml:space="preserve">  </w:t>
     </w:r>
     <w:r>
       <w:rPr>
@@ -5284,16 +5164,7 @@
         <w:bCs/>
         <w:spacing w:val="60"/>
       </w:rPr>
-      <w:t>(</w:t>
-    </w:r>
-    <w:proofErr w:type="gramEnd"/>
-    <w:r>
-      <w:rPr>
-        <w:b/>
-        <w:bCs/>
-        <w:spacing w:val="60"/>
-      </w:rPr>
-      <w:t>I)</w:t>
+      <w:t>(I)</w:t>
     </w:r>
     <w:r>
       <w:rPr>

</xml_diff>

<commit_message>
font size increase and remove fax and phone number
</commit_message>
<xml_diff>
--- a/electron/database/generate-document/templates/custom-invoice.docx
+++ b/electron/database/generate-document/templates/custom-invoice.docx
@@ -2232,7 +2232,7 @@
                     <w:framePr w:hSpace="180" w:wrap="around" w:vAnchor="page" w:hAnchor="margin" w:y="481"/>
                     <w:spacing w:line="276" w:lineRule="auto"/>
                     <w:rPr>
-                      <w:rFonts w:cstheme="minorHAnsi"/>
+                      <w:rFonts w:ascii="Arial" w:hAnsi="Arial" w:cs="Arial"/>
                       <w:b/>
                       <w:bCs/>
                       <w:sz w:val="20"/>
@@ -2241,7 +2241,7 @@
                   </w:pPr>
                   <w:r>
                     <w:rPr>
-                      <w:rFonts w:cstheme="minorHAnsi"/>
+                      <w:rFonts w:ascii="Arial" w:hAnsi="Arial" w:cs="Arial"/>
                       <w:b/>
                       <w:bCs/>
                       <w:sz w:val="18"/>
@@ -2265,7 +2265,7 @@
                     <w:spacing w:line="276" w:lineRule="auto"/>
                     <w:jc w:val="center"/>
                     <w:rPr>
-                      <w:rFonts w:cstheme="minorHAnsi"/>
+                      <w:rFonts w:ascii="Arial" w:hAnsi="Arial" w:cs="Arial"/>
                       <w:b/>
                       <w:bCs/>
                       <w:color w:val="000000"/>
@@ -2369,14 +2369,14 @@
                     <w:pStyle w:val="NoSpacing"/>
                     <w:framePr w:hSpace="180" w:wrap="around" w:vAnchor="page" w:hAnchor="margin" w:y="481"/>
                     <w:rPr>
-                      <w:rFonts w:cstheme="minorHAnsi"/>
+                      <w:rFonts w:ascii="Arial" w:hAnsi="Arial" w:cs="Arial"/>
                       <w:sz w:val="18"/>
                       <w:szCs w:val="18"/>
                     </w:rPr>
                   </w:pPr>
                   <w:r>
                     <w:rPr>
-                      <w:rFonts w:cstheme="minorHAnsi"/>
+                      <w:rFonts w:ascii="Arial" w:hAnsi="Arial" w:cs="Arial"/>
                       <w:sz w:val="18"/>
                       <w:szCs w:val="18"/>
                     </w:rPr>
@@ -2385,7 +2385,7 @@
                   <w:proofErr w:type="gramStart"/>
                   <w:r>
                     <w:rPr>
-                      <w:rFonts w:cstheme="minorHAnsi"/>
+                      <w:rFonts w:ascii="Arial" w:hAnsi="Arial" w:cs="Arial"/>
                       <w:sz w:val="18"/>
                       <w:szCs w:val="18"/>
                     </w:rPr>
@@ -2394,7 +2394,7 @@
                   <w:proofErr w:type="gramEnd"/>
                   <w:r>
                     <w:rPr>
-                      <w:rFonts w:cstheme="minorHAnsi"/>
+                      <w:rFonts w:ascii="Arial" w:hAnsi="Arial" w:cs="Arial"/>
                       <w:sz w:val="18"/>
                       <w:szCs w:val="18"/>
                     </w:rPr>
@@ -2403,7 +2403,7 @@
                   <w:proofErr w:type="gramStart"/>
                   <w:r>
                     <w:rPr>
-                      <w:rFonts w:cstheme="minorHAnsi"/>
+                      <w:rFonts w:ascii="Arial" w:hAnsi="Arial" w:cs="Arial"/>
                       <w:sz w:val="18"/>
                       <w:szCs w:val="18"/>
                     </w:rPr>
@@ -2411,7 +2411,7 @@
                   </w:r>
                   <w:r>
                     <w:rPr>
-                      <w:rFonts w:cstheme="minorHAnsi"/>
+                      <w:rFonts w:ascii="Arial" w:hAnsi="Arial" w:cs="Arial"/>
                       <w:b/>
                       <w:bCs/>
                       <w:sz w:val="18"/>
@@ -2422,7 +2422,7 @@
                   <w:proofErr w:type="gramEnd"/>
                   <w:r>
                     <w:rPr>
-                      <w:rFonts w:cstheme="minorHAnsi"/>
+                      <w:rFonts w:ascii="Arial" w:hAnsi="Arial" w:cs="Arial"/>
                       <w:b/>
                       <w:bCs/>
                       <w:sz w:val="18"/>
@@ -2432,7 +2432,7 @@
                   </w:r>
                   <w:r>
                     <w:rPr>
-                      <w:rFonts w:cstheme="minorHAnsi"/>
+                      <w:rFonts w:ascii="Arial" w:hAnsi="Arial" w:cs="Arial"/>
                       <w:sz w:val="18"/>
                       <w:szCs w:val="18"/>
                     </w:rPr>
@@ -2537,14 +2537,14 @@
                     <w:pStyle w:val="NoSpacing"/>
                     <w:framePr w:hSpace="180" w:wrap="around" w:vAnchor="page" w:hAnchor="margin" w:y="481"/>
                     <w:rPr>
-                      <w:rFonts w:cstheme="minorHAnsi"/>
+                      <w:rFonts w:ascii="Arial" w:hAnsi="Arial" w:cs="Arial"/>
                       <w:sz w:val="18"/>
                       <w:szCs w:val="18"/>
                     </w:rPr>
                   </w:pPr>
                   <w:r>
                     <w:rPr>
-                      <w:rFonts w:cstheme="minorHAnsi"/>
+                      <w:rFonts w:ascii="Arial" w:hAnsi="Arial" w:cs="Arial"/>
                       <w:b/>
                       <w:bCs/>
                       <w:sz w:val="18"/>
@@ -2569,14 +2569,14 @@
                     <w:framePr w:hSpace="180" w:wrap="around" w:vAnchor="page" w:hAnchor="margin" w:y="481"/>
                     <w:jc w:val="center"/>
                     <w:rPr>
-                      <w:rFonts w:cstheme="minorHAnsi"/>
+                      <w:rFonts w:ascii="Arial" w:hAnsi="Arial" w:cs="Arial"/>
                       <w:sz w:val="18"/>
                       <w:szCs w:val="18"/>
                     </w:rPr>
                   </w:pPr>
                   <w:r>
                     <w:rPr>
-                      <w:rFonts w:cstheme="minorHAnsi"/>
+                      <w:rFonts w:ascii="Arial" w:hAnsi="Arial" w:cs="Arial"/>
                       <w:sz w:val="18"/>
                       <w:szCs w:val="18"/>
                     </w:rPr>
@@ -2584,7 +2584,7 @@
                   </w:r>
                   <w:r>
                     <w:rPr>
-                      <w:rFonts w:cstheme="minorHAnsi"/>
+                      <w:rFonts w:ascii="Arial" w:hAnsi="Arial" w:cs="Arial"/>
                       <w:sz w:val="18"/>
                       <w:szCs w:val="18"/>
                     </w:rPr>
@@ -2592,7 +2592,7 @@
                   </w:r>
                   <w:r>
                     <w:rPr>
-                      <w:rFonts w:cstheme="minorHAnsi"/>
+                      <w:rFonts w:ascii="Arial" w:hAnsi="Arial" w:cs="Arial"/>
                       <w:sz w:val="18"/>
                       <w:szCs w:val="18"/>
                     </w:rPr>
@@ -2600,7 +2600,7 @@
                   </w:r>
                   <w:r>
                     <w:rPr>
-                      <w:rFonts w:cstheme="minorHAnsi"/>
+                      <w:rFonts w:ascii="Arial" w:hAnsi="Arial" w:cs="Arial"/>
                       <w:sz w:val="18"/>
                       <w:szCs w:val="18"/>
                     </w:rPr>
@@ -2608,7 +2608,7 @@
                   </w:r>
                   <w:r>
                     <w:rPr>
-                      <w:rFonts w:cstheme="minorHAnsi"/>
+                      <w:rFonts w:ascii="Arial" w:hAnsi="Arial" w:cs="Arial"/>
                       <w:sz w:val="18"/>
                       <w:szCs w:val="18"/>
                     </w:rPr>
@@ -2621,14 +2621,14 @@
                     <w:framePr w:hSpace="180" w:wrap="around" w:vAnchor="page" w:hAnchor="margin" w:y="481"/>
                     <w:jc w:val="center"/>
                     <w:rPr>
-                      <w:rFonts w:cstheme="minorHAnsi"/>
+                      <w:rFonts w:ascii="Arial" w:hAnsi="Arial" w:cs="Arial"/>
                       <w:sz w:val="18"/>
                       <w:szCs w:val="18"/>
                     </w:rPr>
                   </w:pPr>
                   <w:r>
                     <w:rPr>
-                      <w:rFonts w:cstheme="minorHAnsi"/>
+                      <w:rFonts w:ascii="Arial" w:hAnsi="Arial" w:cs="Arial"/>
                       <w:sz w:val="18"/>
                       <w:szCs w:val="18"/>
                     </w:rPr>
@@ -2637,7 +2637,7 @@
                   <w:proofErr w:type="gramStart"/>
                   <w:r>
                     <w:rPr>
-                      <w:rFonts w:cstheme="minorHAnsi"/>
+                      <w:rFonts w:ascii="Arial" w:hAnsi="Arial" w:cs="Arial"/>
                       <w:sz w:val="18"/>
                       <w:szCs w:val="18"/>
                     </w:rPr>
@@ -2647,7 +2647,7 @@
                   <w:proofErr w:type="gramEnd"/>
                   <w:r>
                     <w:rPr>
-                      <w:rFonts w:cstheme="minorHAnsi"/>
+                      <w:rFonts w:ascii="Arial" w:hAnsi="Arial" w:cs="Arial"/>
                       <w:sz w:val="18"/>
                       <w:szCs w:val="18"/>
                     </w:rPr>
@@ -2656,7 +2656,7 @@
                   <w:proofErr w:type="spellEnd"/>
                   <w:r>
                     <w:rPr>
-                      <w:rFonts w:cstheme="minorHAnsi"/>
+                      <w:rFonts w:ascii="Arial" w:hAnsi="Arial" w:cs="Arial"/>
                       <w:sz w:val="18"/>
                       <w:szCs w:val="18"/>
                     </w:rPr>
@@ -2665,7 +2665,7 @@
                   <w:proofErr w:type="spellStart"/>
                   <w:r>
                     <w:rPr>
-                      <w:rFonts w:cstheme="minorHAnsi"/>
+                      <w:rFonts w:ascii="Arial" w:hAnsi="Arial" w:cs="Arial"/>
                       <w:sz w:val="18"/>
                       <w:szCs w:val="18"/>
                     </w:rPr>
@@ -2674,7 +2674,7 @@
                   <w:proofErr w:type="spellEnd"/>
                   <w:r>
                     <w:rPr>
-                      <w:rFonts w:cstheme="minorHAnsi"/>
+                      <w:rFonts w:ascii="Arial" w:hAnsi="Arial" w:cs="Arial"/>
                       <w:sz w:val="18"/>
                       <w:szCs w:val="18"/>
                     </w:rPr>
@@ -2770,14 +2770,14 @@
                     <w:framePr w:hSpace="180" w:wrap="around" w:vAnchor="page" w:hAnchor="margin" w:y="481"/>
                     <w:jc w:val="right"/>
                     <w:rPr>
-                      <w:rFonts w:cstheme="minorHAnsi"/>
+                      <w:rFonts w:ascii="Arial" w:hAnsi="Arial" w:cs="Arial"/>
                       <w:sz w:val="18"/>
                       <w:szCs w:val="18"/>
                     </w:rPr>
                   </w:pPr>
                   <w:r>
                     <w:rPr>
-                      <w:rFonts w:cstheme="minorHAnsi"/>
+                      <w:rFonts w:ascii="Arial" w:hAnsi="Arial" w:cs="Arial"/>
                       <w:sz w:val="18"/>
                       <w:szCs w:val="18"/>
                     </w:rPr>
@@ -2786,7 +2786,7 @@
                   <w:proofErr w:type="gramStart"/>
                   <w:r>
                     <w:rPr>
-                      <w:rFonts w:cstheme="minorHAnsi"/>
+                      <w:rFonts w:ascii="Arial" w:hAnsi="Arial" w:cs="Arial"/>
                       <w:sz w:val="18"/>
                       <w:szCs w:val="18"/>
                     </w:rPr>
@@ -2795,7 +2795,7 @@
                   <w:proofErr w:type="gramEnd"/>
                   <w:r>
                     <w:rPr>
-                      <w:rFonts w:cstheme="minorHAnsi"/>
+                      <w:rFonts w:ascii="Arial" w:hAnsi="Arial" w:cs="Arial"/>
                       <w:sz w:val="18"/>
                       <w:szCs w:val="18"/>
                     </w:rPr>
@@ -2814,14 +2814,14 @@
                     <w:spacing w:line="276" w:lineRule="auto"/>
                     <w:jc w:val="right"/>
                     <w:rPr>
-                      <w:rFonts w:cstheme="minorHAnsi"/>
+                      <w:rFonts w:ascii="Arial" w:hAnsi="Arial" w:cs="Arial"/>
                       <w:sz w:val="18"/>
                       <w:szCs w:val="18"/>
                     </w:rPr>
                   </w:pPr>
                   <w:r>
                     <w:rPr>
-                      <w:rFonts w:cstheme="minorHAnsi"/>
+                      <w:rFonts w:ascii="Arial" w:hAnsi="Arial" w:cs="Arial"/>
                       <w:sz w:val="18"/>
                       <w:szCs w:val="18"/>
                     </w:rPr>
@@ -2840,14 +2840,14 @@
                     <w:spacing w:line="276" w:lineRule="auto"/>
                     <w:jc w:val="right"/>
                     <w:rPr>
-                      <w:rFonts w:cstheme="minorHAnsi"/>
+                      <w:rFonts w:ascii="Arial" w:hAnsi="Arial" w:cs="Arial"/>
                       <w:sz w:val="18"/>
                       <w:szCs w:val="18"/>
                     </w:rPr>
                   </w:pPr>
                   <w:r>
                     <w:rPr>
-                      <w:rFonts w:cstheme="minorHAnsi"/>
+                      <w:rFonts w:ascii="Arial" w:hAnsi="Arial" w:cs="Arial"/>
                       <w:sz w:val="18"/>
                       <w:szCs w:val="18"/>
                     </w:rPr>
@@ -2856,7 +2856,7 @@
                   <w:proofErr w:type="spellStart"/>
                   <w:r>
                     <w:rPr>
-                      <w:rFonts w:cstheme="minorHAnsi"/>
+                      <w:rFonts w:ascii="Arial" w:hAnsi="Arial" w:cs="Arial"/>
                       <w:sz w:val="18"/>
                       <w:szCs w:val="18"/>
                     </w:rPr>
@@ -2865,7 +2865,7 @@
                   <w:proofErr w:type="spellEnd"/>
                   <w:r>
                     <w:rPr>
-                      <w:rFonts w:cstheme="minorHAnsi"/>
+                      <w:rFonts w:ascii="Arial" w:hAnsi="Arial" w:cs="Arial"/>
                       <w:sz w:val="18"/>
                       <w:szCs w:val="18"/>
                     </w:rPr>
@@ -2884,14 +2884,14 @@
                     <w:spacing w:line="276" w:lineRule="auto"/>
                     <w:jc w:val="right"/>
                     <w:rPr>
-                      <w:rFonts w:cstheme="minorHAnsi"/>
+                      <w:rFonts w:ascii="Arial" w:hAnsi="Arial" w:cs="Arial"/>
                       <w:sz w:val="18"/>
                       <w:szCs w:val="18"/>
                     </w:rPr>
                   </w:pPr>
                   <w:r>
                     <w:rPr>
-                      <w:rFonts w:cstheme="minorHAnsi"/>
+                      <w:rFonts w:ascii="Arial" w:hAnsi="Arial" w:cs="Arial"/>
                       <w:sz w:val="18"/>
                       <w:szCs w:val="18"/>
                     </w:rPr>
@@ -2910,14 +2910,14 @@
                     <w:spacing w:line="276" w:lineRule="auto"/>
                     <w:jc w:val="right"/>
                     <w:rPr>
-                      <w:rFonts w:cstheme="minorHAnsi"/>
+                      <w:rFonts w:ascii="Arial" w:hAnsi="Arial" w:cs="Arial"/>
                       <w:sz w:val="18"/>
                       <w:szCs w:val="18"/>
                     </w:rPr>
                   </w:pPr>
                   <w:r>
                     <w:rPr>
-                      <w:rFonts w:cstheme="minorHAnsi"/>
+                      <w:rFonts w:ascii="Arial" w:hAnsi="Arial" w:cs="Arial"/>
                       <w:sz w:val="18"/>
                       <w:szCs w:val="18"/>
                     </w:rPr>
@@ -2926,7 +2926,7 @@
                   <w:proofErr w:type="spellStart"/>
                   <w:r>
                     <w:rPr>
-                      <w:rFonts w:cstheme="minorHAnsi"/>
+                      <w:rFonts w:ascii="Arial" w:hAnsi="Arial" w:cs="Arial"/>
                       <w:sz w:val="18"/>
                       <w:szCs w:val="18"/>
                     </w:rPr>
@@ -2935,7 +2935,7 @@
                   <w:proofErr w:type="spellEnd"/>
                   <w:r>
                     <w:rPr>
-                      <w:rFonts w:cstheme="minorHAnsi"/>
+                      <w:rFonts w:ascii="Arial" w:hAnsi="Arial" w:cs="Arial"/>
                       <w:sz w:val="18"/>
                       <w:szCs w:val="18"/>
                     </w:rPr>
@@ -2961,38 +2961,22 @@
                     <w:framePr w:hSpace="180" w:wrap="around" w:vAnchor="page" w:hAnchor="margin" w:y="481"/>
                     <w:spacing w:before="80"/>
                     <w:rPr>
-                      <w:rFonts w:cstheme="minorHAnsi"/>
+                      <w:rFonts w:ascii="Arial" w:hAnsi="Arial" w:cs="Arial"/>
                       <w:sz w:val="18"/>
                       <w:szCs w:val="18"/>
                     </w:rPr>
                   </w:pPr>
                   <w:r>
                     <w:rPr>
-                      <w:rFonts w:cstheme="minorHAnsi"/>
-                      <w:sz w:val="18"/>
-                      <w:szCs w:val="18"/>
-                    </w:rPr>
-                    <w:t>{#</w:t>
-                  </w:r>
-                  <w:r>
-                    <w:rPr>
-                      <w:rFonts w:cstheme="minorHAnsi"/>
-                      <w:sz w:val="18"/>
-                      <w:szCs w:val="18"/>
-                    </w:rPr>
-                    <w:t>isSampleBox</w:t>
-                  </w:r>
-                  <w:r>
-                    <w:rPr>
-                      <w:rFonts w:cstheme="minorHAnsi"/>
-                      <w:sz w:val="18"/>
-                      <w:szCs w:val="18"/>
-                    </w:rPr>
-                    <w:t>}</w:t>
-                  </w:r>
-                  <w:r>
-                    <w:rPr>
-                      <w:rFonts w:cstheme="minorHAnsi"/>
+                      <w:rFonts w:ascii="Arial" w:hAnsi="Arial" w:cs="Arial"/>
+                      <w:sz w:val="18"/>
+                      <w:szCs w:val="18"/>
+                    </w:rPr>
+                    <w:t>{#isSampleBox}</w:t>
+                  </w:r>
+                  <w:r>
+                    <w:rPr>
+                      <w:rFonts w:ascii="Arial" w:hAnsi="Arial" w:cs="Arial"/>
                       <w:b/>
                       <w:bCs/>
                       <w:sz w:val="18"/>
@@ -3016,31 +3000,23 @@
                     <w:spacing w:before="80"/>
                     <w:jc w:val="center"/>
                     <w:rPr>
-                      <w:rFonts w:cstheme="minorHAnsi"/>
+                      <w:rFonts w:ascii="Arial" w:hAnsi="Arial" w:cs="Arial"/>
                       <w:sz w:val="18"/>
                       <w:szCs w:val="18"/>
                     </w:rPr>
                   </w:pPr>
                   <w:r>
                     <w:rPr>
-                      <w:rFonts w:cstheme="minorHAnsi"/>
-                      <w:sz w:val="18"/>
-                      <w:szCs w:val="18"/>
-                    </w:rPr>
-                    <w:t>As Per P/List</w:t>
-                  </w:r>
-                  <w:r>
-                    <w:rPr>
-                      <w:rFonts w:cstheme="minorHAnsi"/>
-                      <w:sz w:val="18"/>
-                      <w:szCs w:val="18"/>
-                    </w:rPr>
-                    <w:t xml:space="preserve"> {/</w:t>
+                      <w:rFonts w:ascii="Arial" w:hAnsi="Arial" w:cs="Arial"/>
+                      <w:sz w:val="18"/>
+                      <w:szCs w:val="18"/>
+                    </w:rPr>
+                    <w:t>As Per P/List {/</w:t>
                   </w:r>
                   <w:proofErr w:type="spellStart"/>
                   <w:r>
                     <w:rPr>
-                      <w:rFonts w:cstheme="minorHAnsi"/>
+                      <w:rFonts w:ascii="Arial" w:hAnsi="Arial" w:cs="Arial"/>
                       <w:sz w:val="18"/>
                       <w:szCs w:val="18"/>
                     </w:rPr>
@@ -3049,7 +3025,7 @@
                   <w:proofErr w:type="spellEnd"/>
                   <w:r>
                     <w:rPr>
-                      <w:rFonts w:cstheme="minorHAnsi"/>
+                      <w:rFonts w:ascii="Arial" w:hAnsi="Arial" w:cs="Arial"/>
                       <w:sz w:val="18"/>
                       <w:szCs w:val="18"/>
                     </w:rPr>
@@ -3151,34 +3127,18 @@
                     <w:pStyle w:val="NoSpacing"/>
                     <w:framePr w:hSpace="180" w:wrap="around" w:vAnchor="page" w:hAnchor="margin" w:y="481"/>
                     <w:rPr>
-                      <w:rFonts w:cstheme="minorHAnsi"/>
+                      <w:rFonts w:ascii="Arial" w:hAnsi="Arial" w:cs="Arial"/>
                       <w:sz w:val="18"/>
                       <w:szCs w:val="18"/>
                     </w:rPr>
                   </w:pPr>
                   <w:r>
                     <w:rPr>
-                      <w:rFonts w:cstheme="minorHAnsi"/>
-                      <w:sz w:val="18"/>
-                      <w:szCs w:val="18"/>
-                    </w:rPr>
-                    <w:t>{#</w:t>
-                  </w:r>
-                  <w:r>
-                    <w:rPr>
-                      <w:rFonts w:cstheme="minorHAnsi"/>
-                      <w:sz w:val="18"/>
-                      <w:szCs w:val="18"/>
-                    </w:rPr>
-                    <w:t>sampleBox</w:t>
-                  </w:r>
-                  <w:r>
-                    <w:rPr>
-                      <w:rFonts w:cstheme="minorHAnsi"/>
-                      <w:sz w:val="18"/>
-                      <w:szCs w:val="18"/>
-                    </w:rPr>
-                    <w:t>}</w:t>
+                      <w:rFonts w:ascii="Arial" w:hAnsi="Arial" w:cs="Arial"/>
+                      <w:sz w:val="18"/>
+                      <w:szCs w:val="18"/>
+                    </w:rPr>
+                    <w:t>{#sampleBox}</w:t>
                   </w:r>
                 </w:p>
               </w:tc>
@@ -3196,14 +3156,14 @@
                     <w:pStyle w:val="NoSpacing"/>
                     <w:jc w:val="center"/>
                     <w:rPr>
-                      <w:rFonts w:cstheme="minorHAnsi"/>
+                      <w:rFonts w:ascii="Arial" w:hAnsi="Arial" w:cs="Arial"/>
                       <w:sz w:val="18"/>
                       <w:szCs w:val="18"/>
                     </w:rPr>
                   </w:pPr>
                   <w:r>
                     <w:rPr>
-                      <w:rFonts w:cstheme="minorHAnsi"/>
+                      <w:rFonts w:ascii="Arial" w:hAnsi="Arial" w:cs="Arial"/>
                       <w:sz w:val="18"/>
                       <w:szCs w:val="18"/>
                     </w:rPr>
@@ -3213,7 +3173,7 @@
                   <w:proofErr w:type="gramStart"/>
                   <w:r>
                     <w:rPr>
-                      <w:rFonts w:cstheme="minorHAnsi"/>
+                      <w:rFonts w:ascii="Arial" w:hAnsi="Arial" w:cs="Arial"/>
                       <w:sz w:val="18"/>
                       <w:szCs w:val="18"/>
                     </w:rPr>
@@ -3222,7 +3182,7 @@
                   <w:proofErr w:type="spellEnd"/>
                   <w:r>
                     <w:rPr>
-                      <w:rFonts w:cstheme="minorHAnsi"/>
+                      <w:rFonts w:ascii="Arial" w:hAnsi="Arial" w:cs="Arial"/>
                       <w:sz w:val="18"/>
                       <w:szCs w:val="18"/>
                     </w:rPr>
@@ -3231,7 +3191,7 @@
                   <w:proofErr w:type="spellStart"/>
                   <w:r>
                     <w:rPr>
-                      <w:rFonts w:cstheme="minorHAnsi"/>
+                      <w:rFonts w:ascii="Arial" w:hAnsi="Arial" w:cs="Arial"/>
                       <w:sz w:val="18"/>
                       <w:szCs w:val="18"/>
                     </w:rPr>
@@ -3240,32 +3200,16 @@
                   <w:proofErr w:type="spellEnd"/>
                   <w:r>
                     <w:rPr>
-                      <w:rFonts w:cstheme="minorHAnsi"/>
-                      <w:sz w:val="18"/>
-                      <w:szCs w:val="18"/>
-                    </w:rPr>
-                    <w:t>}</w:t>
-                  </w:r>
-                  <w:r>
-                    <w:rPr>
-                      <w:rFonts w:cstheme="minorHAnsi"/>
-                      <w:sz w:val="18"/>
-                      <w:szCs w:val="18"/>
-                    </w:rPr>
-                    <w:t xml:space="preserve"> </w:t>
-                  </w:r>
-                  <w:r>
-                    <w:rPr>
-                      <w:rFonts w:cstheme="minorHAnsi"/>
-                      <w:sz w:val="18"/>
-                      <w:szCs w:val="18"/>
-                    </w:rPr>
-                    <w:t xml:space="preserve"> {</w:t>
+                      <w:rFonts w:ascii="Arial" w:hAnsi="Arial" w:cs="Arial"/>
+                      <w:sz w:val="18"/>
+                      <w:szCs w:val="18"/>
+                    </w:rPr>
+                    <w:t>}  {</w:t>
                   </w:r>
                   <w:proofErr w:type="spellStart"/>
                   <w:r>
                     <w:rPr>
-                      <w:rFonts w:cstheme="minorHAnsi"/>
+                      <w:rFonts w:ascii="Arial" w:hAnsi="Arial" w:cs="Arial"/>
                       <w:sz w:val="18"/>
                       <w:szCs w:val="18"/>
                     </w:rPr>
@@ -3274,7 +3218,7 @@
                   <w:proofErr w:type="spellEnd"/>
                   <w:r>
                     <w:rPr>
-                      <w:rFonts w:cstheme="minorHAnsi"/>
+                      <w:rFonts w:ascii="Arial" w:hAnsi="Arial" w:cs="Arial"/>
                       <w:sz w:val="18"/>
                       <w:szCs w:val="18"/>
                     </w:rPr>
@@ -3284,7 +3228,7 @@
                   <w:proofErr w:type="gramEnd"/>
                   <w:r>
                     <w:rPr>
-                      <w:rFonts w:cstheme="minorHAnsi"/>
+                      <w:rFonts w:ascii="Arial" w:hAnsi="Arial" w:cs="Arial"/>
                       <w:sz w:val="18"/>
                       <w:szCs w:val="18"/>
                     </w:rPr>
@@ -3293,7 +3237,7 @@
                   <w:proofErr w:type="spellEnd"/>
                   <w:r>
                     <w:rPr>
-                      <w:rFonts w:cstheme="minorHAnsi"/>
+                      <w:rFonts w:ascii="Arial" w:hAnsi="Arial" w:cs="Arial"/>
                       <w:sz w:val="18"/>
                       <w:szCs w:val="18"/>
                     </w:rPr>
@@ -3370,14 +3314,14 @@
                     <w:spacing w:line="276" w:lineRule="auto"/>
                     <w:jc w:val="right"/>
                     <w:rPr>
-                      <w:rFonts w:cstheme="minorHAnsi"/>
+                      <w:rFonts w:ascii="Arial" w:hAnsi="Arial" w:cs="Arial"/>
                       <w:sz w:val="18"/>
                       <w:szCs w:val="18"/>
                     </w:rPr>
                   </w:pPr>
                   <w:r>
                     <w:rPr>
-                      <w:rFonts w:cstheme="minorHAnsi"/>
+                      <w:rFonts w:ascii="Arial" w:hAnsi="Arial" w:cs="Arial"/>
                       <w:sz w:val="18"/>
                       <w:szCs w:val="18"/>
                     </w:rPr>
@@ -3386,7 +3330,7 @@
                   <w:proofErr w:type="spellStart"/>
                   <w:r>
                     <w:rPr>
-                      <w:rFonts w:cstheme="minorHAnsi"/>
+                      <w:rFonts w:ascii="Arial" w:hAnsi="Arial" w:cs="Arial"/>
                       <w:sz w:val="18"/>
                       <w:szCs w:val="18"/>
                     </w:rPr>
@@ -3395,7 +3339,7 @@
                   <w:proofErr w:type="spellEnd"/>
                   <w:r>
                     <w:rPr>
-                      <w:rFonts w:cstheme="minorHAnsi"/>
+                      <w:rFonts w:ascii="Arial" w:hAnsi="Arial" w:cs="Arial"/>
                       <w:sz w:val="18"/>
                       <w:szCs w:val="18"/>
                     </w:rPr>

</xml_diff>

<commit_message>
company dynamic in invoices
</commit_message>
<xml_diff>
--- a/electron/database/generate-document/templates/custom-invoice.docx
+++ b/electron/database/generate-document/templates/custom-invoice.docx
@@ -38,51 +38,20 @@
           </w:tcPr>
           <w:p>
             <w:pPr>
-              <w:rPr>
-                <w:rFonts w:cstheme="minorHAnsi"/>
-                <w:sz w:val="20"/>
-                <w:szCs w:val="20"/>
-              </w:rPr>
-            </w:pPr>
-            <w:r>
-              <w:rPr>
-                <w:noProof/>
-              </w:rPr>
-              <w:drawing>
-                <wp:inline distT="0" distB="0" distL="0" distR="0" wp14:anchorId="33AF0355" wp14:editId="5C1F96B4">
-                  <wp:extent cx="819048" cy="780952"/>
-                  <wp:effectExtent l="0" t="0" r="635" b="635"/>
-                  <wp:docPr id="1506392267" name="Picture 1"/>
-                  <wp:cNvGraphicFramePr>
-                    <a:graphicFrameLocks xmlns:a="http://schemas.openxmlformats.org/drawingml/2006/main" noChangeAspect="1"/>
-                  </wp:cNvGraphicFramePr>
-                  <a:graphic xmlns:a="http://schemas.openxmlformats.org/drawingml/2006/main">
-                    <a:graphicData uri="http://schemas.openxmlformats.org/drawingml/2006/picture">
-                      <pic:pic xmlns:pic="http://schemas.openxmlformats.org/drawingml/2006/picture">
-                        <pic:nvPicPr>
-                          <pic:cNvPr id="1506392267" name=""/>
-                          <pic:cNvPicPr/>
-                        </pic:nvPicPr>
-                        <pic:blipFill>
-                          <a:blip r:embed="rId7"/>
-                          <a:stretch>
-                            <a:fillRect/>
-                          </a:stretch>
-                        </pic:blipFill>
-                        <pic:spPr>
-                          <a:xfrm>
-                            <a:off x="0" y="0"/>
-                            <a:ext cx="819048" cy="780952"/>
-                          </a:xfrm>
-                          <a:prstGeom prst="rect">
-                            <a:avLst/>
-                          </a:prstGeom>
-                        </pic:spPr>
-                      </pic:pic>
-                    </a:graphicData>
-                  </a:graphic>
-                </wp:inline>
-              </w:drawing>
+              <w:spacing w:before="40"/>
+              <w:rPr>
+                <w:rFonts w:cstheme="minorHAnsi"/>
+                <w:sz w:val="20"/>
+                <w:szCs w:val="20"/>
+              </w:rPr>
+            </w:pPr>
+            <w:r>
+              <w:rPr>
+                <w:rFonts w:cstheme="minorHAnsi"/>
+                <w:sz w:val="20"/>
+                <w:szCs w:val="20"/>
+              </w:rPr>
+              <w:t>{%%logo}</w:t>
             </w:r>
           </w:p>
         </w:tc>
@@ -171,8 +140,9 @@
                 <w:sz w:val="20"/>
                 <w:szCs w:val="20"/>
               </w:rPr>
-              <w:t>{companyAddressLine1</w:t>
-            </w:r>
+              <w:t xml:space="preserve">{companyAddressLine1} </w:t>
+            </w:r>
+            <w:proofErr w:type="gramStart"/>
             <w:r>
               <w:rPr>
                 <w:rFonts w:cstheme="minorHAnsi"/>
@@ -180,7 +150,17 @@
                 <w:sz w:val="20"/>
                 <w:szCs w:val="20"/>
               </w:rPr>
-              <w:t xml:space="preserve">} </w:t>
+              <w:t xml:space="preserve">   {</w:t>
+            </w:r>
+            <w:proofErr w:type="gramEnd"/>
+            <w:r>
+              <w:rPr>
+                <w:rFonts w:cstheme="minorHAnsi"/>
+                <w:bCs/>
+                <w:sz w:val="20"/>
+                <w:szCs w:val="20"/>
+              </w:rPr>
+              <w:t>companyAddressLine2</w:t>
             </w:r>
             <w:proofErr w:type="gramStart"/>
             <w:r>
@@ -190,8 +170,9 @@
                 <w:sz w:val="20"/>
                 <w:szCs w:val="20"/>
               </w:rPr>
-              <w:t xml:space="preserve">   </w:t>
-            </w:r>
+              <w:t>},      {</w:t>
+            </w:r>
+            <w:proofErr w:type="spellStart"/>
             <w:r>
               <w:rPr>
                 <w:rFonts w:cstheme="minorHAnsi"/>
@@ -199,7 +180,17 @@
                 <w:sz w:val="20"/>
                 <w:szCs w:val="20"/>
               </w:rPr>
-              <w:t>{</w:t>
+              <w:t>companyCity</w:t>
+            </w:r>
+            <w:proofErr w:type="spellEnd"/>
+            <w:r>
+              <w:rPr>
+                <w:rFonts w:cstheme="minorHAnsi"/>
+                <w:bCs/>
+                <w:sz w:val="20"/>
+                <w:szCs w:val="20"/>
+              </w:rPr>
+              <w:t xml:space="preserve">}   </w:t>
             </w:r>
             <w:proofErr w:type="gramEnd"/>
             <w:r>
@@ -209,65 +200,7 @@
                 <w:sz w:val="20"/>
                 <w:szCs w:val="20"/>
               </w:rPr>
-              <w:t>companyAddressLine2</w:t>
-            </w:r>
-            <w:proofErr w:type="gramStart"/>
-            <w:r>
-              <w:rPr>
-                <w:rFonts w:cstheme="minorHAnsi"/>
-                <w:bCs/>
-                <w:sz w:val="20"/>
-                <w:szCs w:val="20"/>
-              </w:rPr>
-              <w:t>},      {</w:t>
-            </w:r>
-            <w:proofErr w:type="spellStart"/>
-            <w:r>
-              <w:rPr>
-                <w:rFonts w:cstheme="minorHAnsi"/>
-                <w:bCs/>
-                <w:sz w:val="20"/>
-                <w:szCs w:val="20"/>
-              </w:rPr>
-              <w:t>companyCity</w:t>
-            </w:r>
-            <w:proofErr w:type="spellEnd"/>
-            <w:r>
-              <w:rPr>
-                <w:rFonts w:cstheme="minorHAnsi"/>
-                <w:bCs/>
-                <w:sz w:val="20"/>
-                <w:szCs w:val="20"/>
-              </w:rPr>
-              <w:t>}</w:t>
-            </w:r>
-            <w:r>
-              <w:rPr>
-                <w:rFonts w:cstheme="minorHAnsi"/>
-                <w:bCs/>
-                <w:sz w:val="20"/>
-                <w:szCs w:val="20"/>
-              </w:rPr>
-              <w:t xml:space="preserve">   </w:t>
-            </w:r>
-            <w:proofErr w:type="gramEnd"/>
-            <w:r>
-              <w:rPr>
-                <w:rFonts w:cstheme="minorHAnsi"/>
-                <w:bCs/>
-                <w:sz w:val="20"/>
-                <w:szCs w:val="20"/>
-              </w:rPr>
-              <w:t xml:space="preserve"> </w:t>
-            </w:r>
-            <w:r>
-              <w:rPr>
-                <w:rFonts w:cstheme="minorHAnsi"/>
-                <w:bCs/>
-                <w:sz w:val="20"/>
-                <w:szCs w:val="20"/>
-              </w:rPr>
-              <w:t>{</w:t>
+              <w:t xml:space="preserve"> {</w:t>
             </w:r>
             <w:proofErr w:type="spellStart"/>
             <w:proofErr w:type="gramStart"/>
@@ -288,16 +221,7 @@
                 <w:sz w:val="20"/>
                 <w:szCs w:val="20"/>
               </w:rPr>
-              <w:t>}</w:t>
-            </w:r>
-            <w:r>
-              <w:rPr>
-                <w:rFonts w:cstheme="minorHAnsi"/>
-                <w:bCs/>
-                <w:sz w:val="20"/>
-                <w:szCs w:val="20"/>
-              </w:rPr>
-              <w:t xml:space="preserve">   </w:t>
+              <w:t xml:space="preserve">}   </w:t>
             </w:r>
             <w:proofErr w:type="gramEnd"/>
             <w:r>
@@ -5387,12 +5311,12 @@
       </w:pPr>
     </w:p>
     <w:sectPr>
-      <w:headerReference w:type="even" r:id="rId8"/>
-      <w:headerReference w:type="default" r:id="rId9"/>
-      <w:footerReference w:type="even" r:id="rId10"/>
-      <w:footerReference w:type="default" r:id="rId11"/>
-      <w:headerReference w:type="first" r:id="rId12"/>
-      <w:footerReference w:type="first" r:id="rId13"/>
+      <w:headerReference w:type="even" r:id="rId7"/>
+      <w:headerReference w:type="default" r:id="rId8"/>
+      <w:footerReference w:type="even" r:id="rId9"/>
+      <w:footerReference w:type="default" r:id="rId10"/>
+      <w:headerReference w:type="first" r:id="rId11"/>
+      <w:footerReference w:type="first" r:id="rId12"/>
       <w:pgSz w:w="12240" w:h="15840" w:code="1"/>
       <w:pgMar w:top="482" w:right="567" w:bottom="1701" w:left="567" w:header="198" w:footer="510" w:gutter="0"/>
       <w:pgBorders w:offsetFrom="page">
@@ -6463,6 +6387,7 @@
   <w:style w:type="character" w:default="1" w:styleId="DefaultParagraphFont">
     <w:name w:val="Default Paragraph Font"/>
     <w:uiPriority w:val="1"/>
+    <w:semiHidden/>
     <w:unhideWhenUsed/>
   </w:style>
   <w:style w:type="table" w:default="1" w:styleId="TableNormal">

</xml_diff>

<commit_message>
notify name and notify address added
</commit_message>
<xml_diff>
--- a/electron/database/generate-document/templates/custom-invoice.docx
+++ b/electron/database/generate-document/templates/custom-invoice.docx
@@ -104,25 +104,7 @@
                 <w:sz w:val="20"/>
                 <w:szCs w:val="20"/>
               </w:rPr>
-              <w:t>{#</w:t>
-            </w:r>
-            <w:proofErr w:type="gramStart"/>
-            <w:r>
-              <w:rPr>
-                <w:rFonts w:cstheme="minorHAnsi"/>
-                <w:sz w:val="20"/>
-                <w:szCs w:val="20"/>
-              </w:rPr>
-              <w:t>companyData}{</w:t>
-            </w:r>
-            <w:proofErr w:type="gramEnd"/>
-            <w:r>
-              <w:rPr>
-                <w:rFonts w:cstheme="minorHAnsi"/>
-                <w:sz w:val="20"/>
-                <w:szCs w:val="20"/>
-              </w:rPr>
-              <w:t>companyName}</w:t>
+              <w:t>{#companyData}{companyName}</w:t>
             </w:r>
           </w:p>
           <w:p>
@@ -140,160 +122,7 @@
                 <w:sz w:val="20"/>
                 <w:szCs w:val="20"/>
               </w:rPr>
-              <w:t xml:space="preserve">{companyAddressLine1} </w:t>
-            </w:r>
-            <w:proofErr w:type="gramStart"/>
-            <w:r>
-              <w:rPr>
-                <w:rFonts w:cstheme="minorHAnsi"/>
-                <w:bCs/>
-                <w:sz w:val="20"/>
-                <w:szCs w:val="20"/>
-              </w:rPr>
-              <w:t xml:space="preserve">   {</w:t>
-            </w:r>
-            <w:proofErr w:type="gramEnd"/>
-            <w:r>
-              <w:rPr>
-                <w:rFonts w:cstheme="minorHAnsi"/>
-                <w:bCs/>
-                <w:sz w:val="20"/>
-                <w:szCs w:val="20"/>
-              </w:rPr>
-              <w:t>companyAddressLine2</w:t>
-            </w:r>
-            <w:proofErr w:type="gramStart"/>
-            <w:r>
-              <w:rPr>
-                <w:rFonts w:cstheme="minorHAnsi"/>
-                <w:bCs/>
-                <w:sz w:val="20"/>
-                <w:szCs w:val="20"/>
-              </w:rPr>
-              <w:t>},      {</w:t>
-            </w:r>
-            <w:proofErr w:type="spellStart"/>
-            <w:r>
-              <w:rPr>
-                <w:rFonts w:cstheme="minorHAnsi"/>
-                <w:bCs/>
-                <w:sz w:val="20"/>
-                <w:szCs w:val="20"/>
-              </w:rPr>
-              <w:t>companyCity</w:t>
-            </w:r>
-            <w:proofErr w:type="spellEnd"/>
-            <w:r>
-              <w:rPr>
-                <w:rFonts w:cstheme="minorHAnsi"/>
-                <w:bCs/>
-                <w:sz w:val="20"/>
-                <w:szCs w:val="20"/>
-              </w:rPr>
-              <w:t xml:space="preserve">}   </w:t>
-            </w:r>
-            <w:proofErr w:type="gramEnd"/>
-            <w:r>
-              <w:rPr>
-                <w:rFonts w:cstheme="minorHAnsi"/>
-                <w:bCs/>
-                <w:sz w:val="20"/>
-                <w:szCs w:val="20"/>
-              </w:rPr>
-              <w:t xml:space="preserve"> {</w:t>
-            </w:r>
-            <w:proofErr w:type="spellStart"/>
-            <w:proofErr w:type="gramStart"/>
-            <w:r>
-              <w:rPr>
-                <w:rFonts w:cstheme="minorHAnsi"/>
-                <w:bCs/>
-                <w:sz w:val="20"/>
-                <w:szCs w:val="20"/>
-              </w:rPr>
-              <w:t>companyPostalCode</w:t>
-            </w:r>
-            <w:proofErr w:type="spellEnd"/>
-            <w:r>
-              <w:rPr>
-                <w:rFonts w:cstheme="minorHAnsi"/>
-                <w:bCs/>
-                <w:sz w:val="20"/>
-                <w:szCs w:val="20"/>
-              </w:rPr>
-              <w:t xml:space="preserve">}   </w:t>
-            </w:r>
-            <w:proofErr w:type="gramEnd"/>
-            <w:r>
-              <w:rPr>
-                <w:rFonts w:cstheme="minorHAnsi"/>
-                <w:bCs/>
-                <w:sz w:val="20"/>
-                <w:szCs w:val="20"/>
-              </w:rPr>
-              <w:t>{</w:t>
-            </w:r>
-            <w:proofErr w:type="spellStart"/>
-            <w:proofErr w:type="gramStart"/>
-            <w:r>
-              <w:rPr>
-                <w:rFonts w:cstheme="minorHAnsi"/>
-                <w:bCs/>
-                <w:sz w:val="20"/>
-                <w:szCs w:val="20"/>
-              </w:rPr>
-              <w:t>companyState</w:t>
-            </w:r>
-            <w:proofErr w:type="spellEnd"/>
-            <w:r>
-              <w:rPr>
-                <w:rFonts w:cstheme="minorHAnsi"/>
-                <w:bCs/>
-                <w:sz w:val="20"/>
-                <w:szCs w:val="20"/>
-              </w:rPr>
-              <w:t xml:space="preserve">}   </w:t>
-            </w:r>
-            <w:proofErr w:type="gramEnd"/>
-            <w:r>
-              <w:rPr>
-                <w:rFonts w:cstheme="minorHAnsi"/>
-                <w:bCs/>
-                <w:sz w:val="20"/>
-                <w:szCs w:val="20"/>
-              </w:rPr>
-              <w:t xml:space="preserve"> {</w:t>
-            </w:r>
-            <w:proofErr w:type="spellStart"/>
-            <w:r>
-              <w:rPr>
-                <w:rFonts w:cstheme="minorHAnsi"/>
-                <w:bCs/>
-                <w:sz w:val="20"/>
-                <w:szCs w:val="20"/>
-              </w:rPr>
-              <w:t>companyCountry</w:t>
-            </w:r>
-            <w:proofErr w:type="spellEnd"/>
-            <w:proofErr w:type="gramStart"/>
-            <w:r>
-              <w:rPr>
-                <w:rFonts w:cstheme="minorHAnsi"/>
-                <w:bCs/>
-                <w:sz w:val="20"/>
-                <w:szCs w:val="20"/>
-              </w:rPr>
-              <w:t>}{</w:t>
-            </w:r>
-            <w:proofErr w:type="gramEnd"/>
-            <w:r>
-              <w:rPr>
-                <w:rFonts w:cstheme="minorHAnsi"/>
-                <w:bCs/>
-                <w:sz w:val="20"/>
-                <w:szCs w:val="20"/>
-              </w:rPr>
-              <w:t>/}</w:t>
+              <w:t>{companyAddressLine1}    {companyAddressLine2},      {companyCity}    {companyPostalCode}   {companyState}    {companyCountry}{/}</w:t>
             </w:r>
           </w:p>
         </w:tc>
@@ -327,14 +156,12 @@
               </w:rPr>
               <w:t>{</w:t>
             </w:r>
-            <w:proofErr w:type="spellStart"/>
             <w:r>
               <w:rPr>
                 <w:rFonts w:cstheme="minorHAnsi"/>
               </w:rPr>
               <w:t>modifyInvNo</w:t>
             </w:r>
-            <w:proofErr w:type="spellEnd"/>
             <w:r>
               <w:rPr>
                 <w:rFonts w:cstheme="minorHAnsi"/>
@@ -376,14 +203,12 @@
               </w:rPr>
               <w:t>{</w:t>
             </w:r>
-            <w:proofErr w:type="spellStart"/>
             <w:r>
               <w:rPr>
                 <w:rFonts w:cstheme="minorHAnsi"/>
               </w:rPr>
               <w:t>invoiceDate</w:t>
             </w:r>
-            <w:proofErr w:type="spellEnd"/>
             <w:r>
               <w:rPr>
                 <w:rFonts w:cstheme="minorHAnsi"/>
@@ -464,14 +289,12 @@
               </w:rPr>
               <w:t>{</w:t>
             </w:r>
-            <w:proofErr w:type="spellStart"/>
             <w:r>
               <w:rPr>
                 <w:rFonts w:cstheme="minorHAnsi"/>
               </w:rPr>
               <w:t>buyersOrderNo</w:t>
             </w:r>
-            <w:proofErr w:type="spellEnd"/>
             <w:r>
               <w:rPr>
                 <w:rFonts w:cstheme="minorHAnsi"/>
@@ -514,14 +337,12 @@
               </w:rPr>
               <w:t>{</w:t>
             </w:r>
-            <w:proofErr w:type="spellStart"/>
             <w:r>
               <w:rPr>
                 <w:rFonts w:cstheme="minorHAnsi"/>
               </w:rPr>
               <w:t>orderDate</w:t>
             </w:r>
-            <w:proofErr w:type="spellEnd"/>
             <w:r>
               <w:rPr>
                 <w:rFonts w:cstheme="minorHAnsi"/>
@@ -578,7 +399,6 @@
               </w:rPr>
               <w:t>{</w:t>
             </w:r>
-            <w:proofErr w:type="spellStart"/>
             <w:r>
               <w:rPr>
                 <w:rFonts w:cstheme="minorHAnsi"/>
@@ -587,7 +407,6 @@
               </w:rPr>
               <w:t>consigneeCountry</w:t>
             </w:r>
-            <w:proofErr w:type="spellEnd"/>
             <w:r>
               <w:rPr>
                 <w:rFonts w:cstheme="minorHAnsi"/>
@@ -647,7 +466,6 @@
               </w:rPr>
               <w:t>{</w:t>
             </w:r>
-            <w:proofErr w:type="spellStart"/>
             <w:r>
               <w:rPr>
                 <w:rFonts w:cstheme="minorHAnsi"/>
@@ -656,7 +474,6 @@
               </w:rPr>
               <w:t>consigneeName</w:t>
             </w:r>
-            <w:proofErr w:type="spellEnd"/>
             <w:r>
               <w:rPr>
                 <w:rFonts w:cstheme="minorHAnsi"/>
@@ -682,7 +499,6 @@
               </w:rPr>
               <w:t>{</w:t>
             </w:r>
-            <w:proofErr w:type="spellStart"/>
             <w:r>
               <w:rPr>
                 <w:rFonts w:cstheme="minorHAnsi"/>
@@ -691,7 +507,6 @@
               </w:rPr>
               <w:t>consigneeAddress</w:t>
             </w:r>
-            <w:proofErr w:type="spellEnd"/>
             <w:r>
               <w:rPr>
                 <w:rFonts w:cstheme="minorHAnsi"/>
@@ -700,7 +515,6 @@
               </w:rPr>
               <w:t>} {</w:t>
             </w:r>
-            <w:proofErr w:type="spellStart"/>
             <w:r>
               <w:rPr>
                 <w:rFonts w:cstheme="minorHAnsi"/>
@@ -709,7 +523,6 @@
               </w:rPr>
               <w:t>consigneeCity</w:t>
             </w:r>
-            <w:proofErr w:type="spellEnd"/>
             <w:r>
               <w:rPr>
                 <w:rFonts w:cstheme="minorHAnsi"/>
@@ -718,7 +531,6 @@
               </w:rPr>
               <w:t>} {</w:t>
             </w:r>
-            <w:proofErr w:type="spellStart"/>
             <w:r>
               <w:rPr>
                 <w:rFonts w:cstheme="minorHAnsi"/>
@@ -727,14 +539,320 @@
               </w:rPr>
               <w:t>consigneeState</w:t>
             </w:r>
-            <w:proofErr w:type="spellEnd"/>
-            <w:r>
-              <w:rPr>
-                <w:rFonts w:cstheme="minorHAnsi"/>
-                <w:sz w:val="20"/>
-                <w:szCs w:val="20"/>
-              </w:rPr>
-              <w:t xml:space="preserve">} </w:t>
+            <w:r>
+              <w:rPr>
+                <w:rFonts w:cstheme="minorHAnsi"/>
+                <w:sz w:val="20"/>
+                <w:szCs w:val="20"/>
+              </w:rPr>
+              <w:t>}{</w:t>
+            </w:r>
+            <w:r>
+              <w:rPr>
+                <w:rFonts w:cstheme="minorHAnsi"/>
+                <w:sz w:val="20"/>
+                <w:szCs w:val="20"/>
+              </w:rPr>
+              <w:t>consigneeCountry</w:t>
+            </w:r>
+            <w:r>
+              <w:rPr>
+                <w:rFonts w:cstheme="minorHAnsi"/>
+                <w:sz w:val="20"/>
+                <w:szCs w:val="20"/>
+              </w:rPr>
+              <w:t>} {</w:t>
+            </w:r>
+            <w:r>
+              <w:rPr>
+                <w:rFonts w:cstheme="minorHAnsi"/>
+                <w:sz w:val="20"/>
+                <w:szCs w:val="20"/>
+              </w:rPr>
+              <w:t>consigneeZip</w:t>
+            </w:r>
+            <w:r>
+              <w:rPr>
+                <w:rFonts w:cstheme="minorHAnsi"/>
+                <w:sz w:val="20"/>
+                <w:szCs w:val="20"/>
+              </w:rPr>
+              <w:t>}</w:t>
+            </w:r>
+            <w:r>
+              <w:rPr>
+                <w:rFonts w:cstheme="minorHAnsi"/>
+                <w:sz w:val="20"/>
+                <w:szCs w:val="20"/>
+              </w:rPr>
+              <w:t xml:space="preserve"> </w:t>
+            </w:r>
+            <w:r>
+              <w:rPr>
+                <w:rFonts w:cstheme="minorHAnsi"/>
+                <w:sz w:val="20"/>
+                <w:szCs w:val="20"/>
+              </w:rPr>
+              <w:t>{#isUK}</w:t>
+            </w:r>
+            <w:r>
+              <w:rPr>
+                <w:rFonts w:cstheme="minorHAnsi"/>
+                <w:sz w:val="20"/>
+                <w:szCs w:val="20"/>
+              </w:rPr>
+              <w:t>{#</w:t>
+            </w:r>
+            <w:r>
+              <w:rPr>
+                <w:rFonts w:cstheme="minorHAnsi"/>
+                <w:sz w:val="20"/>
+                <w:szCs w:val="20"/>
+              </w:rPr>
+              <w:t>consigneePhone</w:t>
+            </w:r>
+            <w:r>
+              <w:rPr>
+                <w:rFonts w:cstheme="minorHAnsi"/>
+                <w:sz w:val="20"/>
+                <w:szCs w:val="20"/>
+              </w:rPr>
+              <w:t>}</w:t>
+            </w:r>
+            <w:r>
+              <w:rPr>
+                <w:rFonts w:cstheme="minorHAnsi"/>
+                <w:sz w:val="20"/>
+                <w:szCs w:val="20"/>
+              </w:rPr>
+              <w:t>TELE:{</w:t>
+            </w:r>
+            <w:r>
+              <w:rPr>
+                <w:rFonts w:cstheme="minorHAnsi"/>
+                <w:sz w:val="20"/>
+                <w:szCs w:val="20"/>
+              </w:rPr>
+              <w:t>consigneePhone</w:t>
+            </w:r>
+            <w:r>
+              <w:rPr>
+                <w:rFonts w:cstheme="minorHAnsi"/>
+                <w:sz w:val="20"/>
+                <w:szCs w:val="20"/>
+              </w:rPr>
+              <w:t>}</w:t>
+            </w:r>
+            <w:r>
+              <w:rPr>
+                <w:rFonts w:cstheme="minorHAnsi"/>
+                <w:sz w:val="20"/>
+                <w:szCs w:val="20"/>
+              </w:rPr>
+              <w:t>{/</w:t>
+            </w:r>
+            <w:r>
+              <w:rPr>
+                <w:rFonts w:cstheme="minorHAnsi"/>
+                <w:sz w:val="20"/>
+                <w:szCs w:val="20"/>
+              </w:rPr>
+              <w:t>consigneePhone</w:t>
+            </w:r>
+            <w:r>
+              <w:rPr>
+                <w:rFonts w:cstheme="minorHAnsi"/>
+                <w:sz w:val="20"/>
+                <w:szCs w:val="20"/>
+              </w:rPr>
+              <w:t>}</w:t>
+            </w:r>
+            <w:r>
+              <w:rPr>
+                <w:rFonts w:cstheme="minorHAnsi"/>
+                <w:sz w:val="20"/>
+                <w:szCs w:val="20"/>
+              </w:rPr>
+              <w:t xml:space="preserve"> </w:t>
+            </w:r>
+          </w:p>
+          <w:p>
+            <w:pPr>
+              <w:rPr>
+                <w:rFonts w:cstheme="minorHAnsi"/>
+                <w:sz w:val="20"/>
+                <w:szCs w:val="20"/>
+              </w:rPr>
+            </w:pPr>
+            <w:r>
+              <w:rPr>
+                <w:rFonts w:cstheme="minorHAnsi"/>
+                <w:sz w:val="20"/>
+                <w:szCs w:val="20"/>
+              </w:rPr>
+              <w:t>{#</w:t>
+            </w:r>
+            <w:r>
+              <w:rPr>
+                <w:rFonts w:cstheme="minorHAnsi"/>
+                <w:sz w:val="20"/>
+                <w:szCs w:val="20"/>
+              </w:rPr>
+              <w:t>consigneeEmail</w:t>
+            </w:r>
+            <w:r>
+              <w:rPr>
+                <w:rFonts w:cstheme="minorHAnsi"/>
+                <w:sz w:val="20"/>
+                <w:szCs w:val="20"/>
+              </w:rPr>
+              <w:t>}</w:t>
+            </w:r>
+            <w:r>
+              <w:rPr>
+                <w:rFonts w:cstheme="minorHAnsi"/>
+                <w:sz w:val="20"/>
+                <w:szCs w:val="20"/>
+              </w:rPr>
+              <w:t>EMAIL</w:t>
+            </w:r>
+            <w:r>
+              <w:rPr>
+                <w:rFonts w:cstheme="minorHAnsi"/>
+                <w:sz w:val="20"/>
+                <w:szCs w:val="20"/>
+              </w:rPr>
+              <w:t>:{</w:t>
+            </w:r>
+            <w:r>
+              <w:rPr>
+                <w:rFonts w:cstheme="minorHAnsi"/>
+                <w:sz w:val="20"/>
+                <w:szCs w:val="20"/>
+              </w:rPr>
+              <w:t>consigneeEmail</w:t>
+            </w:r>
+            <w:r>
+              <w:rPr>
+                <w:rFonts w:cstheme="minorHAnsi"/>
+                <w:sz w:val="20"/>
+                <w:szCs w:val="20"/>
+              </w:rPr>
+              <w:t>}</w:t>
+            </w:r>
+            <w:r>
+              <w:rPr>
+                <w:rFonts w:cstheme="minorHAnsi"/>
+                <w:sz w:val="20"/>
+                <w:szCs w:val="20"/>
+              </w:rPr>
+              <w:t>{/</w:t>
+            </w:r>
+            <w:r>
+              <w:rPr>
+                <w:rFonts w:cstheme="minorHAnsi"/>
+                <w:sz w:val="20"/>
+                <w:szCs w:val="20"/>
+              </w:rPr>
+              <w:t>consigneeEmail</w:t>
+            </w:r>
+            <w:r>
+              <w:rPr>
+                <w:rFonts w:cstheme="minorHAnsi"/>
+                <w:sz w:val="20"/>
+                <w:szCs w:val="20"/>
+              </w:rPr>
+              <w:t>}</w:t>
+            </w:r>
+            <w:r>
+              <w:rPr>
+                <w:rFonts w:cstheme="minorHAnsi"/>
+                <w:sz w:val="20"/>
+                <w:szCs w:val="20"/>
+              </w:rPr>
+              <w:t>{/isUK}</w:t>
+            </w:r>
+          </w:p>
+          <w:p>
+            <w:pPr>
+              <w:rPr>
+                <w:rFonts w:cstheme="minorHAnsi"/>
+                <w:sz w:val="20"/>
+                <w:szCs w:val="20"/>
+              </w:rPr>
+            </w:pPr>
+            <w:r>
+              <w:rPr>
+                <w:rFonts w:cstheme="minorHAnsi"/>
+                <w:sz w:val="20"/>
+                <w:szCs w:val="20"/>
+              </w:rPr>
+              <w:t>{#</w:t>
+            </w:r>
+            <w:r>
+              <w:rPr>
+                <w:rFonts w:cstheme="minorHAnsi"/>
+                <w:sz w:val="20"/>
+                <w:szCs w:val="20"/>
+              </w:rPr>
+              <w:t>notifyName</w:t>
+            </w:r>
+            <w:r>
+              <w:rPr>
+                <w:rFonts w:cstheme="minorHAnsi"/>
+                <w:sz w:val="20"/>
+                <w:szCs w:val="20"/>
+              </w:rPr>
+              <w:t>}</w:t>
+            </w:r>
+            <w:r>
+              <w:rPr>
+                <w:rFonts w:cstheme="minorHAnsi"/>
+                <w:sz w:val="20"/>
+                <w:szCs w:val="20"/>
+              </w:rPr>
+              <w:t>{#</w:t>
+            </w:r>
+            <w:r>
+              <w:rPr>
+                <w:rFonts w:cstheme="minorHAnsi"/>
+                <w:sz w:val="20"/>
+                <w:szCs w:val="20"/>
+              </w:rPr>
+              <w:t>notifyAddress</w:t>
+            </w:r>
+            <w:r>
+              <w:rPr>
+                <w:rFonts w:cstheme="minorHAnsi"/>
+                <w:sz w:val="20"/>
+                <w:szCs w:val="20"/>
+              </w:rPr>
+              <w:t>}</w:t>
+            </w:r>
+          </w:p>
+          <w:p>
+            <w:pPr>
+              <w:rPr>
+                <w:rFonts w:cstheme="minorHAnsi"/>
+                <w:sz w:val="20"/>
+                <w:szCs w:val="20"/>
+              </w:rPr>
+            </w:pPr>
+            <w:r>
+              <w:rPr>
+                <w:rFonts w:cstheme="minorHAnsi"/>
+                <w:sz w:val="20"/>
+                <w:szCs w:val="20"/>
+              </w:rPr>
+              <w:t>NOTIFY</w:t>
+            </w:r>
+            <w:r>
+              <w:rPr>
+                <w:rFonts w:cstheme="minorHAnsi"/>
+                <w:sz w:val="20"/>
+                <w:szCs w:val="20"/>
+              </w:rPr>
+              <w:t xml:space="preserve"> – </w:t>
             </w:r>
           </w:p>
           <w:p>
@@ -753,34 +871,14 @@
               </w:rPr>
               <w:t>{</w:t>
             </w:r>
-            <w:proofErr w:type="spellStart"/>
-            <w:r>
-              <w:rPr>
-                <w:rFonts w:cstheme="minorHAnsi"/>
-                <w:sz w:val="20"/>
-                <w:szCs w:val="20"/>
-              </w:rPr>
-              <w:t>consigneeCountry</w:t>
-            </w:r>
-            <w:proofErr w:type="spellEnd"/>
-            <w:r>
-              <w:rPr>
-                <w:rFonts w:cstheme="minorHAnsi"/>
-                <w:sz w:val="20"/>
-                <w:szCs w:val="20"/>
-              </w:rPr>
-              <w:t>} {</w:t>
-            </w:r>
-            <w:proofErr w:type="spellStart"/>
-            <w:r>
-              <w:rPr>
-                <w:rFonts w:cstheme="minorHAnsi"/>
-                <w:sz w:val="20"/>
-                <w:szCs w:val="20"/>
-              </w:rPr>
-              <w:t>consigneeZip</w:t>
-            </w:r>
-            <w:proofErr w:type="spellEnd"/>
+            <w:r>
+              <w:rPr>
+                <w:rFonts w:cstheme="minorHAnsi"/>
+                <w:sz w:val="20"/>
+                <w:szCs w:val="20"/>
+              </w:rPr>
+              <w:t>notifyName</w:t>
+            </w:r>
             <w:r>
               <w:rPr>
                 <w:rFonts w:cstheme="minorHAnsi"/>
@@ -789,32 +887,23 @@
               </w:rPr>
               <w:t>}</w:t>
             </w:r>
-          </w:p>
-          <w:p>
-            <w:pPr>
-              <w:rPr>
-                <w:rFonts w:cstheme="minorHAnsi"/>
-                <w:sz w:val="20"/>
-                <w:szCs w:val="20"/>
-              </w:rPr>
-            </w:pPr>
-            <w:r>
-              <w:rPr>
-                <w:rFonts w:cstheme="minorHAnsi"/>
-                <w:sz w:val="20"/>
-                <w:szCs w:val="20"/>
-              </w:rPr>
-              <w:t>{#</w:t>
-            </w:r>
-            <w:proofErr w:type="gramStart"/>
-            <w:r>
-              <w:rPr>
-                <w:rFonts w:cstheme="minorHAnsi"/>
-                <w:sz w:val="20"/>
-                <w:szCs w:val="20"/>
-              </w:rPr>
-              <w:t>isUK}</w:t>
-            </w:r>
+            <w:r>
+              <w:rPr>
+                <w:rFonts w:cstheme="minorHAnsi"/>
+                <w:sz w:val="20"/>
+                <w:szCs w:val="20"/>
+              </w:rPr>
+              <w:t xml:space="preserve"> </w:t>
+            </w:r>
+          </w:p>
+          <w:p>
+            <w:pPr>
+              <w:rPr>
+                <w:rFonts w:cstheme="minorHAnsi"/>
+                <w:sz w:val="20"/>
+                <w:szCs w:val="20"/>
+              </w:rPr>
+            </w:pPr>
             <w:r>
               <w:rPr>
                 <w:rFonts w:cstheme="minorHAnsi"/>
@@ -823,23 +912,13 @@
               </w:rPr>
               <w:t>{</w:t>
             </w:r>
-            <w:proofErr w:type="gramEnd"/>
-            <w:r>
-              <w:rPr>
-                <w:rFonts w:cstheme="minorHAnsi"/>
-                <w:sz w:val="20"/>
-                <w:szCs w:val="20"/>
-              </w:rPr>
-              <w:t>#</w:t>
-            </w:r>
-            <w:proofErr w:type="gramStart"/>
-            <w:r>
-              <w:rPr>
-                <w:rFonts w:cstheme="minorHAnsi"/>
-                <w:sz w:val="20"/>
-                <w:szCs w:val="20"/>
-              </w:rPr>
-              <w:t>consigneePhone</w:t>
+            <w:r>
+              <w:rPr>
+                <w:rFonts w:cstheme="minorHAnsi"/>
+                <w:sz w:val="20"/>
+                <w:szCs w:val="20"/>
+              </w:rPr>
+              <w:t>notifyAddress</w:t>
             </w:r>
             <w:r>
               <w:rPr>
@@ -855,207 +934,15 @@
                 <w:sz w:val="20"/>
                 <w:szCs w:val="20"/>
               </w:rPr>
-              <w:t>TELE</w:t>
-            </w:r>
-            <w:proofErr w:type="gramEnd"/>
-            <w:r>
-              <w:rPr>
-                <w:rFonts w:cstheme="minorHAnsi"/>
-                <w:sz w:val="20"/>
-                <w:szCs w:val="20"/>
-              </w:rPr>
-              <w:t>: {</w:t>
-            </w:r>
-            <w:proofErr w:type="spellStart"/>
-            <w:r>
-              <w:rPr>
-                <w:rFonts w:cstheme="minorHAnsi"/>
-                <w:sz w:val="20"/>
-                <w:szCs w:val="20"/>
-              </w:rPr>
-              <w:t>consigneePhone</w:t>
-            </w:r>
-            <w:proofErr w:type="spellEnd"/>
-            <w:r>
-              <w:rPr>
-                <w:rFonts w:cstheme="minorHAnsi"/>
-                <w:sz w:val="20"/>
-                <w:szCs w:val="20"/>
-              </w:rPr>
-              <w:t>}</w:t>
-            </w:r>
-            <w:r>
-              <w:rPr>
-                <w:rFonts w:cstheme="minorHAnsi"/>
-                <w:sz w:val="20"/>
-                <w:szCs w:val="20"/>
-              </w:rPr>
-              <w:t>{/</w:t>
-            </w:r>
-            <w:proofErr w:type="spellStart"/>
-            <w:r>
-              <w:rPr>
-                <w:rFonts w:cstheme="minorHAnsi"/>
-                <w:sz w:val="20"/>
-                <w:szCs w:val="20"/>
-              </w:rPr>
-              <w:t>consigneePhone</w:t>
-            </w:r>
-            <w:proofErr w:type="spellEnd"/>
-            <w:r>
-              <w:rPr>
-                <w:rFonts w:cstheme="minorHAnsi"/>
-                <w:sz w:val="20"/>
-                <w:szCs w:val="20"/>
-              </w:rPr>
-              <w:t>}</w:t>
-            </w:r>
-          </w:p>
-          <w:p>
-            <w:pPr>
-              <w:rPr>
-                <w:rFonts w:cstheme="minorHAnsi"/>
-                <w:sz w:val="20"/>
-                <w:szCs w:val="20"/>
-              </w:rPr>
-            </w:pPr>
-            <w:r>
-              <w:rPr>
-                <w:rFonts w:cstheme="minorHAnsi"/>
-                <w:sz w:val="20"/>
-                <w:szCs w:val="20"/>
-              </w:rPr>
-              <w:t>{#</w:t>
-            </w:r>
-            <w:proofErr w:type="gramStart"/>
-            <w:r>
-              <w:rPr>
-                <w:rFonts w:cstheme="minorHAnsi"/>
-                <w:sz w:val="20"/>
-                <w:szCs w:val="20"/>
-              </w:rPr>
-              <w:t>consigneeEmail</w:t>
-            </w:r>
-            <w:r>
-              <w:rPr>
-                <w:rFonts w:cstheme="minorHAnsi"/>
-                <w:sz w:val="20"/>
-                <w:szCs w:val="20"/>
-              </w:rPr>
-              <w:t>}</w:t>
-            </w:r>
-            <w:r>
-              <w:rPr>
-                <w:rFonts w:cstheme="minorHAnsi"/>
-                <w:sz w:val="20"/>
-                <w:szCs w:val="20"/>
-              </w:rPr>
-              <w:t>EMAIL</w:t>
-            </w:r>
-            <w:proofErr w:type="gramEnd"/>
-            <w:r>
-              <w:rPr>
-                <w:rFonts w:cstheme="minorHAnsi"/>
-                <w:sz w:val="20"/>
-                <w:szCs w:val="20"/>
-              </w:rPr>
-              <w:t>:</w:t>
-            </w:r>
-            <w:r>
-              <w:rPr>
-                <w:rFonts w:cstheme="minorHAnsi"/>
-                <w:sz w:val="20"/>
-                <w:szCs w:val="20"/>
-              </w:rPr>
-              <w:t xml:space="preserve"> </w:t>
-            </w:r>
-            <w:r>
-              <w:rPr>
-                <w:rFonts w:cstheme="minorHAnsi"/>
-                <w:sz w:val="20"/>
-                <w:szCs w:val="20"/>
-              </w:rPr>
-              <w:t>{</w:t>
-            </w:r>
-            <w:proofErr w:type="spellStart"/>
-            <w:r>
-              <w:rPr>
-                <w:rFonts w:cstheme="minorHAnsi"/>
-                <w:sz w:val="20"/>
-                <w:szCs w:val="20"/>
-              </w:rPr>
-              <w:t>consigneeEmail</w:t>
-            </w:r>
-            <w:proofErr w:type="spellEnd"/>
-            <w:r>
-              <w:rPr>
-                <w:rFonts w:cstheme="minorHAnsi"/>
-                <w:sz w:val="20"/>
-                <w:szCs w:val="20"/>
-              </w:rPr>
-              <w:t>}</w:t>
-            </w:r>
-            <w:r>
-              <w:rPr>
-                <w:rFonts w:cstheme="minorHAnsi"/>
-                <w:sz w:val="20"/>
-                <w:szCs w:val="20"/>
-              </w:rPr>
-              <w:t>{/</w:t>
-            </w:r>
-            <w:proofErr w:type="spellStart"/>
-            <w:proofErr w:type="gramStart"/>
-            <w:r>
-              <w:rPr>
-                <w:rFonts w:cstheme="minorHAnsi"/>
-                <w:sz w:val="20"/>
-                <w:szCs w:val="20"/>
-              </w:rPr>
-              <w:t>consigneeEmail</w:t>
-            </w:r>
-            <w:proofErr w:type="spellEnd"/>
-            <w:r>
-              <w:rPr>
-                <w:rFonts w:cstheme="minorHAnsi"/>
-                <w:sz w:val="20"/>
-                <w:szCs w:val="20"/>
-              </w:rPr>
-              <w:t>}</w:t>
-            </w:r>
-            <w:r>
-              <w:rPr>
-                <w:rFonts w:cstheme="minorHAnsi"/>
-                <w:sz w:val="20"/>
-                <w:szCs w:val="20"/>
-              </w:rPr>
-              <w:t>{</w:t>
-            </w:r>
-            <w:proofErr w:type="gramEnd"/>
-            <w:r>
-              <w:rPr>
-                <w:rFonts w:cstheme="minorHAnsi"/>
-                <w:sz w:val="20"/>
-                <w:szCs w:val="20"/>
-              </w:rPr>
-              <w:t>/</w:t>
-            </w:r>
-            <w:proofErr w:type="spellStart"/>
-            <w:r>
-              <w:rPr>
-                <w:rFonts w:cstheme="minorHAnsi"/>
-                <w:sz w:val="20"/>
-                <w:szCs w:val="20"/>
-              </w:rPr>
-              <w:t>isUK</w:t>
-            </w:r>
-            <w:proofErr w:type="spellEnd"/>
-            <w:r>
-              <w:rPr>
-                <w:rFonts w:cstheme="minorHAnsi"/>
-                <w:sz w:val="20"/>
-                <w:szCs w:val="20"/>
-              </w:rPr>
-              <w:t>}</w:t>
+              <w:t>{/}</w:t>
+            </w:r>
+            <w:r>
+              <w:rPr>
+                <w:rFonts w:cstheme="minorHAnsi"/>
+                <w:sz w:val="20"/>
+                <w:szCs w:val="20"/>
+              </w:rPr>
+              <w:t>{/}</w:t>
             </w:r>
           </w:p>
         </w:tc>
@@ -1101,7 +988,6 @@
               </w:rPr>
               <w:t>{</w:t>
             </w:r>
-            <w:proofErr w:type="spellStart"/>
             <w:r>
               <w:rPr>
                 <w:rFonts w:cstheme="minorHAnsi"/>
@@ -1110,7 +996,6 @@
               </w:rPr>
               <w:t>buyerName</w:t>
             </w:r>
-            <w:proofErr w:type="spellEnd"/>
             <w:r>
               <w:rPr>
                 <w:rFonts w:cstheme="minorHAnsi"/>
@@ -1136,7 +1021,6 @@
               </w:rPr>
               <w:t>{</w:t>
             </w:r>
-            <w:proofErr w:type="spellStart"/>
             <w:r>
               <w:rPr>
                 <w:rFonts w:cstheme="minorHAnsi"/>
@@ -1145,7 +1029,6 @@
               </w:rPr>
               <w:t>buyerAddress</w:t>
             </w:r>
-            <w:proofErr w:type="spellEnd"/>
             <w:r>
               <w:rPr>
                 <w:rFonts w:cstheme="minorHAnsi"/>
@@ -1154,7 +1037,6 @@
               </w:rPr>
               <w:t>} {</w:t>
             </w:r>
-            <w:proofErr w:type="spellStart"/>
             <w:r>
               <w:rPr>
                 <w:rFonts w:cstheme="minorHAnsi"/>
@@ -1163,7 +1045,6 @@
               </w:rPr>
               <w:t>buyerCity</w:t>
             </w:r>
-            <w:proofErr w:type="spellEnd"/>
             <w:r>
               <w:rPr>
                 <w:rFonts w:cstheme="minorHAnsi"/>
@@ -1172,7 +1053,6 @@
               </w:rPr>
               <w:t>} {</w:t>
             </w:r>
-            <w:proofErr w:type="spellStart"/>
             <w:r>
               <w:rPr>
                 <w:rFonts w:cstheme="minorHAnsi"/>
@@ -1181,7 +1061,6 @@
               </w:rPr>
               <w:t>buyerState</w:t>
             </w:r>
-            <w:proofErr w:type="spellEnd"/>
             <w:r>
               <w:rPr>
                 <w:rFonts w:cstheme="minorHAnsi"/>
@@ -1207,7 +1086,6 @@
               </w:rPr>
               <w:t>{</w:t>
             </w:r>
-            <w:proofErr w:type="spellStart"/>
             <w:r>
               <w:rPr>
                 <w:rFonts w:cstheme="minorHAnsi"/>
@@ -1216,7 +1094,6 @@
               </w:rPr>
               <w:t>buyerCountry</w:t>
             </w:r>
-            <w:proofErr w:type="spellEnd"/>
             <w:r>
               <w:rPr>
                 <w:rFonts w:cstheme="minorHAnsi"/>
@@ -1225,7 +1102,6 @@
               </w:rPr>
               <w:t>} {</w:t>
             </w:r>
-            <w:proofErr w:type="spellStart"/>
             <w:r>
               <w:rPr>
                 <w:rFonts w:cstheme="minorHAnsi"/>
@@ -1234,7 +1110,6 @@
               </w:rPr>
               <w:t>buyerZip</w:t>
             </w:r>
-            <w:proofErr w:type="spellEnd"/>
             <w:r>
               <w:rPr>
                 <w:rFonts w:cstheme="minorHAnsi"/>
@@ -1307,7 +1182,6 @@
               </w:rPr>
               <w:t>{</w:t>
             </w:r>
-            <w:proofErr w:type="spellStart"/>
             <w:r>
               <w:rPr>
                 <w:rFonts w:cstheme="minorHAnsi"/>
@@ -1316,7 +1190,6 @@
               </w:rPr>
               <w:t>originOfGoods</w:t>
             </w:r>
-            <w:proofErr w:type="spellEnd"/>
             <w:r>
               <w:rPr>
                 <w:rFonts w:cstheme="minorHAnsi"/>
@@ -1368,7 +1241,6 @@
               </w:rPr>
               <w:t>{</w:t>
             </w:r>
-            <w:proofErr w:type="spellStart"/>
             <w:r>
               <w:rPr>
                 <w:rFonts w:cstheme="minorHAnsi"/>
@@ -1377,7 +1249,6 @@
               </w:rPr>
               <w:t>finalDestination</w:t>
             </w:r>
-            <w:proofErr w:type="spellEnd"/>
             <w:r>
               <w:rPr>
                 <w:rFonts w:cstheme="minorHAnsi"/>
@@ -1454,7 +1325,6 @@
               </w:rPr>
               <w:t>{</w:t>
             </w:r>
-            <w:proofErr w:type="spellStart"/>
             <w:r>
               <w:rPr>
                 <w:rFonts w:cstheme="minorHAnsi"/>
@@ -1463,7 +1333,6 @@
               </w:rPr>
               <w:t>termOfDeliveryAndPayment</w:t>
             </w:r>
-            <w:proofErr w:type="spellEnd"/>
             <w:r>
               <w:rPr>
                 <w:rFonts w:cstheme="minorHAnsi"/>
@@ -1500,7 +1369,6 @@
                 <w:szCs w:val="20"/>
               </w:rPr>
             </w:pPr>
-            <w:proofErr w:type="spellStart"/>
             <w:r>
               <w:rPr>
                 <w:rFonts w:ascii="SansSerif" w:hAnsi="SansSerif" w:cs="SansSerif"/>
@@ -1508,17 +1376,7 @@
                 <w:sz w:val="20"/>
                 <w:szCs w:val="20"/>
               </w:rPr>
-              <w:t>Precarriage</w:t>
-            </w:r>
-            <w:proofErr w:type="spellEnd"/>
-            <w:r>
-              <w:rPr>
-                <w:rFonts w:ascii="SansSerif" w:hAnsi="SansSerif" w:cs="SansSerif"/>
-                <w:color w:val="000000"/>
-                <w:sz w:val="20"/>
-                <w:szCs w:val="20"/>
-              </w:rPr>
-              <w:t xml:space="preserve"> by:</w:t>
+              <w:t>Precarriage by:</w:t>
             </w:r>
           </w:p>
         </w:tc>
@@ -1573,7 +1431,6 @@
               </w:rPr>
               <w:t>{</w:t>
             </w:r>
-            <w:proofErr w:type="spellStart"/>
             <w:r>
               <w:rPr>
                 <w:rFonts w:ascii="SansSerif" w:hAnsi="SansSerif" w:cs="SansSerif"/>
@@ -1583,7 +1440,6 @@
               </w:rPr>
               <w:t>placeOfReceipt</w:t>
             </w:r>
-            <w:proofErr w:type="spellEnd"/>
             <w:r>
               <w:rPr>
                 <w:rFonts w:ascii="SansSerif" w:hAnsi="SansSerif" w:cs="SansSerif"/>
@@ -1718,7 +1574,6 @@
               </w:rPr>
               <w:t>{</w:t>
             </w:r>
-            <w:proofErr w:type="spellStart"/>
             <w:r>
               <w:rPr>
                 <w:rFonts w:ascii="SansSerif" w:hAnsi="SansSerif" w:cs="SansSerif"/>
@@ -1728,7 +1583,6 @@
               </w:rPr>
               <w:t>portOfLoading</w:t>
             </w:r>
-            <w:proofErr w:type="spellEnd"/>
             <w:r>
               <w:rPr>
                 <w:rFonts w:ascii="SansSerif" w:hAnsi="SansSerif" w:cs="SansSerif"/>
@@ -1814,7 +1668,6 @@
               </w:rPr>
               <w:t>{</w:t>
             </w:r>
-            <w:proofErr w:type="spellStart"/>
             <w:r>
               <w:rPr>
                 <w:rFonts w:ascii="SansSerif" w:hAnsi="SansSerif" w:cs="SansSerif"/>
@@ -1824,7 +1677,6 @@
               </w:rPr>
               <w:t>portOfDischarge</w:t>
             </w:r>
-            <w:proofErr w:type="spellEnd"/>
             <w:r>
               <w:rPr>
                 <w:rFonts w:ascii="SansSerif" w:hAnsi="SansSerif" w:cs="SansSerif"/>
@@ -1883,7 +1735,6 @@
               </w:rPr>
               <w:t>{</w:t>
             </w:r>
-            <w:proofErr w:type="spellStart"/>
             <w:r>
               <w:rPr>
                 <w:rFonts w:ascii="SansSerif" w:hAnsi="SansSerif" w:cs="SansSerif"/>
@@ -1893,7 +1744,6 @@
               </w:rPr>
               <w:t>finalDestination</w:t>
             </w:r>
-            <w:proofErr w:type="spellEnd"/>
             <w:r>
               <w:rPr>
                 <w:rFonts w:ascii="SansSerif" w:hAnsi="SansSerif" w:cs="SansSerif"/>
@@ -1963,7 +1813,6 @@
               </w:rPr>
               <w:t>{</w:t>
             </w:r>
-            <w:proofErr w:type="spellStart"/>
             <w:r>
               <w:rPr>
                 <w:rFonts w:cstheme="minorHAnsi"/>
@@ -1972,7 +1821,6 @@
               </w:rPr>
               <w:t>privateRemark</w:t>
             </w:r>
-            <w:proofErr w:type="spellEnd"/>
             <w:r>
               <w:rPr>
                 <w:rFonts w:cstheme="minorHAnsi"/>
@@ -2159,22 +2007,8 @@
                       <w:sz w:val="20"/>
                       <w:szCs w:val="20"/>
                     </w:rPr>
-                    <w:t xml:space="preserve">Total </w:t>
-                  </w:r>
-                  <w:proofErr w:type="spellStart"/>
-                  <w:proofErr w:type="gramStart"/>
-                  <w:r>
-                    <w:rPr>
-                      <w:rFonts w:cstheme="minorHAnsi"/>
-                      <w:b/>
-                      <w:bCs/>
-                      <w:sz w:val="20"/>
-                      <w:szCs w:val="20"/>
-                    </w:rPr>
-                    <w:t>Sq.Mt</w:t>
-                  </w:r>
-                  <w:proofErr w:type="spellEnd"/>
-                  <w:proofErr w:type="gramEnd"/>
+                    <w:t>Total Sq.Mt</w:t>
+                  </w:r>
                 </w:p>
               </w:tc>
               <w:tc>
@@ -2234,29 +2068,7 @@
                       <w:sz w:val="20"/>
                       <w:szCs w:val="20"/>
                     </w:rPr>
-                    <w:t>{</w:t>
-                  </w:r>
-                  <w:proofErr w:type="spellStart"/>
-                  <w:r>
-                    <w:rPr>
-                      <w:rFonts w:cstheme="minorHAnsi"/>
-                      <w:b/>
-                      <w:bCs/>
-                      <w:sz w:val="20"/>
-                      <w:szCs w:val="20"/>
-                    </w:rPr>
-                    <w:t>currencyChar</w:t>
-                  </w:r>
-                  <w:proofErr w:type="spellEnd"/>
-                  <w:r>
-                    <w:rPr>
-                      <w:rFonts w:cstheme="minorHAnsi"/>
-                      <w:b/>
-                      <w:bCs/>
-                      <w:sz w:val="20"/>
-                      <w:szCs w:val="20"/>
-                    </w:rPr>
-                    <w:t>}</w:t>
+                    <w:t>{currencyChar}</w:t>
                   </w:r>
                 </w:p>
               </w:tc>
@@ -2311,29 +2123,7 @@
                       <w:sz w:val="20"/>
                       <w:szCs w:val="20"/>
                     </w:rPr>
-                    <w:t>{</w:t>
-                  </w:r>
-                  <w:proofErr w:type="spellStart"/>
-                  <w:r>
-                    <w:rPr>
-                      <w:rFonts w:cstheme="minorHAnsi"/>
-                      <w:b/>
-                      <w:bCs/>
-                      <w:sz w:val="20"/>
-                      <w:szCs w:val="20"/>
-                    </w:rPr>
-                    <w:t>currencyChar</w:t>
-                  </w:r>
-                  <w:proofErr w:type="spellEnd"/>
-                  <w:r>
-                    <w:rPr>
-                      <w:rFonts w:cstheme="minorHAnsi"/>
-                      <w:b/>
-                      <w:bCs/>
-                      <w:sz w:val="20"/>
-                      <w:szCs w:val="20"/>
-                    </w:rPr>
-                    <w:t>}</w:t>
+                    <w:t>{currencyChar}</w:t>
                   </w:r>
                 </w:p>
               </w:tc>
@@ -2504,34 +2294,7 @@
                       <w:sz w:val="18"/>
                       <w:szCs w:val="18"/>
                     </w:rPr>
-                    <w:t>{#</w:t>
-                  </w:r>
-                  <w:proofErr w:type="gramStart"/>
-                  <w:r>
-                    <w:rPr>
-                      <w:rFonts w:ascii="Arial" w:hAnsi="Arial" w:cs="Arial"/>
-                      <w:sz w:val="18"/>
-                      <w:szCs w:val="18"/>
-                    </w:rPr>
-                    <w:t>CIItems}{</w:t>
-                  </w:r>
-                  <w:proofErr w:type="gramEnd"/>
-                  <w:r>
-                    <w:rPr>
-                      <w:rFonts w:ascii="Arial" w:hAnsi="Arial" w:cs="Arial"/>
-                      <w:sz w:val="18"/>
-                      <w:szCs w:val="18"/>
-                    </w:rPr>
-                    <w:t>#</w:t>
-                  </w:r>
-                  <w:proofErr w:type="gramStart"/>
-                  <w:r>
-                    <w:rPr>
-                      <w:rFonts w:ascii="Arial" w:hAnsi="Arial" w:cs="Arial"/>
-                      <w:sz w:val="18"/>
-                      <w:szCs w:val="18"/>
-                    </w:rPr>
-                    <w:t>showThickness}</w:t>
+                    <w:t>{#CIItems}{#showThickness}</w:t>
                   </w:r>
                   <w:r>
                     <w:rPr>
@@ -2541,18 +2304,7 @@
                       <w:sz w:val="18"/>
                       <w:szCs w:val="18"/>
                     </w:rPr>
-                    <w:t>{</w:t>
-                  </w:r>
-                  <w:proofErr w:type="gramEnd"/>
-                  <w:r>
-                    <w:rPr>
-                      <w:rFonts w:ascii="Arial" w:hAnsi="Arial" w:cs="Arial"/>
-                      <w:b/>
-                      <w:bCs/>
-                      <w:sz w:val="18"/>
-                      <w:szCs w:val="18"/>
-                    </w:rPr>
-                    <w:t>thicknessDetail</w:t>
+                    <w:t>{thicknessDetail</w:t>
                   </w:r>
                   <w:r>
                     <w:rPr>
@@ -2756,46 +2508,16 @@
                       <w:sz w:val="18"/>
                       <w:szCs w:val="18"/>
                     </w:rPr>
-                    <w:t>COMMISION-</w:t>
-                  </w:r>
-                  <w:proofErr w:type="gramStart"/>
+                    <w:t>COMMISION-USD.{commision}{/</w:t>
+                  </w:r>
                   <w:r>
                     <w:rPr>
                       <w:rFonts w:ascii="Arial" w:hAnsi="Arial" w:cs="Arial"/>
                       <w:sz w:val="18"/>
                       <w:szCs w:val="18"/>
                     </w:rPr>
-                    <w:t>USD.{</w:t>
-                  </w:r>
-                  <w:proofErr w:type="spellStart"/>
-                  <w:proofErr w:type="gramEnd"/>
-                  <w:r>
-                    <w:rPr>
-                      <w:rFonts w:ascii="Arial" w:hAnsi="Arial" w:cs="Arial"/>
-                      <w:sz w:val="18"/>
-                      <w:szCs w:val="18"/>
-                    </w:rPr>
                     <w:t>commision</w:t>
                   </w:r>
-                  <w:proofErr w:type="spellEnd"/>
-                  <w:r>
-                    <w:rPr>
-                      <w:rFonts w:ascii="Arial" w:hAnsi="Arial" w:cs="Arial"/>
-                      <w:sz w:val="18"/>
-                      <w:szCs w:val="18"/>
-                    </w:rPr>
-                    <w:t>}{/</w:t>
-                  </w:r>
-                  <w:proofErr w:type="spellStart"/>
-                  <w:r>
-                    <w:rPr>
-                      <w:rFonts w:ascii="Arial" w:hAnsi="Arial" w:cs="Arial"/>
-                      <w:sz w:val="18"/>
-                      <w:szCs w:val="18"/>
-                    </w:rPr>
-                    <w:t>commision</w:t>
-                  </w:r>
-                  <w:proofErr w:type="spellEnd"/>
                   <w:r>
                     <w:rPr>
                       <w:rFonts w:ascii="Arial" w:hAnsi="Arial" w:cs="Arial"/>
@@ -2905,25 +2627,7 @@
                       <w:sz w:val="18"/>
                       <w:szCs w:val="18"/>
                     </w:rPr>
-                    <w:t>{#invoices} {#</w:t>
-                  </w:r>
-                  <w:proofErr w:type="gramStart"/>
-                  <w:r>
-                    <w:rPr>
-                      <w:rFonts w:ascii="Arial" w:hAnsi="Arial" w:cs="Arial"/>
-                      <w:sz w:val="18"/>
-                      <w:szCs w:val="18"/>
-                    </w:rPr>
-                    <w:t>isFirst}{</w:t>
-                  </w:r>
-                  <w:proofErr w:type="gramEnd"/>
-                  <w:r>
-                    <w:rPr>
-                      <w:rFonts w:ascii="Arial" w:hAnsi="Arial" w:cs="Arial"/>
-                      <w:sz w:val="18"/>
-                      <w:szCs w:val="18"/>
-                    </w:rPr>
-                    <w:t>fsc}{/isFirst}</w:t>
+                    <w:t>{#invoices} {#isFirst}{fsc}{/isFirst}</w:t>
                   </w:r>
                 </w:p>
               </w:tc>
@@ -2975,25 +2679,7 @@
                       <w:sz w:val="18"/>
                       <w:szCs w:val="18"/>
                     </w:rPr>
-                    <w:t>{</w:t>
-                  </w:r>
-                  <w:proofErr w:type="spellStart"/>
-                  <w:r>
-                    <w:rPr>
-                      <w:rFonts w:ascii="Arial" w:hAnsi="Arial" w:cs="Arial"/>
-                      <w:sz w:val="18"/>
-                      <w:szCs w:val="18"/>
-                    </w:rPr>
-                    <w:t>totalSq</w:t>
-                  </w:r>
-                  <w:proofErr w:type="spellEnd"/>
-                  <w:r>
-                    <w:rPr>
-                      <w:rFonts w:ascii="Arial" w:hAnsi="Arial" w:cs="Arial"/>
-                      <w:sz w:val="18"/>
-                      <w:szCs w:val="18"/>
-                    </w:rPr>
-                    <w:t>}</w:t>
+                    <w:t>{totalSq}</w:t>
                   </w:r>
                 </w:p>
               </w:tc>
@@ -3045,25 +2731,7 @@
                       <w:sz w:val="18"/>
                       <w:szCs w:val="18"/>
                     </w:rPr>
-                    <w:t>{value} {/invoices} {/</w:t>
-                  </w:r>
-                  <w:proofErr w:type="spellStart"/>
-                  <w:r>
-                    <w:rPr>
-                      <w:rFonts w:ascii="Arial" w:hAnsi="Arial" w:cs="Arial"/>
-                      <w:sz w:val="18"/>
-                      <w:szCs w:val="18"/>
-                    </w:rPr>
-                    <w:t>CIItems</w:t>
-                  </w:r>
-                  <w:proofErr w:type="spellEnd"/>
-                  <w:r>
-                    <w:rPr>
-                      <w:rFonts w:ascii="Arial" w:hAnsi="Arial" w:cs="Arial"/>
-                      <w:sz w:val="18"/>
-                      <w:szCs w:val="18"/>
-                    </w:rPr>
-                    <w:t>}</w:t>
+                    <w:t>{value} {/invoices} {/CIItems}</w:t>
                   </w:r>
                 </w:p>
               </w:tc>
@@ -3135,25 +2803,7 @@
                       <w:sz w:val="18"/>
                       <w:szCs w:val="18"/>
                     </w:rPr>
-                    <w:t>As Per P/List {/</w:t>
-                  </w:r>
-                  <w:proofErr w:type="spellStart"/>
-                  <w:r>
-                    <w:rPr>
-                      <w:rFonts w:ascii="Arial" w:hAnsi="Arial" w:cs="Arial"/>
-                      <w:sz w:val="18"/>
-                      <w:szCs w:val="18"/>
-                    </w:rPr>
-                    <w:t>isSampleBox</w:t>
-                  </w:r>
-                  <w:proofErr w:type="spellEnd"/>
-                  <w:r>
-                    <w:rPr>
-                      <w:rFonts w:ascii="Arial" w:hAnsi="Arial" w:cs="Arial"/>
-                      <w:sz w:val="18"/>
-                      <w:szCs w:val="18"/>
-                    </w:rPr>
-                    <w:t>}</w:t>
+                    <w:t>As Per P/List {/isSampleBox}</w:t>
                   </w:r>
                 </w:p>
               </w:tc>
@@ -3294,7 +2944,6 @@
                     </w:rPr>
                     <w:t>{</w:t>
                   </w:r>
-                  <w:proofErr w:type="spellStart"/>
                   <w:r>
                     <w:rPr>
                       <w:rFonts w:ascii="Arial" w:hAnsi="Arial" w:cs="Arial"/>
@@ -3303,7 +2952,6 @@
                     </w:rPr>
                     <w:t>sampleDetails</w:t>
                   </w:r>
-                  <w:proofErr w:type="spellEnd"/>
                   <w:r>
                     <w:rPr>
                       <w:rFonts w:ascii="Arial" w:hAnsi="Arial" w:cs="Arial"/>
@@ -3362,25 +3010,7 @@
                       <w:sz w:val="18"/>
                       <w:szCs w:val="18"/>
                     </w:rPr>
-                    <w:t>{</w:t>
-                  </w:r>
-                  <w:proofErr w:type="spellStart"/>
-                  <w:r>
-                    <w:rPr>
-                      <w:rFonts w:ascii="Arial" w:hAnsi="Arial" w:cs="Arial"/>
-                      <w:sz w:val="18"/>
-                      <w:szCs w:val="18"/>
-                    </w:rPr>
-                    <w:t>totalSq</w:t>
-                  </w:r>
-                  <w:proofErr w:type="spellEnd"/>
-                  <w:r>
-                    <w:rPr>
-                      <w:rFonts w:ascii="Arial" w:hAnsi="Arial" w:cs="Arial"/>
-                      <w:sz w:val="18"/>
-                      <w:szCs w:val="18"/>
-                    </w:rPr>
-                    <w:t>}</w:t>
+                    <w:t>{totalSq}</w:t>
                   </w:r>
                 </w:p>
               </w:tc>
@@ -3440,25 +3070,7 @@
                       <w:sz w:val="16"/>
                       <w:szCs w:val="16"/>
                     </w:rPr>
-                    <w:t>{/</w:t>
-                  </w:r>
-                  <w:proofErr w:type="spellStart"/>
-                  <w:r>
-                    <w:rPr>
-                      <w:rFonts w:ascii="Arial" w:hAnsi="Arial" w:cs="Arial"/>
-                      <w:sz w:val="16"/>
-                      <w:szCs w:val="16"/>
-                    </w:rPr>
-                    <w:t>sampleBox</w:t>
-                  </w:r>
-                  <w:proofErr w:type="spellEnd"/>
-                  <w:r>
-                    <w:rPr>
-                      <w:rFonts w:ascii="Arial" w:hAnsi="Arial" w:cs="Arial"/>
-                      <w:sz w:val="16"/>
-                      <w:szCs w:val="16"/>
-                    </w:rPr>
-                    <w:t>}</w:t>
+                    <w:t>{/sampleBox}</w:t>
                   </w:r>
                 </w:p>
               </w:tc>
@@ -3508,7 +3120,6 @@
               </w:rPr>
               <w:t>{</w:t>
             </w:r>
-            <w:proofErr w:type="spellStart"/>
             <w:r>
               <w:rPr>
                 <w:rFonts w:cstheme="minorHAnsi"/>
@@ -3517,7 +3128,6 @@
               </w:rPr>
               <w:t>additionSumAmount</w:t>
             </w:r>
-            <w:proofErr w:type="spellEnd"/>
             <w:r>
               <w:rPr>
                 <w:rFonts w:cstheme="minorHAnsi"/>
@@ -3794,18 +3404,56 @@
                 <w:sz w:val="20"/>
                 <w:szCs w:val="20"/>
               </w:rPr>
+              <w:t>{deliveryTerms}</w:t>
+            </w:r>
+            <w:r>
+              <w:rPr>
+                <w:rFonts w:cstheme="minorHAnsi"/>
+                <w:sz w:val="20"/>
+                <w:szCs w:val="20"/>
+              </w:rPr>
+              <w:t xml:space="preserve"> </w:t>
+            </w:r>
+            <w:r>
+              <w:rPr>
+                <w:rFonts w:cstheme="minorHAnsi"/>
+                <w:sz w:val="20"/>
+                <w:szCs w:val="20"/>
+              </w:rPr>
+              <w:t>{dischargeTerms}</w:t>
+            </w:r>
+            <w:r>
+              <w:rPr>
+                <w:rFonts w:cstheme="minorHAnsi"/>
+                <w:sz w:val="20"/>
+                <w:szCs w:val="20"/>
+              </w:rPr>
+              <w:t xml:space="preserve"> </w:t>
+            </w:r>
+            <w:r>
+              <w:rPr>
+                <w:rFonts w:cstheme="minorHAnsi"/>
+                <w:sz w:val="20"/>
+                <w:szCs w:val="20"/>
+              </w:rPr>
+              <w:t xml:space="preserve">  </w:t>
+            </w:r>
+            <w:r>
+              <w:rPr>
+                <w:rFonts w:cstheme="minorHAnsi"/>
+                <w:sz w:val="20"/>
+                <w:szCs w:val="20"/>
+              </w:rPr>
               <w:t>{</w:t>
             </w:r>
-            <w:proofErr w:type="spellStart"/>
-            <w:r>
-              <w:rPr>
-                <w:rFonts w:cstheme="minorHAnsi"/>
-                <w:sz w:val="20"/>
-                <w:szCs w:val="20"/>
-              </w:rPr>
-              <w:t>deliveryTerms</w:t>
-            </w:r>
-            <w:proofErr w:type="spellEnd"/>
+            <w:r>
+              <w:rPr>
+                <w:rFonts w:cstheme="minorHAnsi"/>
+                <w:sz w:val="20"/>
+                <w:szCs w:val="20"/>
+              </w:rPr>
+              <w:t>currencyChar</w:t>
+            </w:r>
             <w:r>
               <w:rPr>
                 <w:rFonts w:cstheme="minorHAnsi"/>
@@ -3828,33 +3476,6 @@
                 <w:sz w:val="20"/>
                 <w:szCs w:val="20"/>
               </w:rPr>
-              <w:t>{</w:t>
-            </w:r>
-            <w:proofErr w:type="spellStart"/>
-            <w:proofErr w:type="gramStart"/>
-            <w:r>
-              <w:rPr>
-                <w:rFonts w:cstheme="minorHAnsi"/>
-                <w:sz w:val="20"/>
-                <w:szCs w:val="20"/>
-              </w:rPr>
-              <w:t>dischargeTerms</w:t>
-            </w:r>
-            <w:proofErr w:type="spellEnd"/>
-            <w:r>
-              <w:rPr>
-                <w:rFonts w:cstheme="minorHAnsi"/>
-                <w:sz w:val="20"/>
-                <w:szCs w:val="20"/>
-              </w:rPr>
-              <w:t>}</w:t>
-            </w:r>
-            <w:r>
-              <w:rPr>
-                <w:rFonts w:cstheme="minorHAnsi"/>
-                <w:sz w:val="20"/>
-                <w:szCs w:val="20"/>
-              </w:rPr>
               <w:t xml:space="preserve"> </w:t>
             </w:r>
             <w:r>
@@ -3863,35 +3484,7 @@
                 <w:sz w:val="20"/>
                 <w:szCs w:val="20"/>
               </w:rPr>
-              <w:t xml:space="preserve">  </w:t>
-            </w:r>
-            <w:proofErr w:type="gramEnd"/>
-            <w:r>
-              <w:rPr>
-                <w:rFonts w:cstheme="minorHAnsi"/>
-                <w:sz w:val="20"/>
-                <w:szCs w:val="20"/>
-              </w:rPr>
-              <w:t>{</w:t>
-            </w:r>
-            <w:proofErr w:type="spellStart"/>
-            <w:proofErr w:type="gramStart"/>
-            <w:r>
-              <w:rPr>
-                <w:rFonts w:cstheme="minorHAnsi"/>
-                <w:sz w:val="20"/>
-                <w:szCs w:val="20"/>
-              </w:rPr>
-              <w:t>currencyChar</w:t>
-            </w:r>
-            <w:proofErr w:type="spellEnd"/>
-            <w:r>
-              <w:rPr>
-                <w:rFonts w:cstheme="minorHAnsi"/>
-                <w:sz w:val="20"/>
-                <w:szCs w:val="20"/>
-              </w:rPr>
-              <w:t>}</w:t>
+              <w:t>{netAmountWords}</w:t>
             </w:r>
             <w:r>
               <w:rPr>
@@ -3915,51 +3508,8 @@
                 <w:sz w:val="20"/>
                 <w:szCs w:val="20"/>
               </w:rPr>
-              <w:t>{</w:t>
-            </w:r>
-            <w:proofErr w:type="spellStart"/>
-            <w:r>
-              <w:rPr>
-                <w:rFonts w:cstheme="minorHAnsi"/>
-                <w:sz w:val="20"/>
-                <w:szCs w:val="20"/>
-              </w:rPr>
-              <w:t>netAmountWords</w:t>
-            </w:r>
-            <w:proofErr w:type="spellEnd"/>
-            <w:r>
-              <w:rPr>
-                <w:rFonts w:cstheme="minorHAnsi"/>
-                <w:sz w:val="20"/>
-                <w:szCs w:val="20"/>
-              </w:rPr>
-              <w:t>}</w:t>
-            </w:r>
-            <w:r>
-              <w:rPr>
-                <w:rFonts w:cstheme="minorHAnsi"/>
-                <w:sz w:val="20"/>
-                <w:szCs w:val="20"/>
-              </w:rPr>
-              <w:t xml:space="preserve"> </w:t>
-            </w:r>
-            <w:r>
-              <w:rPr>
-                <w:rFonts w:cstheme="minorHAnsi"/>
-                <w:sz w:val="20"/>
-                <w:szCs w:val="20"/>
-              </w:rPr>
-              <w:t xml:space="preserve"> </w:t>
-            </w:r>
-            <w:r>
-              <w:rPr>
-                <w:rFonts w:cstheme="minorHAnsi"/>
-                <w:sz w:val="20"/>
-                <w:szCs w:val="20"/>
-              </w:rPr>
               <w:t>Only</w:t>
             </w:r>
-            <w:proofErr w:type="gramEnd"/>
           </w:p>
         </w:tc>
         <w:tc>
@@ -3989,25 +3539,7 @@
                 <w:sz w:val="20"/>
                 <w:szCs w:val="20"/>
               </w:rPr>
-              <w:t>{</w:t>
-            </w:r>
-            <w:proofErr w:type="spellStart"/>
-            <w:r>
-              <w:rPr>
-                <w:rFonts w:cstheme="minorHAnsi"/>
-                <w:sz w:val="20"/>
-                <w:szCs w:val="20"/>
-              </w:rPr>
-              <w:t>netAmount</w:t>
-            </w:r>
-            <w:proofErr w:type="spellEnd"/>
-            <w:r>
-              <w:rPr>
-                <w:rFonts w:cstheme="minorHAnsi"/>
-                <w:sz w:val="20"/>
-                <w:szCs w:val="20"/>
-              </w:rPr>
-              <w:t>}</w:t>
+              <w:t>{netAmount}</w:t>
             </w:r>
           </w:p>
         </w:tc>
@@ -4043,7 +3575,6 @@
               </w:rPr>
               <w:t>{#</w:t>
             </w:r>
-            <w:proofErr w:type="gramStart"/>
             <w:r>
               <w:rPr>
                 <w:rFonts w:cstheme="minorHAnsi"/>
@@ -4058,16 +3589,15 @@
                 <w:sz w:val="18"/>
                 <w:szCs w:val="18"/>
               </w:rPr>
-              <w:t>}{</w:t>
-            </w:r>
-            <w:proofErr w:type="gramEnd"/>
+              <w:t>}{specialInstruction}{/</w:t>
+            </w:r>
             <w:r>
               <w:rPr>
                 <w:rFonts w:cstheme="minorHAnsi"/>
                 <w:sz w:val="18"/>
                 <w:szCs w:val="18"/>
               </w:rPr>
-              <w:t>specialInstruction}{/</w:t>
+              <w:t>specialInstruction</w:t>
             </w:r>
             <w:r>
               <w:rPr>
@@ -4075,42 +3605,41 @@
                 <w:sz w:val="18"/>
                 <w:szCs w:val="18"/>
               </w:rPr>
-              <w:t>specialInstruction</w:t>
-            </w:r>
-            <w:r>
+              <w:t>}</w:t>
+            </w:r>
+          </w:p>
+          <w:p>
+            <w:pPr>
+              <w:pStyle w:val="NoSpacing"/>
               <w:rPr>
                 <w:rFonts w:cstheme="minorHAnsi"/>
                 <w:sz w:val="18"/>
                 <w:szCs w:val="18"/>
               </w:rPr>
-              <w:t>}</w:t>
-            </w:r>
-          </w:p>
-          <w:p>
-            <w:pPr>
-              <w:pStyle w:val="NoSpacing"/>
+            </w:pPr>
+            <w:r>
               <w:rPr>
                 <w:rFonts w:cstheme="minorHAnsi"/>
                 <w:sz w:val="18"/>
                 <w:szCs w:val="18"/>
               </w:rPr>
-            </w:pPr>
+              <w:t>{#</w:t>
+            </w:r>
             <w:r>
               <w:rPr>
                 <w:rFonts w:cstheme="minorHAnsi"/>
                 <w:sz w:val="18"/>
                 <w:szCs w:val="18"/>
               </w:rPr>
-              <w:t>{#</w:t>
-            </w:r>
-            <w:proofErr w:type="gramStart"/>
+              <w:t>bottomNotes</w:t>
+            </w:r>
             <w:r>
               <w:rPr>
                 <w:rFonts w:cstheme="minorHAnsi"/>
                 <w:sz w:val="18"/>
                 <w:szCs w:val="18"/>
               </w:rPr>
-              <w:t>bottomNotes</w:t>
+              <w:t>}{</w:t>
             </w:r>
             <w:r>
               <w:rPr>
@@ -4118,53 +3647,42 @@
                 <w:sz w:val="18"/>
                 <w:szCs w:val="18"/>
               </w:rPr>
-              <w:t>}{</w:t>
-            </w:r>
-            <w:proofErr w:type="gramEnd"/>
+              <w:t>bottomNote</w:t>
+            </w:r>
             <w:r>
               <w:rPr>
                 <w:rFonts w:cstheme="minorHAnsi"/>
                 <w:sz w:val="18"/>
                 <w:szCs w:val="18"/>
               </w:rPr>
-              <w:t>bottomNote</w:t>
-            </w:r>
+              <w:t>}</w:t>
+            </w:r>
+          </w:p>
+          <w:p>
+            <w:pPr>
+              <w:pStyle w:val="NoSpacing"/>
+              <w:rPr>
+                <w:rFonts w:cstheme="minorHAnsi"/>
+                <w:sz w:val="20"/>
+                <w:szCs w:val="20"/>
+              </w:rPr>
+            </w:pPr>
             <w:r>
               <w:rPr>
                 <w:rFonts w:cstheme="minorHAnsi"/>
                 <w:sz w:val="18"/>
                 <w:szCs w:val="18"/>
               </w:rPr>
-              <w:t>}</w:t>
-            </w:r>
-          </w:p>
-          <w:p>
-            <w:pPr>
-              <w:pStyle w:val="NoSpacing"/>
-              <w:rPr>
-                <w:rFonts w:cstheme="minorHAnsi"/>
-                <w:sz w:val="20"/>
-                <w:szCs w:val="20"/>
-              </w:rPr>
-            </w:pPr>
+              <w:t>{/</w:t>
+            </w:r>
             <w:r>
               <w:rPr>
                 <w:rFonts w:cstheme="minorHAnsi"/>
                 <w:sz w:val="18"/>
                 <w:szCs w:val="18"/>
               </w:rPr>
-              <w:t>{/</w:t>
-            </w:r>
-            <w:proofErr w:type="spellStart"/>
-            <w:r>
-              <w:rPr>
-                <w:rFonts w:cstheme="minorHAnsi"/>
-                <w:sz w:val="18"/>
-                <w:szCs w:val="18"/>
-              </w:rPr>
               <w:t>bottomNotes</w:t>
             </w:r>
-            <w:proofErr w:type="spellEnd"/>
             <w:r>
               <w:rPr>
                 <w:rFonts w:cstheme="minorHAnsi"/>
@@ -4240,6 +3758,7 @@
                       <w:sz w:val="20"/>
                       <w:szCs w:val="20"/>
                     </w:rPr>
+                    <w:lastRenderedPageBreak/>
                     <w:t>Total Sheets:</w:t>
                   </w:r>
                 </w:p>
@@ -4267,7 +3786,6 @@
                     </w:rPr>
                     <w:t>{</w:t>
                   </w:r>
-                  <w:proofErr w:type="spellStart"/>
                   <w:r>
                     <w:rPr>
                       <w:rFonts w:cstheme="minorHAnsi"/>
@@ -4276,7 +3794,6 @@
                     </w:rPr>
                     <w:t>totalQuantity</w:t>
                   </w:r>
-                  <w:proofErr w:type="spellEnd"/>
                   <w:r>
                     <w:rPr>
                       <w:rFonts w:cstheme="minorHAnsi"/>
@@ -4341,7 +3858,6 @@
                     </w:rPr>
                     <w:t>{</w:t>
                   </w:r>
-                  <w:proofErr w:type="spellStart"/>
                   <w:r>
                     <w:rPr>
                       <w:rFonts w:cstheme="minorHAnsi"/>
@@ -4350,7 +3866,6 @@
                     </w:rPr>
                     <w:t>totalBox</w:t>
                   </w:r>
-                  <w:proofErr w:type="spellEnd"/>
                   <w:r>
                     <w:rPr>
                       <w:rFonts w:cstheme="minorHAnsi"/>
@@ -4388,27 +3903,7 @@
                       <w:sz w:val="20"/>
                       <w:szCs w:val="20"/>
                     </w:rPr>
-                    <w:t xml:space="preserve">Total </w:t>
-                  </w:r>
-                  <w:proofErr w:type="spellStart"/>
-                  <w:proofErr w:type="gramStart"/>
-                  <w:r>
-                    <w:rPr>
-                      <w:rFonts w:cstheme="minorHAnsi"/>
-                      <w:sz w:val="20"/>
-                      <w:szCs w:val="20"/>
-                    </w:rPr>
-                    <w:t>Sq.Meter</w:t>
-                  </w:r>
-                  <w:proofErr w:type="spellEnd"/>
-                  <w:proofErr w:type="gramEnd"/>
-                  <w:r>
-                    <w:rPr>
-                      <w:rFonts w:cstheme="minorHAnsi"/>
-                      <w:sz w:val="20"/>
-                      <w:szCs w:val="20"/>
-                    </w:rPr>
-                    <w:t>:</w:t>
+                    <w:t>Total Sq.Meter:</w:t>
                   </w:r>
                 </w:p>
               </w:tc>
@@ -4435,7 +3930,6 @@
                     </w:rPr>
                     <w:t>{</w:t>
                   </w:r>
-                  <w:proofErr w:type="spellStart"/>
                   <w:r>
                     <w:rPr>
                       <w:rFonts w:cstheme="minorHAnsi"/>
@@ -4444,7 +3938,6 @@
                     </w:rPr>
                     <w:t>totalSqMt</w:t>
                   </w:r>
-                  <w:proofErr w:type="spellEnd"/>
                   <w:r>
                     <w:rPr>
                       <w:rFonts w:cstheme="minorHAnsi"/>
@@ -4555,25 +4048,7 @@
                       <w:sz w:val="20"/>
                       <w:szCs w:val="20"/>
                     </w:rPr>
-                    <w:t>Avg./</w:t>
-                  </w:r>
-                  <w:proofErr w:type="gramStart"/>
-                  <w:r>
-                    <w:rPr>
-                      <w:rFonts w:cstheme="minorHAnsi"/>
-                      <w:sz w:val="20"/>
-                      <w:szCs w:val="20"/>
-                    </w:rPr>
-                    <w:t>Wt.(</w:t>
-                  </w:r>
-                  <w:proofErr w:type="gramEnd"/>
-                  <w:r>
-                    <w:rPr>
-                      <w:rFonts w:cstheme="minorHAnsi"/>
-                      <w:sz w:val="20"/>
-                      <w:szCs w:val="20"/>
-                    </w:rPr>
-                    <w:t>Kg)</w:t>
+                    <w:t>Avg./Wt.(Kg)</w:t>
                   </w:r>
                 </w:p>
               </w:tc>
@@ -4656,7 +4131,6 @@
                     </w:rPr>
                     <w:t>{#</w:t>
                   </w:r>
-                  <w:proofErr w:type="gramStart"/>
                   <w:r>
                     <w:rPr>
                       <w:rFonts w:cstheme="minorHAnsi"/>
@@ -4673,7 +4147,6 @@
                     </w:rPr>
                     <w:t>}{</w:t>
                   </w:r>
-                  <w:proofErr w:type="gramEnd"/>
                   <w:r>
                     <w:rPr>
                       <w:rFonts w:cstheme="minorHAnsi"/>
@@ -4715,7 +4188,6 @@
                     </w:rPr>
                     <w:t>{</w:t>
                   </w:r>
-                  <w:proofErr w:type="spellStart"/>
                   <w:r>
                     <w:rPr>
                       <w:rFonts w:cstheme="minorHAnsi"/>
@@ -4724,7 +4196,6 @@
                     </w:rPr>
                     <w:t>totalSqMtPerType</w:t>
                   </w:r>
-                  <w:proofErr w:type="spellEnd"/>
                   <w:r>
                     <w:rPr>
                       <w:rFonts w:cstheme="minorHAnsi"/>
@@ -4814,7 +4285,6 @@
                     </w:rPr>
                     <w:t>} MM{/</w:t>
                   </w:r>
-                  <w:proofErr w:type="spellStart"/>
                   <w:r>
                     <w:rPr>
                       <w:rFonts w:cstheme="minorHAnsi"/>
@@ -4823,7 +4293,6 @@
                     </w:rPr>
                     <w:t>containerSummary</w:t>
                   </w:r>
-                  <w:proofErr w:type="spellEnd"/>
                   <w:r>
                     <w:rPr>
                       <w:rFonts w:cstheme="minorHAnsi"/>
@@ -4949,25 +4418,7 @@
                       <w:sz w:val="20"/>
                       <w:szCs w:val="20"/>
                     </w:rPr>
-                    <w:t>{</w:t>
-                  </w:r>
-                  <w:proofErr w:type="spellStart"/>
-                  <w:r>
-                    <w:rPr>
-                      <w:rFonts w:cstheme="minorHAnsi"/>
-                      <w:sz w:val="20"/>
-                      <w:szCs w:val="20"/>
-                    </w:rPr>
-                    <w:t>panNo</w:t>
-                  </w:r>
-                  <w:proofErr w:type="spellEnd"/>
-                  <w:r>
-                    <w:rPr>
-                      <w:rFonts w:cstheme="minorHAnsi"/>
-                      <w:sz w:val="20"/>
-                      <w:szCs w:val="20"/>
-                    </w:rPr>
-                    <w:t>}</w:t>
+                    <w:t>{panNo}</w:t>
                   </w:r>
                 </w:p>
               </w:tc>
@@ -5023,43 +4474,7 @@
                       <w:sz w:val="20"/>
                       <w:szCs w:val="20"/>
                     </w:rPr>
-                    <w:t>{</w:t>
-                  </w:r>
-                  <w:proofErr w:type="spellStart"/>
-                  <w:r>
-                    <w:rPr>
-                      <w:rFonts w:cstheme="minorHAnsi"/>
-                      <w:sz w:val="20"/>
-                      <w:szCs w:val="20"/>
-                    </w:rPr>
-                    <w:t>bankName</w:t>
-                  </w:r>
-                  <w:proofErr w:type="spellEnd"/>
-                  <w:r>
-                    <w:rPr>
-                      <w:rFonts w:cstheme="minorHAnsi"/>
-                      <w:sz w:val="20"/>
-                      <w:szCs w:val="20"/>
-                    </w:rPr>
-                    <w:t>} {</w:t>
-                  </w:r>
-                  <w:proofErr w:type="spellStart"/>
-                  <w:r>
-                    <w:rPr>
-                      <w:rFonts w:cstheme="minorHAnsi"/>
-                      <w:sz w:val="20"/>
-                      <w:szCs w:val="20"/>
-                    </w:rPr>
-                    <w:t>bankBranch</w:t>
-                  </w:r>
-                  <w:proofErr w:type="spellEnd"/>
-                  <w:r>
-                    <w:rPr>
-                      <w:rFonts w:cstheme="minorHAnsi"/>
-                      <w:sz w:val="20"/>
-                      <w:szCs w:val="20"/>
-                    </w:rPr>
-                    <w:t>}</w:t>
+                    <w:t>{bankName} {bankBranch}</w:t>
                   </w:r>
                 </w:p>
               </w:tc>
@@ -5115,25 +4530,7 @@
                       <w:sz w:val="20"/>
                       <w:szCs w:val="20"/>
                     </w:rPr>
-                    <w:t>{</w:t>
-                  </w:r>
-                  <w:proofErr w:type="spellStart"/>
-                  <w:r>
-                    <w:rPr>
-                      <w:rFonts w:cstheme="minorHAnsi"/>
-                      <w:sz w:val="20"/>
-                      <w:szCs w:val="20"/>
-                    </w:rPr>
-                    <w:t>adCode</w:t>
-                  </w:r>
-                  <w:proofErr w:type="spellEnd"/>
-                  <w:r>
-                    <w:rPr>
-                      <w:rFonts w:cstheme="minorHAnsi"/>
-                      <w:sz w:val="20"/>
-                      <w:szCs w:val="20"/>
-                    </w:rPr>
-                    <w:t>}</w:t>
+                    <w:t>{adCode}</w:t>
                   </w:r>
                 </w:p>
               </w:tc>
@@ -5189,25 +4586,7 @@
                       <w:sz w:val="20"/>
                       <w:szCs w:val="20"/>
                     </w:rPr>
-                    <w:t>{</w:t>
-                  </w:r>
-                  <w:proofErr w:type="spellStart"/>
-                  <w:r>
-                    <w:rPr>
-                      <w:rFonts w:cstheme="minorHAnsi"/>
-                      <w:sz w:val="20"/>
-                      <w:szCs w:val="20"/>
-                    </w:rPr>
-                    <w:t>acCode</w:t>
-                  </w:r>
-                  <w:proofErr w:type="spellEnd"/>
-                  <w:r>
-                    <w:rPr>
-                      <w:rFonts w:cstheme="minorHAnsi"/>
-                      <w:sz w:val="20"/>
-                      <w:szCs w:val="20"/>
-                    </w:rPr>
-                    <w:t>}</w:t>
+                    <w:t>{acCode}</w:t>
                   </w:r>
                 </w:p>
               </w:tc>
@@ -5263,25 +4642,7 @@
                       <w:sz w:val="20"/>
                       <w:szCs w:val="20"/>
                     </w:rPr>
-                    <w:t>{</w:t>
-                  </w:r>
-                  <w:proofErr w:type="spellStart"/>
-                  <w:r>
-                    <w:rPr>
-                      <w:rFonts w:cstheme="minorHAnsi"/>
-                      <w:sz w:val="20"/>
-                      <w:szCs w:val="20"/>
-                    </w:rPr>
-                    <w:t>iec</w:t>
-                  </w:r>
-                  <w:proofErr w:type="spellEnd"/>
-                  <w:r>
-                    <w:rPr>
-                      <w:rFonts w:cstheme="minorHAnsi"/>
-                      <w:sz w:val="20"/>
-                      <w:szCs w:val="20"/>
-                    </w:rPr>
-                    <w:t>}</w:t>
+                    <w:t>{iec}</w:t>
                   </w:r>
                 </w:p>
               </w:tc>
@@ -5556,7 +4917,6 @@
       </w:rPr>
       <w:t>{#</w:t>
     </w:r>
-    <w:proofErr w:type="gramStart"/>
     <w:r>
       <w:rPr>
         <w:rFonts w:cstheme="minorHAnsi"/>
@@ -5582,29 +4942,7 @@
         <w:sz w:val="20"/>
         <w:szCs w:val="20"/>
       </w:rPr>
-      <w:t>{</w:t>
-    </w:r>
-    <w:proofErr w:type="gramEnd"/>
-    <w:r>
-      <w:rPr>
-        <w:b/>
-        <w:bCs/>
-        <w:spacing w:val="60"/>
-        <w:sz w:val="20"/>
-        <w:szCs w:val="20"/>
-      </w:rPr>
-      <w:t>companyName</w:t>
-    </w:r>
-    <w:proofErr w:type="gramStart"/>
-    <w:r>
-      <w:rPr>
-        <w:b/>
-        <w:bCs/>
-        <w:spacing w:val="60"/>
-        <w:sz w:val="20"/>
-        <w:szCs w:val="20"/>
-      </w:rPr>
-      <w:t>}</w:t>
+      <w:t>{companyName}</w:t>
     </w:r>
     <w:r>
       <w:rPr>
@@ -5613,17 +4951,7 @@
         <w:sz w:val="12"/>
         <w:szCs w:val="12"/>
       </w:rPr>
-      <w:t>{</w:t>
-    </w:r>
-    <w:proofErr w:type="gramEnd"/>
-    <w:r>
-      <w:rPr>
-        <w:b/>
-        <w:bCs/>
-        <w:sz w:val="12"/>
-        <w:szCs w:val="12"/>
-      </w:rPr>
-      <w:t>/}</w:t>
+      <w:t>{/}</w:t>
     </w:r>
   </w:p>
   <w:p>
@@ -6387,7 +5715,6 @@
   <w:style w:type="character" w:default="1" w:styleId="DefaultParagraphFont">
     <w:name w:val="Default Paragraph Font"/>
     <w:uiPriority w:val="1"/>
-    <w:semiHidden/>
     <w:unhideWhenUsed/>
   </w:style>
   <w:style w:type="table" w:default="1" w:styleId="TableNormal">

</xml_diff>

<commit_message>
Sign person lable added
</commit_message>
<xml_diff>
--- a/electron/database/generate-document/templates/custom-invoice.docx
+++ b/electron/database/generate-document/templates/custom-invoice.docx
@@ -4942,16 +4942,17 @@
         <w:sz w:val="20"/>
         <w:szCs w:val="20"/>
       </w:rPr>
-      <w:t>{companyName}</w:t>
+      <w:t>{companyName</w:t>
     </w:r>
     <w:r>
       <w:rPr>
         <w:b/>
         <w:bCs/>
-        <w:sz w:val="12"/>
-        <w:szCs w:val="12"/>
+        <w:spacing w:val="60"/>
+        <w:sz w:val="20"/>
+        <w:szCs w:val="20"/>
       </w:rPr>
-      <w:t>{/}</w:t>
+      <w:t>}</w:t>
     </w:r>
   </w:p>
   <w:p>
@@ -5018,13 +5019,13 @@
         <w:noProof/>
       </w:rPr>
       <w:tab/>
-      <w:t xml:space="preserve">          DIRECTOR</w:t>
+      <w:t xml:space="preserve">        </w:t>
     </w:r>
     <w:r>
       <w:rPr>
         <w:noProof/>
       </w:rPr>
-      <w:tab/>
+      <w:t>{signPerson}{/}</w:t>
     </w:r>
   </w:p>
 </w:ftr>
@@ -5715,6 +5716,7 @@
   <w:style w:type="character" w:default="1" w:styleId="DefaultParagraphFont">
     <w:name w:val="Default Paragraph Font"/>
     <w:uiPriority w:val="1"/>
+    <w:semiHidden/>
     <w:unhideWhenUsed/>
   </w:style>
   <w:style w:type="table" w:default="1" w:styleId="TableNormal">

</xml_diff>

<commit_message>
Notify to BUYER / CONSIGNEE Remove static swift number
</commit_message>
<xml_diff>
--- a/electron/database/generate-document/templates/custom-invoice.docx
+++ b/electron/database/generate-document/templates/custom-invoice.docx
@@ -104,7 +104,25 @@
                 <w:sz w:val="20"/>
                 <w:szCs w:val="20"/>
               </w:rPr>
-              <w:t>{#companyData}{companyName}</w:t>
+              <w:t>{#</w:t>
+            </w:r>
+            <w:proofErr w:type="gramStart"/>
+            <w:r>
+              <w:rPr>
+                <w:rFonts w:cstheme="minorHAnsi"/>
+                <w:sz w:val="20"/>
+                <w:szCs w:val="20"/>
+              </w:rPr>
+              <w:t>companyData}{</w:t>
+            </w:r>
+            <w:proofErr w:type="gramEnd"/>
+            <w:r>
+              <w:rPr>
+                <w:rFonts w:cstheme="minorHAnsi"/>
+                <w:sz w:val="20"/>
+                <w:szCs w:val="20"/>
+              </w:rPr>
+              <w:t>companyName}</w:t>
             </w:r>
           </w:p>
           <w:p>
@@ -122,7 +140,160 @@
                 <w:sz w:val="20"/>
                 <w:szCs w:val="20"/>
               </w:rPr>
-              <w:t>{companyAddressLine1}    {companyAddressLine2},      {companyCity}    {companyPostalCode}   {companyState}    {companyCountry}{/}</w:t>
+              <w:t xml:space="preserve">{companyAddressLine1} </w:t>
+            </w:r>
+            <w:proofErr w:type="gramStart"/>
+            <w:r>
+              <w:rPr>
+                <w:rFonts w:cstheme="minorHAnsi"/>
+                <w:bCs/>
+                <w:sz w:val="20"/>
+                <w:szCs w:val="20"/>
+              </w:rPr>
+              <w:t xml:space="preserve">   {</w:t>
+            </w:r>
+            <w:proofErr w:type="gramEnd"/>
+            <w:r>
+              <w:rPr>
+                <w:rFonts w:cstheme="minorHAnsi"/>
+                <w:bCs/>
+                <w:sz w:val="20"/>
+                <w:szCs w:val="20"/>
+              </w:rPr>
+              <w:t>companyAddressLine2</w:t>
+            </w:r>
+            <w:proofErr w:type="gramStart"/>
+            <w:r>
+              <w:rPr>
+                <w:rFonts w:cstheme="minorHAnsi"/>
+                <w:bCs/>
+                <w:sz w:val="20"/>
+                <w:szCs w:val="20"/>
+              </w:rPr>
+              <w:t>},      {</w:t>
+            </w:r>
+            <w:proofErr w:type="spellStart"/>
+            <w:r>
+              <w:rPr>
+                <w:rFonts w:cstheme="minorHAnsi"/>
+                <w:bCs/>
+                <w:sz w:val="20"/>
+                <w:szCs w:val="20"/>
+              </w:rPr>
+              <w:t>companyCity</w:t>
+            </w:r>
+            <w:proofErr w:type="spellEnd"/>
+            <w:r>
+              <w:rPr>
+                <w:rFonts w:cstheme="minorHAnsi"/>
+                <w:bCs/>
+                <w:sz w:val="20"/>
+                <w:szCs w:val="20"/>
+              </w:rPr>
+              <w:t xml:space="preserve">}   </w:t>
+            </w:r>
+            <w:proofErr w:type="gramEnd"/>
+            <w:r>
+              <w:rPr>
+                <w:rFonts w:cstheme="minorHAnsi"/>
+                <w:bCs/>
+                <w:sz w:val="20"/>
+                <w:szCs w:val="20"/>
+              </w:rPr>
+              <w:t xml:space="preserve"> {</w:t>
+            </w:r>
+            <w:proofErr w:type="spellStart"/>
+            <w:proofErr w:type="gramStart"/>
+            <w:r>
+              <w:rPr>
+                <w:rFonts w:cstheme="minorHAnsi"/>
+                <w:bCs/>
+                <w:sz w:val="20"/>
+                <w:szCs w:val="20"/>
+              </w:rPr>
+              <w:t>companyPostalCode</w:t>
+            </w:r>
+            <w:proofErr w:type="spellEnd"/>
+            <w:r>
+              <w:rPr>
+                <w:rFonts w:cstheme="minorHAnsi"/>
+                <w:bCs/>
+                <w:sz w:val="20"/>
+                <w:szCs w:val="20"/>
+              </w:rPr>
+              <w:t xml:space="preserve">}   </w:t>
+            </w:r>
+            <w:proofErr w:type="gramEnd"/>
+            <w:r>
+              <w:rPr>
+                <w:rFonts w:cstheme="minorHAnsi"/>
+                <w:bCs/>
+                <w:sz w:val="20"/>
+                <w:szCs w:val="20"/>
+              </w:rPr>
+              <w:t>{</w:t>
+            </w:r>
+            <w:proofErr w:type="spellStart"/>
+            <w:proofErr w:type="gramStart"/>
+            <w:r>
+              <w:rPr>
+                <w:rFonts w:cstheme="minorHAnsi"/>
+                <w:bCs/>
+                <w:sz w:val="20"/>
+                <w:szCs w:val="20"/>
+              </w:rPr>
+              <w:t>companyState</w:t>
+            </w:r>
+            <w:proofErr w:type="spellEnd"/>
+            <w:r>
+              <w:rPr>
+                <w:rFonts w:cstheme="minorHAnsi"/>
+                <w:bCs/>
+                <w:sz w:val="20"/>
+                <w:szCs w:val="20"/>
+              </w:rPr>
+              <w:t xml:space="preserve">}   </w:t>
+            </w:r>
+            <w:proofErr w:type="gramEnd"/>
+            <w:r>
+              <w:rPr>
+                <w:rFonts w:cstheme="minorHAnsi"/>
+                <w:bCs/>
+                <w:sz w:val="20"/>
+                <w:szCs w:val="20"/>
+              </w:rPr>
+              <w:t xml:space="preserve"> {</w:t>
+            </w:r>
+            <w:proofErr w:type="spellStart"/>
+            <w:r>
+              <w:rPr>
+                <w:rFonts w:cstheme="minorHAnsi"/>
+                <w:bCs/>
+                <w:sz w:val="20"/>
+                <w:szCs w:val="20"/>
+              </w:rPr>
+              <w:t>companyCountry</w:t>
+            </w:r>
+            <w:proofErr w:type="spellEnd"/>
+            <w:proofErr w:type="gramStart"/>
+            <w:r>
+              <w:rPr>
+                <w:rFonts w:cstheme="minorHAnsi"/>
+                <w:bCs/>
+                <w:sz w:val="20"/>
+                <w:szCs w:val="20"/>
+              </w:rPr>
+              <w:t>}{</w:t>
+            </w:r>
+            <w:proofErr w:type="gramEnd"/>
+            <w:r>
+              <w:rPr>
+                <w:rFonts w:cstheme="minorHAnsi"/>
+                <w:bCs/>
+                <w:sz w:val="20"/>
+                <w:szCs w:val="20"/>
+              </w:rPr>
+              <w:t>/}</w:t>
             </w:r>
           </w:p>
         </w:tc>
@@ -156,12 +327,14 @@
               </w:rPr>
               <w:t>{</w:t>
             </w:r>
+            <w:proofErr w:type="spellStart"/>
             <w:r>
               <w:rPr>
                 <w:rFonts w:cstheme="minorHAnsi"/>
               </w:rPr>
               <w:t>modifyInvNo</w:t>
             </w:r>
+            <w:proofErr w:type="spellEnd"/>
             <w:r>
               <w:rPr>
                 <w:rFonts w:cstheme="minorHAnsi"/>
@@ -203,12 +376,14 @@
               </w:rPr>
               <w:t>{</w:t>
             </w:r>
+            <w:proofErr w:type="spellStart"/>
             <w:r>
               <w:rPr>
                 <w:rFonts w:cstheme="minorHAnsi"/>
               </w:rPr>
               <w:t>invoiceDate</w:t>
             </w:r>
+            <w:proofErr w:type="spellEnd"/>
             <w:r>
               <w:rPr>
                 <w:rFonts w:cstheme="minorHAnsi"/>
@@ -289,12 +464,14 @@
               </w:rPr>
               <w:t>{</w:t>
             </w:r>
+            <w:proofErr w:type="spellStart"/>
             <w:r>
               <w:rPr>
                 <w:rFonts w:cstheme="minorHAnsi"/>
               </w:rPr>
               <w:t>buyersOrderNo</w:t>
             </w:r>
+            <w:proofErr w:type="spellEnd"/>
             <w:r>
               <w:rPr>
                 <w:rFonts w:cstheme="minorHAnsi"/>
@@ -337,12 +514,14 @@
               </w:rPr>
               <w:t>{</w:t>
             </w:r>
+            <w:proofErr w:type="spellStart"/>
             <w:r>
               <w:rPr>
                 <w:rFonts w:cstheme="minorHAnsi"/>
               </w:rPr>
               <w:t>orderDate</w:t>
             </w:r>
+            <w:proofErr w:type="spellEnd"/>
             <w:r>
               <w:rPr>
                 <w:rFonts w:cstheme="minorHAnsi"/>
@@ -399,6 +578,7 @@
               </w:rPr>
               <w:t>{</w:t>
             </w:r>
+            <w:proofErr w:type="spellStart"/>
             <w:r>
               <w:rPr>
                 <w:rFonts w:cstheme="minorHAnsi"/>
@@ -407,6 +587,7 @@
               </w:rPr>
               <w:t>consigneeCountry</w:t>
             </w:r>
+            <w:proofErr w:type="spellEnd"/>
             <w:r>
               <w:rPr>
                 <w:rFonts w:cstheme="minorHAnsi"/>
@@ -439,15 +620,7 @@
                 <w:sz w:val="20"/>
                 <w:szCs w:val="20"/>
               </w:rPr>
-              <w:t xml:space="preserve">NOTIFY </w:t>
-            </w:r>
-            <w:r>
-              <w:rPr>
-                <w:rFonts w:cstheme="minorHAnsi"/>
-                <w:sz w:val="20"/>
-                <w:szCs w:val="20"/>
-              </w:rPr>
-              <w:t>–</w:t>
+              <w:t>BUYER / CONSIGNEE</w:t>
             </w:r>
           </w:p>
           <w:p>
@@ -466,6 +639,7 @@
               </w:rPr>
               <w:t>{</w:t>
             </w:r>
+            <w:proofErr w:type="spellStart"/>
             <w:r>
               <w:rPr>
                 <w:rFonts w:cstheme="minorHAnsi"/>
@@ -474,6 +648,7 @@
               </w:rPr>
               <w:t>consigneeName</w:t>
             </w:r>
+            <w:proofErr w:type="spellEnd"/>
             <w:r>
               <w:rPr>
                 <w:rFonts w:cstheme="minorHAnsi"/>
@@ -499,6 +674,7 @@
               </w:rPr>
               <w:t>{</w:t>
             </w:r>
+            <w:proofErr w:type="spellStart"/>
             <w:r>
               <w:rPr>
                 <w:rFonts w:cstheme="minorHAnsi"/>
@@ -507,6 +683,7 @@
               </w:rPr>
               <w:t>consigneeAddress</w:t>
             </w:r>
+            <w:proofErr w:type="spellEnd"/>
             <w:r>
               <w:rPr>
                 <w:rFonts w:cstheme="minorHAnsi"/>
@@ -515,6 +692,7 @@
               </w:rPr>
               <w:t>} {</w:t>
             </w:r>
+            <w:proofErr w:type="spellStart"/>
             <w:r>
               <w:rPr>
                 <w:rFonts w:cstheme="minorHAnsi"/>
@@ -523,6 +701,7 @@
               </w:rPr>
               <w:t>consigneeCity</w:t>
             </w:r>
+            <w:proofErr w:type="spellEnd"/>
             <w:r>
               <w:rPr>
                 <w:rFonts w:cstheme="minorHAnsi"/>
@@ -531,6 +710,7 @@
               </w:rPr>
               <w:t>} {</w:t>
             </w:r>
+            <w:proofErr w:type="spellStart"/>
             <w:r>
               <w:rPr>
                 <w:rFonts w:cstheme="minorHAnsi"/>
@@ -539,6 +719,7 @@
               </w:rPr>
               <w:t>consigneeState</w:t>
             </w:r>
+            <w:proofErr w:type="spellEnd"/>
             <w:r>
               <w:rPr>
                 <w:rFonts w:cstheme="minorHAnsi"/>
@@ -547,6 +728,7 @@
               </w:rPr>
               <w:t>}{</w:t>
             </w:r>
+            <w:proofErr w:type="spellStart"/>
             <w:r>
               <w:rPr>
                 <w:rFonts w:cstheme="minorHAnsi"/>
@@ -555,6 +737,7 @@
               </w:rPr>
               <w:t>consigneeCountry</w:t>
             </w:r>
+            <w:proofErr w:type="spellEnd"/>
             <w:r>
               <w:rPr>
                 <w:rFonts w:cstheme="minorHAnsi"/>
@@ -563,6 +746,7 @@
               </w:rPr>
               <w:t>} {</w:t>
             </w:r>
+            <w:proofErr w:type="spellStart"/>
             <w:r>
               <w:rPr>
                 <w:rFonts w:cstheme="minorHAnsi"/>
@@ -571,6 +755,7 @@
               </w:rPr>
               <w:t>consigneeZip</w:t>
             </w:r>
+            <w:proofErr w:type="spellEnd"/>
             <w:r>
               <w:rPr>
                 <w:rFonts w:cstheme="minorHAnsi"/>
@@ -593,16 +778,35 @@
                 <w:sz w:val="20"/>
                 <w:szCs w:val="20"/>
               </w:rPr>
-              <w:t>{#isUK}</w:t>
-            </w:r>
-            <w:r>
-              <w:rPr>
-                <w:rFonts w:cstheme="minorHAnsi"/>
-                <w:sz w:val="20"/>
-                <w:szCs w:val="20"/>
-              </w:rPr>
               <w:t>{#</w:t>
             </w:r>
+            <w:proofErr w:type="gramStart"/>
+            <w:r>
+              <w:rPr>
+                <w:rFonts w:cstheme="minorHAnsi"/>
+                <w:sz w:val="20"/>
+                <w:szCs w:val="20"/>
+              </w:rPr>
+              <w:t>isUK}</w:t>
+            </w:r>
+            <w:r>
+              <w:rPr>
+                <w:rFonts w:cstheme="minorHAnsi"/>
+                <w:sz w:val="20"/>
+                <w:szCs w:val="20"/>
+              </w:rPr>
+              <w:t>{</w:t>
+            </w:r>
+            <w:proofErr w:type="gramEnd"/>
+            <w:r>
+              <w:rPr>
+                <w:rFonts w:cstheme="minorHAnsi"/>
+                <w:sz w:val="20"/>
+                <w:szCs w:val="20"/>
+              </w:rPr>
+              <w:t>#</w:t>
+            </w:r>
+            <w:proofErr w:type="gramStart"/>
             <w:r>
               <w:rPr>
                 <w:rFonts w:cstheme="minorHAnsi"/>
@@ -625,7 +829,16 @@
                 <w:sz w:val="20"/>
                 <w:szCs w:val="20"/>
               </w:rPr>
-              <w:t>TELE:{</w:t>
+              <w:t>TELE</w:t>
+            </w:r>
+            <w:proofErr w:type="gramEnd"/>
+            <w:r>
+              <w:rPr>
+                <w:rFonts w:cstheme="minorHAnsi"/>
+                <w:sz w:val="20"/>
+                <w:szCs w:val="20"/>
+              </w:rPr>
+              <w:t>:{</w:t>
             </w:r>
             <w:r>
               <w:rPr>
@@ -692,6 +905,7 @@
               </w:rPr>
               <w:t>{#</w:t>
             </w:r>
+            <w:proofErr w:type="gramStart"/>
             <w:r>
               <w:rPr>
                 <w:rFonts w:cstheme="minorHAnsi"/>
@@ -716,6 +930,7 @@
               </w:rPr>
               <w:t>EMAIL</w:t>
             </w:r>
+            <w:proofErr w:type="gramEnd"/>
             <w:r>
               <w:rPr>
                 <w:rFonts w:cstheme="minorHAnsi"/>
@@ -748,6 +963,7 @@
               </w:rPr>
               <w:t>{/</w:t>
             </w:r>
+            <w:proofErr w:type="gramStart"/>
             <w:r>
               <w:rPr>
                 <w:rFonts w:cstheme="minorHAnsi"/>
@@ -770,7 +986,16 @@
                 <w:sz w:val="20"/>
                 <w:szCs w:val="20"/>
               </w:rPr>
-              <w:t>{/isUK}</w:t>
+              <w:t>{</w:t>
+            </w:r>
+            <w:proofErr w:type="gramEnd"/>
+            <w:r>
+              <w:rPr>
+                <w:rFonts w:cstheme="minorHAnsi"/>
+                <w:sz w:val="20"/>
+                <w:szCs w:val="20"/>
+              </w:rPr>
+              <w:t>/isUK}</w:t>
             </w:r>
           </w:p>
           <w:p>
@@ -789,6 +1014,7 @@
               </w:rPr>
               <w:t>{#</w:t>
             </w:r>
+            <w:proofErr w:type="gramStart"/>
             <w:r>
               <w:rPr>
                 <w:rFonts w:cstheme="minorHAnsi"/>
@@ -811,7 +1037,16 @@
                 <w:sz w:val="20"/>
                 <w:szCs w:val="20"/>
               </w:rPr>
-              <w:t>{#</w:t>
+              <w:t>{</w:t>
+            </w:r>
+            <w:proofErr w:type="gramEnd"/>
+            <w:r>
+              <w:rPr>
+                <w:rFonts w:cstheme="minorHAnsi"/>
+                <w:sz w:val="20"/>
+                <w:szCs w:val="20"/>
+              </w:rPr>
+              <w:t>#</w:t>
             </w:r>
             <w:r>
               <w:rPr>
@@ -871,6 +1106,7 @@
               </w:rPr>
               <w:t>{</w:t>
             </w:r>
+            <w:proofErr w:type="spellStart"/>
             <w:r>
               <w:rPr>
                 <w:rFonts w:cstheme="minorHAnsi"/>
@@ -879,6 +1115,7 @@
               </w:rPr>
               <w:t>notifyName</w:t>
             </w:r>
+            <w:proofErr w:type="spellEnd"/>
             <w:r>
               <w:rPr>
                 <w:rFonts w:cstheme="minorHAnsi"/>
@@ -912,6 +1149,7 @@
               </w:rPr>
               <w:t>{</w:t>
             </w:r>
+            <w:proofErr w:type="spellStart"/>
             <w:r>
               <w:rPr>
                 <w:rFonts w:cstheme="minorHAnsi"/>
@@ -920,6 +1158,8 @@
               </w:rPr>
               <w:t>notifyAddress</w:t>
             </w:r>
+            <w:proofErr w:type="spellEnd"/>
+            <w:proofErr w:type="gramStart"/>
             <w:r>
               <w:rPr>
                 <w:rFonts w:cstheme="minorHAnsi"/>
@@ -942,7 +1182,16 @@
                 <w:sz w:val="20"/>
                 <w:szCs w:val="20"/>
               </w:rPr>
-              <w:t>{/}</w:t>
+              <w:t>{</w:t>
+            </w:r>
+            <w:proofErr w:type="gramEnd"/>
+            <w:r>
+              <w:rPr>
+                <w:rFonts w:cstheme="minorHAnsi"/>
+                <w:sz w:val="20"/>
+                <w:szCs w:val="20"/>
+              </w:rPr>
+              <w:t>/}</w:t>
             </w:r>
           </w:p>
         </w:tc>
@@ -988,6 +1237,7 @@
               </w:rPr>
               <w:t>{</w:t>
             </w:r>
+            <w:proofErr w:type="spellStart"/>
             <w:r>
               <w:rPr>
                 <w:rFonts w:cstheme="minorHAnsi"/>
@@ -996,6 +1246,7 @@
               </w:rPr>
               <w:t>buyerName</w:t>
             </w:r>
+            <w:proofErr w:type="spellEnd"/>
             <w:r>
               <w:rPr>
                 <w:rFonts w:cstheme="minorHAnsi"/>
@@ -1021,6 +1272,7 @@
               </w:rPr>
               <w:t>{</w:t>
             </w:r>
+            <w:proofErr w:type="spellStart"/>
             <w:r>
               <w:rPr>
                 <w:rFonts w:cstheme="minorHAnsi"/>
@@ -1029,6 +1281,7 @@
               </w:rPr>
               <w:t>buyerAddress</w:t>
             </w:r>
+            <w:proofErr w:type="spellEnd"/>
             <w:r>
               <w:rPr>
                 <w:rFonts w:cstheme="minorHAnsi"/>
@@ -1037,6 +1290,7 @@
               </w:rPr>
               <w:t>} {</w:t>
             </w:r>
+            <w:proofErr w:type="spellStart"/>
             <w:r>
               <w:rPr>
                 <w:rFonts w:cstheme="minorHAnsi"/>
@@ -1045,6 +1299,7 @@
               </w:rPr>
               <w:t>buyerCity</w:t>
             </w:r>
+            <w:proofErr w:type="spellEnd"/>
             <w:r>
               <w:rPr>
                 <w:rFonts w:cstheme="minorHAnsi"/>
@@ -1053,6 +1308,7 @@
               </w:rPr>
               <w:t>} {</w:t>
             </w:r>
+            <w:proofErr w:type="spellStart"/>
             <w:r>
               <w:rPr>
                 <w:rFonts w:cstheme="minorHAnsi"/>
@@ -1061,6 +1317,7 @@
               </w:rPr>
               <w:t>buyerState</w:t>
             </w:r>
+            <w:proofErr w:type="spellEnd"/>
             <w:r>
               <w:rPr>
                 <w:rFonts w:cstheme="minorHAnsi"/>
@@ -1086,6 +1343,7 @@
               </w:rPr>
               <w:t>{</w:t>
             </w:r>
+            <w:proofErr w:type="spellStart"/>
             <w:r>
               <w:rPr>
                 <w:rFonts w:cstheme="minorHAnsi"/>
@@ -1094,6 +1352,7 @@
               </w:rPr>
               <w:t>buyerCountry</w:t>
             </w:r>
+            <w:proofErr w:type="spellEnd"/>
             <w:r>
               <w:rPr>
                 <w:rFonts w:cstheme="minorHAnsi"/>
@@ -1102,6 +1361,7 @@
               </w:rPr>
               <w:t>} {</w:t>
             </w:r>
+            <w:proofErr w:type="spellStart"/>
             <w:r>
               <w:rPr>
                 <w:rFonts w:cstheme="minorHAnsi"/>
@@ -1110,6 +1370,7 @@
               </w:rPr>
               <w:t>buyerZip</w:t>
             </w:r>
+            <w:proofErr w:type="spellEnd"/>
             <w:r>
               <w:rPr>
                 <w:rFonts w:cstheme="minorHAnsi"/>
@@ -1182,6 +1443,7 @@
               </w:rPr>
               <w:t>{</w:t>
             </w:r>
+            <w:proofErr w:type="spellStart"/>
             <w:r>
               <w:rPr>
                 <w:rFonts w:cstheme="minorHAnsi"/>
@@ -1190,6 +1452,7 @@
               </w:rPr>
               <w:t>originOfGoods</w:t>
             </w:r>
+            <w:proofErr w:type="spellEnd"/>
             <w:r>
               <w:rPr>
                 <w:rFonts w:cstheme="minorHAnsi"/>
@@ -1241,6 +1504,7 @@
               </w:rPr>
               <w:t>{</w:t>
             </w:r>
+            <w:proofErr w:type="spellStart"/>
             <w:r>
               <w:rPr>
                 <w:rFonts w:cstheme="minorHAnsi"/>
@@ -1249,6 +1513,7 @@
               </w:rPr>
               <w:t>finalDestination</w:t>
             </w:r>
+            <w:proofErr w:type="spellEnd"/>
             <w:r>
               <w:rPr>
                 <w:rFonts w:cstheme="minorHAnsi"/>
@@ -1325,6 +1590,7 @@
               </w:rPr>
               <w:t>{</w:t>
             </w:r>
+            <w:proofErr w:type="spellStart"/>
             <w:r>
               <w:rPr>
                 <w:rFonts w:cstheme="minorHAnsi"/>
@@ -1333,6 +1599,7 @@
               </w:rPr>
               <w:t>termOfDeliveryAndPayment</w:t>
             </w:r>
+            <w:proofErr w:type="spellEnd"/>
             <w:r>
               <w:rPr>
                 <w:rFonts w:cstheme="minorHAnsi"/>
@@ -1369,6 +1636,7 @@
                 <w:szCs w:val="20"/>
               </w:rPr>
             </w:pPr>
+            <w:proofErr w:type="spellStart"/>
             <w:r>
               <w:rPr>
                 <w:rFonts w:ascii="SansSerif" w:hAnsi="SansSerif" w:cs="SansSerif"/>
@@ -1376,7 +1644,17 @@
                 <w:sz w:val="20"/>
                 <w:szCs w:val="20"/>
               </w:rPr>
-              <w:t>Precarriage by:</w:t>
+              <w:t>Precarriage</w:t>
+            </w:r>
+            <w:proofErr w:type="spellEnd"/>
+            <w:r>
+              <w:rPr>
+                <w:rFonts w:ascii="SansSerif" w:hAnsi="SansSerif" w:cs="SansSerif"/>
+                <w:color w:val="000000"/>
+                <w:sz w:val="20"/>
+                <w:szCs w:val="20"/>
+              </w:rPr>
+              <w:t xml:space="preserve"> by:</w:t>
             </w:r>
           </w:p>
         </w:tc>
@@ -1431,6 +1709,7 @@
               </w:rPr>
               <w:t>{</w:t>
             </w:r>
+            <w:proofErr w:type="spellStart"/>
             <w:r>
               <w:rPr>
                 <w:rFonts w:ascii="SansSerif" w:hAnsi="SansSerif" w:cs="SansSerif"/>
@@ -1440,6 +1719,7 @@
               </w:rPr>
               <w:t>placeOfReceipt</w:t>
             </w:r>
+            <w:proofErr w:type="spellEnd"/>
             <w:r>
               <w:rPr>
                 <w:rFonts w:ascii="SansSerif" w:hAnsi="SansSerif" w:cs="SansSerif"/>
@@ -1574,6 +1854,7 @@
               </w:rPr>
               <w:t>{</w:t>
             </w:r>
+            <w:proofErr w:type="spellStart"/>
             <w:r>
               <w:rPr>
                 <w:rFonts w:ascii="SansSerif" w:hAnsi="SansSerif" w:cs="SansSerif"/>
@@ -1583,6 +1864,7 @@
               </w:rPr>
               <w:t>portOfLoading</w:t>
             </w:r>
+            <w:proofErr w:type="spellEnd"/>
             <w:r>
               <w:rPr>
                 <w:rFonts w:ascii="SansSerif" w:hAnsi="SansSerif" w:cs="SansSerif"/>
@@ -1668,6 +1950,7 @@
               </w:rPr>
               <w:t>{</w:t>
             </w:r>
+            <w:proofErr w:type="spellStart"/>
             <w:r>
               <w:rPr>
                 <w:rFonts w:ascii="SansSerif" w:hAnsi="SansSerif" w:cs="SansSerif"/>
@@ -1677,6 +1960,7 @@
               </w:rPr>
               <w:t>portOfDischarge</w:t>
             </w:r>
+            <w:proofErr w:type="spellEnd"/>
             <w:r>
               <w:rPr>
                 <w:rFonts w:ascii="SansSerif" w:hAnsi="SansSerif" w:cs="SansSerif"/>
@@ -1735,6 +2019,7 @@
               </w:rPr>
               <w:t>{</w:t>
             </w:r>
+            <w:proofErr w:type="spellStart"/>
             <w:r>
               <w:rPr>
                 <w:rFonts w:ascii="SansSerif" w:hAnsi="SansSerif" w:cs="SansSerif"/>
@@ -1744,6 +2029,7 @@
               </w:rPr>
               <w:t>finalDestination</w:t>
             </w:r>
+            <w:proofErr w:type="spellEnd"/>
             <w:r>
               <w:rPr>
                 <w:rFonts w:ascii="SansSerif" w:hAnsi="SansSerif" w:cs="SansSerif"/>
@@ -1813,6 +2099,7 @@
               </w:rPr>
               <w:t>{</w:t>
             </w:r>
+            <w:proofErr w:type="spellStart"/>
             <w:r>
               <w:rPr>
                 <w:rFonts w:cstheme="minorHAnsi"/>
@@ -1821,6 +2108,7 @@
               </w:rPr>
               <w:t>privateRemark</w:t>
             </w:r>
+            <w:proofErr w:type="spellEnd"/>
             <w:r>
               <w:rPr>
                 <w:rFonts w:cstheme="minorHAnsi"/>
@@ -2007,8 +2295,22 @@
                       <w:sz w:val="20"/>
                       <w:szCs w:val="20"/>
                     </w:rPr>
-                    <w:t>Total Sq.Mt</w:t>
-                  </w:r>
+                    <w:t xml:space="preserve">Total </w:t>
+                  </w:r>
+                  <w:proofErr w:type="spellStart"/>
+                  <w:proofErr w:type="gramStart"/>
+                  <w:r>
+                    <w:rPr>
+                      <w:rFonts w:cstheme="minorHAnsi"/>
+                      <w:b/>
+                      <w:bCs/>
+                      <w:sz w:val="20"/>
+                      <w:szCs w:val="20"/>
+                    </w:rPr>
+                    <w:t>Sq.Mt</w:t>
+                  </w:r>
+                  <w:proofErr w:type="spellEnd"/>
+                  <w:proofErr w:type="gramEnd"/>
                 </w:p>
               </w:tc>
               <w:tc>
@@ -2068,7 +2370,29 @@
                       <w:sz w:val="20"/>
                       <w:szCs w:val="20"/>
                     </w:rPr>
-                    <w:t>{currencyChar}</w:t>
+                    <w:t>{</w:t>
+                  </w:r>
+                  <w:proofErr w:type="spellStart"/>
+                  <w:r>
+                    <w:rPr>
+                      <w:rFonts w:cstheme="minorHAnsi"/>
+                      <w:b/>
+                      <w:bCs/>
+                      <w:sz w:val="20"/>
+                      <w:szCs w:val="20"/>
+                    </w:rPr>
+                    <w:t>currencyChar</w:t>
+                  </w:r>
+                  <w:proofErr w:type="spellEnd"/>
+                  <w:r>
+                    <w:rPr>
+                      <w:rFonts w:cstheme="minorHAnsi"/>
+                      <w:b/>
+                      <w:bCs/>
+                      <w:sz w:val="20"/>
+                      <w:szCs w:val="20"/>
+                    </w:rPr>
+                    <w:t>}</w:t>
                   </w:r>
                 </w:p>
               </w:tc>
@@ -2123,7 +2447,29 @@
                       <w:sz w:val="20"/>
                       <w:szCs w:val="20"/>
                     </w:rPr>
-                    <w:t>{currencyChar}</w:t>
+                    <w:t>{</w:t>
+                  </w:r>
+                  <w:proofErr w:type="spellStart"/>
+                  <w:r>
+                    <w:rPr>
+                      <w:rFonts w:cstheme="minorHAnsi"/>
+                      <w:b/>
+                      <w:bCs/>
+                      <w:sz w:val="20"/>
+                      <w:szCs w:val="20"/>
+                    </w:rPr>
+                    <w:t>currencyChar</w:t>
+                  </w:r>
+                  <w:proofErr w:type="spellEnd"/>
+                  <w:r>
+                    <w:rPr>
+                      <w:rFonts w:cstheme="minorHAnsi"/>
+                      <w:b/>
+                      <w:bCs/>
+                      <w:sz w:val="20"/>
+                      <w:szCs w:val="20"/>
+                    </w:rPr>
+                    <w:t>}</w:t>
                   </w:r>
                 </w:p>
               </w:tc>
@@ -2294,7 +2640,34 @@
                       <w:sz w:val="18"/>
                       <w:szCs w:val="18"/>
                     </w:rPr>
-                    <w:t>{#CIItems}{#showThickness}</w:t>
+                    <w:t>{#</w:t>
+                  </w:r>
+                  <w:proofErr w:type="gramStart"/>
+                  <w:r>
+                    <w:rPr>
+                      <w:rFonts w:ascii="Arial" w:hAnsi="Arial" w:cs="Arial"/>
+                      <w:sz w:val="18"/>
+                      <w:szCs w:val="18"/>
+                    </w:rPr>
+                    <w:t>CIItems}{</w:t>
+                  </w:r>
+                  <w:proofErr w:type="gramEnd"/>
+                  <w:r>
+                    <w:rPr>
+                      <w:rFonts w:ascii="Arial" w:hAnsi="Arial" w:cs="Arial"/>
+                      <w:sz w:val="18"/>
+                      <w:szCs w:val="18"/>
+                    </w:rPr>
+                    <w:t>#</w:t>
+                  </w:r>
+                  <w:proofErr w:type="gramStart"/>
+                  <w:r>
+                    <w:rPr>
+                      <w:rFonts w:ascii="Arial" w:hAnsi="Arial" w:cs="Arial"/>
+                      <w:sz w:val="18"/>
+                      <w:szCs w:val="18"/>
+                    </w:rPr>
+                    <w:t>showThickness}</w:t>
                   </w:r>
                   <w:r>
                     <w:rPr>
@@ -2304,7 +2677,18 @@
                       <w:sz w:val="18"/>
                       <w:szCs w:val="18"/>
                     </w:rPr>
-                    <w:t>{thicknessDetail</w:t>
+                    <w:t>{</w:t>
+                  </w:r>
+                  <w:proofErr w:type="gramEnd"/>
+                  <w:r>
+                    <w:rPr>
+                      <w:rFonts w:ascii="Arial" w:hAnsi="Arial" w:cs="Arial"/>
+                      <w:b/>
+                      <w:bCs/>
+                      <w:sz w:val="18"/>
+                      <w:szCs w:val="18"/>
+                    </w:rPr>
+                    <w:t>thicknessDetail</w:t>
                   </w:r>
                   <w:r>
                     <w:rPr>
@@ -2508,16 +2892,46 @@
                       <w:sz w:val="18"/>
                       <w:szCs w:val="18"/>
                     </w:rPr>
-                    <w:t>COMMISION-USD.{commision}{/</w:t>
-                  </w:r>
+                    <w:t>COMMISION-</w:t>
+                  </w:r>
+                  <w:proofErr w:type="gramStart"/>
                   <w:r>
                     <w:rPr>
                       <w:rFonts w:ascii="Arial" w:hAnsi="Arial" w:cs="Arial"/>
                       <w:sz w:val="18"/>
                       <w:szCs w:val="18"/>
                     </w:rPr>
+                    <w:t>USD.{</w:t>
+                  </w:r>
+                  <w:proofErr w:type="spellStart"/>
+                  <w:proofErr w:type="gramEnd"/>
+                  <w:r>
+                    <w:rPr>
+                      <w:rFonts w:ascii="Arial" w:hAnsi="Arial" w:cs="Arial"/>
+                      <w:sz w:val="18"/>
+                      <w:szCs w:val="18"/>
+                    </w:rPr>
                     <w:t>commision</w:t>
                   </w:r>
+                  <w:proofErr w:type="spellEnd"/>
+                  <w:r>
+                    <w:rPr>
+                      <w:rFonts w:ascii="Arial" w:hAnsi="Arial" w:cs="Arial"/>
+                      <w:sz w:val="18"/>
+                      <w:szCs w:val="18"/>
+                    </w:rPr>
+                    <w:t>}{/</w:t>
+                  </w:r>
+                  <w:proofErr w:type="spellStart"/>
+                  <w:r>
+                    <w:rPr>
+                      <w:rFonts w:ascii="Arial" w:hAnsi="Arial" w:cs="Arial"/>
+                      <w:sz w:val="18"/>
+                      <w:szCs w:val="18"/>
+                    </w:rPr>
+                    <w:t>commision</w:t>
+                  </w:r>
+                  <w:proofErr w:type="spellEnd"/>
                   <w:r>
                     <w:rPr>
                       <w:rFonts w:ascii="Arial" w:hAnsi="Arial" w:cs="Arial"/>
@@ -2627,7 +3041,25 @@
                       <w:sz w:val="18"/>
                       <w:szCs w:val="18"/>
                     </w:rPr>
-                    <w:t>{#invoices} {#isFirst}{fsc}{/isFirst}</w:t>
+                    <w:t>{#invoices} {#</w:t>
+                  </w:r>
+                  <w:proofErr w:type="gramStart"/>
+                  <w:r>
+                    <w:rPr>
+                      <w:rFonts w:ascii="Arial" w:hAnsi="Arial" w:cs="Arial"/>
+                      <w:sz w:val="18"/>
+                      <w:szCs w:val="18"/>
+                    </w:rPr>
+                    <w:t>isFirst}{</w:t>
+                  </w:r>
+                  <w:proofErr w:type="gramEnd"/>
+                  <w:r>
+                    <w:rPr>
+                      <w:rFonts w:ascii="Arial" w:hAnsi="Arial" w:cs="Arial"/>
+                      <w:sz w:val="18"/>
+                      <w:szCs w:val="18"/>
+                    </w:rPr>
+                    <w:t>fsc}{/isFirst}</w:t>
                   </w:r>
                 </w:p>
               </w:tc>
@@ -2679,7 +3111,25 @@
                       <w:sz w:val="18"/>
                       <w:szCs w:val="18"/>
                     </w:rPr>
-                    <w:t>{totalSq}</w:t>
+                    <w:t>{</w:t>
+                  </w:r>
+                  <w:proofErr w:type="spellStart"/>
+                  <w:r>
+                    <w:rPr>
+                      <w:rFonts w:ascii="Arial" w:hAnsi="Arial" w:cs="Arial"/>
+                      <w:sz w:val="18"/>
+                      <w:szCs w:val="18"/>
+                    </w:rPr>
+                    <w:t>totalSq</w:t>
+                  </w:r>
+                  <w:proofErr w:type="spellEnd"/>
+                  <w:r>
+                    <w:rPr>
+                      <w:rFonts w:ascii="Arial" w:hAnsi="Arial" w:cs="Arial"/>
+                      <w:sz w:val="18"/>
+                      <w:szCs w:val="18"/>
+                    </w:rPr>
+                    <w:t>}</w:t>
                   </w:r>
                 </w:p>
               </w:tc>
@@ -2731,7 +3181,25 @@
                       <w:sz w:val="18"/>
                       <w:szCs w:val="18"/>
                     </w:rPr>
-                    <w:t>{value} {/invoices} {/CIItems}</w:t>
+                    <w:t>{value} {/invoices} {/</w:t>
+                  </w:r>
+                  <w:proofErr w:type="spellStart"/>
+                  <w:r>
+                    <w:rPr>
+                      <w:rFonts w:ascii="Arial" w:hAnsi="Arial" w:cs="Arial"/>
+                      <w:sz w:val="18"/>
+                      <w:szCs w:val="18"/>
+                    </w:rPr>
+                    <w:t>CIItems</w:t>
+                  </w:r>
+                  <w:proofErr w:type="spellEnd"/>
+                  <w:r>
+                    <w:rPr>
+                      <w:rFonts w:ascii="Arial" w:hAnsi="Arial" w:cs="Arial"/>
+                      <w:sz w:val="18"/>
+                      <w:szCs w:val="18"/>
+                    </w:rPr>
+                    <w:t>}</w:t>
                   </w:r>
                 </w:p>
               </w:tc>
@@ -2803,7 +3271,25 @@
                       <w:sz w:val="18"/>
                       <w:szCs w:val="18"/>
                     </w:rPr>
-                    <w:t>As Per P/List {/isSampleBox}</w:t>
+                    <w:t>As Per P/List {/</w:t>
+                  </w:r>
+                  <w:proofErr w:type="spellStart"/>
+                  <w:r>
+                    <w:rPr>
+                      <w:rFonts w:ascii="Arial" w:hAnsi="Arial" w:cs="Arial"/>
+                      <w:sz w:val="18"/>
+                      <w:szCs w:val="18"/>
+                    </w:rPr>
+                    <w:t>isSampleBox</w:t>
+                  </w:r>
+                  <w:proofErr w:type="spellEnd"/>
+                  <w:r>
+                    <w:rPr>
+                      <w:rFonts w:ascii="Arial" w:hAnsi="Arial" w:cs="Arial"/>
+                      <w:sz w:val="18"/>
+                      <w:szCs w:val="18"/>
+                    </w:rPr>
+                    <w:t>}</w:t>
                   </w:r>
                 </w:p>
               </w:tc>
@@ -2944,6 +3430,7 @@
                     </w:rPr>
                     <w:t>{</w:t>
                   </w:r>
+                  <w:proofErr w:type="spellStart"/>
                   <w:r>
                     <w:rPr>
                       <w:rFonts w:ascii="Arial" w:hAnsi="Arial" w:cs="Arial"/>
@@ -2952,6 +3439,7 @@
                     </w:rPr>
                     <w:t>sampleDetails</w:t>
                   </w:r>
+                  <w:proofErr w:type="spellEnd"/>
                   <w:r>
                     <w:rPr>
                       <w:rFonts w:ascii="Arial" w:hAnsi="Arial" w:cs="Arial"/>
@@ -3010,7 +3498,25 @@
                       <w:sz w:val="18"/>
                       <w:szCs w:val="18"/>
                     </w:rPr>
-                    <w:t>{totalSq}</w:t>
+                    <w:t>{</w:t>
+                  </w:r>
+                  <w:proofErr w:type="spellStart"/>
+                  <w:r>
+                    <w:rPr>
+                      <w:rFonts w:ascii="Arial" w:hAnsi="Arial" w:cs="Arial"/>
+                      <w:sz w:val="18"/>
+                      <w:szCs w:val="18"/>
+                    </w:rPr>
+                    <w:t>totalSq</w:t>
+                  </w:r>
+                  <w:proofErr w:type="spellEnd"/>
+                  <w:r>
+                    <w:rPr>
+                      <w:rFonts w:ascii="Arial" w:hAnsi="Arial" w:cs="Arial"/>
+                      <w:sz w:val="18"/>
+                      <w:szCs w:val="18"/>
+                    </w:rPr>
+                    <w:t>}</w:t>
                   </w:r>
                 </w:p>
               </w:tc>
@@ -3070,7 +3576,25 @@
                       <w:sz w:val="16"/>
                       <w:szCs w:val="16"/>
                     </w:rPr>
-                    <w:t>{/sampleBox}</w:t>
+                    <w:t>{/</w:t>
+                  </w:r>
+                  <w:proofErr w:type="spellStart"/>
+                  <w:r>
+                    <w:rPr>
+                      <w:rFonts w:ascii="Arial" w:hAnsi="Arial" w:cs="Arial"/>
+                      <w:sz w:val="16"/>
+                      <w:szCs w:val="16"/>
+                    </w:rPr>
+                    <w:t>sampleBox</w:t>
+                  </w:r>
+                  <w:proofErr w:type="spellEnd"/>
+                  <w:r>
+                    <w:rPr>
+                      <w:rFonts w:ascii="Arial" w:hAnsi="Arial" w:cs="Arial"/>
+                      <w:sz w:val="16"/>
+                      <w:szCs w:val="16"/>
+                    </w:rPr>
+                    <w:t>}</w:t>
                   </w:r>
                 </w:p>
               </w:tc>
@@ -3120,6 +3644,7 @@
               </w:rPr>
               <w:t>{</w:t>
             </w:r>
+            <w:proofErr w:type="spellStart"/>
             <w:r>
               <w:rPr>
                 <w:rFonts w:cstheme="minorHAnsi"/>
@@ -3128,6 +3653,7 @@
               </w:rPr>
               <w:t>additionSumAmount</w:t>
             </w:r>
+            <w:proofErr w:type="spellEnd"/>
             <w:r>
               <w:rPr>
                 <w:rFonts w:cstheme="minorHAnsi"/>
@@ -3404,7 +3930,25 @@
                 <w:sz w:val="20"/>
                 <w:szCs w:val="20"/>
               </w:rPr>
-              <w:t>{deliveryTerms}</w:t>
+              <w:t>{</w:t>
+            </w:r>
+            <w:proofErr w:type="spellStart"/>
+            <w:r>
+              <w:rPr>
+                <w:rFonts w:cstheme="minorHAnsi"/>
+                <w:sz w:val="20"/>
+                <w:szCs w:val="20"/>
+              </w:rPr>
+              <w:t>deliveryTerms</w:t>
+            </w:r>
+            <w:proofErr w:type="spellEnd"/>
+            <w:r>
+              <w:rPr>
+                <w:rFonts w:cstheme="minorHAnsi"/>
+                <w:sz w:val="20"/>
+                <w:szCs w:val="20"/>
+              </w:rPr>
+              <w:t>}</w:t>
             </w:r>
             <w:r>
               <w:rPr>
@@ -3420,7 +3964,26 @@
                 <w:sz w:val="20"/>
                 <w:szCs w:val="20"/>
               </w:rPr>
-              <w:t>{dischargeTerms}</w:t>
+              <w:t>{</w:t>
+            </w:r>
+            <w:proofErr w:type="spellStart"/>
+            <w:proofErr w:type="gramStart"/>
+            <w:r>
+              <w:rPr>
+                <w:rFonts w:cstheme="minorHAnsi"/>
+                <w:sz w:val="20"/>
+                <w:szCs w:val="20"/>
+              </w:rPr>
+              <w:t>dischargeTerms</w:t>
+            </w:r>
+            <w:proofErr w:type="spellEnd"/>
+            <w:r>
+              <w:rPr>
+                <w:rFonts w:cstheme="minorHAnsi"/>
+                <w:sz w:val="20"/>
+                <w:szCs w:val="20"/>
+              </w:rPr>
+              <w:t>}</w:t>
             </w:r>
             <w:r>
               <w:rPr>
@@ -3438,6 +4001,7 @@
               </w:rPr>
               <w:t xml:space="preserve">  </w:t>
             </w:r>
+            <w:proofErr w:type="gramEnd"/>
             <w:r>
               <w:rPr>
                 <w:rFonts w:cstheme="minorHAnsi"/>
@@ -3446,6 +4010,8 @@
               </w:rPr>
               <w:t>{</w:t>
             </w:r>
+            <w:proofErr w:type="spellStart"/>
+            <w:proofErr w:type="gramStart"/>
             <w:r>
               <w:rPr>
                 <w:rFonts w:cstheme="minorHAnsi"/>
@@ -3454,6 +4020,7 @@
               </w:rPr>
               <w:t>currencyChar</w:t>
             </w:r>
+            <w:proofErr w:type="spellEnd"/>
             <w:r>
               <w:rPr>
                 <w:rFonts w:cstheme="minorHAnsi"/>
@@ -3484,7 +4051,25 @@
                 <w:sz w:val="20"/>
                 <w:szCs w:val="20"/>
               </w:rPr>
-              <w:t>{netAmountWords}</w:t>
+              <w:t>{</w:t>
+            </w:r>
+            <w:proofErr w:type="spellStart"/>
+            <w:r>
+              <w:rPr>
+                <w:rFonts w:cstheme="minorHAnsi"/>
+                <w:sz w:val="20"/>
+                <w:szCs w:val="20"/>
+              </w:rPr>
+              <w:t>netAmountWords</w:t>
+            </w:r>
+            <w:proofErr w:type="spellEnd"/>
+            <w:r>
+              <w:rPr>
+                <w:rFonts w:cstheme="minorHAnsi"/>
+                <w:sz w:val="20"/>
+                <w:szCs w:val="20"/>
+              </w:rPr>
+              <w:t>}</w:t>
             </w:r>
             <w:r>
               <w:rPr>
@@ -3510,6 +4095,7 @@
               </w:rPr>
               <w:t>Only</w:t>
             </w:r>
+            <w:proofErr w:type="gramEnd"/>
           </w:p>
         </w:tc>
         <w:tc>
@@ -3539,7 +4125,25 @@
                 <w:sz w:val="20"/>
                 <w:szCs w:val="20"/>
               </w:rPr>
-              <w:t>{netAmount}</w:t>
+              <w:t>{</w:t>
+            </w:r>
+            <w:proofErr w:type="spellStart"/>
+            <w:r>
+              <w:rPr>
+                <w:rFonts w:cstheme="minorHAnsi"/>
+                <w:sz w:val="20"/>
+                <w:szCs w:val="20"/>
+              </w:rPr>
+              <w:t>netAmount</w:t>
+            </w:r>
+            <w:proofErr w:type="spellEnd"/>
+            <w:r>
+              <w:rPr>
+                <w:rFonts w:cstheme="minorHAnsi"/>
+                <w:sz w:val="20"/>
+                <w:szCs w:val="20"/>
+              </w:rPr>
+              <w:t>}</w:t>
             </w:r>
           </w:p>
         </w:tc>
@@ -3575,6 +4179,7 @@
               </w:rPr>
               <w:t>{#</w:t>
             </w:r>
+            <w:proofErr w:type="gramStart"/>
             <w:r>
               <w:rPr>
                 <w:rFonts w:cstheme="minorHAnsi"/>
@@ -3589,15 +4194,16 @@
                 <w:sz w:val="18"/>
                 <w:szCs w:val="18"/>
               </w:rPr>
-              <w:t>}{specialInstruction}{/</w:t>
-            </w:r>
+              <w:t>}{</w:t>
+            </w:r>
+            <w:proofErr w:type="gramEnd"/>
             <w:r>
               <w:rPr>
                 <w:rFonts w:cstheme="minorHAnsi"/>
                 <w:sz w:val="18"/>
                 <w:szCs w:val="18"/>
               </w:rPr>
-              <w:t>specialInstruction</w:t>
+              <w:t>specialInstruction}{/</w:t>
             </w:r>
             <w:r>
               <w:rPr>
@@ -3605,41 +4211,42 @@
                 <w:sz w:val="18"/>
                 <w:szCs w:val="18"/>
               </w:rPr>
-              <w:t>}</w:t>
-            </w:r>
-          </w:p>
-          <w:p>
-            <w:pPr>
-              <w:pStyle w:val="NoSpacing"/>
+              <w:t>specialInstruction</w:t>
+            </w:r>
+            <w:r>
               <w:rPr>
                 <w:rFonts w:cstheme="minorHAnsi"/>
                 <w:sz w:val="18"/>
                 <w:szCs w:val="18"/>
               </w:rPr>
-            </w:pPr>
-            <w:r>
+              <w:t>}</w:t>
+            </w:r>
+          </w:p>
+          <w:p>
+            <w:pPr>
+              <w:pStyle w:val="NoSpacing"/>
               <w:rPr>
                 <w:rFonts w:cstheme="minorHAnsi"/>
                 <w:sz w:val="18"/>
                 <w:szCs w:val="18"/>
               </w:rPr>
-              <w:t>{#</w:t>
-            </w:r>
+            </w:pPr>
             <w:r>
               <w:rPr>
                 <w:rFonts w:cstheme="minorHAnsi"/>
                 <w:sz w:val="18"/>
                 <w:szCs w:val="18"/>
               </w:rPr>
-              <w:t>bottomNotes</w:t>
-            </w:r>
+              <w:t>{#</w:t>
+            </w:r>
+            <w:proofErr w:type="gramStart"/>
             <w:r>
               <w:rPr>
                 <w:rFonts w:cstheme="minorHAnsi"/>
                 <w:sz w:val="18"/>
                 <w:szCs w:val="18"/>
               </w:rPr>
-              <w:t>}{</w:t>
+              <w:t>bottomNotes</w:t>
             </w:r>
             <w:r>
               <w:rPr>
@@ -3647,42 +4254,53 @@
                 <w:sz w:val="18"/>
                 <w:szCs w:val="18"/>
               </w:rPr>
-              <w:t>bottomNote</w:t>
-            </w:r>
+              <w:t>}{</w:t>
+            </w:r>
+            <w:proofErr w:type="gramEnd"/>
             <w:r>
               <w:rPr>
                 <w:rFonts w:cstheme="minorHAnsi"/>
                 <w:sz w:val="18"/>
                 <w:szCs w:val="18"/>
               </w:rPr>
-              <w:t>}</w:t>
-            </w:r>
-          </w:p>
-          <w:p>
-            <w:pPr>
-              <w:pStyle w:val="NoSpacing"/>
-              <w:rPr>
-                <w:rFonts w:cstheme="minorHAnsi"/>
-                <w:sz w:val="20"/>
-                <w:szCs w:val="20"/>
-              </w:rPr>
-            </w:pPr>
+              <w:t>bottomNote</w:t>
+            </w:r>
             <w:r>
               <w:rPr>
                 <w:rFonts w:cstheme="minorHAnsi"/>
                 <w:sz w:val="18"/>
                 <w:szCs w:val="18"/>
               </w:rPr>
-              <w:t>{/</w:t>
-            </w:r>
+              <w:t>}</w:t>
+            </w:r>
+          </w:p>
+          <w:p>
+            <w:pPr>
+              <w:pStyle w:val="NoSpacing"/>
+              <w:rPr>
+                <w:rFonts w:cstheme="minorHAnsi"/>
+                <w:sz w:val="20"/>
+                <w:szCs w:val="20"/>
+              </w:rPr>
+            </w:pPr>
             <w:r>
               <w:rPr>
                 <w:rFonts w:cstheme="minorHAnsi"/>
                 <w:sz w:val="18"/>
                 <w:szCs w:val="18"/>
               </w:rPr>
+              <w:t>{/</w:t>
+            </w:r>
+            <w:proofErr w:type="spellStart"/>
+            <w:r>
+              <w:rPr>
+                <w:rFonts w:cstheme="minorHAnsi"/>
+                <w:sz w:val="18"/>
+                <w:szCs w:val="18"/>
+              </w:rPr>
               <w:t>bottomNotes</w:t>
             </w:r>
+            <w:proofErr w:type="spellEnd"/>
             <w:r>
               <w:rPr>
                 <w:rFonts w:cstheme="minorHAnsi"/>
@@ -3786,6 +4404,7 @@
                     </w:rPr>
                     <w:t>{</w:t>
                   </w:r>
+                  <w:proofErr w:type="spellStart"/>
                   <w:r>
                     <w:rPr>
                       <w:rFonts w:cstheme="minorHAnsi"/>
@@ -3794,6 +4413,7 @@
                     </w:rPr>
                     <w:t>totalQuantity</w:t>
                   </w:r>
+                  <w:proofErr w:type="spellEnd"/>
                   <w:r>
                     <w:rPr>
                       <w:rFonts w:cstheme="minorHAnsi"/>
@@ -3858,6 +4478,7 @@
                     </w:rPr>
                     <w:t>{</w:t>
                   </w:r>
+                  <w:proofErr w:type="spellStart"/>
                   <w:r>
                     <w:rPr>
                       <w:rFonts w:cstheme="minorHAnsi"/>
@@ -3866,6 +4487,7 @@
                     </w:rPr>
                     <w:t>totalBox</w:t>
                   </w:r>
+                  <w:proofErr w:type="spellEnd"/>
                   <w:r>
                     <w:rPr>
                       <w:rFonts w:cstheme="minorHAnsi"/>
@@ -3903,7 +4525,27 @@
                       <w:sz w:val="20"/>
                       <w:szCs w:val="20"/>
                     </w:rPr>
-                    <w:t>Total Sq.Meter:</w:t>
+                    <w:t xml:space="preserve">Total </w:t>
+                  </w:r>
+                  <w:proofErr w:type="spellStart"/>
+                  <w:proofErr w:type="gramStart"/>
+                  <w:r>
+                    <w:rPr>
+                      <w:rFonts w:cstheme="minorHAnsi"/>
+                      <w:sz w:val="20"/>
+                      <w:szCs w:val="20"/>
+                    </w:rPr>
+                    <w:t>Sq.Meter</w:t>
+                  </w:r>
+                  <w:proofErr w:type="spellEnd"/>
+                  <w:proofErr w:type="gramEnd"/>
+                  <w:r>
+                    <w:rPr>
+                      <w:rFonts w:cstheme="minorHAnsi"/>
+                      <w:sz w:val="20"/>
+                      <w:szCs w:val="20"/>
+                    </w:rPr>
+                    <w:t>:</w:t>
                   </w:r>
                 </w:p>
               </w:tc>
@@ -3930,6 +4572,7 @@
                     </w:rPr>
                     <w:t>{</w:t>
                   </w:r>
+                  <w:proofErr w:type="spellStart"/>
                   <w:r>
                     <w:rPr>
                       <w:rFonts w:cstheme="minorHAnsi"/>
@@ -3938,6 +4581,7 @@
                     </w:rPr>
                     <w:t>totalSqMt</w:t>
                   </w:r>
+                  <w:proofErr w:type="spellEnd"/>
                   <w:r>
                     <w:rPr>
                       <w:rFonts w:cstheme="minorHAnsi"/>
@@ -4048,7 +4692,25 @@
                       <w:sz w:val="20"/>
                       <w:szCs w:val="20"/>
                     </w:rPr>
-                    <w:t>Avg./Wt.(Kg)</w:t>
+                    <w:t>Avg./</w:t>
+                  </w:r>
+                  <w:proofErr w:type="gramStart"/>
+                  <w:r>
+                    <w:rPr>
+                      <w:rFonts w:cstheme="minorHAnsi"/>
+                      <w:sz w:val="20"/>
+                      <w:szCs w:val="20"/>
+                    </w:rPr>
+                    <w:t>Wt.(</w:t>
+                  </w:r>
+                  <w:proofErr w:type="gramEnd"/>
+                  <w:r>
+                    <w:rPr>
+                      <w:rFonts w:cstheme="minorHAnsi"/>
+                      <w:sz w:val="20"/>
+                      <w:szCs w:val="20"/>
+                    </w:rPr>
+                    <w:t>Kg)</w:t>
                   </w:r>
                 </w:p>
               </w:tc>
@@ -4131,6 +4793,7 @@
                     </w:rPr>
                     <w:t>{#</w:t>
                   </w:r>
+                  <w:proofErr w:type="gramStart"/>
                   <w:r>
                     <w:rPr>
                       <w:rFonts w:cstheme="minorHAnsi"/>
@@ -4147,6 +4810,7 @@
                     </w:rPr>
                     <w:t>}{</w:t>
                   </w:r>
+                  <w:proofErr w:type="gramEnd"/>
                   <w:r>
                     <w:rPr>
                       <w:rFonts w:cstheme="minorHAnsi"/>
@@ -4188,6 +4852,7 @@
                     </w:rPr>
                     <w:t>{</w:t>
                   </w:r>
+                  <w:proofErr w:type="spellStart"/>
                   <w:r>
                     <w:rPr>
                       <w:rFonts w:cstheme="minorHAnsi"/>
@@ -4196,6 +4861,7 @@
                     </w:rPr>
                     <w:t>totalSqMtPerType</w:t>
                   </w:r>
+                  <w:proofErr w:type="spellEnd"/>
                   <w:r>
                     <w:rPr>
                       <w:rFonts w:cstheme="minorHAnsi"/>
@@ -4285,6 +4951,7 @@
                     </w:rPr>
                     <w:t>} MM{/</w:t>
                   </w:r>
+                  <w:proofErr w:type="spellStart"/>
                   <w:r>
                     <w:rPr>
                       <w:rFonts w:cstheme="minorHAnsi"/>
@@ -4293,6 +4960,7 @@
                     </w:rPr>
                     <w:t>containerSummary</w:t>
                   </w:r>
+                  <w:proofErr w:type="spellEnd"/>
                   <w:r>
                     <w:rPr>
                       <w:rFonts w:cstheme="minorHAnsi"/>
@@ -4418,7 +5086,25 @@
                       <w:sz w:val="20"/>
                       <w:szCs w:val="20"/>
                     </w:rPr>
-                    <w:t>{panNo}</w:t>
+                    <w:t>{</w:t>
+                  </w:r>
+                  <w:proofErr w:type="spellStart"/>
+                  <w:r>
+                    <w:rPr>
+                      <w:rFonts w:cstheme="minorHAnsi"/>
+                      <w:sz w:val="20"/>
+                      <w:szCs w:val="20"/>
+                    </w:rPr>
+                    <w:t>panNo</w:t>
+                  </w:r>
+                  <w:proofErr w:type="spellEnd"/>
+                  <w:r>
+                    <w:rPr>
+                      <w:rFonts w:cstheme="minorHAnsi"/>
+                      <w:sz w:val="20"/>
+                      <w:szCs w:val="20"/>
+                    </w:rPr>
+                    <w:t>}</w:t>
                   </w:r>
                 </w:p>
               </w:tc>
@@ -4474,7 +5160,43 @@
                       <w:sz w:val="20"/>
                       <w:szCs w:val="20"/>
                     </w:rPr>
-                    <w:t>{bankName} {bankBranch}</w:t>
+                    <w:t>{</w:t>
+                  </w:r>
+                  <w:proofErr w:type="spellStart"/>
+                  <w:r>
+                    <w:rPr>
+                      <w:rFonts w:cstheme="minorHAnsi"/>
+                      <w:sz w:val="20"/>
+                      <w:szCs w:val="20"/>
+                    </w:rPr>
+                    <w:t>bankName</w:t>
+                  </w:r>
+                  <w:proofErr w:type="spellEnd"/>
+                  <w:r>
+                    <w:rPr>
+                      <w:rFonts w:cstheme="minorHAnsi"/>
+                      <w:sz w:val="20"/>
+                      <w:szCs w:val="20"/>
+                    </w:rPr>
+                    <w:t>} {</w:t>
+                  </w:r>
+                  <w:proofErr w:type="spellStart"/>
+                  <w:r>
+                    <w:rPr>
+                      <w:rFonts w:cstheme="minorHAnsi"/>
+                      <w:sz w:val="20"/>
+                      <w:szCs w:val="20"/>
+                    </w:rPr>
+                    <w:t>bankBranch</w:t>
+                  </w:r>
+                  <w:proofErr w:type="spellEnd"/>
+                  <w:r>
+                    <w:rPr>
+                      <w:rFonts w:cstheme="minorHAnsi"/>
+                      <w:sz w:val="20"/>
+                      <w:szCs w:val="20"/>
+                    </w:rPr>
+                    <w:t>}</w:t>
                   </w:r>
                 </w:p>
               </w:tc>
@@ -4530,7 +5252,25 @@
                       <w:sz w:val="20"/>
                       <w:szCs w:val="20"/>
                     </w:rPr>
-                    <w:t>{adCode}</w:t>
+                    <w:t>{</w:t>
+                  </w:r>
+                  <w:proofErr w:type="spellStart"/>
+                  <w:r>
+                    <w:rPr>
+                      <w:rFonts w:cstheme="minorHAnsi"/>
+                      <w:sz w:val="20"/>
+                      <w:szCs w:val="20"/>
+                    </w:rPr>
+                    <w:t>adCode</w:t>
+                  </w:r>
+                  <w:proofErr w:type="spellEnd"/>
+                  <w:r>
+                    <w:rPr>
+                      <w:rFonts w:cstheme="minorHAnsi"/>
+                      <w:sz w:val="20"/>
+                      <w:szCs w:val="20"/>
+                    </w:rPr>
+                    <w:t>}</w:t>
                   </w:r>
                 </w:p>
               </w:tc>
@@ -4586,7 +5326,25 @@
                       <w:sz w:val="20"/>
                       <w:szCs w:val="20"/>
                     </w:rPr>
-                    <w:t>{acCode}</w:t>
+                    <w:t>{</w:t>
+                  </w:r>
+                  <w:proofErr w:type="spellStart"/>
+                  <w:r>
+                    <w:rPr>
+                      <w:rFonts w:cstheme="minorHAnsi"/>
+                      <w:sz w:val="20"/>
+                      <w:szCs w:val="20"/>
+                    </w:rPr>
+                    <w:t>acCode</w:t>
+                  </w:r>
+                  <w:proofErr w:type="spellEnd"/>
+                  <w:r>
+                    <w:rPr>
+                      <w:rFonts w:cstheme="minorHAnsi"/>
+                      <w:sz w:val="20"/>
+                      <w:szCs w:val="20"/>
+                    </w:rPr>
+                    <w:t>}</w:t>
                   </w:r>
                 </w:p>
               </w:tc>
@@ -4642,7 +5400,25 @@
                       <w:sz w:val="20"/>
                       <w:szCs w:val="20"/>
                     </w:rPr>
-                    <w:t>{iec}</w:t>
+                    <w:t>{</w:t>
+                  </w:r>
+                  <w:proofErr w:type="spellStart"/>
+                  <w:r>
+                    <w:rPr>
+                      <w:rFonts w:cstheme="minorHAnsi"/>
+                      <w:sz w:val="20"/>
+                      <w:szCs w:val="20"/>
+                    </w:rPr>
+                    <w:t>iec</w:t>
+                  </w:r>
+                  <w:proofErr w:type="spellEnd"/>
+                  <w:r>
+                    <w:rPr>
+                      <w:rFonts w:cstheme="minorHAnsi"/>
+                      <w:sz w:val="20"/>
+                      <w:szCs w:val="20"/>
+                    </w:rPr>
+                    <w:t>}</w:t>
                   </w:r>
                 </w:p>
               </w:tc>
@@ -4917,6 +5693,7 @@
       </w:rPr>
       <w:t>{#</w:t>
     </w:r>
+    <w:proofErr w:type="gramStart"/>
     <w:r>
       <w:rPr>
         <w:rFonts w:cstheme="minorHAnsi"/>
@@ -4942,7 +5719,18 @@
         <w:sz w:val="20"/>
         <w:szCs w:val="20"/>
       </w:rPr>
-      <w:t>{companyName</w:t>
+      <w:t>{</w:t>
+    </w:r>
+    <w:proofErr w:type="gramEnd"/>
+    <w:r>
+      <w:rPr>
+        <w:b/>
+        <w:bCs/>
+        <w:spacing w:val="60"/>
+        <w:sz w:val="20"/>
+        <w:szCs w:val="20"/>
+      </w:rPr>
+      <w:t>companyName</w:t>
     </w:r>
     <w:r>
       <w:rPr>

</xml_diff>

<commit_message>
1. ToFixedThree in custom invoice 2. Single rate like 7000 dont rouding 3. HS code added in all invoice 4. Bank details add in party invoices
</commit_message>
<xml_diff>
--- a/electron/database/generate-document/templates/custom-invoice.docx
+++ b/electron/database/generate-document/templates/custom-invoice.docx
@@ -1485,7 +1485,15 @@
                 <w:sz w:val="20"/>
                 <w:szCs w:val="20"/>
               </w:rPr>
-              <w:t xml:space="preserve">Final Destination: </w:t>
+              <w:t>H.S. Code</w:t>
+            </w:r>
+            <w:r>
+              <w:rPr>
+                <w:rFonts w:cstheme="minorHAnsi"/>
+                <w:sz w:val="20"/>
+                <w:szCs w:val="20"/>
+              </w:rPr>
+              <w:t xml:space="preserve">: </w:t>
             </w:r>
           </w:p>
           <w:p>
@@ -1511,7 +1519,7 @@
                 <w:sz w:val="20"/>
                 <w:szCs w:val="20"/>
               </w:rPr>
-              <w:t>finalDestination</w:t>
+              <w:t>hsCode</w:t>
             </w:r>
             <w:proofErr w:type="spellEnd"/>
             <w:r>
@@ -6504,7 +6512,6 @@
   <w:style w:type="character" w:default="1" w:styleId="DefaultParagraphFont">
     <w:name w:val="Default Paragraph Font"/>
     <w:uiPriority w:val="1"/>
-    <w:semiHidden/>
     <w:unhideWhenUsed/>
   </w:style>
   <w:style w:type="table" w:default="1" w:styleId="TableNormal">

</xml_diff>

<commit_message>
In all generated document -> field Buyer's Order No.  -> Now showing invoicePiNo
</commit_message>
<xml_diff>
--- a/electron/database/generate-document/templates/custom-invoice.docx
+++ b/electron/database/generate-document/templates/custom-invoice.docx
@@ -104,25 +104,7 @@
                 <w:sz w:val="20"/>
                 <w:szCs w:val="20"/>
               </w:rPr>
-              <w:t>{#</w:t>
-            </w:r>
-            <w:proofErr w:type="gramStart"/>
-            <w:r>
-              <w:rPr>
-                <w:rFonts w:cstheme="minorHAnsi"/>
-                <w:sz w:val="20"/>
-                <w:szCs w:val="20"/>
-              </w:rPr>
-              <w:t>companyData}{</w:t>
-            </w:r>
-            <w:proofErr w:type="gramEnd"/>
-            <w:r>
-              <w:rPr>
-                <w:rFonts w:cstheme="minorHAnsi"/>
-                <w:sz w:val="20"/>
-                <w:szCs w:val="20"/>
-              </w:rPr>
-              <w:t>companyName}</w:t>
+              <w:t>{#companyData}{companyName}</w:t>
             </w:r>
           </w:p>
           <w:p>
@@ -140,160 +122,7 @@
                 <w:sz w:val="20"/>
                 <w:szCs w:val="20"/>
               </w:rPr>
-              <w:t xml:space="preserve">{companyAddressLine1} </w:t>
-            </w:r>
-            <w:proofErr w:type="gramStart"/>
-            <w:r>
-              <w:rPr>
-                <w:rFonts w:cstheme="minorHAnsi"/>
-                <w:bCs/>
-                <w:sz w:val="20"/>
-                <w:szCs w:val="20"/>
-              </w:rPr>
-              <w:t xml:space="preserve">   {</w:t>
-            </w:r>
-            <w:proofErr w:type="gramEnd"/>
-            <w:r>
-              <w:rPr>
-                <w:rFonts w:cstheme="minorHAnsi"/>
-                <w:bCs/>
-                <w:sz w:val="20"/>
-                <w:szCs w:val="20"/>
-              </w:rPr>
-              <w:t>companyAddressLine2</w:t>
-            </w:r>
-            <w:proofErr w:type="gramStart"/>
-            <w:r>
-              <w:rPr>
-                <w:rFonts w:cstheme="minorHAnsi"/>
-                <w:bCs/>
-                <w:sz w:val="20"/>
-                <w:szCs w:val="20"/>
-              </w:rPr>
-              <w:t>},      {</w:t>
-            </w:r>
-            <w:proofErr w:type="spellStart"/>
-            <w:r>
-              <w:rPr>
-                <w:rFonts w:cstheme="minorHAnsi"/>
-                <w:bCs/>
-                <w:sz w:val="20"/>
-                <w:szCs w:val="20"/>
-              </w:rPr>
-              <w:t>companyCity</w:t>
-            </w:r>
-            <w:proofErr w:type="spellEnd"/>
-            <w:r>
-              <w:rPr>
-                <w:rFonts w:cstheme="minorHAnsi"/>
-                <w:bCs/>
-                <w:sz w:val="20"/>
-                <w:szCs w:val="20"/>
-              </w:rPr>
-              <w:t xml:space="preserve">}   </w:t>
-            </w:r>
-            <w:proofErr w:type="gramEnd"/>
-            <w:r>
-              <w:rPr>
-                <w:rFonts w:cstheme="minorHAnsi"/>
-                <w:bCs/>
-                <w:sz w:val="20"/>
-                <w:szCs w:val="20"/>
-              </w:rPr>
-              <w:t xml:space="preserve"> {</w:t>
-            </w:r>
-            <w:proofErr w:type="spellStart"/>
-            <w:proofErr w:type="gramStart"/>
-            <w:r>
-              <w:rPr>
-                <w:rFonts w:cstheme="minorHAnsi"/>
-                <w:bCs/>
-                <w:sz w:val="20"/>
-                <w:szCs w:val="20"/>
-              </w:rPr>
-              <w:t>companyPostalCode</w:t>
-            </w:r>
-            <w:proofErr w:type="spellEnd"/>
-            <w:r>
-              <w:rPr>
-                <w:rFonts w:cstheme="minorHAnsi"/>
-                <w:bCs/>
-                <w:sz w:val="20"/>
-                <w:szCs w:val="20"/>
-              </w:rPr>
-              <w:t xml:space="preserve">}   </w:t>
-            </w:r>
-            <w:proofErr w:type="gramEnd"/>
-            <w:r>
-              <w:rPr>
-                <w:rFonts w:cstheme="minorHAnsi"/>
-                <w:bCs/>
-                <w:sz w:val="20"/>
-                <w:szCs w:val="20"/>
-              </w:rPr>
-              <w:t>{</w:t>
-            </w:r>
-            <w:proofErr w:type="spellStart"/>
-            <w:proofErr w:type="gramStart"/>
-            <w:r>
-              <w:rPr>
-                <w:rFonts w:cstheme="minorHAnsi"/>
-                <w:bCs/>
-                <w:sz w:val="20"/>
-                <w:szCs w:val="20"/>
-              </w:rPr>
-              <w:t>companyState</w:t>
-            </w:r>
-            <w:proofErr w:type="spellEnd"/>
-            <w:r>
-              <w:rPr>
-                <w:rFonts w:cstheme="minorHAnsi"/>
-                <w:bCs/>
-                <w:sz w:val="20"/>
-                <w:szCs w:val="20"/>
-              </w:rPr>
-              <w:t xml:space="preserve">}   </w:t>
-            </w:r>
-            <w:proofErr w:type="gramEnd"/>
-            <w:r>
-              <w:rPr>
-                <w:rFonts w:cstheme="minorHAnsi"/>
-                <w:bCs/>
-                <w:sz w:val="20"/>
-                <w:szCs w:val="20"/>
-              </w:rPr>
-              <w:t xml:space="preserve"> {</w:t>
-            </w:r>
-            <w:proofErr w:type="spellStart"/>
-            <w:r>
-              <w:rPr>
-                <w:rFonts w:cstheme="minorHAnsi"/>
-                <w:bCs/>
-                <w:sz w:val="20"/>
-                <w:szCs w:val="20"/>
-              </w:rPr>
-              <w:t>companyCountry</w:t>
-            </w:r>
-            <w:proofErr w:type="spellEnd"/>
-            <w:proofErr w:type="gramStart"/>
-            <w:r>
-              <w:rPr>
-                <w:rFonts w:cstheme="minorHAnsi"/>
-                <w:bCs/>
-                <w:sz w:val="20"/>
-                <w:szCs w:val="20"/>
-              </w:rPr>
-              <w:t>}{</w:t>
-            </w:r>
-            <w:proofErr w:type="gramEnd"/>
-            <w:r>
-              <w:rPr>
-                <w:rFonts w:cstheme="minorHAnsi"/>
-                <w:bCs/>
-                <w:sz w:val="20"/>
-                <w:szCs w:val="20"/>
-              </w:rPr>
-              <w:t>/}</w:t>
+              <w:t>{companyAddressLine1}    {companyAddressLine2},      {companyCity}    {companyPostalCode}   {companyState}    {companyCountry}{/}</w:t>
             </w:r>
           </w:p>
         </w:tc>
@@ -327,14 +156,12 @@
               </w:rPr>
               <w:t>{</w:t>
             </w:r>
-            <w:proofErr w:type="spellStart"/>
             <w:r>
               <w:rPr>
                 <w:rFonts w:cstheme="minorHAnsi"/>
               </w:rPr>
               <w:t>modifyInvNo</w:t>
             </w:r>
-            <w:proofErr w:type="spellEnd"/>
             <w:r>
               <w:rPr>
                 <w:rFonts w:cstheme="minorHAnsi"/>
@@ -376,14 +203,12 @@
               </w:rPr>
               <w:t>{</w:t>
             </w:r>
-            <w:proofErr w:type="spellStart"/>
             <w:r>
               <w:rPr>
                 <w:rFonts w:cstheme="minorHAnsi"/>
               </w:rPr>
               <w:t>invoiceDate</w:t>
             </w:r>
-            <w:proofErr w:type="spellEnd"/>
             <w:r>
               <w:rPr>
                 <w:rFonts w:cstheme="minorHAnsi"/>
@@ -464,14 +289,12 @@
               </w:rPr>
               <w:t>{</w:t>
             </w:r>
-            <w:proofErr w:type="spellStart"/>
-            <w:r>
-              <w:rPr>
-                <w:rFonts w:cstheme="minorHAnsi"/>
-              </w:rPr>
-              <w:t>buyersOrderNo</w:t>
-            </w:r>
-            <w:proofErr w:type="spellEnd"/>
+            <w:r>
+              <w:rPr>
+                <w:rFonts w:cstheme="minorHAnsi"/>
+              </w:rPr>
+              <w:t>invoicePiNo</w:t>
+            </w:r>
             <w:r>
               <w:rPr>
                 <w:rFonts w:cstheme="minorHAnsi"/>
@@ -514,14 +337,12 @@
               </w:rPr>
               <w:t>{</w:t>
             </w:r>
-            <w:proofErr w:type="spellStart"/>
             <w:r>
               <w:rPr>
                 <w:rFonts w:cstheme="minorHAnsi"/>
               </w:rPr>
               <w:t>orderDate</w:t>
             </w:r>
-            <w:proofErr w:type="spellEnd"/>
             <w:r>
               <w:rPr>
                 <w:rFonts w:cstheme="minorHAnsi"/>
@@ -578,7 +399,6 @@
               </w:rPr>
               <w:t>{</w:t>
             </w:r>
-            <w:proofErr w:type="spellStart"/>
             <w:r>
               <w:rPr>
                 <w:rFonts w:cstheme="minorHAnsi"/>
@@ -587,7 +407,6 @@
               </w:rPr>
               <w:t>consigneeCountry</w:t>
             </w:r>
-            <w:proofErr w:type="spellEnd"/>
             <w:r>
               <w:rPr>
                 <w:rFonts w:cstheme="minorHAnsi"/>
@@ -639,7 +458,6 @@
               </w:rPr>
               <w:t>{</w:t>
             </w:r>
-            <w:proofErr w:type="spellStart"/>
             <w:r>
               <w:rPr>
                 <w:rFonts w:cstheme="minorHAnsi"/>
@@ -648,7 +466,6 @@
               </w:rPr>
               <w:t>consigneeName</w:t>
             </w:r>
-            <w:proofErr w:type="spellEnd"/>
             <w:r>
               <w:rPr>
                 <w:rFonts w:cstheme="minorHAnsi"/>
@@ -674,7 +491,6 @@
               </w:rPr>
               <w:t>{</w:t>
             </w:r>
-            <w:proofErr w:type="spellStart"/>
             <w:r>
               <w:rPr>
                 <w:rFonts w:cstheme="minorHAnsi"/>
@@ -683,7 +499,6 @@
               </w:rPr>
               <w:t>consigneeAddress</w:t>
             </w:r>
-            <w:proofErr w:type="spellEnd"/>
             <w:r>
               <w:rPr>
                 <w:rFonts w:cstheme="minorHAnsi"/>
@@ -692,7 +507,6 @@
               </w:rPr>
               <w:t>} {</w:t>
             </w:r>
-            <w:proofErr w:type="spellStart"/>
             <w:r>
               <w:rPr>
                 <w:rFonts w:cstheme="minorHAnsi"/>
@@ -701,7 +515,6 @@
               </w:rPr>
               <w:t>consigneeCity</w:t>
             </w:r>
-            <w:proofErr w:type="spellEnd"/>
             <w:r>
               <w:rPr>
                 <w:rFonts w:cstheme="minorHAnsi"/>
@@ -710,7 +523,6 @@
               </w:rPr>
               <w:t>} {</w:t>
             </w:r>
-            <w:proofErr w:type="spellStart"/>
             <w:r>
               <w:rPr>
                 <w:rFonts w:cstheme="minorHAnsi"/>
@@ -719,7 +531,6 @@
               </w:rPr>
               <w:t>consigneeState</w:t>
             </w:r>
-            <w:proofErr w:type="spellEnd"/>
             <w:r>
               <w:rPr>
                 <w:rFonts w:cstheme="minorHAnsi"/>
@@ -728,7 +539,6 @@
               </w:rPr>
               <w:t>}{</w:t>
             </w:r>
-            <w:proofErr w:type="spellStart"/>
             <w:r>
               <w:rPr>
                 <w:rFonts w:cstheme="minorHAnsi"/>
@@ -737,7 +547,6 @@
               </w:rPr>
               <w:t>consigneeCountry</w:t>
             </w:r>
-            <w:proofErr w:type="spellEnd"/>
             <w:r>
               <w:rPr>
                 <w:rFonts w:cstheme="minorHAnsi"/>
@@ -746,7 +555,6 @@
               </w:rPr>
               <w:t>} {</w:t>
             </w:r>
-            <w:proofErr w:type="spellStart"/>
             <w:r>
               <w:rPr>
                 <w:rFonts w:cstheme="minorHAnsi"/>
@@ -755,7 +563,6 @@
               </w:rPr>
               <w:t>consigneeZip</w:t>
             </w:r>
-            <w:proofErr w:type="spellEnd"/>
             <w:r>
               <w:rPr>
                 <w:rFonts w:cstheme="minorHAnsi"/>
@@ -778,17 +585,276 @@
                 <w:sz w:val="20"/>
                 <w:szCs w:val="20"/>
               </w:rPr>
+              <w:t>{#isUK}</w:t>
+            </w:r>
+            <w:r>
+              <w:rPr>
+                <w:rFonts w:cstheme="minorHAnsi"/>
+                <w:sz w:val="20"/>
+                <w:szCs w:val="20"/>
+              </w:rPr>
               <w:t>{#</w:t>
             </w:r>
-            <w:proofErr w:type="gramStart"/>
-            <w:r>
-              <w:rPr>
-                <w:rFonts w:cstheme="minorHAnsi"/>
-                <w:sz w:val="20"/>
-                <w:szCs w:val="20"/>
-              </w:rPr>
-              <w:t>isUK}</w:t>
-            </w:r>
+            <w:r>
+              <w:rPr>
+                <w:rFonts w:cstheme="minorHAnsi"/>
+                <w:sz w:val="20"/>
+                <w:szCs w:val="20"/>
+              </w:rPr>
+              <w:t>consigneePhone</w:t>
+            </w:r>
+            <w:r>
+              <w:rPr>
+                <w:rFonts w:cstheme="minorHAnsi"/>
+                <w:sz w:val="20"/>
+                <w:szCs w:val="20"/>
+              </w:rPr>
+              <w:t>}</w:t>
+            </w:r>
+            <w:r>
+              <w:rPr>
+                <w:rFonts w:cstheme="minorHAnsi"/>
+                <w:sz w:val="20"/>
+                <w:szCs w:val="20"/>
+              </w:rPr>
+              <w:t>TELE:{</w:t>
+            </w:r>
+            <w:r>
+              <w:rPr>
+                <w:rFonts w:cstheme="minorHAnsi"/>
+                <w:sz w:val="20"/>
+                <w:szCs w:val="20"/>
+              </w:rPr>
+              <w:t>consigneePhone</w:t>
+            </w:r>
+            <w:r>
+              <w:rPr>
+                <w:rFonts w:cstheme="minorHAnsi"/>
+                <w:sz w:val="20"/>
+                <w:szCs w:val="20"/>
+              </w:rPr>
+              <w:t>}</w:t>
+            </w:r>
+            <w:r>
+              <w:rPr>
+                <w:rFonts w:cstheme="minorHAnsi"/>
+                <w:sz w:val="20"/>
+                <w:szCs w:val="20"/>
+              </w:rPr>
+              <w:t>{/</w:t>
+            </w:r>
+            <w:r>
+              <w:rPr>
+                <w:rFonts w:cstheme="minorHAnsi"/>
+                <w:sz w:val="20"/>
+                <w:szCs w:val="20"/>
+              </w:rPr>
+              <w:t>consigneePhone</w:t>
+            </w:r>
+            <w:r>
+              <w:rPr>
+                <w:rFonts w:cstheme="minorHAnsi"/>
+                <w:sz w:val="20"/>
+                <w:szCs w:val="20"/>
+              </w:rPr>
+              <w:t>}</w:t>
+            </w:r>
+            <w:r>
+              <w:rPr>
+                <w:rFonts w:cstheme="minorHAnsi"/>
+                <w:sz w:val="20"/>
+                <w:szCs w:val="20"/>
+              </w:rPr>
+              <w:t xml:space="preserve"> </w:t>
+            </w:r>
+          </w:p>
+          <w:p>
+            <w:pPr>
+              <w:rPr>
+                <w:rFonts w:cstheme="minorHAnsi"/>
+                <w:sz w:val="20"/>
+                <w:szCs w:val="20"/>
+              </w:rPr>
+            </w:pPr>
+            <w:r>
+              <w:rPr>
+                <w:rFonts w:cstheme="minorHAnsi"/>
+                <w:sz w:val="20"/>
+                <w:szCs w:val="20"/>
+              </w:rPr>
+              <w:t>{#</w:t>
+            </w:r>
+            <w:r>
+              <w:rPr>
+                <w:rFonts w:cstheme="minorHAnsi"/>
+                <w:sz w:val="20"/>
+                <w:szCs w:val="20"/>
+              </w:rPr>
+              <w:t>consigneeEmail</w:t>
+            </w:r>
+            <w:r>
+              <w:rPr>
+                <w:rFonts w:cstheme="minorHAnsi"/>
+                <w:sz w:val="20"/>
+                <w:szCs w:val="20"/>
+              </w:rPr>
+              <w:t>}</w:t>
+            </w:r>
+            <w:r>
+              <w:rPr>
+                <w:rFonts w:cstheme="minorHAnsi"/>
+                <w:sz w:val="20"/>
+                <w:szCs w:val="20"/>
+              </w:rPr>
+              <w:t>EMAIL</w:t>
+            </w:r>
+            <w:r>
+              <w:rPr>
+                <w:rFonts w:cstheme="minorHAnsi"/>
+                <w:sz w:val="20"/>
+                <w:szCs w:val="20"/>
+              </w:rPr>
+              <w:t>:{</w:t>
+            </w:r>
+            <w:r>
+              <w:rPr>
+                <w:rFonts w:cstheme="minorHAnsi"/>
+                <w:sz w:val="20"/>
+                <w:szCs w:val="20"/>
+              </w:rPr>
+              <w:t>consigneeEmail</w:t>
+            </w:r>
+            <w:r>
+              <w:rPr>
+                <w:rFonts w:cstheme="minorHAnsi"/>
+                <w:sz w:val="20"/>
+                <w:szCs w:val="20"/>
+              </w:rPr>
+              <w:t>}</w:t>
+            </w:r>
+            <w:r>
+              <w:rPr>
+                <w:rFonts w:cstheme="minorHAnsi"/>
+                <w:sz w:val="20"/>
+                <w:szCs w:val="20"/>
+              </w:rPr>
+              <w:t>{/</w:t>
+            </w:r>
+            <w:r>
+              <w:rPr>
+                <w:rFonts w:cstheme="minorHAnsi"/>
+                <w:sz w:val="20"/>
+                <w:szCs w:val="20"/>
+              </w:rPr>
+              <w:t>consigneeEmail</w:t>
+            </w:r>
+            <w:r>
+              <w:rPr>
+                <w:rFonts w:cstheme="minorHAnsi"/>
+                <w:sz w:val="20"/>
+                <w:szCs w:val="20"/>
+              </w:rPr>
+              <w:t>}</w:t>
+            </w:r>
+            <w:r>
+              <w:rPr>
+                <w:rFonts w:cstheme="minorHAnsi"/>
+                <w:sz w:val="20"/>
+                <w:szCs w:val="20"/>
+              </w:rPr>
+              <w:t>{/isUK}</w:t>
+            </w:r>
+          </w:p>
+          <w:p>
+            <w:pPr>
+              <w:rPr>
+                <w:rFonts w:cstheme="minorHAnsi"/>
+                <w:sz w:val="20"/>
+                <w:szCs w:val="20"/>
+              </w:rPr>
+            </w:pPr>
+            <w:r>
+              <w:rPr>
+                <w:rFonts w:cstheme="minorHAnsi"/>
+                <w:sz w:val="20"/>
+                <w:szCs w:val="20"/>
+              </w:rPr>
+              <w:t>{#</w:t>
+            </w:r>
+            <w:r>
+              <w:rPr>
+                <w:rFonts w:cstheme="minorHAnsi"/>
+                <w:sz w:val="20"/>
+                <w:szCs w:val="20"/>
+              </w:rPr>
+              <w:t>notifyName</w:t>
+            </w:r>
+            <w:r>
+              <w:rPr>
+                <w:rFonts w:cstheme="minorHAnsi"/>
+                <w:sz w:val="20"/>
+                <w:szCs w:val="20"/>
+              </w:rPr>
+              <w:t>}</w:t>
+            </w:r>
+            <w:r>
+              <w:rPr>
+                <w:rFonts w:cstheme="minorHAnsi"/>
+                <w:sz w:val="20"/>
+                <w:szCs w:val="20"/>
+              </w:rPr>
+              <w:t>{#</w:t>
+            </w:r>
+            <w:r>
+              <w:rPr>
+                <w:rFonts w:cstheme="minorHAnsi"/>
+                <w:sz w:val="20"/>
+                <w:szCs w:val="20"/>
+              </w:rPr>
+              <w:t>notifyAddress</w:t>
+            </w:r>
+            <w:r>
+              <w:rPr>
+                <w:rFonts w:cstheme="minorHAnsi"/>
+                <w:sz w:val="20"/>
+                <w:szCs w:val="20"/>
+              </w:rPr>
+              <w:t>}</w:t>
+            </w:r>
+          </w:p>
+          <w:p>
+            <w:pPr>
+              <w:rPr>
+                <w:rFonts w:cstheme="minorHAnsi"/>
+                <w:sz w:val="20"/>
+                <w:szCs w:val="20"/>
+              </w:rPr>
+            </w:pPr>
+            <w:r>
+              <w:rPr>
+                <w:rFonts w:cstheme="minorHAnsi"/>
+                <w:sz w:val="20"/>
+                <w:szCs w:val="20"/>
+              </w:rPr>
+              <w:t>NOTIFY</w:t>
+            </w:r>
+            <w:r>
+              <w:rPr>
+                <w:rFonts w:cstheme="minorHAnsi"/>
+                <w:sz w:val="20"/>
+                <w:szCs w:val="20"/>
+              </w:rPr>
+              <w:t xml:space="preserve"> – </w:t>
+            </w:r>
+          </w:p>
+          <w:p>
+            <w:pPr>
+              <w:rPr>
+                <w:rFonts w:cstheme="minorHAnsi"/>
+                <w:sz w:val="20"/>
+                <w:szCs w:val="20"/>
+              </w:rPr>
+            </w:pPr>
             <w:r>
               <w:rPr>
                 <w:rFonts w:cstheme="minorHAnsi"/>
@@ -797,23 +863,13 @@
               </w:rPr>
               <w:t>{</w:t>
             </w:r>
-            <w:proofErr w:type="gramEnd"/>
-            <w:r>
-              <w:rPr>
-                <w:rFonts w:cstheme="minorHAnsi"/>
-                <w:sz w:val="20"/>
-                <w:szCs w:val="20"/>
-              </w:rPr>
-              <w:t>#</w:t>
-            </w:r>
-            <w:proofErr w:type="gramStart"/>
-            <w:r>
-              <w:rPr>
-                <w:rFonts w:cstheme="minorHAnsi"/>
-                <w:sz w:val="20"/>
-                <w:szCs w:val="20"/>
-              </w:rPr>
-              <w:t>consigneePhone</w:t>
+            <w:r>
+              <w:rPr>
+                <w:rFonts w:cstheme="minorHAnsi"/>
+                <w:sz w:val="20"/>
+                <w:szCs w:val="20"/>
+              </w:rPr>
+              <w:t>notifyName</w:t>
             </w:r>
             <w:r>
               <w:rPr>
@@ -829,24 +885,32 @@
                 <w:sz w:val="20"/>
                 <w:szCs w:val="20"/>
               </w:rPr>
-              <w:t>TELE</w:t>
-            </w:r>
-            <w:proofErr w:type="gramEnd"/>
-            <w:r>
-              <w:rPr>
-                <w:rFonts w:cstheme="minorHAnsi"/>
-                <w:sz w:val="20"/>
-                <w:szCs w:val="20"/>
-              </w:rPr>
-              <w:t>:{</w:t>
-            </w:r>
-            <w:r>
-              <w:rPr>
-                <w:rFonts w:cstheme="minorHAnsi"/>
-                <w:sz w:val="20"/>
-                <w:szCs w:val="20"/>
-              </w:rPr>
-              <w:t>consigneePhone</w:t>
+              <w:t xml:space="preserve"> </w:t>
+            </w:r>
+          </w:p>
+          <w:p>
+            <w:pPr>
+              <w:rPr>
+                <w:rFonts w:cstheme="minorHAnsi"/>
+                <w:sz w:val="20"/>
+                <w:szCs w:val="20"/>
+              </w:rPr>
+            </w:pPr>
+            <w:r>
+              <w:rPr>
+                <w:rFonts w:cstheme="minorHAnsi"/>
+                <w:sz w:val="20"/>
+                <w:szCs w:val="20"/>
+              </w:rPr>
+              <w:t>{</w:t>
+            </w:r>
+            <w:r>
+              <w:rPr>
+                <w:rFonts w:cstheme="minorHAnsi"/>
+                <w:sz w:val="20"/>
+                <w:szCs w:val="20"/>
+              </w:rPr>
+              <w:t>notifyAddress</w:t>
             </w:r>
             <w:r>
               <w:rPr>
@@ -862,318 +926,6 @@
                 <w:sz w:val="20"/>
                 <w:szCs w:val="20"/>
               </w:rPr>
-              <w:t>{/</w:t>
-            </w:r>
-            <w:r>
-              <w:rPr>
-                <w:rFonts w:cstheme="minorHAnsi"/>
-                <w:sz w:val="20"/>
-                <w:szCs w:val="20"/>
-              </w:rPr>
-              <w:t>consigneePhone</w:t>
-            </w:r>
-            <w:r>
-              <w:rPr>
-                <w:rFonts w:cstheme="minorHAnsi"/>
-                <w:sz w:val="20"/>
-                <w:szCs w:val="20"/>
-              </w:rPr>
-              <w:t>}</w:t>
-            </w:r>
-            <w:r>
-              <w:rPr>
-                <w:rFonts w:cstheme="minorHAnsi"/>
-                <w:sz w:val="20"/>
-                <w:szCs w:val="20"/>
-              </w:rPr>
-              <w:t xml:space="preserve"> </w:t>
-            </w:r>
-          </w:p>
-          <w:p>
-            <w:pPr>
-              <w:rPr>
-                <w:rFonts w:cstheme="minorHAnsi"/>
-                <w:sz w:val="20"/>
-                <w:szCs w:val="20"/>
-              </w:rPr>
-            </w:pPr>
-            <w:r>
-              <w:rPr>
-                <w:rFonts w:cstheme="minorHAnsi"/>
-                <w:sz w:val="20"/>
-                <w:szCs w:val="20"/>
-              </w:rPr>
-              <w:t>{#</w:t>
-            </w:r>
-            <w:proofErr w:type="gramStart"/>
-            <w:r>
-              <w:rPr>
-                <w:rFonts w:cstheme="minorHAnsi"/>
-                <w:sz w:val="20"/>
-                <w:szCs w:val="20"/>
-              </w:rPr>
-              <w:t>consigneeEmail</w:t>
-            </w:r>
-            <w:r>
-              <w:rPr>
-                <w:rFonts w:cstheme="minorHAnsi"/>
-                <w:sz w:val="20"/>
-                <w:szCs w:val="20"/>
-              </w:rPr>
-              <w:t>}</w:t>
-            </w:r>
-            <w:r>
-              <w:rPr>
-                <w:rFonts w:cstheme="minorHAnsi"/>
-                <w:sz w:val="20"/>
-                <w:szCs w:val="20"/>
-              </w:rPr>
-              <w:t>EMAIL</w:t>
-            </w:r>
-            <w:proofErr w:type="gramEnd"/>
-            <w:r>
-              <w:rPr>
-                <w:rFonts w:cstheme="minorHAnsi"/>
-                <w:sz w:val="20"/>
-                <w:szCs w:val="20"/>
-              </w:rPr>
-              <w:t>:{</w:t>
-            </w:r>
-            <w:r>
-              <w:rPr>
-                <w:rFonts w:cstheme="minorHAnsi"/>
-                <w:sz w:val="20"/>
-                <w:szCs w:val="20"/>
-              </w:rPr>
-              <w:t>consigneeEmail</w:t>
-            </w:r>
-            <w:r>
-              <w:rPr>
-                <w:rFonts w:cstheme="minorHAnsi"/>
-                <w:sz w:val="20"/>
-                <w:szCs w:val="20"/>
-              </w:rPr>
-              <w:t>}</w:t>
-            </w:r>
-            <w:r>
-              <w:rPr>
-                <w:rFonts w:cstheme="minorHAnsi"/>
-                <w:sz w:val="20"/>
-                <w:szCs w:val="20"/>
-              </w:rPr>
-              <w:t>{/</w:t>
-            </w:r>
-            <w:proofErr w:type="gramStart"/>
-            <w:r>
-              <w:rPr>
-                <w:rFonts w:cstheme="minorHAnsi"/>
-                <w:sz w:val="20"/>
-                <w:szCs w:val="20"/>
-              </w:rPr>
-              <w:t>consigneeEmail</w:t>
-            </w:r>
-            <w:r>
-              <w:rPr>
-                <w:rFonts w:cstheme="minorHAnsi"/>
-                <w:sz w:val="20"/>
-                <w:szCs w:val="20"/>
-              </w:rPr>
-              <w:t>}</w:t>
-            </w:r>
-            <w:r>
-              <w:rPr>
-                <w:rFonts w:cstheme="minorHAnsi"/>
-                <w:sz w:val="20"/>
-                <w:szCs w:val="20"/>
-              </w:rPr>
-              <w:t>{</w:t>
-            </w:r>
-            <w:proofErr w:type="gramEnd"/>
-            <w:r>
-              <w:rPr>
-                <w:rFonts w:cstheme="minorHAnsi"/>
-                <w:sz w:val="20"/>
-                <w:szCs w:val="20"/>
-              </w:rPr>
-              <w:t>/isUK}</w:t>
-            </w:r>
-          </w:p>
-          <w:p>
-            <w:pPr>
-              <w:rPr>
-                <w:rFonts w:cstheme="minorHAnsi"/>
-                <w:sz w:val="20"/>
-                <w:szCs w:val="20"/>
-              </w:rPr>
-            </w:pPr>
-            <w:r>
-              <w:rPr>
-                <w:rFonts w:cstheme="minorHAnsi"/>
-                <w:sz w:val="20"/>
-                <w:szCs w:val="20"/>
-              </w:rPr>
-              <w:t>{#</w:t>
-            </w:r>
-            <w:proofErr w:type="gramStart"/>
-            <w:r>
-              <w:rPr>
-                <w:rFonts w:cstheme="minorHAnsi"/>
-                <w:sz w:val="20"/>
-                <w:szCs w:val="20"/>
-              </w:rPr>
-              <w:t>notifyName</w:t>
-            </w:r>
-            <w:r>
-              <w:rPr>
-                <w:rFonts w:cstheme="minorHAnsi"/>
-                <w:sz w:val="20"/>
-                <w:szCs w:val="20"/>
-              </w:rPr>
-              <w:t>}</w:t>
-            </w:r>
-            <w:r>
-              <w:rPr>
-                <w:rFonts w:cstheme="minorHAnsi"/>
-                <w:sz w:val="20"/>
-                <w:szCs w:val="20"/>
-              </w:rPr>
-              <w:t>{</w:t>
-            </w:r>
-            <w:proofErr w:type="gramEnd"/>
-            <w:r>
-              <w:rPr>
-                <w:rFonts w:cstheme="minorHAnsi"/>
-                <w:sz w:val="20"/>
-                <w:szCs w:val="20"/>
-              </w:rPr>
-              <w:t>#</w:t>
-            </w:r>
-            <w:r>
-              <w:rPr>
-                <w:rFonts w:cstheme="minorHAnsi"/>
-                <w:sz w:val="20"/>
-                <w:szCs w:val="20"/>
-              </w:rPr>
-              <w:t>notifyAddress</w:t>
-            </w:r>
-            <w:r>
-              <w:rPr>
-                <w:rFonts w:cstheme="minorHAnsi"/>
-                <w:sz w:val="20"/>
-                <w:szCs w:val="20"/>
-              </w:rPr>
-              <w:t>}</w:t>
-            </w:r>
-          </w:p>
-          <w:p>
-            <w:pPr>
-              <w:rPr>
-                <w:rFonts w:cstheme="minorHAnsi"/>
-                <w:sz w:val="20"/>
-                <w:szCs w:val="20"/>
-              </w:rPr>
-            </w:pPr>
-            <w:r>
-              <w:rPr>
-                <w:rFonts w:cstheme="minorHAnsi"/>
-                <w:sz w:val="20"/>
-                <w:szCs w:val="20"/>
-              </w:rPr>
-              <w:t>NOTIFY</w:t>
-            </w:r>
-            <w:r>
-              <w:rPr>
-                <w:rFonts w:cstheme="minorHAnsi"/>
-                <w:sz w:val="20"/>
-                <w:szCs w:val="20"/>
-              </w:rPr>
-              <w:t xml:space="preserve"> – </w:t>
-            </w:r>
-          </w:p>
-          <w:p>
-            <w:pPr>
-              <w:rPr>
-                <w:rFonts w:cstheme="minorHAnsi"/>
-                <w:sz w:val="20"/>
-                <w:szCs w:val="20"/>
-              </w:rPr>
-            </w:pPr>
-            <w:r>
-              <w:rPr>
-                <w:rFonts w:cstheme="minorHAnsi"/>
-                <w:sz w:val="20"/>
-                <w:szCs w:val="20"/>
-              </w:rPr>
-              <w:t>{</w:t>
-            </w:r>
-            <w:proofErr w:type="spellStart"/>
-            <w:r>
-              <w:rPr>
-                <w:rFonts w:cstheme="minorHAnsi"/>
-                <w:sz w:val="20"/>
-                <w:szCs w:val="20"/>
-              </w:rPr>
-              <w:t>notifyName</w:t>
-            </w:r>
-            <w:proofErr w:type="spellEnd"/>
-            <w:r>
-              <w:rPr>
-                <w:rFonts w:cstheme="minorHAnsi"/>
-                <w:sz w:val="20"/>
-                <w:szCs w:val="20"/>
-              </w:rPr>
-              <w:t>}</w:t>
-            </w:r>
-            <w:r>
-              <w:rPr>
-                <w:rFonts w:cstheme="minorHAnsi"/>
-                <w:sz w:val="20"/>
-                <w:szCs w:val="20"/>
-              </w:rPr>
-              <w:t xml:space="preserve"> </w:t>
-            </w:r>
-          </w:p>
-          <w:p>
-            <w:pPr>
-              <w:rPr>
-                <w:rFonts w:cstheme="minorHAnsi"/>
-                <w:sz w:val="20"/>
-                <w:szCs w:val="20"/>
-              </w:rPr>
-            </w:pPr>
-            <w:r>
-              <w:rPr>
-                <w:rFonts w:cstheme="minorHAnsi"/>
-                <w:sz w:val="20"/>
-                <w:szCs w:val="20"/>
-              </w:rPr>
-              <w:t>{</w:t>
-            </w:r>
-            <w:proofErr w:type="spellStart"/>
-            <w:r>
-              <w:rPr>
-                <w:rFonts w:cstheme="minorHAnsi"/>
-                <w:sz w:val="20"/>
-                <w:szCs w:val="20"/>
-              </w:rPr>
-              <w:t>notifyAddress</w:t>
-            </w:r>
-            <w:proofErr w:type="spellEnd"/>
-            <w:proofErr w:type="gramStart"/>
-            <w:r>
-              <w:rPr>
-                <w:rFonts w:cstheme="minorHAnsi"/>
-                <w:sz w:val="20"/>
-                <w:szCs w:val="20"/>
-              </w:rPr>
-              <w:t>}</w:t>
-            </w:r>
-            <w:r>
-              <w:rPr>
-                <w:rFonts w:cstheme="minorHAnsi"/>
-                <w:sz w:val="20"/>
-                <w:szCs w:val="20"/>
-              </w:rPr>
               <w:t>{/}</w:t>
             </w:r>
             <w:r>
@@ -1182,16 +934,7 @@
                 <w:sz w:val="20"/>
                 <w:szCs w:val="20"/>
               </w:rPr>
-              <w:t>{</w:t>
-            </w:r>
-            <w:proofErr w:type="gramEnd"/>
-            <w:r>
-              <w:rPr>
-                <w:rFonts w:cstheme="minorHAnsi"/>
-                <w:sz w:val="20"/>
-                <w:szCs w:val="20"/>
-              </w:rPr>
-              <w:t>/}</w:t>
+              <w:t>{/}</w:t>
             </w:r>
           </w:p>
         </w:tc>
@@ -1237,7 +980,6 @@
               </w:rPr>
               <w:t>{</w:t>
             </w:r>
-            <w:proofErr w:type="spellStart"/>
             <w:r>
               <w:rPr>
                 <w:rFonts w:cstheme="minorHAnsi"/>
@@ -1246,7 +988,6 @@
               </w:rPr>
               <w:t>buyerName</w:t>
             </w:r>
-            <w:proofErr w:type="spellEnd"/>
             <w:r>
               <w:rPr>
                 <w:rFonts w:cstheme="minorHAnsi"/>
@@ -1272,7 +1013,6 @@
               </w:rPr>
               <w:t>{</w:t>
             </w:r>
-            <w:proofErr w:type="spellStart"/>
             <w:r>
               <w:rPr>
                 <w:rFonts w:cstheme="minorHAnsi"/>
@@ -1281,7 +1021,6 @@
               </w:rPr>
               <w:t>buyerAddress</w:t>
             </w:r>
-            <w:proofErr w:type="spellEnd"/>
             <w:r>
               <w:rPr>
                 <w:rFonts w:cstheme="minorHAnsi"/>
@@ -1290,7 +1029,6 @@
               </w:rPr>
               <w:t>} {</w:t>
             </w:r>
-            <w:proofErr w:type="spellStart"/>
             <w:r>
               <w:rPr>
                 <w:rFonts w:cstheme="minorHAnsi"/>
@@ -1299,7 +1037,6 @@
               </w:rPr>
               <w:t>buyerCity</w:t>
             </w:r>
-            <w:proofErr w:type="spellEnd"/>
             <w:r>
               <w:rPr>
                 <w:rFonts w:cstheme="minorHAnsi"/>
@@ -1308,7 +1045,6 @@
               </w:rPr>
               <w:t>} {</w:t>
             </w:r>
-            <w:proofErr w:type="spellStart"/>
             <w:r>
               <w:rPr>
                 <w:rFonts w:cstheme="minorHAnsi"/>
@@ -1317,7 +1053,6 @@
               </w:rPr>
               <w:t>buyerState</w:t>
             </w:r>
-            <w:proofErr w:type="spellEnd"/>
             <w:r>
               <w:rPr>
                 <w:rFonts w:cstheme="minorHAnsi"/>
@@ -1343,7 +1078,6 @@
               </w:rPr>
               <w:t>{</w:t>
             </w:r>
-            <w:proofErr w:type="spellStart"/>
             <w:r>
               <w:rPr>
                 <w:rFonts w:cstheme="minorHAnsi"/>
@@ -1352,7 +1086,6 @@
               </w:rPr>
               <w:t>buyerCountry</w:t>
             </w:r>
-            <w:proofErr w:type="spellEnd"/>
             <w:r>
               <w:rPr>
                 <w:rFonts w:cstheme="minorHAnsi"/>
@@ -1361,7 +1094,6 @@
               </w:rPr>
               <w:t>} {</w:t>
             </w:r>
-            <w:proofErr w:type="spellStart"/>
             <w:r>
               <w:rPr>
                 <w:rFonts w:cstheme="minorHAnsi"/>
@@ -1370,7 +1102,6 @@
               </w:rPr>
               <w:t>buyerZip</w:t>
             </w:r>
-            <w:proofErr w:type="spellEnd"/>
             <w:r>
               <w:rPr>
                 <w:rFonts w:cstheme="minorHAnsi"/>
@@ -1443,7 +1174,6 @@
               </w:rPr>
               <w:t>{</w:t>
             </w:r>
-            <w:proofErr w:type="spellStart"/>
             <w:r>
               <w:rPr>
                 <w:rFonts w:cstheme="minorHAnsi"/>
@@ -1452,7 +1182,6 @@
               </w:rPr>
               <w:t>originOfGoods</w:t>
             </w:r>
-            <w:proofErr w:type="spellEnd"/>
             <w:r>
               <w:rPr>
                 <w:rFonts w:cstheme="minorHAnsi"/>
@@ -1512,7 +1241,6 @@
               </w:rPr>
               <w:t>{</w:t>
             </w:r>
-            <w:proofErr w:type="spellStart"/>
             <w:r>
               <w:rPr>
                 <w:rFonts w:cstheme="minorHAnsi"/>
@@ -1521,7 +1249,6 @@
               </w:rPr>
               <w:t>hsCode</w:t>
             </w:r>
-            <w:proofErr w:type="spellEnd"/>
             <w:r>
               <w:rPr>
                 <w:rFonts w:cstheme="minorHAnsi"/>
@@ -1598,7 +1325,6 @@
               </w:rPr>
               <w:t>{</w:t>
             </w:r>
-            <w:proofErr w:type="spellStart"/>
             <w:r>
               <w:rPr>
                 <w:rFonts w:cstheme="minorHAnsi"/>
@@ -1607,7 +1333,6 @@
               </w:rPr>
               <w:t>termOfDeliveryAndPayment</w:t>
             </w:r>
-            <w:proofErr w:type="spellEnd"/>
             <w:r>
               <w:rPr>
                 <w:rFonts w:cstheme="minorHAnsi"/>
@@ -1644,7 +1369,6 @@
                 <w:szCs w:val="20"/>
               </w:rPr>
             </w:pPr>
-            <w:proofErr w:type="spellStart"/>
             <w:r>
               <w:rPr>
                 <w:rFonts w:ascii="SansSerif" w:hAnsi="SansSerif" w:cs="SansSerif"/>
@@ -1652,17 +1376,7 @@
                 <w:sz w:val="20"/>
                 <w:szCs w:val="20"/>
               </w:rPr>
-              <w:t>Precarriage</w:t>
-            </w:r>
-            <w:proofErr w:type="spellEnd"/>
-            <w:r>
-              <w:rPr>
-                <w:rFonts w:ascii="SansSerif" w:hAnsi="SansSerif" w:cs="SansSerif"/>
-                <w:color w:val="000000"/>
-                <w:sz w:val="20"/>
-                <w:szCs w:val="20"/>
-              </w:rPr>
-              <w:t xml:space="preserve"> by:</w:t>
+              <w:t>Precarriage by:</w:t>
             </w:r>
           </w:p>
         </w:tc>
@@ -1717,7 +1431,6 @@
               </w:rPr>
               <w:t>{</w:t>
             </w:r>
-            <w:proofErr w:type="spellStart"/>
             <w:r>
               <w:rPr>
                 <w:rFonts w:ascii="SansSerif" w:hAnsi="SansSerif" w:cs="SansSerif"/>
@@ -1727,7 +1440,6 @@
               </w:rPr>
               <w:t>placeOfReceipt</w:t>
             </w:r>
-            <w:proofErr w:type="spellEnd"/>
             <w:r>
               <w:rPr>
                 <w:rFonts w:ascii="SansSerif" w:hAnsi="SansSerif" w:cs="SansSerif"/>
@@ -1862,7 +1574,6 @@
               </w:rPr>
               <w:t>{</w:t>
             </w:r>
-            <w:proofErr w:type="spellStart"/>
             <w:r>
               <w:rPr>
                 <w:rFonts w:ascii="SansSerif" w:hAnsi="SansSerif" w:cs="SansSerif"/>
@@ -1872,7 +1583,6 @@
               </w:rPr>
               <w:t>portOfLoading</w:t>
             </w:r>
-            <w:proofErr w:type="spellEnd"/>
             <w:r>
               <w:rPr>
                 <w:rFonts w:ascii="SansSerif" w:hAnsi="SansSerif" w:cs="SansSerif"/>
@@ -1958,7 +1668,6 @@
               </w:rPr>
               <w:t>{</w:t>
             </w:r>
-            <w:proofErr w:type="spellStart"/>
             <w:r>
               <w:rPr>
                 <w:rFonts w:ascii="SansSerif" w:hAnsi="SansSerif" w:cs="SansSerif"/>
@@ -1968,7 +1677,6 @@
               </w:rPr>
               <w:t>portOfDischarge</w:t>
             </w:r>
-            <w:proofErr w:type="spellEnd"/>
             <w:r>
               <w:rPr>
                 <w:rFonts w:ascii="SansSerif" w:hAnsi="SansSerif" w:cs="SansSerif"/>
@@ -2027,7 +1735,6 @@
               </w:rPr>
               <w:t>{</w:t>
             </w:r>
-            <w:proofErr w:type="spellStart"/>
             <w:r>
               <w:rPr>
                 <w:rFonts w:ascii="SansSerif" w:hAnsi="SansSerif" w:cs="SansSerif"/>
@@ -2037,7 +1744,6 @@
               </w:rPr>
               <w:t>finalDestination</w:t>
             </w:r>
-            <w:proofErr w:type="spellEnd"/>
             <w:r>
               <w:rPr>
                 <w:rFonts w:ascii="SansSerif" w:hAnsi="SansSerif" w:cs="SansSerif"/>
@@ -2107,7 +1813,6 @@
               </w:rPr>
               <w:t>{</w:t>
             </w:r>
-            <w:proofErr w:type="spellStart"/>
             <w:r>
               <w:rPr>
                 <w:rFonts w:cstheme="minorHAnsi"/>
@@ -2116,7 +1821,6 @@
               </w:rPr>
               <w:t>privateRemark</w:t>
             </w:r>
-            <w:proofErr w:type="spellEnd"/>
             <w:r>
               <w:rPr>
                 <w:rFonts w:cstheme="minorHAnsi"/>
@@ -2303,22 +2007,8 @@
                       <w:sz w:val="20"/>
                       <w:szCs w:val="20"/>
                     </w:rPr>
-                    <w:t xml:space="preserve">Total </w:t>
-                  </w:r>
-                  <w:proofErr w:type="spellStart"/>
-                  <w:proofErr w:type="gramStart"/>
-                  <w:r>
-                    <w:rPr>
-                      <w:rFonts w:cstheme="minorHAnsi"/>
-                      <w:b/>
-                      <w:bCs/>
-                      <w:sz w:val="20"/>
-                      <w:szCs w:val="20"/>
-                    </w:rPr>
-                    <w:t>Sq.Mt</w:t>
-                  </w:r>
-                  <w:proofErr w:type="spellEnd"/>
-                  <w:proofErr w:type="gramEnd"/>
+                    <w:t>Total Sq.Mt</w:t>
+                  </w:r>
                 </w:p>
               </w:tc>
               <w:tc>
@@ -2378,29 +2068,7 @@
                       <w:sz w:val="20"/>
                       <w:szCs w:val="20"/>
                     </w:rPr>
-                    <w:t>{</w:t>
-                  </w:r>
-                  <w:proofErr w:type="spellStart"/>
-                  <w:r>
-                    <w:rPr>
-                      <w:rFonts w:cstheme="minorHAnsi"/>
-                      <w:b/>
-                      <w:bCs/>
-                      <w:sz w:val="20"/>
-                      <w:szCs w:val="20"/>
-                    </w:rPr>
-                    <w:t>currencyChar</w:t>
-                  </w:r>
-                  <w:proofErr w:type="spellEnd"/>
-                  <w:r>
-                    <w:rPr>
-                      <w:rFonts w:cstheme="minorHAnsi"/>
-                      <w:b/>
-                      <w:bCs/>
-                      <w:sz w:val="20"/>
-                      <w:szCs w:val="20"/>
-                    </w:rPr>
-                    <w:t>}</w:t>
+                    <w:t>{currencyChar}</w:t>
                   </w:r>
                 </w:p>
               </w:tc>
@@ -2455,29 +2123,7 @@
                       <w:sz w:val="20"/>
                       <w:szCs w:val="20"/>
                     </w:rPr>
-                    <w:t>{</w:t>
-                  </w:r>
-                  <w:proofErr w:type="spellStart"/>
-                  <w:r>
-                    <w:rPr>
-                      <w:rFonts w:cstheme="minorHAnsi"/>
-                      <w:b/>
-                      <w:bCs/>
-                      <w:sz w:val="20"/>
-                      <w:szCs w:val="20"/>
-                    </w:rPr>
-                    <w:t>currencyChar</w:t>
-                  </w:r>
-                  <w:proofErr w:type="spellEnd"/>
-                  <w:r>
-                    <w:rPr>
-                      <w:rFonts w:cstheme="minorHAnsi"/>
-                      <w:b/>
-                      <w:bCs/>
-                      <w:sz w:val="20"/>
-                      <w:szCs w:val="20"/>
-                    </w:rPr>
-                    <w:t>}</w:t>
+                    <w:t>{currencyChar}</w:t>
                   </w:r>
                 </w:p>
               </w:tc>
@@ -2648,34 +2294,7 @@
                       <w:sz w:val="18"/>
                       <w:szCs w:val="18"/>
                     </w:rPr>
-                    <w:t>{#</w:t>
-                  </w:r>
-                  <w:proofErr w:type="gramStart"/>
-                  <w:r>
-                    <w:rPr>
-                      <w:rFonts w:ascii="Arial" w:hAnsi="Arial" w:cs="Arial"/>
-                      <w:sz w:val="18"/>
-                      <w:szCs w:val="18"/>
-                    </w:rPr>
-                    <w:t>CIItems}{</w:t>
-                  </w:r>
-                  <w:proofErr w:type="gramEnd"/>
-                  <w:r>
-                    <w:rPr>
-                      <w:rFonts w:ascii="Arial" w:hAnsi="Arial" w:cs="Arial"/>
-                      <w:sz w:val="18"/>
-                      <w:szCs w:val="18"/>
-                    </w:rPr>
-                    <w:t>#</w:t>
-                  </w:r>
-                  <w:proofErr w:type="gramStart"/>
-                  <w:r>
-                    <w:rPr>
-                      <w:rFonts w:ascii="Arial" w:hAnsi="Arial" w:cs="Arial"/>
-                      <w:sz w:val="18"/>
-                      <w:szCs w:val="18"/>
-                    </w:rPr>
-                    <w:t>showThickness}</w:t>
+                    <w:t>{#CIItems}{#showThickness}</w:t>
                   </w:r>
                   <w:r>
                     <w:rPr>
@@ -2685,18 +2304,7 @@
                       <w:sz w:val="18"/>
                       <w:szCs w:val="18"/>
                     </w:rPr>
-                    <w:t>{</w:t>
-                  </w:r>
-                  <w:proofErr w:type="gramEnd"/>
-                  <w:r>
-                    <w:rPr>
-                      <w:rFonts w:ascii="Arial" w:hAnsi="Arial" w:cs="Arial"/>
-                      <w:b/>
-                      <w:bCs/>
-                      <w:sz w:val="18"/>
-                      <w:szCs w:val="18"/>
-                    </w:rPr>
-                    <w:t>thicknessDetail</w:t>
+                    <w:t>{thicknessDetail</w:t>
                   </w:r>
                   <w:r>
                     <w:rPr>
@@ -2900,46 +2508,16 @@
                       <w:sz w:val="18"/>
                       <w:szCs w:val="18"/>
                     </w:rPr>
-                    <w:t>COMMISION-</w:t>
-                  </w:r>
-                  <w:proofErr w:type="gramStart"/>
+                    <w:t>COMMISION-USD.{commision}{/</w:t>
+                  </w:r>
                   <w:r>
                     <w:rPr>
                       <w:rFonts w:ascii="Arial" w:hAnsi="Arial" w:cs="Arial"/>
                       <w:sz w:val="18"/>
                       <w:szCs w:val="18"/>
                     </w:rPr>
-                    <w:t>USD.{</w:t>
-                  </w:r>
-                  <w:proofErr w:type="spellStart"/>
-                  <w:proofErr w:type="gramEnd"/>
-                  <w:r>
-                    <w:rPr>
-                      <w:rFonts w:ascii="Arial" w:hAnsi="Arial" w:cs="Arial"/>
-                      <w:sz w:val="18"/>
-                      <w:szCs w:val="18"/>
-                    </w:rPr>
                     <w:t>commision</w:t>
                   </w:r>
-                  <w:proofErr w:type="spellEnd"/>
-                  <w:r>
-                    <w:rPr>
-                      <w:rFonts w:ascii="Arial" w:hAnsi="Arial" w:cs="Arial"/>
-                      <w:sz w:val="18"/>
-                      <w:szCs w:val="18"/>
-                    </w:rPr>
-                    <w:t>}{/</w:t>
-                  </w:r>
-                  <w:proofErr w:type="spellStart"/>
-                  <w:r>
-                    <w:rPr>
-                      <w:rFonts w:ascii="Arial" w:hAnsi="Arial" w:cs="Arial"/>
-                      <w:sz w:val="18"/>
-                      <w:szCs w:val="18"/>
-                    </w:rPr>
-                    <w:t>commision</w:t>
-                  </w:r>
-                  <w:proofErr w:type="spellEnd"/>
                   <w:r>
                     <w:rPr>
                       <w:rFonts w:ascii="Arial" w:hAnsi="Arial" w:cs="Arial"/>
@@ -3049,25 +2627,7 @@
                       <w:sz w:val="18"/>
                       <w:szCs w:val="18"/>
                     </w:rPr>
-                    <w:t>{#invoices} {#</w:t>
-                  </w:r>
-                  <w:proofErr w:type="gramStart"/>
-                  <w:r>
-                    <w:rPr>
-                      <w:rFonts w:ascii="Arial" w:hAnsi="Arial" w:cs="Arial"/>
-                      <w:sz w:val="18"/>
-                      <w:szCs w:val="18"/>
-                    </w:rPr>
-                    <w:t>isFirst}{</w:t>
-                  </w:r>
-                  <w:proofErr w:type="gramEnd"/>
-                  <w:r>
-                    <w:rPr>
-                      <w:rFonts w:ascii="Arial" w:hAnsi="Arial" w:cs="Arial"/>
-                      <w:sz w:val="18"/>
-                      <w:szCs w:val="18"/>
-                    </w:rPr>
-                    <w:t>fsc}{/isFirst}</w:t>
+                    <w:t>{#invoices} {#isFirst}{fsc}{/isFirst}</w:t>
                   </w:r>
                 </w:p>
               </w:tc>
@@ -3119,25 +2679,7 @@
                       <w:sz w:val="18"/>
                       <w:szCs w:val="18"/>
                     </w:rPr>
-                    <w:t>{</w:t>
-                  </w:r>
-                  <w:proofErr w:type="spellStart"/>
-                  <w:r>
-                    <w:rPr>
-                      <w:rFonts w:ascii="Arial" w:hAnsi="Arial" w:cs="Arial"/>
-                      <w:sz w:val="18"/>
-                      <w:szCs w:val="18"/>
-                    </w:rPr>
-                    <w:t>totalSq</w:t>
-                  </w:r>
-                  <w:proofErr w:type="spellEnd"/>
-                  <w:r>
-                    <w:rPr>
-                      <w:rFonts w:ascii="Arial" w:hAnsi="Arial" w:cs="Arial"/>
-                      <w:sz w:val="18"/>
-                      <w:szCs w:val="18"/>
-                    </w:rPr>
-                    <w:t>}</w:t>
+                    <w:t>{totalSq}</w:t>
                   </w:r>
                 </w:p>
               </w:tc>
@@ -3189,25 +2731,7 @@
                       <w:sz w:val="18"/>
                       <w:szCs w:val="18"/>
                     </w:rPr>
-                    <w:t>{value} {/invoices} {/</w:t>
-                  </w:r>
-                  <w:proofErr w:type="spellStart"/>
-                  <w:r>
-                    <w:rPr>
-                      <w:rFonts w:ascii="Arial" w:hAnsi="Arial" w:cs="Arial"/>
-                      <w:sz w:val="18"/>
-                      <w:szCs w:val="18"/>
-                    </w:rPr>
-                    <w:t>CIItems</w:t>
-                  </w:r>
-                  <w:proofErr w:type="spellEnd"/>
-                  <w:r>
-                    <w:rPr>
-                      <w:rFonts w:ascii="Arial" w:hAnsi="Arial" w:cs="Arial"/>
-                      <w:sz w:val="18"/>
-                      <w:szCs w:val="18"/>
-                    </w:rPr>
-                    <w:t>}</w:t>
+                    <w:t>{value} {/invoices} {/CIItems}</w:t>
                   </w:r>
                 </w:p>
               </w:tc>
@@ -3279,25 +2803,7 @@
                       <w:sz w:val="18"/>
                       <w:szCs w:val="18"/>
                     </w:rPr>
-                    <w:t>As Per P/List {/</w:t>
-                  </w:r>
-                  <w:proofErr w:type="spellStart"/>
-                  <w:r>
-                    <w:rPr>
-                      <w:rFonts w:ascii="Arial" w:hAnsi="Arial" w:cs="Arial"/>
-                      <w:sz w:val="18"/>
-                      <w:szCs w:val="18"/>
-                    </w:rPr>
-                    <w:t>isSampleBox</w:t>
-                  </w:r>
-                  <w:proofErr w:type="spellEnd"/>
-                  <w:r>
-                    <w:rPr>
-                      <w:rFonts w:ascii="Arial" w:hAnsi="Arial" w:cs="Arial"/>
-                      <w:sz w:val="18"/>
-                      <w:szCs w:val="18"/>
-                    </w:rPr>
-                    <w:t>}</w:t>
+                    <w:t>As Per P/List {/isSampleBox}</w:t>
                   </w:r>
                 </w:p>
               </w:tc>
@@ -3438,7 +2944,6 @@
                     </w:rPr>
                     <w:t>{</w:t>
                   </w:r>
-                  <w:proofErr w:type="spellStart"/>
                   <w:r>
                     <w:rPr>
                       <w:rFonts w:ascii="Arial" w:hAnsi="Arial" w:cs="Arial"/>
@@ -3447,7 +2952,6 @@
                     </w:rPr>
                     <w:t>sampleDetails</w:t>
                   </w:r>
-                  <w:proofErr w:type="spellEnd"/>
                   <w:r>
                     <w:rPr>
                       <w:rFonts w:ascii="Arial" w:hAnsi="Arial" w:cs="Arial"/>
@@ -3506,25 +3010,7 @@
                       <w:sz w:val="18"/>
                       <w:szCs w:val="18"/>
                     </w:rPr>
-                    <w:t>{</w:t>
-                  </w:r>
-                  <w:proofErr w:type="spellStart"/>
-                  <w:r>
-                    <w:rPr>
-                      <w:rFonts w:ascii="Arial" w:hAnsi="Arial" w:cs="Arial"/>
-                      <w:sz w:val="18"/>
-                      <w:szCs w:val="18"/>
-                    </w:rPr>
-                    <w:t>totalSq</w:t>
-                  </w:r>
-                  <w:proofErr w:type="spellEnd"/>
-                  <w:r>
-                    <w:rPr>
-                      <w:rFonts w:ascii="Arial" w:hAnsi="Arial" w:cs="Arial"/>
-                      <w:sz w:val="18"/>
-                      <w:szCs w:val="18"/>
-                    </w:rPr>
-                    <w:t>}</w:t>
+                    <w:t>{totalSq}</w:t>
                   </w:r>
                 </w:p>
               </w:tc>
@@ -3584,25 +3070,7 @@
                       <w:sz w:val="16"/>
                       <w:szCs w:val="16"/>
                     </w:rPr>
-                    <w:t>{/</w:t>
-                  </w:r>
-                  <w:proofErr w:type="spellStart"/>
-                  <w:r>
-                    <w:rPr>
-                      <w:rFonts w:ascii="Arial" w:hAnsi="Arial" w:cs="Arial"/>
-                      <w:sz w:val="16"/>
-                      <w:szCs w:val="16"/>
-                    </w:rPr>
-                    <w:t>sampleBox</w:t>
-                  </w:r>
-                  <w:proofErr w:type="spellEnd"/>
-                  <w:r>
-                    <w:rPr>
-                      <w:rFonts w:ascii="Arial" w:hAnsi="Arial" w:cs="Arial"/>
-                      <w:sz w:val="16"/>
-                      <w:szCs w:val="16"/>
-                    </w:rPr>
-                    <w:t>}</w:t>
+                    <w:t>{/sampleBox}</w:t>
                   </w:r>
                 </w:p>
               </w:tc>
@@ -3652,7 +3120,6 @@
               </w:rPr>
               <w:t>{</w:t>
             </w:r>
-            <w:proofErr w:type="spellStart"/>
             <w:r>
               <w:rPr>
                 <w:rFonts w:cstheme="minorHAnsi"/>
@@ -3661,7 +3128,6 @@
               </w:rPr>
               <w:t>additionSumAmount</w:t>
             </w:r>
-            <w:proofErr w:type="spellEnd"/>
             <w:r>
               <w:rPr>
                 <w:rFonts w:cstheme="minorHAnsi"/>
@@ -3938,18 +3404,56 @@
                 <w:sz w:val="20"/>
                 <w:szCs w:val="20"/>
               </w:rPr>
+              <w:t>{deliveryTerms}</w:t>
+            </w:r>
+            <w:r>
+              <w:rPr>
+                <w:rFonts w:cstheme="minorHAnsi"/>
+                <w:sz w:val="20"/>
+                <w:szCs w:val="20"/>
+              </w:rPr>
+              <w:t xml:space="preserve"> </w:t>
+            </w:r>
+            <w:r>
+              <w:rPr>
+                <w:rFonts w:cstheme="minorHAnsi"/>
+                <w:sz w:val="20"/>
+                <w:szCs w:val="20"/>
+              </w:rPr>
+              <w:t>{dischargeTerms}</w:t>
+            </w:r>
+            <w:r>
+              <w:rPr>
+                <w:rFonts w:cstheme="minorHAnsi"/>
+                <w:sz w:val="20"/>
+                <w:szCs w:val="20"/>
+              </w:rPr>
+              <w:t xml:space="preserve"> </w:t>
+            </w:r>
+            <w:r>
+              <w:rPr>
+                <w:rFonts w:cstheme="minorHAnsi"/>
+                <w:sz w:val="20"/>
+                <w:szCs w:val="20"/>
+              </w:rPr>
+              <w:t xml:space="preserve">  </w:t>
+            </w:r>
+            <w:r>
+              <w:rPr>
+                <w:rFonts w:cstheme="minorHAnsi"/>
+                <w:sz w:val="20"/>
+                <w:szCs w:val="20"/>
+              </w:rPr>
               <w:t>{</w:t>
             </w:r>
-            <w:proofErr w:type="spellStart"/>
-            <w:r>
-              <w:rPr>
-                <w:rFonts w:cstheme="minorHAnsi"/>
-                <w:sz w:val="20"/>
-                <w:szCs w:val="20"/>
-              </w:rPr>
-              <w:t>deliveryTerms</w:t>
-            </w:r>
-            <w:proofErr w:type="spellEnd"/>
+            <w:r>
+              <w:rPr>
+                <w:rFonts w:cstheme="minorHAnsi"/>
+                <w:sz w:val="20"/>
+                <w:szCs w:val="20"/>
+              </w:rPr>
+              <w:t>currencyChar</w:t>
+            </w:r>
             <w:r>
               <w:rPr>
                 <w:rFonts w:cstheme="minorHAnsi"/>
@@ -3972,33 +3476,6 @@
                 <w:sz w:val="20"/>
                 <w:szCs w:val="20"/>
               </w:rPr>
-              <w:t>{</w:t>
-            </w:r>
-            <w:proofErr w:type="spellStart"/>
-            <w:proofErr w:type="gramStart"/>
-            <w:r>
-              <w:rPr>
-                <w:rFonts w:cstheme="minorHAnsi"/>
-                <w:sz w:val="20"/>
-                <w:szCs w:val="20"/>
-              </w:rPr>
-              <w:t>dischargeTerms</w:t>
-            </w:r>
-            <w:proofErr w:type="spellEnd"/>
-            <w:r>
-              <w:rPr>
-                <w:rFonts w:cstheme="minorHAnsi"/>
-                <w:sz w:val="20"/>
-                <w:szCs w:val="20"/>
-              </w:rPr>
-              <w:t>}</w:t>
-            </w:r>
-            <w:r>
-              <w:rPr>
-                <w:rFonts w:cstheme="minorHAnsi"/>
-                <w:sz w:val="20"/>
-                <w:szCs w:val="20"/>
-              </w:rPr>
               <w:t xml:space="preserve"> </w:t>
             </w:r>
             <w:r>
@@ -4007,35 +3484,7 @@
                 <w:sz w:val="20"/>
                 <w:szCs w:val="20"/>
               </w:rPr>
-              <w:t xml:space="preserve">  </w:t>
-            </w:r>
-            <w:proofErr w:type="gramEnd"/>
-            <w:r>
-              <w:rPr>
-                <w:rFonts w:cstheme="minorHAnsi"/>
-                <w:sz w:val="20"/>
-                <w:szCs w:val="20"/>
-              </w:rPr>
-              <w:t>{</w:t>
-            </w:r>
-            <w:proofErr w:type="spellStart"/>
-            <w:proofErr w:type="gramStart"/>
-            <w:r>
-              <w:rPr>
-                <w:rFonts w:cstheme="minorHAnsi"/>
-                <w:sz w:val="20"/>
-                <w:szCs w:val="20"/>
-              </w:rPr>
-              <w:t>currencyChar</w:t>
-            </w:r>
-            <w:proofErr w:type="spellEnd"/>
-            <w:r>
-              <w:rPr>
-                <w:rFonts w:cstheme="minorHAnsi"/>
-                <w:sz w:val="20"/>
-                <w:szCs w:val="20"/>
-              </w:rPr>
-              <w:t>}</w:t>
+              <w:t>{netAmountWords}</w:t>
             </w:r>
             <w:r>
               <w:rPr>
@@ -4059,51 +3508,8 @@
                 <w:sz w:val="20"/>
                 <w:szCs w:val="20"/>
               </w:rPr>
-              <w:t>{</w:t>
-            </w:r>
-            <w:proofErr w:type="spellStart"/>
-            <w:r>
-              <w:rPr>
-                <w:rFonts w:cstheme="minorHAnsi"/>
-                <w:sz w:val="20"/>
-                <w:szCs w:val="20"/>
-              </w:rPr>
-              <w:t>netAmountWords</w:t>
-            </w:r>
-            <w:proofErr w:type="spellEnd"/>
-            <w:r>
-              <w:rPr>
-                <w:rFonts w:cstheme="minorHAnsi"/>
-                <w:sz w:val="20"/>
-                <w:szCs w:val="20"/>
-              </w:rPr>
-              <w:t>}</w:t>
-            </w:r>
-            <w:r>
-              <w:rPr>
-                <w:rFonts w:cstheme="minorHAnsi"/>
-                <w:sz w:val="20"/>
-                <w:szCs w:val="20"/>
-              </w:rPr>
-              <w:t xml:space="preserve"> </w:t>
-            </w:r>
-            <w:r>
-              <w:rPr>
-                <w:rFonts w:cstheme="minorHAnsi"/>
-                <w:sz w:val="20"/>
-                <w:szCs w:val="20"/>
-              </w:rPr>
-              <w:t xml:space="preserve"> </w:t>
-            </w:r>
-            <w:r>
-              <w:rPr>
-                <w:rFonts w:cstheme="minorHAnsi"/>
-                <w:sz w:val="20"/>
-                <w:szCs w:val="20"/>
-              </w:rPr>
               <w:t>Only</w:t>
             </w:r>
-            <w:proofErr w:type="gramEnd"/>
           </w:p>
         </w:tc>
         <w:tc>
@@ -4133,25 +3539,7 @@
                 <w:sz w:val="20"/>
                 <w:szCs w:val="20"/>
               </w:rPr>
-              <w:t>{</w:t>
-            </w:r>
-            <w:proofErr w:type="spellStart"/>
-            <w:r>
-              <w:rPr>
-                <w:rFonts w:cstheme="minorHAnsi"/>
-                <w:sz w:val="20"/>
-                <w:szCs w:val="20"/>
-              </w:rPr>
-              <w:t>netAmount</w:t>
-            </w:r>
-            <w:proofErr w:type="spellEnd"/>
-            <w:r>
-              <w:rPr>
-                <w:rFonts w:cstheme="minorHAnsi"/>
-                <w:sz w:val="20"/>
-                <w:szCs w:val="20"/>
-              </w:rPr>
-              <w:t>}</w:t>
+              <w:t>{netAmount}</w:t>
             </w:r>
           </w:p>
         </w:tc>
@@ -4187,7 +3575,6 @@
               </w:rPr>
               <w:t>{#</w:t>
             </w:r>
-            <w:proofErr w:type="gramStart"/>
             <w:r>
               <w:rPr>
                 <w:rFonts w:cstheme="minorHAnsi"/>
@@ -4202,16 +3589,15 @@
                 <w:sz w:val="18"/>
                 <w:szCs w:val="18"/>
               </w:rPr>
-              <w:t>}{</w:t>
-            </w:r>
-            <w:proofErr w:type="gramEnd"/>
+              <w:t>}{specialInstruction}{/</w:t>
+            </w:r>
             <w:r>
               <w:rPr>
                 <w:rFonts w:cstheme="minorHAnsi"/>
                 <w:sz w:val="18"/>
                 <w:szCs w:val="18"/>
               </w:rPr>
-              <w:t>specialInstruction}{/</w:t>
+              <w:t>specialInstruction</w:t>
             </w:r>
             <w:r>
               <w:rPr>
@@ -4219,42 +3605,41 @@
                 <w:sz w:val="18"/>
                 <w:szCs w:val="18"/>
               </w:rPr>
-              <w:t>specialInstruction</w:t>
-            </w:r>
-            <w:r>
+              <w:t>}</w:t>
+            </w:r>
+          </w:p>
+          <w:p>
+            <w:pPr>
+              <w:pStyle w:val="NoSpacing"/>
               <w:rPr>
                 <w:rFonts w:cstheme="minorHAnsi"/>
                 <w:sz w:val="18"/>
                 <w:szCs w:val="18"/>
               </w:rPr>
-              <w:t>}</w:t>
-            </w:r>
-          </w:p>
-          <w:p>
-            <w:pPr>
-              <w:pStyle w:val="NoSpacing"/>
+            </w:pPr>
+            <w:r>
               <w:rPr>
                 <w:rFonts w:cstheme="minorHAnsi"/>
                 <w:sz w:val="18"/>
                 <w:szCs w:val="18"/>
               </w:rPr>
-            </w:pPr>
+              <w:t>{#</w:t>
+            </w:r>
             <w:r>
               <w:rPr>
                 <w:rFonts w:cstheme="minorHAnsi"/>
                 <w:sz w:val="18"/>
                 <w:szCs w:val="18"/>
               </w:rPr>
-              <w:t>{#</w:t>
-            </w:r>
-            <w:proofErr w:type="gramStart"/>
+              <w:t>bottomNotes</w:t>
+            </w:r>
             <w:r>
               <w:rPr>
                 <w:rFonts w:cstheme="minorHAnsi"/>
                 <w:sz w:val="18"/>
                 <w:szCs w:val="18"/>
               </w:rPr>
-              <w:t>bottomNotes</w:t>
+              <w:t>}{</w:t>
             </w:r>
             <w:r>
               <w:rPr>
@@ -4262,53 +3647,42 @@
                 <w:sz w:val="18"/>
                 <w:szCs w:val="18"/>
               </w:rPr>
-              <w:t>}{</w:t>
-            </w:r>
-            <w:proofErr w:type="gramEnd"/>
+              <w:t>bottomNote</w:t>
+            </w:r>
             <w:r>
               <w:rPr>
                 <w:rFonts w:cstheme="minorHAnsi"/>
                 <w:sz w:val="18"/>
                 <w:szCs w:val="18"/>
               </w:rPr>
-              <w:t>bottomNote</w:t>
-            </w:r>
+              <w:t>}</w:t>
+            </w:r>
+          </w:p>
+          <w:p>
+            <w:pPr>
+              <w:pStyle w:val="NoSpacing"/>
+              <w:rPr>
+                <w:rFonts w:cstheme="minorHAnsi"/>
+                <w:sz w:val="20"/>
+                <w:szCs w:val="20"/>
+              </w:rPr>
+            </w:pPr>
             <w:r>
               <w:rPr>
                 <w:rFonts w:cstheme="minorHAnsi"/>
                 <w:sz w:val="18"/>
                 <w:szCs w:val="18"/>
               </w:rPr>
-              <w:t>}</w:t>
-            </w:r>
-          </w:p>
-          <w:p>
-            <w:pPr>
-              <w:pStyle w:val="NoSpacing"/>
-              <w:rPr>
-                <w:rFonts w:cstheme="minorHAnsi"/>
-                <w:sz w:val="20"/>
-                <w:szCs w:val="20"/>
-              </w:rPr>
-            </w:pPr>
+              <w:t>{/</w:t>
+            </w:r>
             <w:r>
               <w:rPr>
                 <w:rFonts w:cstheme="minorHAnsi"/>
                 <w:sz w:val="18"/>
                 <w:szCs w:val="18"/>
               </w:rPr>
-              <w:t>{/</w:t>
-            </w:r>
-            <w:proofErr w:type="spellStart"/>
-            <w:r>
-              <w:rPr>
-                <w:rFonts w:cstheme="minorHAnsi"/>
-                <w:sz w:val="18"/>
-                <w:szCs w:val="18"/>
-              </w:rPr>
               <w:t>bottomNotes</w:t>
             </w:r>
-            <w:proofErr w:type="spellEnd"/>
             <w:r>
               <w:rPr>
                 <w:rFonts w:cstheme="minorHAnsi"/>
@@ -4412,7 +3786,6 @@
                     </w:rPr>
                     <w:t>{</w:t>
                   </w:r>
-                  <w:proofErr w:type="spellStart"/>
                   <w:r>
                     <w:rPr>
                       <w:rFonts w:cstheme="minorHAnsi"/>
@@ -4421,7 +3794,6 @@
                     </w:rPr>
                     <w:t>totalQuantity</w:t>
                   </w:r>
-                  <w:proofErr w:type="spellEnd"/>
                   <w:r>
                     <w:rPr>
                       <w:rFonts w:cstheme="minorHAnsi"/>
@@ -4486,7 +3858,6 @@
                     </w:rPr>
                     <w:t>{</w:t>
                   </w:r>
-                  <w:proofErr w:type="spellStart"/>
                   <w:r>
                     <w:rPr>
                       <w:rFonts w:cstheme="minorHAnsi"/>
@@ -4495,7 +3866,6 @@
                     </w:rPr>
                     <w:t>totalBox</w:t>
                   </w:r>
-                  <w:proofErr w:type="spellEnd"/>
                   <w:r>
                     <w:rPr>
                       <w:rFonts w:cstheme="minorHAnsi"/>
@@ -4533,27 +3903,7 @@
                       <w:sz w:val="20"/>
                       <w:szCs w:val="20"/>
                     </w:rPr>
-                    <w:t xml:space="preserve">Total </w:t>
-                  </w:r>
-                  <w:proofErr w:type="spellStart"/>
-                  <w:proofErr w:type="gramStart"/>
-                  <w:r>
-                    <w:rPr>
-                      <w:rFonts w:cstheme="minorHAnsi"/>
-                      <w:sz w:val="20"/>
-                      <w:szCs w:val="20"/>
-                    </w:rPr>
-                    <w:t>Sq.Meter</w:t>
-                  </w:r>
-                  <w:proofErr w:type="spellEnd"/>
-                  <w:proofErr w:type="gramEnd"/>
-                  <w:r>
-                    <w:rPr>
-                      <w:rFonts w:cstheme="minorHAnsi"/>
-                      <w:sz w:val="20"/>
-                      <w:szCs w:val="20"/>
-                    </w:rPr>
-                    <w:t>:</w:t>
+                    <w:t>Total Sq.Meter:</w:t>
                   </w:r>
                 </w:p>
               </w:tc>
@@ -4580,7 +3930,6 @@
                     </w:rPr>
                     <w:t>{</w:t>
                   </w:r>
-                  <w:proofErr w:type="spellStart"/>
                   <w:r>
                     <w:rPr>
                       <w:rFonts w:cstheme="minorHAnsi"/>
@@ -4589,7 +3938,6 @@
                     </w:rPr>
                     <w:t>totalSqMt</w:t>
                   </w:r>
-                  <w:proofErr w:type="spellEnd"/>
                   <w:r>
                     <w:rPr>
                       <w:rFonts w:cstheme="minorHAnsi"/>
@@ -4700,25 +4048,7 @@
                       <w:sz w:val="20"/>
                       <w:szCs w:val="20"/>
                     </w:rPr>
-                    <w:t>Avg./</w:t>
-                  </w:r>
-                  <w:proofErr w:type="gramStart"/>
-                  <w:r>
-                    <w:rPr>
-                      <w:rFonts w:cstheme="minorHAnsi"/>
-                      <w:sz w:val="20"/>
-                      <w:szCs w:val="20"/>
-                    </w:rPr>
-                    <w:t>Wt.(</w:t>
-                  </w:r>
-                  <w:proofErr w:type="gramEnd"/>
-                  <w:r>
-                    <w:rPr>
-                      <w:rFonts w:cstheme="minorHAnsi"/>
-                      <w:sz w:val="20"/>
-                      <w:szCs w:val="20"/>
-                    </w:rPr>
-                    <w:t>Kg)</w:t>
+                    <w:t>Avg./Wt.(Kg)</w:t>
                   </w:r>
                 </w:p>
               </w:tc>
@@ -4801,7 +4131,6 @@
                     </w:rPr>
                     <w:t>{#</w:t>
                   </w:r>
-                  <w:proofErr w:type="gramStart"/>
                   <w:r>
                     <w:rPr>
                       <w:rFonts w:cstheme="minorHAnsi"/>
@@ -4818,7 +4147,6 @@
                     </w:rPr>
                     <w:t>}{</w:t>
                   </w:r>
-                  <w:proofErr w:type="gramEnd"/>
                   <w:r>
                     <w:rPr>
                       <w:rFonts w:cstheme="minorHAnsi"/>
@@ -4860,7 +4188,6 @@
                     </w:rPr>
                     <w:t>{</w:t>
                   </w:r>
-                  <w:proofErr w:type="spellStart"/>
                   <w:r>
                     <w:rPr>
                       <w:rFonts w:cstheme="minorHAnsi"/>
@@ -4869,7 +4196,6 @@
                     </w:rPr>
                     <w:t>totalSqMtPerType</w:t>
                   </w:r>
-                  <w:proofErr w:type="spellEnd"/>
                   <w:r>
                     <w:rPr>
                       <w:rFonts w:cstheme="minorHAnsi"/>
@@ -4959,7 +4285,6 @@
                     </w:rPr>
                     <w:t>} MM{/</w:t>
                   </w:r>
-                  <w:proofErr w:type="spellStart"/>
                   <w:r>
                     <w:rPr>
                       <w:rFonts w:cstheme="minorHAnsi"/>
@@ -4968,7 +4293,6 @@
                     </w:rPr>
                     <w:t>containerSummary</w:t>
                   </w:r>
-                  <w:proofErr w:type="spellEnd"/>
                   <w:r>
                     <w:rPr>
                       <w:rFonts w:cstheme="minorHAnsi"/>
@@ -5094,25 +4418,7 @@
                       <w:sz w:val="20"/>
                       <w:szCs w:val="20"/>
                     </w:rPr>
-                    <w:t>{</w:t>
-                  </w:r>
-                  <w:proofErr w:type="spellStart"/>
-                  <w:r>
-                    <w:rPr>
-                      <w:rFonts w:cstheme="minorHAnsi"/>
-                      <w:sz w:val="20"/>
-                      <w:szCs w:val="20"/>
-                    </w:rPr>
-                    <w:t>panNo</w:t>
-                  </w:r>
-                  <w:proofErr w:type="spellEnd"/>
-                  <w:r>
-                    <w:rPr>
-                      <w:rFonts w:cstheme="minorHAnsi"/>
-                      <w:sz w:val="20"/>
-                      <w:szCs w:val="20"/>
-                    </w:rPr>
-                    <w:t>}</w:t>
+                    <w:t>{panNo}</w:t>
                   </w:r>
                 </w:p>
               </w:tc>
@@ -5168,43 +4474,7 @@
                       <w:sz w:val="20"/>
                       <w:szCs w:val="20"/>
                     </w:rPr>
-                    <w:t>{</w:t>
-                  </w:r>
-                  <w:proofErr w:type="spellStart"/>
-                  <w:r>
-                    <w:rPr>
-                      <w:rFonts w:cstheme="minorHAnsi"/>
-                      <w:sz w:val="20"/>
-                      <w:szCs w:val="20"/>
-                    </w:rPr>
-                    <w:t>bankName</w:t>
-                  </w:r>
-                  <w:proofErr w:type="spellEnd"/>
-                  <w:r>
-                    <w:rPr>
-                      <w:rFonts w:cstheme="minorHAnsi"/>
-                      <w:sz w:val="20"/>
-                      <w:szCs w:val="20"/>
-                    </w:rPr>
-                    <w:t>} {</w:t>
-                  </w:r>
-                  <w:proofErr w:type="spellStart"/>
-                  <w:r>
-                    <w:rPr>
-                      <w:rFonts w:cstheme="minorHAnsi"/>
-                      <w:sz w:val="20"/>
-                      <w:szCs w:val="20"/>
-                    </w:rPr>
-                    <w:t>bankBranch</w:t>
-                  </w:r>
-                  <w:proofErr w:type="spellEnd"/>
-                  <w:r>
-                    <w:rPr>
-                      <w:rFonts w:cstheme="minorHAnsi"/>
-                      <w:sz w:val="20"/>
-                      <w:szCs w:val="20"/>
-                    </w:rPr>
-                    <w:t>}</w:t>
+                    <w:t>{bankName} {bankBranch}</w:t>
                   </w:r>
                 </w:p>
               </w:tc>
@@ -5260,25 +4530,7 @@
                       <w:sz w:val="20"/>
                       <w:szCs w:val="20"/>
                     </w:rPr>
-                    <w:t>{</w:t>
-                  </w:r>
-                  <w:proofErr w:type="spellStart"/>
-                  <w:r>
-                    <w:rPr>
-                      <w:rFonts w:cstheme="minorHAnsi"/>
-                      <w:sz w:val="20"/>
-                      <w:szCs w:val="20"/>
-                    </w:rPr>
-                    <w:t>adCode</w:t>
-                  </w:r>
-                  <w:proofErr w:type="spellEnd"/>
-                  <w:r>
-                    <w:rPr>
-                      <w:rFonts w:cstheme="minorHAnsi"/>
-                      <w:sz w:val="20"/>
-                      <w:szCs w:val="20"/>
-                    </w:rPr>
-                    <w:t>}</w:t>
+                    <w:t>{adCode}</w:t>
                   </w:r>
                 </w:p>
               </w:tc>
@@ -5334,25 +4586,7 @@
                       <w:sz w:val="20"/>
                       <w:szCs w:val="20"/>
                     </w:rPr>
-                    <w:t>{</w:t>
-                  </w:r>
-                  <w:proofErr w:type="spellStart"/>
-                  <w:r>
-                    <w:rPr>
-                      <w:rFonts w:cstheme="minorHAnsi"/>
-                      <w:sz w:val="20"/>
-                      <w:szCs w:val="20"/>
-                    </w:rPr>
-                    <w:t>acCode</w:t>
-                  </w:r>
-                  <w:proofErr w:type="spellEnd"/>
-                  <w:r>
-                    <w:rPr>
-                      <w:rFonts w:cstheme="minorHAnsi"/>
-                      <w:sz w:val="20"/>
-                      <w:szCs w:val="20"/>
-                    </w:rPr>
-                    <w:t>}</w:t>
+                    <w:t>{acCode}</w:t>
                   </w:r>
                 </w:p>
               </w:tc>
@@ -5408,25 +4642,7 @@
                       <w:sz w:val="20"/>
                       <w:szCs w:val="20"/>
                     </w:rPr>
-                    <w:t>{</w:t>
-                  </w:r>
-                  <w:proofErr w:type="spellStart"/>
-                  <w:r>
-                    <w:rPr>
-                      <w:rFonts w:cstheme="minorHAnsi"/>
-                      <w:sz w:val="20"/>
-                      <w:szCs w:val="20"/>
-                    </w:rPr>
-                    <w:t>iec</w:t>
-                  </w:r>
-                  <w:proofErr w:type="spellEnd"/>
-                  <w:r>
-                    <w:rPr>
-                      <w:rFonts w:cstheme="minorHAnsi"/>
-                      <w:sz w:val="20"/>
-                      <w:szCs w:val="20"/>
-                    </w:rPr>
-                    <w:t>}</w:t>
+                    <w:t>{iec}</w:t>
                   </w:r>
                 </w:p>
               </w:tc>
@@ -5701,7 +4917,6 @@
       </w:rPr>
       <w:t>{#</w:t>
     </w:r>
-    <w:proofErr w:type="gramStart"/>
     <w:r>
       <w:rPr>
         <w:rFonts w:cstheme="minorHAnsi"/>
@@ -5727,18 +4942,7 @@
         <w:sz w:val="20"/>
         <w:szCs w:val="20"/>
       </w:rPr>
-      <w:t>{</w:t>
-    </w:r>
-    <w:proofErr w:type="gramEnd"/>
-    <w:r>
-      <w:rPr>
-        <w:b/>
-        <w:bCs/>
-        <w:spacing w:val="60"/>
-        <w:sz w:val="20"/>
-        <w:szCs w:val="20"/>
-      </w:rPr>
-      <w:t>companyName</w:t>
+      <w:t>{companyName</w:t>
     </w:r>
     <w:r>
       <w:rPr>
@@ -6512,6 +5716,7 @@
   <w:style w:type="character" w:default="1" w:styleId="DefaultParagraphFont">
     <w:name w:val="Default Paragraph Font"/>
     <w:uiPriority w:val="1"/>
+    <w:semiHidden/>
     <w:unhideWhenUsed/>
   </w:style>
   <w:style w:type="table" w:default="1" w:styleId="TableNormal">

</xml_diff>

<commit_message>
For Aus client remove buyer lable from custom invoice and party invoice
</commit_message>
<xml_diff>
--- a/electron/database/generate-document/templates/custom-invoice.docx
+++ b/electron/database/generate-document/templates/custom-invoice.docx
@@ -961,7 +961,63 @@
                 <w:sz w:val="20"/>
                 <w:szCs w:val="20"/>
               </w:rPr>
-              <w:t xml:space="preserve">Buyer </w:t>
+              <w:t>{</w:t>
+            </w:r>
+            <w:r>
+              <w:rPr>
+                <w:rFonts w:cstheme="minorHAnsi"/>
+                <w:sz w:val="20"/>
+                <w:szCs w:val="20"/>
+              </w:rPr>
+              <w:t>^</w:t>
+            </w:r>
+            <w:r>
+              <w:rPr>
+                <w:rFonts w:cstheme="minorHAnsi"/>
+                <w:sz w:val="20"/>
+                <w:szCs w:val="20"/>
+              </w:rPr>
+              <w:t>isAus</w:t>
+            </w:r>
+            <w:r>
+              <w:rPr>
+                <w:rFonts w:cstheme="minorHAnsi"/>
+                <w:sz w:val="20"/>
+                <w:szCs w:val="20"/>
+              </w:rPr>
+              <w:t>}</w:t>
+            </w:r>
+            <w:r>
+              <w:rPr>
+                <w:rFonts w:cstheme="minorHAnsi"/>
+                <w:sz w:val="20"/>
+                <w:szCs w:val="20"/>
+              </w:rPr>
+              <w:t>Buyer</w:t>
+            </w:r>
+            <w:r>
+              <w:rPr>
+                <w:rFonts w:cstheme="minorHAnsi"/>
+                <w:sz w:val="20"/>
+                <w:szCs w:val="20"/>
+              </w:rPr>
+              <w:t>{/</w:t>
+            </w:r>
+            <w:r>
+              <w:rPr>
+                <w:rFonts w:cstheme="minorHAnsi"/>
+                <w:sz w:val="20"/>
+                <w:szCs w:val="20"/>
+              </w:rPr>
+              <w:t>isAus</w:t>
+            </w:r>
+            <w:r>
+              <w:rPr>
+                <w:rFonts w:cstheme="minorHAnsi"/>
+                <w:sz w:val="20"/>
+                <w:szCs w:val="20"/>
+              </w:rPr>
+              <w:t>}</w:t>
             </w:r>
           </w:p>
           <w:p>
@@ -5512,7 +5568,7 @@
   <w:style w:type="paragraph" w:default="1" w:styleId="Normal">
     <w:name w:val="Normal"/>
     <w:qFormat/>
-    <w:rsid w:val="00BC1199"/>
+    <w:rsid w:val="00531932"/>
   </w:style>
   <w:style w:type="paragraph" w:styleId="Heading1">
     <w:name w:val="heading 1"/>
@@ -5716,7 +5772,6 @@
   <w:style w:type="character" w:default="1" w:styleId="DefaultParagraphFont">
     <w:name w:val="Default Paragraph Font"/>
     <w:uiPriority w:val="1"/>
-    <w:semiHidden/>
     <w:unhideWhenUsed/>
   </w:style>
   <w:style w:type="table" w:default="1" w:styleId="TableNormal">

</xml_diff>

<commit_message>
Payment Terms –  & Addition - Seafreight Charges -   & three-four filter added
</commit_message>
<xml_diff>
--- a/electron/database/generate-document/templates/custom-invoice.docx
+++ b/electron/database/generate-document/templates/custom-invoice.docx
@@ -1,6 +1,6 @@
 
 <file path=word/document.xml><?xml version="1.0" encoding="utf-8"?>
-<w:document xmlns:wpc="http://schemas.microsoft.com/office/word/2010/wordprocessingCanvas" xmlns:cx="http://schemas.microsoft.com/office/drawing/2014/chartex" xmlns:cx1="http://schemas.microsoft.com/office/drawing/2015/9/8/chartex" xmlns:cx2="http://schemas.microsoft.com/office/drawing/2015/10/21/chartex" xmlns:cx3="http://schemas.microsoft.com/office/drawing/2016/5/9/chartex" xmlns:cx4="http://schemas.microsoft.com/office/drawing/2016/5/10/chartex" xmlns:cx5="http://schemas.microsoft.com/office/drawing/2016/5/11/chartex" xmlns:cx6="http://schemas.microsoft.com/office/drawing/2016/5/12/chartex" xmlns:cx7="http://schemas.microsoft.com/office/drawing/2016/5/13/chartex" xmlns:cx8="http://schemas.microsoft.com/office/drawing/2016/5/14/chartex" xmlns:mc="http://schemas.openxmlformats.org/markup-compatibility/2006" xmlns:aink="http://schemas.microsoft.com/office/drawing/2016/ink" xmlns:am3d="http://schemas.microsoft.com/office/drawing/2017/model3d" xmlns:o="urn:schemas-microsoft-com:office:office" xmlns:oel="http://schemas.microsoft.com/office/2019/extlst" xmlns:r="http://schemas.openxmlformats.org/officeDocument/2006/relationships" xmlns:m="http://schemas.openxmlformats.org/officeDocument/2006/math" xmlns:v="urn:schemas-microsoft-com:vml" xmlns:wp14="http://schemas.microsoft.com/office/word/2010/wordprocessingDrawing" xmlns:wp="http://schemas.openxmlformats.org/drawingml/2006/wordprocessingDrawing" xmlns:w10="urn:schemas-microsoft-com:office:word" xmlns:w="http://schemas.openxmlformats.org/wordprocessingml/2006/main" xmlns:w14="http://schemas.microsoft.com/office/word/2010/wordml" xmlns:w15="http://schemas.microsoft.com/office/word/2012/wordml" xmlns:w16cex="http://schemas.microsoft.com/office/word/2018/wordml/cex" xmlns:w16cid="http://schemas.microsoft.com/office/word/2016/wordml/cid" xmlns:w16="http://schemas.microsoft.com/office/word/2018/wordml" xmlns:w16du="http://schemas.microsoft.com/office/word/2023/wordml/word16du" xmlns:w16sdtdh="http://schemas.microsoft.com/office/word/2020/wordml/sdtdatahash" xmlns:w16sdtfl="http://schemas.microsoft.com/office/word/2024/wordml/sdtformatlock" xmlns:w16se="http://schemas.microsoft.com/office/word/2015/wordml/symex" xmlns:wpg="http://schemas.microsoft.com/office/word/2010/wordprocessingGroup" xmlns:wpi="http://schemas.microsoft.com/office/word/2010/wordprocessingInk" xmlns:wne="http://schemas.microsoft.com/office/word/2006/wordml" xmlns:wps="http://schemas.microsoft.com/office/word/2010/wordprocessingShape" mc:Ignorable="w14 w15 w16se w16cid w16 w16cex w16sdtdh w16sdtfl w16du wp14">
+<w:document xmlns:wpc="http://schemas.microsoft.com/office/word/2010/wordprocessingCanvas" xmlns:cx="http://schemas.microsoft.com/office/drawing/2014/chartex" xmlns:cx1="http://schemas.microsoft.com/office/drawing/2015/9/8/chartex" xmlns:cx2="http://schemas.microsoft.com/office/drawing/2015/10/21/chartex" xmlns:cx3="http://schemas.microsoft.com/office/drawing/2016/5/9/chartex" xmlns:cx4="http://schemas.microsoft.com/office/drawing/2016/5/10/chartex" xmlns:cx5="http://schemas.microsoft.com/office/drawing/2016/5/11/chartex" xmlns:cx6="http://schemas.microsoft.com/office/drawing/2016/5/12/chartex" xmlns:cx7="http://schemas.microsoft.com/office/drawing/2016/5/13/chartex" xmlns:cx8="http://schemas.microsoft.com/office/drawing/2016/5/14/chartex" xmlns:mc="http://schemas.openxmlformats.org/markup-compatibility/2006" xmlns:aink="http://schemas.microsoft.com/office/drawing/2016/ink" xmlns:am3d="http://schemas.microsoft.com/office/drawing/2017/model3d" xmlns:o="urn:schemas-microsoft-com:office:office" xmlns:r="http://schemas.openxmlformats.org/officeDocument/2006/relationships" xmlns:m="http://schemas.openxmlformats.org/officeDocument/2006/math" xmlns:v="urn:schemas-microsoft-com:vml" xmlns:wp14="http://schemas.microsoft.com/office/word/2010/wordprocessingDrawing" xmlns:wp="http://schemas.openxmlformats.org/drawingml/2006/wordprocessingDrawing" xmlns:w10="urn:schemas-microsoft-com:office:word" xmlns:w="http://schemas.openxmlformats.org/wordprocessingml/2006/main" xmlns:w14="http://schemas.microsoft.com/office/word/2010/wordml" xmlns:w15="http://schemas.microsoft.com/office/word/2012/wordml" xmlns:w16cid="http://schemas.microsoft.com/office/word/2016/wordml/cid" xmlns:w16se="http://schemas.microsoft.com/office/word/2015/wordml/symex" xmlns:wpg="http://schemas.microsoft.com/office/word/2010/wordprocessingGroup" xmlns:wpi="http://schemas.microsoft.com/office/word/2010/wordprocessingInk" xmlns:wne="http://schemas.microsoft.com/office/word/2006/wordml" xmlns:wps="http://schemas.microsoft.com/office/word/2010/wordprocessingShape" mc:Ignorable="w14 w15 w16se w16cid wp14">
   <w:body>
     <w:tbl>
       <w:tblPr>
@@ -1362,17 +1362,10 @@
                 <w:sz w:val="20"/>
                 <w:szCs w:val="20"/>
               </w:rPr>
-              <w:t>Term Of Delivery &amp; Payment</w:t>
-            </w:r>
-          </w:p>
-          <w:p>
-            <w:pPr>
-              <w:rPr>
-                <w:rFonts w:cstheme="minorHAnsi"/>
-                <w:sz w:val="20"/>
-                <w:szCs w:val="20"/>
-              </w:rPr>
-            </w:pPr>
+              <w:t xml:space="preserve">Payment Terms – </w:t>
+            </w:r>
+            <w:bookmarkStart w:id="0" w:name="_GoBack"/>
+            <w:bookmarkEnd w:id="0"/>
             <w:r>
               <w:rPr>
                 <w:rFonts w:cstheme="minorHAnsi"/>
@@ -4414,6 +4407,7 @@
                 <w:insideH w:val="none" w:sz="0" w:space="0" w:color="auto"/>
                 <w:insideV w:val="none" w:sz="0" w:space="0" w:color="auto"/>
               </w:tblBorders>
+              <w:tblLayout w:type="fixed"/>
               <w:tblCellMar>
                 <w:left w:w="0" w:type="dxa"/>
               </w:tblCellMar>
@@ -4750,7 +4744,7 @@
 </file>
 
 <file path=word/endnotes.xml><?xml version="1.0" encoding="utf-8"?>
-<w:endnotes xmlns:wpc="http://schemas.microsoft.com/office/word/2010/wordprocessingCanvas" xmlns:cx="http://schemas.microsoft.com/office/drawing/2014/chartex" xmlns:cx1="http://schemas.microsoft.com/office/drawing/2015/9/8/chartex" xmlns:cx2="http://schemas.microsoft.com/office/drawing/2015/10/21/chartex" xmlns:cx3="http://schemas.microsoft.com/office/drawing/2016/5/9/chartex" xmlns:cx4="http://schemas.microsoft.com/office/drawing/2016/5/10/chartex" xmlns:cx5="http://schemas.microsoft.com/office/drawing/2016/5/11/chartex" xmlns:cx6="http://schemas.microsoft.com/office/drawing/2016/5/12/chartex" xmlns:cx7="http://schemas.microsoft.com/office/drawing/2016/5/13/chartex" xmlns:cx8="http://schemas.microsoft.com/office/drawing/2016/5/14/chartex" xmlns:mc="http://schemas.openxmlformats.org/markup-compatibility/2006" xmlns:aink="http://schemas.microsoft.com/office/drawing/2016/ink" xmlns:am3d="http://schemas.microsoft.com/office/drawing/2017/model3d" xmlns:o="urn:schemas-microsoft-com:office:office" xmlns:oel="http://schemas.microsoft.com/office/2019/extlst" xmlns:r="http://schemas.openxmlformats.org/officeDocument/2006/relationships" xmlns:m="http://schemas.openxmlformats.org/officeDocument/2006/math" xmlns:v="urn:schemas-microsoft-com:vml" xmlns:wp14="http://schemas.microsoft.com/office/word/2010/wordprocessingDrawing" xmlns:wp="http://schemas.openxmlformats.org/drawingml/2006/wordprocessingDrawing" xmlns:w10="urn:schemas-microsoft-com:office:word" xmlns:w="http://schemas.openxmlformats.org/wordprocessingml/2006/main" xmlns:w14="http://schemas.microsoft.com/office/word/2010/wordml" xmlns:w15="http://schemas.microsoft.com/office/word/2012/wordml" xmlns:w16cex="http://schemas.microsoft.com/office/word/2018/wordml/cex" xmlns:w16cid="http://schemas.microsoft.com/office/word/2016/wordml/cid" xmlns:w16="http://schemas.microsoft.com/office/word/2018/wordml" xmlns:w16du="http://schemas.microsoft.com/office/word/2023/wordml/word16du" xmlns:w16sdtdh="http://schemas.microsoft.com/office/word/2020/wordml/sdtdatahash" xmlns:w16sdtfl="http://schemas.microsoft.com/office/word/2024/wordml/sdtformatlock" xmlns:w16se="http://schemas.microsoft.com/office/word/2015/wordml/symex" xmlns:wpg="http://schemas.microsoft.com/office/word/2010/wordprocessingGroup" xmlns:wpi="http://schemas.microsoft.com/office/word/2010/wordprocessingInk" xmlns:wne="http://schemas.microsoft.com/office/word/2006/wordml" xmlns:wps="http://schemas.microsoft.com/office/word/2010/wordprocessingShape" mc:Ignorable="w14 w15 w16se w16cid w16 w16cex w16sdtdh w16sdtfl w16du wp14">
+<w:endnotes xmlns:wpc="http://schemas.microsoft.com/office/word/2010/wordprocessingCanvas" xmlns:cx="http://schemas.microsoft.com/office/drawing/2014/chartex" xmlns:cx1="http://schemas.microsoft.com/office/drawing/2015/9/8/chartex" xmlns:cx2="http://schemas.microsoft.com/office/drawing/2015/10/21/chartex" xmlns:cx3="http://schemas.microsoft.com/office/drawing/2016/5/9/chartex" xmlns:cx4="http://schemas.microsoft.com/office/drawing/2016/5/10/chartex" xmlns:cx5="http://schemas.microsoft.com/office/drawing/2016/5/11/chartex" xmlns:cx6="http://schemas.microsoft.com/office/drawing/2016/5/12/chartex" xmlns:cx7="http://schemas.microsoft.com/office/drawing/2016/5/13/chartex" xmlns:cx8="http://schemas.microsoft.com/office/drawing/2016/5/14/chartex" xmlns:mc="http://schemas.openxmlformats.org/markup-compatibility/2006" xmlns:aink="http://schemas.microsoft.com/office/drawing/2016/ink" xmlns:am3d="http://schemas.microsoft.com/office/drawing/2017/model3d" xmlns:o="urn:schemas-microsoft-com:office:office" xmlns:r="http://schemas.openxmlformats.org/officeDocument/2006/relationships" xmlns:m="http://schemas.openxmlformats.org/officeDocument/2006/math" xmlns:v="urn:schemas-microsoft-com:vml" xmlns:wp14="http://schemas.microsoft.com/office/word/2010/wordprocessingDrawing" xmlns:wp="http://schemas.openxmlformats.org/drawingml/2006/wordprocessingDrawing" xmlns:w10="urn:schemas-microsoft-com:office:word" xmlns:w="http://schemas.openxmlformats.org/wordprocessingml/2006/main" xmlns:w14="http://schemas.microsoft.com/office/word/2010/wordml" xmlns:w15="http://schemas.microsoft.com/office/word/2012/wordml" xmlns:w16cid="http://schemas.microsoft.com/office/word/2016/wordml/cid" xmlns:w16se="http://schemas.microsoft.com/office/word/2015/wordml/symex" xmlns:wpg="http://schemas.microsoft.com/office/word/2010/wordprocessingGroup" xmlns:wpi="http://schemas.microsoft.com/office/word/2010/wordprocessingInk" xmlns:wne="http://schemas.microsoft.com/office/word/2006/wordml" xmlns:wps="http://schemas.microsoft.com/office/word/2010/wordprocessingShape" mc:Ignorable="w14 w15 w16se w16cid wp14">
   <w:endnote w:type="separator" w:id="-1">
     <w:p>
       <w:pPr>
@@ -4775,7 +4769,7 @@
 </file>
 
 <file path=word/footer1.xml><?xml version="1.0" encoding="utf-8"?>
-<w:ftr xmlns:wpc="http://schemas.microsoft.com/office/word/2010/wordprocessingCanvas" xmlns:cx="http://schemas.microsoft.com/office/drawing/2014/chartex" xmlns:cx1="http://schemas.microsoft.com/office/drawing/2015/9/8/chartex" xmlns:cx2="http://schemas.microsoft.com/office/drawing/2015/10/21/chartex" xmlns:cx3="http://schemas.microsoft.com/office/drawing/2016/5/9/chartex" xmlns:cx4="http://schemas.microsoft.com/office/drawing/2016/5/10/chartex" xmlns:cx5="http://schemas.microsoft.com/office/drawing/2016/5/11/chartex" xmlns:cx6="http://schemas.microsoft.com/office/drawing/2016/5/12/chartex" xmlns:cx7="http://schemas.microsoft.com/office/drawing/2016/5/13/chartex" xmlns:cx8="http://schemas.microsoft.com/office/drawing/2016/5/14/chartex" xmlns:mc="http://schemas.openxmlformats.org/markup-compatibility/2006" xmlns:aink="http://schemas.microsoft.com/office/drawing/2016/ink" xmlns:am3d="http://schemas.microsoft.com/office/drawing/2017/model3d" xmlns:o="urn:schemas-microsoft-com:office:office" xmlns:oel="http://schemas.microsoft.com/office/2019/extlst" xmlns:r="http://schemas.openxmlformats.org/officeDocument/2006/relationships" xmlns:m="http://schemas.openxmlformats.org/officeDocument/2006/math" xmlns:v="urn:schemas-microsoft-com:vml" xmlns:wp14="http://schemas.microsoft.com/office/word/2010/wordprocessingDrawing" xmlns:wp="http://schemas.openxmlformats.org/drawingml/2006/wordprocessingDrawing" xmlns:w10="urn:schemas-microsoft-com:office:word" xmlns:w="http://schemas.openxmlformats.org/wordprocessingml/2006/main" xmlns:w14="http://schemas.microsoft.com/office/word/2010/wordml" xmlns:w15="http://schemas.microsoft.com/office/word/2012/wordml" xmlns:w16cex="http://schemas.microsoft.com/office/word/2018/wordml/cex" xmlns:w16cid="http://schemas.microsoft.com/office/word/2016/wordml/cid" xmlns:w16="http://schemas.microsoft.com/office/word/2018/wordml" xmlns:w16du="http://schemas.microsoft.com/office/word/2023/wordml/word16du" xmlns:w16sdtdh="http://schemas.microsoft.com/office/word/2020/wordml/sdtdatahash" xmlns:w16sdtfl="http://schemas.microsoft.com/office/word/2024/wordml/sdtformatlock" xmlns:w16se="http://schemas.microsoft.com/office/word/2015/wordml/symex" xmlns:wpg="http://schemas.microsoft.com/office/word/2010/wordprocessingGroup" xmlns:wpi="http://schemas.microsoft.com/office/word/2010/wordprocessingInk" xmlns:wne="http://schemas.microsoft.com/office/word/2006/wordml" xmlns:wps="http://schemas.microsoft.com/office/word/2010/wordprocessingShape" mc:Ignorable="w14 w15 w16se w16cid w16 w16cex w16sdtdh w16sdtfl w16du wp14">
+<w:ftr xmlns:wpc="http://schemas.microsoft.com/office/word/2010/wordprocessingCanvas" xmlns:cx="http://schemas.microsoft.com/office/drawing/2014/chartex" xmlns:cx1="http://schemas.microsoft.com/office/drawing/2015/9/8/chartex" xmlns:cx2="http://schemas.microsoft.com/office/drawing/2015/10/21/chartex" xmlns:cx3="http://schemas.microsoft.com/office/drawing/2016/5/9/chartex" xmlns:cx4="http://schemas.microsoft.com/office/drawing/2016/5/10/chartex" xmlns:cx5="http://schemas.microsoft.com/office/drawing/2016/5/11/chartex" xmlns:cx6="http://schemas.microsoft.com/office/drawing/2016/5/12/chartex" xmlns:cx7="http://schemas.microsoft.com/office/drawing/2016/5/13/chartex" xmlns:cx8="http://schemas.microsoft.com/office/drawing/2016/5/14/chartex" xmlns:mc="http://schemas.openxmlformats.org/markup-compatibility/2006" xmlns:aink="http://schemas.microsoft.com/office/drawing/2016/ink" xmlns:am3d="http://schemas.microsoft.com/office/drawing/2017/model3d" xmlns:o="urn:schemas-microsoft-com:office:office" xmlns:r="http://schemas.openxmlformats.org/officeDocument/2006/relationships" xmlns:m="http://schemas.openxmlformats.org/officeDocument/2006/math" xmlns:v="urn:schemas-microsoft-com:vml" xmlns:wp14="http://schemas.microsoft.com/office/word/2010/wordprocessingDrawing" xmlns:wp="http://schemas.openxmlformats.org/drawingml/2006/wordprocessingDrawing" xmlns:w10="urn:schemas-microsoft-com:office:word" xmlns:w="http://schemas.openxmlformats.org/wordprocessingml/2006/main" xmlns:w14="http://schemas.microsoft.com/office/word/2010/wordml" xmlns:w15="http://schemas.microsoft.com/office/word/2012/wordml" xmlns:w16cid="http://schemas.microsoft.com/office/word/2016/wordml/cid" xmlns:w16se="http://schemas.microsoft.com/office/word/2015/wordml/symex" xmlns:wpg="http://schemas.microsoft.com/office/word/2010/wordprocessingGroup" xmlns:wpi="http://schemas.microsoft.com/office/word/2010/wordprocessingInk" xmlns:wne="http://schemas.microsoft.com/office/word/2006/wordml" xmlns:wps="http://schemas.microsoft.com/office/word/2010/wordprocessingShape" mc:Ignorable="w14 w15 w16se w16cid wp14">
   <w:p>
     <w:pPr>
       <w:pStyle w:val="Footer"/>
@@ -4785,7 +4779,7 @@
 </file>
 
 <file path=word/footer2.xml><?xml version="1.0" encoding="utf-8"?>
-<w:ftr xmlns:wpc="http://schemas.microsoft.com/office/word/2010/wordprocessingCanvas" xmlns:cx="http://schemas.microsoft.com/office/drawing/2014/chartex" xmlns:cx1="http://schemas.microsoft.com/office/drawing/2015/9/8/chartex" xmlns:cx2="http://schemas.microsoft.com/office/drawing/2015/10/21/chartex" xmlns:cx3="http://schemas.microsoft.com/office/drawing/2016/5/9/chartex" xmlns:cx4="http://schemas.microsoft.com/office/drawing/2016/5/10/chartex" xmlns:cx5="http://schemas.microsoft.com/office/drawing/2016/5/11/chartex" xmlns:cx6="http://schemas.microsoft.com/office/drawing/2016/5/12/chartex" xmlns:cx7="http://schemas.microsoft.com/office/drawing/2016/5/13/chartex" xmlns:cx8="http://schemas.microsoft.com/office/drawing/2016/5/14/chartex" xmlns:mc="http://schemas.openxmlformats.org/markup-compatibility/2006" xmlns:aink="http://schemas.microsoft.com/office/drawing/2016/ink" xmlns:am3d="http://schemas.microsoft.com/office/drawing/2017/model3d" xmlns:o="urn:schemas-microsoft-com:office:office" xmlns:oel="http://schemas.microsoft.com/office/2019/extlst" xmlns:r="http://schemas.openxmlformats.org/officeDocument/2006/relationships" xmlns:m="http://schemas.openxmlformats.org/officeDocument/2006/math" xmlns:v="urn:schemas-microsoft-com:vml" xmlns:wp14="http://schemas.microsoft.com/office/word/2010/wordprocessingDrawing" xmlns:wp="http://schemas.openxmlformats.org/drawingml/2006/wordprocessingDrawing" xmlns:w10="urn:schemas-microsoft-com:office:word" xmlns:w="http://schemas.openxmlformats.org/wordprocessingml/2006/main" xmlns:w14="http://schemas.microsoft.com/office/word/2010/wordml" xmlns:w15="http://schemas.microsoft.com/office/word/2012/wordml" xmlns:w16cex="http://schemas.microsoft.com/office/word/2018/wordml/cex" xmlns:w16cid="http://schemas.microsoft.com/office/word/2016/wordml/cid" xmlns:w16="http://schemas.microsoft.com/office/word/2018/wordml" xmlns:w16du="http://schemas.microsoft.com/office/word/2023/wordml/word16du" xmlns:w16sdtdh="http://schemas.microsoft.com/office/word/2020/wordml/sdtdatahash" xmlns:w16sdtfl="http://schemas.microsoft.com/office/word/2024/wordml/sdtformatlock" xmlns:w16se="http://schemas.microsoft.com/office/word/2015/wordml/symex" xmlns:wpg="http://schemas.microsoft.com/office/word/2010/wordprocessingGroup" xmlns:wpi="http://schemas.microsoft.com/office/word/2010/wordprocessingInk" xmlns:wne="http://schemas.microsoft.com/office/word/2006/wordml" xmlns:wps="http://schemas.microsoft.com/office/word/2010/wordprocessingShape" mc:Ignorable="w14 w15 w16se w16cid w16 w16cex w16sdtdh w16sdtfl w16du wp14">
+<w:ftr xmlns:wpc="http://schemas.microsoft.com/office/word/2010/wordprocessingCanvas" xmlns:cx="http://schemas.microsoft.com/office/drawing/2014/chartex" xmlns:cx1="http://schemas.microsoft.com/office/drawing/2015/9/8/chartex" xmlns:cx2="http://schemas.microsoft.com/office/drawing/2015/10/21/chartex" xmlns:cx3="http://schemas.microsoft.com/office/drawing/2016/5/9/chartex" xmlns:cx4="http://schemas.microsoft.com/office/drawing/2016/5/10/chartex" xmlns:cx5="http://schemas.microsoft.com/office/drawing/2016/5/11/chartex" xmlns:cx6="http://schemas.microsoft.com/office/drawing/2016/5/12/chartex" xmlns:cx7="http://schemas.microsoft.com/office/drawing/2016/5/13/chartex" xmlns:cx8="http://schemas.microsoft.com/office/drawing/2016/5/14/chartex" xmlns:mc="http://schemas.openxmlformats.org/markup-compatibility/2006" xmlns:aink="http://schemas.microsoft.com/office/drawing/2016/ink" xmlns:am3d="http://schemas.microsoft.com/office/drawing/2017/model3d" xmlns:o="urn:schemas-microsoft-com:office:office" xmlns:r="http://schemas.openxmlformats.org/officeDocument/2006/relationships" xmlns:m="http://schemas.openxmlformats.org/officeDocument/2006/math" xmlns:v="urn:schemas-microsoft-com:vml" xmlns:wp14="http://schemas.microsoft.com/office/word/2010/wordprocessingDrawing" xmlns:wp="http://schemas.openxmlformats.org/drawingml/2006/wordprocessingDrawing" xmlns:w10="urn:schemas-microsoft-com:office:word" xmlns:w="http://schemas.openxmlformats.org/wordprocessingml/2006/main" xmlns:w14="http://schemas.microsoft.com/office/word/2010/wordml" xmlns:w15="http://schemas.microsoft.com/office/word/2012/wordml" xmlns:w16cid="http://schemas.microsoft.com/office/word/2016/wordml/cid" xmlns:w16se="http://schemas.microsoft.com/office/word/2015/wordml/symex" xmlns:wpg="http://schemas.microsoft.com/office/word/2010/wordprocessingGroup" xmlns:wpi="http://schemas.microsoft.com/office/word/2010/wordprocessingInk" xmlns:wne="http://schemas.microsoft.com/office/word/2006/wordml" xmlns:wps="http://schemas.microsoft.com/office/word/2010/wordprocessingShape" mc:Ignorable="w14 w15 w16se w16cid wp14">
   <w:p>
     <w:pPr>
       <w:pStyle w:val="Footer"/>
@@ -4855,7 +4849,7 @@
             </wp:anchor>
           </w:drawing>
         </mc:Choice>
-        <mc:Fallback>
+        <mc:Fallback xmlns:oel="http://schemas.microsoft.com/office/2019/extlst" xmlns:w16cex="http://schemas.microsoft.com/office/word/2018/wordml/cex" xmlns:w16="http://schemas.microsoft.com/office/word/2018/wordml" xmlns:w16du="http://schemas.microsoft.com/office/word/2023/wordml/word16du" xmlns:w16sdtdh="http://schemas.microsoft.com/office/word/2020/wordml/sdtdatahash" xmlns:w16sdtfl="http://schemas.microsoft.com/office/word/2024/wordml/sdtformatlock">
           <w:pict>
             <v:line w14:anchorId="3B85C156" id="Straight Connector 9" o:spid="_x0000_s1026" style="position:absolute;z-index:251658240;visibility:visible;mso-wrap-style:square;mso-width-percent:0;mso-height-percent:0;mso-wrap-distance-left:9pt;mso-wrap-distance-top:-3e-5mm;mso-wrap-distance-right:9pt;mso-wrap-distance-bottom:-3e-5mm;mso-position-horizontal:absolute;mso-position-horizontal-relative:margin;mso-position-vertical:absolute;mso-position-vertical-relative:text;mso-width-percent:0;mso-height-percent:0;mso-width-relative:margin;mso-height-relative:margin" from="373.65pt,.1pt" to="555.15pt,.1pt" o:gfxdata="UEsDBBQABgAIAAAAIQC2gziS/gAAAOEBAAATAAAAW0NvbnRlbnRfVHlwZXNdLnhtbJSRQU7DMBBF&#10;90jcwfIWJU67QAgl6YK0S0CoHGBkTxKLZGx5TGhvj5O2G0SRWNoz/78nu9wcxkFMGNg6quQqL6RA&#10;0s5Y6ir5vt9lD1JwBDIwOMJKHpHlpr69KfdHjyxSmriSfYz+USnWPY7AufNIadK6MEJMx9ApD/oD&#10;OlTrorhX2lFEilmcO2RdNtjC5xDF9pCuTyYBB5bi6bQ4syoJ3g9WQ0ymaiLzg5KdCXlKLjvcW893&#10;SUOqXwnz5DrgnHtJTxOsQfEKIT7DmDSUCaxw7Rqn8787ZsmRM9e2VmPeBN4uqYvTtW7jvijg9N/y&#10;JsXecLq0q+WD6m8AAAD//wMAUEsDBBQABgAIAAAAIQA4/SH/1gAAAJQBAAALAAAAX3JlbHMvLnJl&#10;bHOkkMFqwzAMhu+DvYPRfXGawxijTi+j0GvpHsDYimMaW0Yy2fr2M4PBMnrbUb/Q94l/f/hMi1qR&#10;JVI2sOt6UJgd+ZiDgffL8ekFlFSbvV0oo4EbChzGx4f9GRdb25HMsYhqlCwG5lrLq9biZkxWOiqY&#10;22YiTra2kYMu1l1tQD30/bPm3wwYN0x18gb45AdQl1tp5j/sFB2T0FQ7R0nTNEV3j6o9feQzro1i&#10;OWA14Fm+Q8a1a8+Bvu/d/dMb2JY5uiPbhG/ktn4cqGU/er3pcvwCAAD//wMAUEsDBBQABgAIAAAA&#10;IQAIoMetpgEAAKQDAAAOAAAAZHJzL2Uyb0RvYy54bWysU8Fu1DAQvSPxD5bvrLOLQCjabA+t4FJB&#10;ReEDps54Y9X2WLbZZP8e29kEVBBCVRXJij3vzbw3Hu+vJmvYCUPU5Dq+3TScoZPUa3fs+PdvH998&#10;4CwmcD0YctjxM0Z+dXj9aj/6Fnc0kOkxsJzExXb0HR9S8q0QUQ5oIW7Io8tBRcFCyttwFH2AMWe3&#10;Ruya5r0YKfQ+kMQY8+nNHOSHml8plOmLUhETMx3P2lJdQ10fyioOe2iPAfyg5UUGPEOFBe1y0TXV&#10;DSRgP4L+I5XVMlAklTaSrCCltMTqIbvZNk/c3A/gsXrJzYl+bVN8ubTy8+na3YUiXU7u3t+SfIy5&#10;KWL0sV2DZRP9DJtUsAWetbOpNvK8NhKnxGQ+3L1t3uWPM7nEBLQL0YeYPiFZVn46brQrHqGF021M&#10;pTS0C+SiYy5dRaSzwQI27isqpvtcbFvZdWLw2gR2gnzX/eO23G3OVZGForQxK6n5N+mCLTSsU/S/&#10;xBVdK5JLK9FqR+FvVdO0SFUzfnE9ey22H6g/34XlWvIoVGeXsS2z9vu+0n89rsNPAAAA//8DAFBL&#10;AwQUAAYACAAAACEAqr4wKNkAAAAGAQAADwAAAGRycy9kb3ducmV2LnhtbEyOwU7DMBBE70j8g7VI&#10;3KiTgFoU4lRVJYS4IJrC3Y23TsBeR7aThr/HOcHxaUYzr9rO1rAJfegdCchXGTCk1qmetICP4/Pd&#10;I7AQJSlpHKGAHwywra+vKlkqd6EDTk3ULI1QKKWALsah5Dy0HVoZVm5AStnZeStjQq+58vKSxq3h&#10;RZatuZU9pYdODrjvsP1uRivAvPrpU+/1Lowvh3Xz9X4u3o6TELc38+4JWMQ5/pVh0U/qUCenkxtJ&#10;BWYEbB4296kqoAC2xHmeJT4tzOuK/9evfwEAAP//AwBQSwECLQAUAAYACAAAACEAtoM4kv4AAADh&#10;AQAAEwAAAAAAAAAAAAAAAAAAAAAAW0NvbnRlbnRfVHlwZXNdLnhtbFBLAQItABQABgAIAAAAIQA4&#10;/SH/1gAAAJQBAAALAAAAAAAAAAAAAAAAAC8BAABfcmVscy8ucmVsc1BLAQItABQABgAIAAAAIQAI&#10;oMetpgEAAKQDAAAOAAAAAAAAAAAAAAAAAC4CAABkcnMvZTJvRG9jLnhtbFBLAQItABQABgAIAAAA&#10;IQCqvjAo2QAAAAYBAAAPAAAAAAAAAAAAAAAAAAAEAABkcnMvZG93bnJldi54bWxQSwUGAAAAAAQA&#10;BADzAAAABgUAAAAA&#10;" strokecolor="black [3200]" strokeweight=".5pt">
               <v:stroke joinstyle="miter"/>
@@ -4930,7 +4924,7 @@
             </wp:anchor>
           </w:drawing>
         </mc:Choice>
-        <mc:Fallback>
+        <mc:Fallback xmlns:oel="http://schemas.microsoft.com/office/2019/extlst" xmlns:w16cex="http://schemas.microsoft.com/office/word/2018/wordml/cex" xmlns:w16="http://schemas.microsoft.com/office/word/2018/wordml" xmlns:w16du="http://schemas.microsoft.com/office/word/2023/wordml/word16du" xmlns:w16sdtdh="http://schemas.microsoft.com/office/word/2020/wordml/sdtdatahash" xmlns:w16sdtfl="http://schemas.microsoft.com/office/word/2024/wordml/sdtformatlock">
           <w:pict>
             <v:line w14:anchorId="7A0307E0" id="Straight Connector 7" o:spid="_x0000_s1026" style="position:absolute;z-index:251658240;visibility:visible;mso-wrap-style:square;mso-width-percent:0;mso-height-percent:0;mso-wrap-distance-left:3.17497mm;mso-wrap-distance-top:0;mso-wrap-distance-right:3.17497mm;mso-wrap-distance-bottom:0;mso-position-horizontal:absolute;mso-position-horizontal-relative:text;mso-position-vertical:absolute;mso-position-vertical-relative:text;mso-width-percent:0;mso-height-percent:0;mso-width-relative:page;mso-height-relative:page" from="373.95pt,.1pt" to="373.95pt,67.3pt" o:gfxdata="UEsDBBQABgAIAAAAIQC2gziS/gAAAOEBAAATAAAAW0NvbnRlbnRfVHlwZXNdLnhtbJSRQU7DMBBF&#10;90jcwfIWJU67QAgl6YK0S0CoHGBkTxKLZGx5TGhvj5O2G0SRWNoz/78nu9wcxkFMGNg6quQqL6RA&#10;0s5Y6ir5vt9lD1JwBDIwOMJKHpHlpr69KfdHjyxSmriSfYz+USnWPY7AufNIadK6MEJMx9ApD/oD&#10;OlTrorhX2lFEilmcO2RdNtjC5xDF9pCuTyYBB5bi6bQ4syoJ3g9WQ0ymaiLzg5KdCXlKLjvcW893&#10;SUOqXwnz5DrgnHtJTxOsQfEKIT7DmDSUCaxw7Rqn8787ZsmRM9e2VmPeBN4uqYvTtW7jvijg9N/y&#10;JsXecLq0q+WD6m8AAAD//wMAUEsDBBQABgAIAAAAIQA4/SH/1gAAAJQBAAALAAAAX3JlbHMvLnJl&#10;bHOkkMFqwzAMhu+DvYPRfXGawxijTi+j0GvpHsDYimMaW0Yy2fr2M4PBMnrbUb/Q94l/f/hMi1qR&#10;JVI2sOt6UJgd+ZiDgffL8ekFlFSbvV0oo4EbChzGx4f9GRdb25HMsYhqlCwG5lrLq9biZkxWOiqY&#10;22YiTra2kYMu1l1tQD30/bPm3wwYN0x18gb45AdQl1tp5j/sFB2T0FQ7R0nTNEV3j6o9feQzro1i&#10;OWA14Fm+Q8a1a8+Bvu/d/dMb2JY5uiPbhG/ktn4cqGU/er3pcvwCAAD//wMAUEsDBBQABgAIAAAA&#10;IQCCqzI2pgEAAKMDAAAOAAAAZHJzL2Uyb0RvYy54bWysU8Fu1DAQvSPxD5bvrLOloCrabA+t4FJB&#10;ReEDps54Y9X2WLbZZP8e29mkCBBCqBcrtt978954sruerGFHDFGT6/h203CGTlKv3aHj375+eHPF&#10;WUzgejDksOMnjPx6//rVbvQtXtBApsfAsoiL7eg7PqTkWyGiHNBC3JBHly8VBQspb8NB9AHGrG6N&#10;uGia92Kk0PtAEmPMp7fzJd9XfaVQps9KRUzMdDx7S3UNdX0sq9jvoD0E8IOWZxvwHy4saJeLrlK3&#10;kIB9D/o3KatloEgqbSRZQUppiTVDTrNtfknzMIDHmiU3J/q1TfHlZOWn4427D8W6nNyDvyP5FHNT&#10;xOhju16WTfQzbFLBFnj2zqbayNPaSJwSk/OhzKdX795eXtYeC2gXng8xfUSyrHx03GhXIkILx7uY&#10;SmVoF8jZxly5ekgngwVs3BdUTPe51ray68DgjQnsCPmp+6dtedqsVZGForQxK6n5O+mMLTSsQ/Sv&#10;xBVdK5JLK9FqR+FPVdO0WFUzfkk9Zy2xH6k/3YflVfIk1GTnqS2j9vO+0p//rf0PAAAA//8DAFBL&#10;AwQUAAYACAAAACEAZDRu0dwAAAAIAQAADwAAAGRycy9kb3ducmV2LnhtbEyPwU7DMBBE70j8g7VI&#10;3KhDqFIIcaqqEkJcEE3h7sZbJ2CvI9tJw99jxKEcR/M0+7Zaz9awCX3oHQm4XWTAkFqnetIC3vdP&#10;N/fAQpSkpHGEAr4xwLq+vKhkqdyJdjg1UbM0QqGUAroYh5Lz0HZoZVi4ASl1R+etjCl6zZWXpzRu&#10;Dc+zrOBW9pQudHLAbYftVzNaAebFTx96qzdhfN4VzefbMX/dT0JcX82bR2AR53iG4Vc/qUOdnA5u&#10;JBWYEbBarh4SKiAHluq/eEjc3bIAXlf8/wP1DwAAAP//AwBQSwECLQAUAAYACAAAACEAtoM4kv4A&#10;AADhAQAAEwAAAAAAAAAAAAAAAAAAAAAAW0NvbnRlbnRfVHlwZXNdLnhtbFBLAQItABQABgAIAAAA&#10;IQA4/SH/1gAAAJQBAAALAAAAAAAAAAAAAAAAAC8BAABfcmVscy8ucmVsc1BLAQItABQABgAIAAAA&#10;IQCCqzI2pgEAAKMDAAAOAAAAAAAAAAAAAAAAAC4CAABkcnMvZTJvRG9jLnhtbFBLAQItABQABgAI&#10;AAAAIQBkNG7R3AAAAAgBAAAPAAAAAAAAAAAAAAAAAAAEAABkcnMvZG93bnJldi54bWxQSwUGAAAA&#10;AAQABADzAAAACQUAAAAA&#10;" strokecolor="black [3200]" strokeweight=".5pt">
               <v:stroke joinstyle="miter"/>
@@ -5088,7 +5082,7 @@
 </file>
 
 <file path=word/footer3.xml><?xml version="1.0" encoding="utf-8"?>
-<w:ftr xmlns:wpc="http://schemas.microsoft.com/office/word/2010/wordprocessingCanvas" xmlns:cx="http://schemas.microsoft.com/office/drawing/2014/chartex" xmlns:cx1="http://schemas.microsoft.com/office/drawing/2015/9/8/chartex" xmlns:cx2="http://schemas.microsoft.com/office/drawing/2015/10/21/chartex" xmlns:cx3="http://schemas.microsoft.com/office/drawing/2016/5/9/chartex" xmlns:cx4="http://schemas.microsoft.com/office/drawing/2016/5/10/chartex" xmlns:cx5="http://schemas.microsoft.com/office/drawing/2016/5/11/chartex" xmlns:cx6="http://schemas.microsoft.com/office/drawing/2016/5/12/chartex" xmlns:cx7="http://schemas.microsoft.com/office/drawing/2016/5/13/chartex" xmlns:cx8="http://schemas.microsoft.com/office/drawing/2016/5/14/chartex" xmlns:mc="http://schemas.openxmlformats.org/markup-compatibility/2006" xmlns:aink="http://schemas.microsoft.com/office/drawing/2016/ink" xmlns:am3d="http://schemas.microsoft.com/office/drawing/2017/model3d" xmlns:o="urn:schemas-microsoft-com:office:office" xmlns:oel="http://schemas.microsoft.com/office/2019/extlst" xmlns:r="http://schemas.openxmlformats.org/officeDocument/2006/relationships" xmlns:m="http://schemas.openxmlformats.org/officeDocument/2006/math" xmlns:v="urn:schemas-microsoft-com:vml" xmlns:wp14="http://schemas.microsoft.com/office/word/2010/wordprocessingDrawing" xmlns:wp="http://schemas.openxmlformats.org/drawingml/2006/wordprocessingDrawing" xmlns:w10="urn:schemas-microsoft-com:office:word" xmlns:w="http://schemas.openxmlformats.org/wordprocessingml/2006/main" xmlns:w14="http://schemas.microsoft.com/office/word/2010/wordml" xmlns:w15="http://schemas.microsoft.com/office/word/2012/wordml" xmlns:w16cex="http://schemas.microsoft.com/office/word/2018/wordml/cex" xmlns:w16cid="http://schemas.microsoft.com/office/word/2016/wordml/cid" xmlns:w16="http://schemas.microsoft.com/office/word/2018/wordml" xmlns:w16du="http://schemas.microsoft.com/office/word/2023/wordml/word16du" xmlns:w16sdtdh="http://schemas.microsoft.com/office/word/2020/wordml/sdtdatahash" xmlns:w16sdtfl="http://schemas.microsoft.com/office/word/2024/wordml/sdtformatlock" xmlns:w16se="http://schemas.microsoft.com/office/word/2015/wordml/symex" xmlns:wpg="http://schemas.microsoft.com/office/word/2010/wordprocessingGroup" xmlns:wpi="http://schemas.microsoft.com/office/word/2010/wordprocessingInk" xmlns:wne="http://schemas.microsoft.com/office/word/2006/wordml" xmlns:wps="http://schemas.microsoft.com/office/word/2010/wordprocessingShape" mc:Ignorable="w14 w15 w16se w16cid w16 w16cex w16sdtdh w16sdtfl w16du wp14">
+<w:ftr xmlns:wpc="http://schemas.microsoft.com/office/word/2010/wordprocessingCanvas" xmlns:cx="http://schemas.microsoft.com/office/drawing/2014/chartex" xmlns:cx1="http://schemas.microsoft.com/office/drawing/2015/9/8/chartex" xmlns:cx2="http://schemas.microsoft.com/office/drawing/2015/10/21/chartex" xmlns:cx3="http://schemas.microsoft.com/office/drawing/2016/5/9/chartex" xmlns:cx4="http://schemas.microsoft.com/office/drawing/2016/5/10/chartex" xmlns:cx5="http://schemas.microsoft.com/office/drawing/2016/5/11/chartex" xmlns:cx6="http://schemas.microsoft.com/office/drawing/2016/5/12/chartex" xmlns:cx7="http://schemas.microsoft.com/office/drawing/2016/5/13/chartex" xmlns:cx8="http://schemas.microsoft.com/office/drawing/2016/5/14/chartex" xmlns:mc="http://schemas.openxmlformats.org/markup-compatibility/2006" xmlns:aink="http://schemas.microsoft.com/office/drawing/2016/ink" xmlns:am3d="http://schemas.microsoft.com/office/drawing/2017/model3d" xmlns:o="urn:schemas-microsoft-com:office:office" xmlns:r="http://schemas.openxmlformats.org/officeDocument/2006/relationships" xmlns:m="http://schemas.openxmlformats.org/officeDocument/2006/math" xmlns:v="urn:schemas-microsoft-com:vml" xmlns:wp14="http://schemas.microsoft.com/office/word/2010/wordprocessingDrawing" xmlns:wp="http://schemas.openxmlformats.org/drawingml/2006/wordprocessingDrawing" xmlns:w10="urn:schemas-microsoft-com:office:word" xmlns:w="http://schemas.openxmlformats.org/wordprocessingml/2006/main" xmlns:w14="http://schemas.microsoft.com/office/word/2010/wordml" xmlns:w15="http://schemas.microsoft.com/office/word/2012/wordml" xmlns:w16cid="http://schemas.microsoft.com/office/word/2016/wordml/cid" xmlns:w16se="http://schemas.microsoft.com/office/word/2015/wordml/symex" xmlns:wpg="http://schemas.microsoft.com/office/word/2010/wordprocessingGroup" xmlns:wpi="http://schemas.microsoft.com/office/word/2010/wordprocessingInk" xmlns:wne="http://schemas.microsoft.com/office/word/2006/wordml" xmlns:wps="http://schemas.microsoft.com/office/word/2010/wordprocessingShape" mc:Ignorable="w14 w15 w16se w16cid wp14">
   <w:p>
     <w:pPr>
       <w:pStyle w:val="Footer"/>
@@ -5098,7 +5092,7 @@
 </file>
 
 <file path=word/footnotes.xml><?xml version="1.0" encoding="utf-8"?>
-<w:footnotes xmlns:wpc="http://schemas.microsoft.com/office/word/2010/wordprocessingCanvas" xmlns:cx="http://schemas.microsoft.com/office/drawing/2014/chartex" xmlns:cx1="http://schemas.microsoft.com/office/drawing/2015/9/8/chartex" xmlns:cx2="http://schemas.microsoft.com/office/drawing/2015/10/21/chartex" xmlns:cx3="http://schemas.microsoft.com/office/drawing/2016/5/9/chartex" xmlns:cx4="http://schemas.microsoft.com/office/drawing/2016/5/10/chartex" xmlns:cx5="http://schemas.microsoft.com/office/drawing/2016/5/11/chartex" xmlns:cx6="http://schemas.microsoft.com/office/drawing/2016/5/12/chartex" xmlns:cx7="http://schemas.microsoft.com/office/drawing/2016/5/13/chartex" xmlns:cx8="http://schemas.microsoft.com/office/drawing/2016/5/14/chartex" xmlns:mc="http://schemas.openxmlformats.org/markup-compatibility/2006" xmlns:aink="http://schemas.microsoft.com/office/drawing/2016/ink" xmlns:am3d="http://schemas.microsoft.com/office/drawing/2017/model3d" xmlns:o="urn:schemas-microsoft-com:office:office" xmlns:oel="http://schemas.microsoft.com/office/2019/extlst" xmlns:r="http://schemas.openxmlformats.org/officeDocument/2006/relationships" xmlns:m="http://schemas.openxmlformats.org/officeDocument/2006/math" xmlns:v="urn:schemas-microsoft-com:vml" xmlns:wp14="http://schemas.microsoft.com/office/word/2010/wordprocessingDrawing" xmlns:wp="http://schemas.openxmlformats.org/drawingml/2006/wordprocessingDrawing" xmlns:w10="urn:schemas-microsoft-com:office:word" xmlns:w="http://schemas.openxmlformats.org/wordprocessingml/2006/main" xmlns:w14="http://schemas.microsoft.com/office/word/2010/wordml" xmlns:w15="http://schemas.microsoft.com/office/word/2012/wordml" xmlns:w16cex="http://schemas.microsoft.com/office/word/2018/wordml/cex" xmlns:w16cid="http://schemas.microsoft.com/office/word/2016/wordml/cid" xmlns:w16="http://schemas.microsoft.com/office/word/2018/wordml" xmlns:w16du="http://schemas.microsoft.com/office/word/2023/wordml/word16du" xmlns:w16sdtdh="http://schemas.microsoft.com/office/word/2020/wordml/sdtdatahash" xmlns:w16sdtfl="http://schemas.microsoft.com/office/word/2024/wordml/sdtformatlock" xmlns:w16se="http://schemas.microsoft.com/office/word/2015/wordml/symex" xmlns:wpg="http://schemas.microsoft.com/office/word/2010/wordprocessingGroup" xmlns:wpi="http://schemas.microsoft.com/office/word/2010/wordprocessingInk" xmlns:wne="http://schemas.microsoft.com/office/word/2006/wordml" xmlns:wps="http://schemas.microsoft.com/office/word/2010/wordprocessingShape" mc:Ignorable="w14 w15 w16se w16cid w16 w16cex w16sdtdh w16sdtfl w16du wp14">
+<w:footnotes xmlns:wpc="http://schemas.microsoft.com/office/word/2010/wordprocessingCanvas" xmlns:cx="http://schemas.microsoft.com/office/drawing/2014/chartex" xmlns:cx1="http://schemas.microsoft.com/office/drawing/2015/9/8/chartex" xmlns:cx2="http://schemas.microsoft.com/office/drawing/2015/10/21/chartex" xmlns:cx3="http://schemas.microsoft.com/office/drawing/2016/5/9/chartex" xmlns:cx4="http://schemas.microsoft.com/office/drawing/2016/5/10/chartex" xmlns:cx5="http://schemas.microsoft.com/office/drawing/2016/5/11/chartex" xmlns:cx6="http://schemas.microsoft.com/office/drawing/2016/5/12/chartex" xmlns:cx7="http://schemas.microsoft.com/office/drawing/2016/5/13/chartex" xmlns:cx8="http://schemas.microsoft.com/office/drawing/2016/5/14/chartex" xmlns:mc="http://schemas.openxmlformats.org/markup-compatibility/2006" xmlns:aink="http://schemas.microsoft.com/office/drawing/2016/ink" xmlns:am3d="http://schemas.microsoft.com/office/drawing/2017/model3d" xmlns:o="urn:schemas-microsoft-com:office:office" xmlns:r="http://schemas.openxmlformats.org/officeDocument/2006/relationships" xmlns:m="http://schemas.openxmlformats.org/officeDocument/2006/math" xmlns:v="urn:schemas-microsoft-com:vml" xmlns:wp14="http://schemas.microsoft.com/office/word/2010/wordprocessingDrawing" xmlns:wp="http://schemas.openxmlformats.org/drawingml/2006/wordprocessingDrawing" xmlns:w10="urn:schemas-microsoft-com:office:word" xmlns:w="http://schemas.openxmlformats.org/wordprocessingml/2006/main" xmlns:w14="http://schemas.microsoft.com/office/word/2010/wordml" xmlns:w15="http://schemas.microsoft.com/office/word/2012/wordml" xmlns:w16cid="http://schemas.microsoft.com/office/word/2016/wordml/cid" xmlns:w16se="http://schemas.microsoft.com/office/word/2015/wordml/symex" xmlns:wpg="http://schemas.microsoft.com/office/word/2010/wordprocessingGroup" xmlns:wpi="http://schemas.microsoft.com/office/word/2010/wordprocessingInk" xmlns:wne="http://schemas.microsoft.com/office/word/2006/wordml" xmlns:wps="http://schemas.microsoft.com/office/word/2010/wordprocessingShape" mc:Ignorable="w14 w15 w16se w16cid wp14">
   <w:footnote w:type="separator" w:id="-1">
     <w:p>
       <w:pPr>
@@ -5123,7 +5117,7 @@
 </file>
 
 <file path=word/header1.xml><?xml version="1.0" encoding="utf-8"?>
-<w:hdr xmlns:wpc="http://schemas.microsoft.com/office/word/2010/wordprocessingCanvas" xmlns:cx="http://schemas.microsoft.com/office/drawing/2014/chartex" xmlns:cx1="http://schemas.microsoft.com/office/drawing/2015/9/8/chartex" xmlns:cx2="http://schemas.microsoft.com/office/drawing/2015/10/21/chartex" xmlns:cx3="http://schemas.microsoft.com/office/drawing/2016/5/9/chartex" xmlns:cx4="http://schemas.microsoft.com/office/drawing/2016/5/10/chartex" xmlns:cx5="http://schemas.microsoft.com/office/drawing/2016/5/11/chartex" xmlns:cx6="http://schemas.microsoft.com/office/drawing/2016/5/12/chartex" xmlns:cx7="http://schemas.microsoft.com/office/drawing/2016/5/13/chartex" xmlns:cx8="http://schemas.microsoft.com/office/drawing/2016/5/14/chartex" xmlns:mc="http://schemas.openxmlformats.org/markup-compatibility/2006" xmlns:aink="http://schemas.microsoft.com/office/drawing/2016/ink" xmlns:am3d="http://schemas.microsoft.com/office/drawing/2017/model3d" xmlns:o="urn:schemas-microsoft-com:office:office" xmlns:oel="http://schemas.microsoft.com/office/2019/extlst" xmlns:r="http://schemas.openxmlformats.org/officeDocument/2006/relationships" xmlns:m="http://schemas.openxmlformats.org/officeDocument/2006/math" xmlns:v="urn:schemas-microsoft-com:vml" xmlns:wp14="http://schemas.microsoft.com/office/word/2010/wordprocessingDrawing" xmlns:wp="http://schemas.openxmlformats.org/drawingml/2006/wordprocessingDrawing" xmlns:w10="urn:schemas-microsoft-com:office:word" xmlns:w="http://schemas.openxmlformats.org/wordprocessingml/2006/main" xmlns:w14="http://schemas.microsoft.com/office/word/2010/wordml" xmlns:w15="http://schemas.microsoft.com/office/word/2012/wordml" xmlns:w16cex="http://schemas.microsoft.com/office/word/2018/wordml/cex" xmlns:w16cid="http://schemas.microsoft.com/office/word/2016/wordml/cid" xmlns:w16="http://schemas.microsoft.com/office/word/2018/wordml" xmlns:w16du="http://schemas.microsoft.com/office/word/2023/wordml/word16du" xmlns:w16sdtdh="http://schemas.microsoft.com/office/word/2020/wordml/sdtdatahash" xmlns:w16sdtfl="http://schemas.microsoft.com/office/word/2024/wordml/sdtformatlock" xmlns:w16se="http://schemas.microsoft.com/office/word/2015/wordml/symex" xmlns:wpg="http://schemas.microsoft.com/office/word/2010/wordprocessingGroup" xmlns:wpi="http://schemas.microsoft.com/office/word/2010/wordprocessingInk" xmlns:wne="http://schemas.microsoft.com/office/word/2006/wordml" xmlns:wps="http://schemas.microsoft.com/office/word/2010/wordprocessingShape" mc:Ignorable="w14 w15 w16se w16cid w16 w16cex w16sdtdh w16sdtfl w16du wp14">
+<w:hdr xmlns:wpc="http://schemas.microsoft.com/office/word/2010/wordprocessingCanvas" xmlns:cx="http://schemas.microsoft.com/office/drawing/2014/chartex" xmlns:cx1="http://schemas.microsoft.com/office/drawing/2015/9/8/chartex" xmlns:cx2="http://schemas.microsoft.com/office/drawing/2015/10/21/chartex" xmlns:cx3="http://schemas.microsoft.com/office/drawing/2016/5/9/chartex" xmlns:cx4="http://schemas.microsoft.com/office/drawing/2016/5/10/chartex" xmlns:cx5="http://schemas.microsoft.com/office/drawing/2016/5/11/chartex" xmlns:cx6="http://schemas.microsoft.com/office/drawing/2016/5/12/chartex" xmlns:cx7="http://schemas.microsoft.com/office/drawing/2016/5/13/chartex" xmlns:cx8="http://schemas.microsoft.com/office/drawing/2016/5/14/chartex" xmlns:mc="http://schemas.openxmlformats.org/markup-compatibility/2006" xmlns:aink="http://schemas.microsoft.com/office/drawing/2016/ink" xmlns:am3d="http://schemas.microsoft.com/office/drawing/2017/model3d" xmlns:o="urn:schemas-microsoft-com:office:office" xmlns:r="http://schemas.openxmlformats.org/officeDocument/2006/relationships" xmlns:m="http://schemas.openxmlformats.org/officeDocument/2006/math" xmlns:v="urn:schemas-microsoft-com:vml" xmlns:wp14="http://schemas.microsoft.com/office/word/2010/wordprocessingDrawing" xmlns:wp="http://schemas.openxmlformats.org/drawingml/2006/wordprocessingDrawing" xmlns:w10="urn:schemas-microsoft-com:office:word" xmlns:w="http://schemas.openxmlformats.org/wordprocessingml/2006/main" xmlns:w14="http://schemas.microsoft.com/office/word/2010/wordml" xmlns:w15="http://schemas.microsoft.com/office/word/2012/wordml" xmlns:w16cid="http://schemas.microsoft.com/office/word/2016/wordml/cid" xmlns:w16se="http://schemas.microsoft.com/office/word/2015/wordml/symex" xmlns:wpg="http://schemas.microsoft.com/office/word/2010/wordprocessingGroup" xmlns:wpi="http://schemas.microsoft.com/office/word/2010/wordprocessingInk" xmlns:wne="http://schemas.microsoft.com/office/word/2006/wordml" xmlns:wps="http://schemas.microsoft.com/office/word/2010/wordprocessingShape" mc:Ignorable="w14 w15 w16se w16cid wp14">
   <w:p>
     <w:pPr>
       <w:pStyle w:val="Header"/>
@@ -5133,7 +5127,7 @@
 </file>
 
 <file path=word/header2.xml><?xml version="1.0" encoding="utf-8"?>
-<w:hdr xmlns:wpc="http://schemas.microsoft.com/office/word/2010/wordprocessingCanvas" xmlns:cx="http://schemas.microsoft.com/office/drawing/2014/chartex" xmlns:cx1="http://schemas.microsoft.com/office/drawing/2015/9/8/chartex" xmlns:cx2="http://schemas.microsoft.com/office/drawing/2015/10/21/chartex" xmlns:cx3="http://schemas.microsoft.com/office/drawing/2016/5/9/chartex" xmlns:cx4="http://schemas.microsoft.com/office/drawing/2016/5/10/chartex" xmlns:cx5="http://schemas.microsoft.com/office/drawing/2016/5/11/chartex" xmlns:cx6="http://schemas.microsoft.com/office/drawing/2016/5/12/chartex" xmlns:cx7="http://schemas.microsoft.com/office/drawing/2016/5/13/chartex" xmlns:cx8="http://schemas.microsoft.com/office/drawing/2016/5/14/chartex" xmlns:mc="http://schemas.openxmlformats.org/markup-compatibility/2006" xmlns:aink="http://schemas.microsoft.com/office/drawing/2016/ink" xmlns:am3d="http://schemas.microsoft.com/office/drawing/2017/model3d" xmlns:o="urn:schemas-microsoft-com:office:office" xmlns:oel="http://schemas.microsoft.com/office/2019/extlst" xmlns:r="http://schemas.openxmlformats.org/officeDocument/2006/relationships" xmlns:m="http://schemas.openxmlformats.org/officeDocument/2006/math" xmlns:v="urn:schemas-microsoft-com:vml" xmlns:wp14="http://schemas.microsoft.com/office/word/2010/wordprocessingDrawing" xmlns:wp="http://schemas.openxmlformats.org/drawingml/2006/wordprocessingDrawing" xmlns:w10="urn:schemas-microsoft-com:office:word" xmlns:w="http://schemas.openxmlformats.org/wordprocessingml/2006/main" xmlns:w14="http://schemas.microsoft.com/office/word/2010/wordml" xmlns:w15="http://schemas.microsoft.com/office/word/2012/wordml" xmlns:w16cex="http://schemas.microsoft.com/office/word/2018/wordml/cex" xmlns:w16cid="http://schemas.microsoft.com/office/word/2016/wordml/cid" xmlns:w16="http://schemas.microsoft.com/office/word/2018/wordml" xmlns:w16du="http://schemas.microsoft.com/office/word/2023/wordml/word16du" xmlns:w16sdtdh="http://schemas.microsoft.com/office/word/2020/wordml/sdtdatahash" xmlns:w16sdtfl="http://schemas.microsoft.com/office/word/2024/wordml/sdtformatlock" xmlns:w16se="http://schemas.microsoft.com/office/word/2015/wordml/symex" xmlns:wpg="http://schemas.microsoft.com/office/word/2010/wordprocessingGroup" xmlns:wpi="http://schemas.microsoft.com/office/word/2010/wordprocessingInk" xmlns:wne="http://schemas.microsoft.com/office/word/2006/wordml" xmlns:wps="http://schemas.microsoft.com/office/word/2010/wordprocessingShape" mc:Ignorable="w14 w15 w16se w16cid w16 w16cex w16sdtdh w16sdtfl w16du wp14">
+<w:hdr xmlns:wpc="http://schemas.microsoft.com/office/word/2010/wordprocessingCanvas" xmlns:cx="http://schemas.microsoft.com/office/drawing/2014/chartex" xmlns:cx1="http://schemas.microsoft.com/office/drawing/2015/9/8/chartex" xmlns:cx2="http://schemas.microsoft.com/office/drawing/2015/10/21/chartex" xmlns:cx3="http://schemas.microsoft.com/office/drawing/2016/5/9/chartex" xmlns:cx4="http://schemas.microsoft.com/office/drawing/2016/5/10/chartex" xmlns:cx5="http://schemas.microsoft.com/office/drawing/2016/5/11/chartex" xmlns:cx6="http://schemas.microsoft.com/office/drawing/2016/5/12/chartex" xmlns:cx7="http://schemas.microsoft.com/office/drawing/2016/5/13/chartex" xmlns:cx8="http://schemas.microsoft.com/office/drawing/2016/5/14/chartex" xmlns:mc="http://schemas.openxmlformats.org/markup-compatibility/2006" xmlns:aink="http://schemas.microsoft.com/office/drawing/2016/ink" xmlns:am3d="http://schemas.microsoft.com/office/drawing/2017/model3d" xmlns:o="urn:schemas-microsoft-com:office:office" xmlns:r="http://schemas.openxmlformats.org/officeDocument/2006/relationships" xmlns:m="http://schemas.openxmlformats.org/officeDocument/2006/math" xmlns:v="urn:schemas-microsoft-com:vml" xmlns:wp14="http://schemas.microsoft.com/office/word/2010/wordprocessingDrawing" xmlns:wp="http://schemas.openxmlformats.org/drawingml/2006/wordprocessingDrawing" xmlns:w10="urn:schemas-microsoft-com:office:word" xmlns:w="http://schemas.openxmlformats.org/wordprocessingml/2006/main" xmlns:w14="http://schemas.microsoft.com/office/word/2010/wordml" xmlns:w15="http://schemas.microsoft.com/office/word/2012/wordml" xmlns:w16cid="http://schemas.microsoft.com/office/word/2016/wordml/cid" xmlns:w16se="http://schemas.microsoft.com/office/word/2015/wordml/symex" xmlns:wpg="http://schemas.microsoft.com/office/word/2010/wordprocessingGroup" xmlns:wpi="http://schemas.microsoft.com/office/word/2010/wordprocessingInk" xmlns:wne="http://schemas.microsoft.com/office/word/2006/wordml" xmlns:wps="http://schemas.microsoft.com/office/word/2010/wordprocessingShape" mc:Ignorable="w14 w15 w16se w16cid wp14">
   <w:p>
     <w:pPr>
       <w:pStyle w:val="Header"/>
@@ -5159,7 +5153,7 @@
 </file>
 
 <file path=word/header3.xml><?xml version="1.0" encoding="utf-8"?>
-<w:hdr xmlns:wpc="http://schemas.microsoft.com/office/word/2010/wordprocessingCanvas" xmlns:cx="http://schemas.microsoft.com/office/drawing/2014/chartex" xmlns:cx1="http://schemas.microsoft.com/office/drawing/2015/9/8/chartex" xmlns:cx2="http://schemas.microsoft.com/office/drawing/2015/10/21/chartex" xmlns:cx3="http://schemas.microsoft.com/office/drawing/2016/5/9/chartex" xmlns:cx4="http://schemas.microsoft.com/office/drawing/2016/5/10/chartex" xmlns:cx5="http://schemas.microsoft.com/office/drawing/2016/5/11/chartex" xmlns:cx6="http://schemas.microsoft.com/office/drawing/2016/5/12/chartex" xmlns:cx7="http://schemas.microsoft.com/office/drawing/2016/5/13/chartex" xmlns:cx8="http://schemas.microsoft.com/office/drawing/2016/5/14/chartex" xmlns:mc="http://schemas.openxmlformats.org/markup-compatibility/2006" xmlns:aink="http://schemas.microsoft.com/office/drawing/2016/ink" xmlns:am3d="http://schemas.microsoft.com/office/drawing/2017/model3d" xmlns:o="urn:schemas-microsoft-com:office:office" xmlns:oel="http://schemas.microsoft.com/office/2019/extlst" xmlns:r="http://schemas.openxmlformats.org/officeDocument/2006/relationships" xmlns:m="http://schemas.openxmlformats.org/officeDocument/2006/math" xmlns:v="urn:schemas-microsoft-com:vml" xmlns:wp14="http://schemas.microsoft.com/office/word/2010/wordprocessingDrawing" xmlns:wp="http://schemas.openxmlformats.org/drawingml/2006/wordprocessingDrawing" xmlns:w10="urn:schemas-microsoft-com:office:word" xmlns:w="http://schemas.openxmlformats.org/wordprocessingml/2006/main" xmlns:w14="http://schemas.microsoft.com/office/word/2010/wordml" xmlns:w15="http://schemas.microsoft.com/office/word/2012/wordml" xmlns:w16cex="http://schemas.microsoft.com/office/word/2018/wordml/cex" xmlns:w16cid="http://schemas.microsoft.com/office/word/2016/wordml/cid" xmlns:w16="http://schemas.microsoft.com/office/word/2018/wordml" xmlns:w16du="http://schemas.microsoft.com/office/word/2023/wordml/word16du" xmlns:w16sdtdh="http://schemas.microsoft.com/office/word/2020/wordml/sdtdatahash" xmlns:w16sdtfl="http://schemas.microsoft.com/office/word/2024/wordml/sdtformatlock" xmlns:w16se="http://schemas.microsoft.com/office/word/2015/wordml/symex" xmlns:wpg="http://schemas.microsoft.com/office/word/2010/wordprocessingGroup" xmlns:wpi="http://schemas.microsoft.com/office/word/2010/wordprocessingInk" xmlns:wne="http://schemas.microsoft.com/office/word/2006/wordml" xmlns:wps="http://schemas.microsoft.com/office/word/2010/wordprocessingShape" mc:Ignorable="w14 w15 w16se w16cid w16 w16cex w16sdtdh w16sdtfl w16du wp14">
+<w:hdr xmlns:wpc="http://schemas.microsoft.com/office/word/2010/wordprocessingCanvas" xmlns:cx="http://schemas.microsoft.com/office/drawing/2014/chartex" xmlns:cx1="http://schemas.microsoft.com/office/drawing/2015/9/8/chartex" xmlns:cx2="http://schemas.microsoft.com/office/drawing/2015/10/21/chartex" xmlns:cx3="http://schemas.microsoft.com/office/drawing/2016/5/9/chartex" xmlns:cx4="http://schemas.microsoft.com/office/drawing/2016/5/10/chartex" xmlns:cx5="http://schemas.microsoft.com/office/drawing/2016/5/11/chartex" xmlns:cx6="http://schemas.microsoft.com/office/drawing/2016/5/12/chartex" xmlns:cx7="http://schemas.microsoft.com/office/drawing/2016/5/13/chartex" xmlns:cx8="http://schemas.microsoft.com/office/drawing/2016/5/14/chartex" xmlns:mc="http://schemas.openxmlformats.org/markup-compatibility/2006" xmlns:aink="http://schemas.microsoft.com/office/drawing/2016/ink" xmlns:am3d="http://schemas.microsoft.com/office/drawing/2017/model3d" xmlns:o="urn:schemas-microsoft-com:office:office" xmlns:r="http://schemas.openxmlformats.org/officeDocument/2006/relationships" xmlns:m="http://schemas.openxmlformats.org/officeDocument/2006/math" xmlns:v="urn:schemas-microsoft-com:vml" xmlns:wp14="http://schemas.microsoft.com/office/word/2010/wordprocessingDrawing" xmlns:wp="http://schemas.openxmlformats.org/drawingml/2006/wordprocessingDrawing" xmlns:w10="urn:schemas-microsoft-com:office:word" xmlns:w="http://schemas.openxmlformats.org/wordprocessingml/2006/main" xmlns:w14="http://schemas.microsoft.com/office/word/2010/wordml" xmlns:w15="http://schemas.microsoft.com/office/word/2012/wordml" xmlns:w16cid="http://schemas.microsoft.com/office/word/2016/wordml/cid" xmlns:w16se="http://schemas.microsoft.com/office/word/2015/wordml/symex" xmlns:wpg="http://schemas.microsoft.com/office/word/2010/wordprocessingGroup" xmlns:wpi="http://schemas.microsoft.com/office/word/2010/wordprocessingInk" xmlns:wne="http://schemas.microsoft.com/office/word/2006/wordml" xmlns:wps="http://schemas.microsoft.com/office/word/2010/wordprocessingShape" mc:Ignorable="w14 w15 w16se w16cid wp14">
   <w:p>
     <w:pPr>
       <w:pStyle w:val="Header"/>
@@ -5169,7 +5163,7 @@
 </file>
 
 <file path=word/styles.xml><?xml version="1.0" encoding="utf-8"?>
-<w:styles xmlns:mc="http://schemas.openxmlformats.org/markup-compatibility/2006" xmlns:r="http://schemas.openxmlformats.org/officeDocument/2006/relationships" xmlns:w="http://schemas.openxmlformats.org/wordprocessingml/2006/main" xmlns:w14="http://schemas.microsoft.com/office/word/2010/wordml" xmlns:w15="http://schemas.microsoft.com/office/word/2012/wordml" xmlns:w16cex="http://schemas.microsoft.com/office/word/2018/wordml/cex" xmlns:w16cid="http://schemas.microsoft.com/office/word/2016/wordml/cid" xmlns:w16="http://schemas.microsoft.com/office/word/2018/wordml" xmlns:w16du="http://schemas.microsoft.com/office/word/2023/wordml/word16du" xmlns:w16sdtdh="http://schemas.microsoft.com/office/word/2020/wordml/sdtdatahash" xmlns:w16sdtfl="http://schemas.microsoft.com/office/word/2024/wordml/sdtformatlock" xmlns:w16se="http://schemas.microsoft.com/office/word/2015/wordml/symex" mc:Ignorable="w14 w15 w16se w16cid w16 w16cex w16sdtdh w16sdtfl w16du">
+<w:styles xmlns:mc="http://schemas.openxmlformats.org/markup-compatibility/2006" xmlns:r="http://schemas.openxmlformats.org/officeDocument/2006/relationships" xmlns:w="http://schemas.openxmlformats.org/wordprocessingml/2006/main" xmlns:w14="http://schemas.microsoft.com/office/word/2010/wordml" xmlns:w15="http://schemas.microsoft.com/office/word/2012/wordml" xmlns:w16cid="http://schemas.microsoft.com/office/word/2016/wordml/cid" xmlns:w16se="http://schemas.microsoft.com/office/word/2015/wordml/symex" mc:Ignorable="w14 w15 w16se w16cid">
   <w:docDefaults>
     <w:rPrDefault>
       <w:rPr>
@@ -5187,7 +5181,7 @@
       </w:pPr>
     </w:pPrDefault>
   </w:docDefaults>
-  <w:latentStyles w:defLockedState="0" w:defUIPriority="99" w:defSemiHidden="0" w:defUnhideWhenUsed="0" w:defQFormat="0" w:count="376">
+  <w:latentStyles w:defLockedState="0" w:defUIPriority="99" w:defSemiHidden="0" w:defUnhideWhenUsed="0" w:defQFormat="0" w:count="375">
     <w:lsdException w:name="Normal" w:uiPriority="0" w:qFormat="1"/>
     <w:lsdException w:name="heading 1" w:uiPriority="9" w:qFormat="1"/>
     <w:lsdException w:name="heading 2" w:semiHidden="1" w:uiPriority="9" w:unhideWhenUsed="1" w:qFormat="1"/>
@@ -5563,7 +5557,6 @@
     <w:lsdException w:name="Smart Hyperlink" w:semiHidden="1" w:unhideWhenUsed="1"/>
     <w:lsdException w:name="Hashtag" w:semiHidden="1" w:unhideWhenUsed="1"/>
     <w:lsdException w:name="Unresolved Mention" w:semiHidden="1" w:unhideWhenUsed="1"/>
-    <w:lsdException w:name="Smart Link" w:semiHidden="1" w:unhideWhenUsed="1"/>
   </w:latentStyles>
   <w:style w:type="paragraph" w:default="1" w:styleId="Normal">
     <w:name w:val="Normal"/>
@@ -5772,6 +5765,7 @@
   <w:style w:type="character" w:default="1" w:styleId="DefaultParagraphFont">
     <w:name w:val="Default Paragraph Font"/>
     <w:uiPriority w:val="1"/>
+    <w:semiHidden/>
     <w:unhideWhenUsed/>
   </w:style>
   <w:style w:type="table" w:default="1" w:styleId="TableNormal">
@@ -6460,7 +6454,7 @@
 </file>
 
 <file path=customXml/itemProps1.xml><?xml version="1.0" encoding="utf-8"?>
-<ds:datastoreItem xmlns:ds="http://schemas.openxmlformats.org/officeDocument/2006/customXml" ds:itemID="{FFAC696C-E34C-4C8A-83C8-974B9911AEE2}">
+<ds:datastoreItem xmlns:ds="http://schemas.openxmlformats.org/officeDocument/2006/customXml" ds:itemID="{B1E563B8-708E-4842-B687-AE8C328E488D}">
   <ds:schemaRefs>
     <ds:schemaRef ds:uri="http://schemas.openxmlformats.org/officeDocument/2006/bibliography"/>
   </ds:schemaRefs>

</xml_diff>